<commit_message>
Anotaciones para capitulo 2
</commit_message>
<xml_diff>
--- a/Propuesta - Vacunas.docx
+++ b/Propuesta - Vacunas.docx
@@ -3670,7 +3670,23 @@
           <w:rFonts w:ascii="Arial" w:eastAsiaTheme="minorHAnsi" w:hAnsi="Arial" w:cs="Arial"/>
           <w:lang w:val="es-419" w:eastAsia="es-GT"/>
         </w:rPr>
-        <w:t>En Guatemala, el Ministerio de Salud Pública y Asistencia Social (MSPAS) es la entidad rectora encargada de formular las políticas y hacer cumplir el régimen jurídico relativo a la salud preventiva y curativa de la población (MSPAS, s.f.). Dentro de su estructura organizativa, la Dirección General de Salud concentra las funciones de epidemiología, salud ambiental y atención primaria, mientras que unidades especializadas, entre ellas la Unidad de Vacunación, son responsables de coordinar los programas de inmunización a nivel nacional. En este contexto, con la entrada en vigencia del Decreto 25-2024, Ley de Vacunación, el Estado guatemalteco fortaleció el marco legal en materia de inmunización, garantizando el acceso universal y gratuito a las vacunas para toda la población y estableciendo la obligación del MSPAS de actualizar anualmente un esquema nacional de vacunación adaptado a las necesidades epidemiológicas del país (Congreso de la República de Guatemala, Decreto 25-2024).</w:t>
+        <w:t xml:space="preserve">En Guatemala, el Ministerio de Salud Pública y Asistencia Social (MSPAS) es la entidad rectora encargada de formular las políticas y hacer cumplir el régimen jurídico relativo a la salud preventiva y curativa de la población (MSPAS, s.f.). Dentro de su estructura organizativa, la Dirección General de Salud concentra las funciones de epidemiología, salud ambiental y atención primaria, mientras que unidades especializadas, entre ellas la Unidad de Vacunación, son responsables de coordinar los programas de inmunización a nivel nacional. En este contexto, con la </w:t>
+      </w:r>
+      <w:proofErr w:type="gramStart"/>
+      <w:r>
+        <w:rPr>
+          <w:rFonts w:ascii="Arial" w:eastAsiaTheme="minorHAnsi" w:hAnsi="Arial" w:cs="Arial"/>
+          <w:lang w:val="es-419" w:eastAsia="es-GT"/>
+        </w:rPr>
+        <w:t>entrada en vigencia</w:t>
+      </w:r>
+      <w:proofErr w:type="gramEnd"/>
+      <w:r>
+        <w:rPr>
+          <w:rFonts w:ascii="Arial" w:eastAsiaTheme="minorHAnsi" w:hAnsi="Arial" w:cs="Arial"/>
+          <w:lang w:val="es-419" w:eastAsia="es-GT"/>
+        </w:rPr>
+        <w:t xml:space="preserve"> del Decreto 25-2024, Ley de Vacunación, el Estado guatemalteco fortaleció el marco legal en materia de inmunización, garantizando el acceso universal y gratuito a las vacunas para toda la población y estableciendo la obligación del MSPAS de actualizar anualmente un esquema nacional de vacunación adaptado a las necesidades epidemiológicas del país (Congreso de la República de Guatemala, Decreto 25-2024).</w:t>
       </w:r>
     </w:p>
     <w:p>
@@ -4076,7 +4092,23 @@
           <w:rFonts w:ascii="Arial" w:eastAsiaTheme="minorHAnsi" w:hAnsi="Arial" w:cs="Arial"/>
           <w:lang w:val="es-419" w:eastAsia="es-GT"/>
         </w:rPr>
-        <w:t>En los centros de salud del departamento de San Marcos también se utiliza el SIGSA para el registro de la vacunación aplicada a la población; sin embargo, para el control interno de las existencias de vacunas, hasta el momento el único método confirmado es el registro físico en hojas de papel, el cual constituye la principal causa de las dificultades que existen actualmente para el manejo de esta información. A continuación se presenta este intento de solución al problema:</w:t>
+        <w:t xml:space="preserve">En los centros de salud del departamento de San Marcos también se utiliza el SIGSA para el registro de la vacunación aplicada a la población; sin embargo, para el control interno de las existencias de vacunas, hasta el momento el único método confirmado es el registro físico en hojas de papel, el cual constituye la principal causa de las dificultades que existen actualmente para el manejo de esta información. A </w:t>
+      </w:r>
+      <w:proofErr w:type="gramStart"/>
+      <w:r>
+        <w:rPr>
+          <w:rFonts w:ascii="Arial" w:eastAsiaTheme="minorHAnsi" w:hAnsi="Arial" w:cs="Arial"/>
+          <w:lang w:val="es-419" w:eastAsia="es-GT"/>
+        </w:rPr>
+        <w:t>continuación</w:t>
+      </w:r>
+      <w:proofErr w:type="gramEnd"/>
+      <w:r>
+        <w:rPr>
+          <w:rFonts w:ascii="Arial" w:eastAsiaTheme="minorHAnsi" w:hAnsi="Arial" w:cs="Arial"/>
+          <w:lang w:val="es-419" w:eastAsia="es-GT"/>
+        </w:rPr>
+        <w:t xml:space="preserve"> se presenta este intento de solución al problema:</w:t>
       </w:r>
     </w:p>
     <w:p>
@@ -4623,8 +4655,19 @@
           <w:bCs/>
           <w:lang w:val="es-419" w:eastAsia="es-GT"/>
         </w:rPr>
-        <w:t>Open mSupply</w:t>
-      </w:r>
+        <w:t xml:space="preserve">Open </w:t>
+      </w:r>
+      <w:proofErr w:type="spellStart"/>
+      <w:r>
+        <w:rPr>
+          <w:rFonts w:ascii="Arial" w:eastAsiaTheme="minorHAnsi" w:hAnsi="Arial" w:cs="Arial"/>
+          <w:b/>
+          <w:bCs/>
+          <w:lang w:val="es-419" w:eastAsia="es-GT"/>
+        </w:rPr>
+        <w:t>mSupply</w:t>
+      </w:r>
+      <w:proofErr w:type="spellEnd"/>
     </w:p>
     <w:p>
       <w:pPr>
@@ -4641,7 +4684,39 @@
           <w:rFonts w:ascii="Arial" w:eastAsiaTheme="minorHAnsi" w:hAnsi="Arial" w:cs="Arial"/>
           <w:lang w:val="es-GT" w:eastAsia="es-GT"/>
         </w:rPr>
-        <w:t>Es un sistema de información para la gestión logística (LMIS, por sus siglas en inglés) de código abierto, bajo licencia AGPL, utilizado en más de 30 países para apoyar el registro, la distribución y el despacho de productos médicos desde bodegas nacionales hasta clínicas remotas (mSupply Foundation, s.f.). Incluye un módulo específico de cadena de frío que permite monitorear el estado de los refrigeradores y dar seguimiento al historial de cada lote de vacunas desde su adquisición hasta su aplicación. Sin embargo, al tratarse de una plataforma diseñada para cadenas de suministro nacionales de varios niveles, su implementación requiere infraestructura de servidor propia y personal con conocimientos técnicos para instalarla, configurarla y mantenerla, y no cuenta con un proveedor local en Guatemala que brinde soporte o capacitación. Estas condiciones representan una barrera considerable para su adopción directa por parte de los centros de salud del departamento de San Marcos, donde no se cuenta con personal técnico dedicado a la administración de este tipo de sistemas.</w:t>
+        <w:t>Es un sistema de información para la gestión logística (LMIS, por sus siglas en inglés) de código abierto, bajo licencia AGPL, utilizado en más de 30 países para apoyar el registro, la distribución y el despacho de productos médicos desde bodegas nacionales hasta clínicas remotas (</w:t>
+      </w:r>
+      <w:proofErr w:type="spellStart"/>
+      <w:r>
+        <w:rPr>
+          <w:rFonts w:ascii="Arial" w:eastAsiaTheme="minorHAnsi" w:hAnsi="Arial" w:cs="Arial"/>
+          <w:lang w:val="es-GT" w:eastAsia="es-GT"/>
+        </w:rPr>
+        <w:t>mSupply</w:t>
+      </w:r>
+      <w:proofErr w:type="spellEnd"/>
+      <w:r>
+        <w:rPr>
+          <w:rFonts w:ascii="Arial" w:eastAsiaTheme="minorHAnsi" w:hAnsi="Arial" w:cs="Arial"/>
+          <w:lang w:val="es-GT" w:eastAsia="es-GT"/>
+        </w:rPr>
+        <w:t xml:space="preserve"> </w:t>
+      </w:r>
+      <w:proofErr w:type="spellStart"/>
+      <w:r>
+        <w:rPr>
+          <w:rFonts w:ascii="Arial" w:eastAsiaTheme="minorHAnsi" w:hAnsi="Arial" w:cs="Arial"/>
+          <w:lang w:val="es-GT" w:eastAsia="es-GT"/>
+        </w:rPr>
+        <w:t>Foundation</w:t>
+      </w:r>
+      <w:proofErr w:type="spellEnd"/>
+      <w:r>
+        <w:rPr>
+          <w:rFonts w:ascii="Arial" w:eastAsiaTheme="minorHAnsi" w:hAnsi="Arial" w:cs="Arial"/>
+          <w:lang w:val="es-GT" w:eastAsia="es-GT"/>
+        </w:rPr>
+        <w:t>, s.f.). Incluye un módulo específico de cadena de frío que permite monitorear el estado de los refrigeradores y dar seguimiento al historial de cada lote de vacunas desde su adquisición hasta su aplicación. Sin embargo, al tratarse de una plataforma diseñada para cadenas de suministro nacionales de varios niveles, su implementación requiere infraestructura de servidor propia y personal con conocimientos técnicos para instalarla, configurarla y mantenerla, y no cuenta con un proveedor local en Guatemala que brinde soporte o capacitación. Estas condiciones representan una barrera considerable para su adopción directa por parte de los centros de salud del departamento de San Marcos, donde no se cuenta con personal técnico dedicado a la administración de este tipo de sistemas.</w:t>
       </w:r>
     </w:p>
     <w:p>
@@ -5059,7 +5134,35 @@
           <w:rFonts w:ascii="Arial" w:hAnsi="Arial" w:cs="Arial"/>
           <w:lang w:val="es-GT"/>
         </w:rPr>
-        <w:t>Implementar una aplicación web centralizada para gestionar y controlar la disponibilidad de vacunas en los centros de salud del departamento de San Marcos, con el fin de optimizar los procesos de registro e inventario en tiempo real.</w:t>
+        <w:t xml:space="preserve">Implementar una aplicación web centralizada </w:t>
+      </w:r>
+      <w:r>
+        <w:rPr>
+          <w:rFonts w:ascii="Arial" w:hAnsi="Arial" w:cs="Arial"/>
+          <w:lang w:val="es-GT"/>
+        </w:rPr>
+        <w:t>y</w:t>
+      </w:r>
+      <w:r>
+        <w:rPr>
+          <w:rFonts w:ascii="Arial" w:hAnsi="Arial" w:cs="Arial"/>
+          <w:lang w:val="es-GT"/>
+        </w:rPr>
+        <w:t xml:space="preserve"> </w:t>
+      </w:r>
+      <w:r>
+        <w:rPr>
+          <w:rFonts w:ascii="Arial" w:hAnsi="Arial" w:cs="Arial"/>
+          <w:lang w:val="es-GT"/>
+        </w:rPr>
+        <w:t xml:space="preserve">distrital </w:t>
+      </w:r>
+      <w:r>
+        <w:rPr>
+          <w:rFonts w:ascii="Arial" w:hAnsi="Arial" w:cs="Arial"/>
+          <w:lang w:val="es-GT"/>
+        </w:rPr>
+        <w:t>para gestionar y controlar la disponibilidad de vacunas en los centros de salud del departamento de San Marcos, con el fin de optimizar los procesos de registro e inventario en tiempo real.</w:t>
       </w:r>
     </w:p>
     <w:p>
@@ -5237,7 +5340,21 @@
           <w:rFonts w:ascii="Arial" w:eastAsiaTheme="minorHAnsi" w:hAnsi="Arial" w:cs="Arial"/>
           <w:lang w:val="es-419" w:eastAsia="es-GT"/>
         </w:rPr>
-        <w:t>Desplegar el sistema web publicándolo en un servidor alojado en la nube, para que la Dirección de Área de Salud de San Marcos y los centros de salud del departamento tengan acceso continuo y remoto al sistema.</w:t>
+        <w:t>Desplegar el sistema web publicándolo en un servidor alojado en la nube, para que los centros de salud del departamento</w:t>
+      </w:r>
+      <w:r>
+        <w:rPr>
+          <w:rFonts w:ascii="Arial" w:eastAsiaTheme="minorHAnsi" w:hAnsi="Arial" w:cs="Arial"/>
+          <w:lang w:val="es-419" w:eastAsia="es-GT"/>
+        </w:rPr>
+        <w:t xml:space="preserve"> de San Marcos</w:t>
+      </w:r>
+      <w:r>
+        <w:rPr>
+          <w:rFonts w:ascii="Arial" w:eastAsiaTheme="minorHAnsi" w:hAnsi="Arial" w:cs="Arial"/>
+          <w:lang w:val="es-419" w:eastAsia="es-GT"/>
+        </w:rPr>
+        <w:t xml:space="preserve"> tengan acceso continuo y remoto al sistema.</w:t>
       </w:r>
     </w:p>
     <w:p>
@@ -5311,6 +5428,33 @@
     </w:p>
     <w:p>
       <w:pPr>
+        <w:rPr>
+          <w:lang w:eastAsia="es-GT"/>
+        </w:rPr>
+      </w:pPr>
+      <w:r>
+        <w:rPr>
+          <w:lang w:eastAsia="es-GT"/>
+        </w:rPr>
+        <w:t>(</w:t>
+      </w:r>
+      <w:proofErr w:type="spellStart"/>
+      <w:r>
+        <w:rPr>
+          <w:lang w:eastAsia="es-GT"/>
+        </w:rPr>
+        <w:t>Parrafo</w:t>
+      </w:r>
+      <w:proofErr w:type="spellEnd"/>
+      <w:r>
+        <w:rPr>
+          <w:lang w:eastAsia="es-GT"/>
+        </w:rPr>
+        <w:t xml:space="preserve"> introductorio)</w:t>
+      </w:r>
+    </w:p>
+    <w:p>
+      <w:pPr>
         <w:pStyle w:val="Ttulo2"/>
         <w:numPr>
           <w:ilvl w:val="0"/>
@@ -5328,7 +5472,21 @@
     </w:p>
     <w:p>
       <w:pPr>
+        <w:rPr>
+          <w:lang w:val="es-419" w:eastAsia="es-GT"/>
+        </w:rPr>
+      </w:pPr>
+      <w:r>
+        <w:rPr>
+          <w:lang w:val="es-419" w:eastAsia="es-GT"/>
+        </w:rPr>
+        <w:t>(Hay que reordenar todo)</w:t>
+      </w:r>
+    </w:p>
+    <w:p>
+      <w:pPr>
         <w:spacing w:after="0" w:line="276" w:lineRule="auto"/>
+        <w:ind w:firstLine="360"/>
         <w:jc w:val="both"/>
         <w:rPr>
           <w:rFonts w:ascii="Arial" w:hAnsi="Arial" w:cs="Arial"/>
@@ -5816,7 +5974,25 @@
           <w:sz w:val="24"/>
           <w:szCs w:val="24"/>
         </w:rPr>
-        <w:t>Para el desarrollo del proyecto se utilizará la metodología Scrum, debido a que permite organizar el trabajo en ciclos cortos e incrementales, conocidos como sprints. Esta metodología resulta adecuada para proyectos de software en los que se requiere flexibilidad, revisión constante y adaptación a cambios durante el proceso de desarrollo. La elección de Scrum responde a la naturaleza del proyecto, ya que el desarrollo de una aplicación web para centros de salud requiere validaciones frecuentes, definición progresiva de funcionalidades y revisión constante de los módulos implementados. Esto favorece la reducción de errores, mejora la comunicación del equipo y permite entregar incrementos funcionales durante el desarrollo.</w:t>
+        <w:t xml:space="preserve">Para el desarrollo del proyecto se utilizará la metodología Scrum, debido a que permite organizar el trabajo en ciclos cortos e incrementales, conocidos como </w:t>
+      </w:r>
+      <w:proofErr w:type="spellStart"/>
+      <w:r>
+        <w:rPr>
+          <w:rFonts w:ascii="Arial" w:hAnsi="Arial" w:cs="Arial"/>
+          <w:sz w:val="24"/>
+          <w:szCs w:val="24"/>
+        </w:rPr>
+        <w:t>sprints</w:t>
+      </w:r>
+      <w:proofErr w:type="spellEnd"/>
+      <w:r>
+        <w:rPr>
+          <w:rFonts w:ascii="Arial" w:hAnsi="Arial" w:cs="Arial"/>
+          <w:sz w:val="24"/>
+          <w:szCs w:val="24"/>
+        </w:rPr>
+        <w:t>. Esta metodología resulta adecuada para proyectos de software en los que se requiere flexibilidad, revisión constante y adaptación a cambios durante el proceso de desarrollo. La elección de Scrum responde a la naturaleza del proyecto, ya que el desarrollo de una aplicación web para centros de salud requiere validaciones frecuentes, definición progresiva de funcionalidades y revisión constante de los módulos implementados. Esto favorece la reducción de errores, mejora la comunicación del equipo y permite entregar incrementos funcionales durante el desarrollo.</w:t>
       </w:r>
     </w:p>
     <w:p>
@@ -5836,7 +6012,61 @@
           <w:sz w:val="24"/>
           <w:szCs w:val="24"/>
         </w:rPr>
-        <w:t>El rol de Product Owner será representado por el integrante encargado de priorizar los requerimientos del sistema, considerando las necesidades del centro de salud y los objetivos del proyecto. El Scrum Master será el responsable de coordinar el cumplimiento de la metodología, organizar las reuniones y apoyar al equipo en la eliminación de obstáculos. Los Developers serán los integrantes encargados del análisis, diseño, programación, pruebas y documentación del sistema.</w:t>
+        <w:t xml:space="preserve">El rol de </w:t>
+      </w:r>
+      <w:proofErr w:type="spellStart"/>
+      <w:r>
+        <w:rPr>
+          <w:rFonts w:ascii="Arial" w:hAnsi="Arial" w:cs="Arial"/>
+          <w:sz w:val="24"/>
+          <w:szCs w:val="24"/>
+        </w:rPr>
+        <w:t>Product</w:t>
+      </w:r>
+      <w:proofErr w:type="spellEnd"/>
+      <w:r>
+        <w:rPr>
+          <w:rFonts w:ascii="Arial" w:hAnsi="Arial" w:cs="Arial"/>
+          <w:sz w:val="24"/>
+          <w:szCs w:val="24"/>
+        </w:rPr>
+        <w:t xml:space="preserve"> Owner será representado por el integrante encargado de priorizar los requerimientos del sistema, considerando las necesidades del centro de salud y los objetivos del proyecto. El Scrum </w:t>
+      </w:r>
+      <w:proofErr w:type="gramStart"/>
+      <w:r>
+        <w:rPr>
+          <w:rFonts w:ascii="Arial" w:hAnsi="Arial" w:cs="Arial"/>
+          <w:sz w:val="24"/>
+          <w:szCs w:val="24"/>
+        </w:rPr>
+        <w:t>Master</w:t>
+      </w:r>
+      <w:proofErr w:type="gramEnd"/>
+      <w:r>
+        <w:rPr>
+          <w:rFonts w:ascii="Arial" w:hAnsi="Arial" w:cs="Arial"/>
+          <w:sz w:val="24"/>
+          <w:szCs w:val="24"/>
+        </w:rPr>
+        <w:t xml:space="preserve"> será el responsable de coordinar el cumplimiento de la metodología, organizar las reuniones y apoyar al equipo en la eliminación de obstáculos. Los </w:t>
+      </w:r>
+      <w:proofErr w:type="spellStart"/>
+      <w:r>
+        <w:rPr>
+          <w:rFonts w:ascii="Arial" w:hAnsi="Arial" w:cs="Arial"/>
+          <w:sz w:val="24"/>
+          <w:szCs w:val="24"/>
+        </w:rPr>
+        <w:t>Developers</w:t>
+      </w:r>
+      <w:proofErr w:type="spellEnd"/>
+      <w:r>
+        <w:rPr>
+          <w:rFonts w:ascii="Arial" w:hAnsi="Arial" w:cs="Arial"/>
+          <w:sz w:val="24"/>
+          <w:szCs w:val="24"/>
+        </w:rPr>
+        <w:t xml:space="preserve"> serán los integrantes encargados del análisis, diseño, programación, pruebas y documentación del sistema.</w:t>
       </w:r>
     </w:p>
     <w:p>
@@ -5856,7 +6086,43 @@
           <w:sz w:val="24"/>
           <w:szCs w:val="24"/>
         </w:rPr>
-        <w:t>Las principales herramientas de Scrum que se utilizarán en el proyecto serán el Product Backlog, el Sprint Backlog y el Incremento. El Product Backlog contendrá la lista priorizada de funcionalidades del sistema, tales como autenticación de usuarios, registro de vacunas, descarga de formatos, carga de información, vista tipo tabla y consultas. El Sprint Backlog incluirá las tareas seleccionadas para cada ciclo de trabajo. El Incremento representará el avance funcional obtenido al finalizar cada sprint.</w:t>
+        <w:t xml:space="preserve">Las principales herramientas de Scrum que se utilizarán en el proyecto serán el </w:t>
+      </w:r>
+      <w:proofErr w:type="spellStart"/>
+      <w:r>
+        <w:rPr>
+          <w:rFonts w:ascii="Arial" w:hAnsi="Arial" w:cs="Arial"/>
+          <w:sz w:val="24"/>
+          <w:szCs w:val="24"/>
+        </w:rPr>
+        <w:t>Product</w:t>
+      </w:r>
+      <w:proofErr w:type="spellEnd"/>
+      <w:r>
+        <w:rPr>
+          <w:rFonts w:ascii="Arial" w:hAnsi="Arial" w:cs="Arial"/>
+          <w:sz w:val="24"/>
+          <w:szCs w:val="24"/>
+        </w:rPr>
+        <w:t xml:space="preserve"> Backlog, el Sprint Backlog y el Incremento. El </w:t>
+      </w:r>
+      <w:proofErr w:type="spellStart"/>
+      <w:r>
+        <w:rPr>
+          <w:rFonts w:ascii="Arial" w:hAnsi="Arial" w:cs="Arial"/>
+          <w:sz w:val="24"/>
+          <w:szCs w:val="24"/>
+        </w:rPr>
+        <w:t>Product</w:t>
+      </w:r>
+      <w:proofErr w:type="spellEnd"/>
+      <w:r>
+        <w:rPr>
+          <w:rFonts w:ascii="Arial" w:hAnsi="Arial" w:cs="Arial"/>
+          <w:sz w:val="24"/>
+          <w:szCs w:val="24"/>
+        </w:rPr>
+        <w:t xml:space="preserve"> Backlog contendrá la lista priorizada de funcionalidades del sistema, tales como autenticación de usuarios, registro de vacunas, descarga de formatos, carga de información, vista tipo tabla y consultas. El Sprint Backlog incluirá las tareas seleccionadas para cada ciclo de trabajo. El Incremento representará el avance funcional obtenido al finalizar cada sprint.</w:t>
       </w:r>
     </w:p>
     <w:p>
@@ -6005,7 +6271,15 @@
       </w:pPr>
       <w:bookmarkStart w:id="31" w:name="_Toc236118328"/>
       <w:r>
-        <w:t>Etapa uno: levantamiento de requerimientos y definición del Product Backlog</w:t>
+        <w:t xml:space="preserve">Etapa uno: levantamiento de requerimientos y definición del </w:t>
+      </w:r>
+      <w:proofErr w:type="spellStart"/>
+      <w:r>
+        <w:t>Product</w:t>
+      </w:r>
+      <w:proofErr w:type="spellEnd"/>
+      <w:r>
+        <w:t xml:space="preserve"> Backlog</w:t>
       </w:r>
       <w:bookmarkEnd w:id="31"/>
     </w:p>
@@ -6043,6 +6317,7 @@
           <w:szCs w:val="24"/>
         </w:rPr>
       </w:pPr>
+      <w:proofErr w:type="gramStart"/>
       <w:r>
         <w:rPr>
           <w:rFonts w:ascii="Arial" w:hAnsi="Arial" w:cs="Arial"/>
@@ -6051,6 +6326,7 @@
         </w:rPr>
         <w:t>Herramientas a utilizar</w:t>
       </w:r>
+      <w:proofErr w:type="gramEnd"/>
       <w:r>
         <w:rPr>
           <w:rFonts w:ascii="Arial" w:hAnsi="Arial" w:cs="Arial"/>
@@ -6130,13 +6406,23 @@
           <w:szCs w:val="24"/>
         </w:rPr>
       </w:pPr>
-      <w:r>
-        <w:rPr>
-          <w:rFonts w:ascii="Arial" w:hAnsi="Arial" w:cs="Arial"/>
-          <w:sz w:val="24"/>
-          <w:szCs w:val="24"/>
-        </w:rPr>
-        <w:t>Herramientas a utilizar:</w:t>
+      <w:proofErr w:type="gramStart"/>
+      <w:r>
+        <w:rPr>
+          <w:rFonts w:ascii="Arial" w:hAnsi="Arial" w:cs="Arial"/>
+          <w:sz w:val="24"/>
+          <w:szCs w:val="24"/>
+        </w:rPr>
+        <w:t>Herramientas a utilizar</w:t>
+      </w:r>
+      <w:proofErr w:type="gramEnd"/>
+      <w:r>
+        <w:rPr>
+          <w:rFonts w:ascii="Arial" w:hAnsi="Arial" w:cs="Arial"/>
+          <w:sz w:val="24"/>
+          <w:szCs w:val="24"/>
+        </w:rPr>
+        <w:t>:</w:t>
       </w:r>
       <w:r>
         <w:t xml:space="preserve"> </w:t>
@@ -6199,13 +6485,23 @@
           <w:szCs w:val="24"/>
         </w:rPr>
       </w:pPr>
-      <w:r>
-        <w:rPr>
-          <w:rFonts w:ascii="Arial" w:hAnsi="Arial" w:cs="Arial"/>
-          <w:sz w:val="24"/>
-          <w:szCs w:val="24"/>
-        </w:rPr>
-        <w:t>Herramientas a utilizar:</w:t>
+      <w:proofErr w:type="gramStart"/>
+      <w:r>
+        <w:rPr>
+          <w:rFonts w:ascii="Arial" w:hAnsi="Arial" w:cs="Arial"/>
+          <w:sz w:val="24"/>
+          <w:szCs w:val="24"/>
+        </w:rPr>
+        <w:t>Herramientas a utilizar</w:t>
+      </w:r>
+      <w:proofErr w:type="gramEnd"/>
+      <w:r>
+        <w:rPr>
+          <w:rFonts w:ascii="Arial" w:hAnsi="Arial" w:cs="Arial"/>
+          <w:sz w:val="24"/>
+          <w:szCs w:val="24"/>
+        </w:rPr>
+        <w:t>:</w:t>
       </w:r>
       <w:r>
         <w:rPr>
@@ -6221,7 +6517,25 @@
           <w:sz w:val="24"/>
           <w:szCs w:val="24"/>
         </w:rPr>
-        <w:t>entorno de desarrollo integrado para escribir y organizar el código del sistema, lenguaje de programación web para crear las funciones principales de la aplicación, framework de desarrollo para facilitar la estructura del proyecto, gestor de base de datos para almacenar la información de usuarios, vacunas y centros de salud, y sistema de control de versiones para guardar los cambios realizados y llevar un mejor control del avance durante el desarrollo.</w:t>
+        <w:t xml:space="preserve">entorno de desarrollo integrado para escribir y organizar el código del sistema, lenguaje de programación web para crear las funciones principales de la aplicación, </w:t>
+      </w:r>
+      <w:proofErr w:type="spellStart"/>
+      <w:r>
+        <w:rPr>
+          <w:rFonts w:ascii="Arial" w:hAnsi="Arial" w:cs="Arial"/>
+          <w:sz w:val="24"/>
+          <w:szCs w:val="24"/>
+        </w:rPr>
+        <w:t>framework</w:t>
+      </w:r>
+      <w:proofErr w:type="spellEnd"/>
+      <w:r>
+        <w:rPr>
+          <w:rFonts w:ascii="Arial" w:hAnsi="Arial" w:cs="Arial"/>
+          <w:sz w:val="24"/>
+          <w:szCs w:val="24"/>
+        </w:rPr>
+        <w:t xml:space="preserve"> de desarrollo para facilitar la estructura del proyecto, gestor de base de datos para almacenar la información de usuarios, vacunas y centros de salud, y sistema de control de versiones para guardar los cambios realizados y llevar un mejor control del avance durante el desarrollo.</w:t>
       </w:r>
     </w:p>
     <w:p>
@@ -7241,7 +7555,7 @@
         <w:rPr>
           <w:noProof/>
         </w:rPr>
-        <w:t>Antecedentes</w:t>
+        <w:t>Diseño</w:t>
       </w:r>
     </w:fldSimple>
   </w:p>

</xml_diff>

<commit_message>
Documento finalizado - falta formato
</commit_message>
<xml_diff>
--- a/Propuesta - Vacunas.docx
+++ b/Propuesta - Vacunas.docx
@@ -3422,6 +3422,202 @@
     </w:p>
     <w:p>
       <w:pPr>
+        <w:rPr>
+          <w:rFonts w:ascii="Arial" w:hAnsi="Arial" w:cs="Arial"/>
+          <w:sz w:val="24"/>
+          <w:szCs w:val="24"/>
+        </w:rPr>
+      </w:pPr>
+      <w:r>
+        <w:rPr>
+          <w:rFonts w:ascii="Arial" w:hAnsi="Arial" w:cs="Arial"/>
+          <w:sz w:val="24"/>
+          <w:szCs w:val="24"/>
+        </w:rPr>
+        <w:br w:type="page"/>
+      </w:r>
+    </w:p>
+    <w:p>
+      <w:pPr>
+        <w:rPr>
+          <w:rFonts w:ascii="Arial" w:hAnsi="Arial" w:cs="Arial"/>
+          <w:b/>
+          <w:bCs/>
+          <w:sz w:val="24"/>
+          <w:szCs w:val="24"/>
+          <w:lang w:val="es-MX"/>
+        </w:rPr>
+      </w:pPr>
+      <w:r>
+        <w:rPr>
+          <w:rFonts w:ascii="Arial" w:hAnsi="Arial" w:cs="Arial"/>
+          <w:b/>
+          <w:bCs/>
+          <w:sz w:val="24"/>
+          <w:szCs w:val="24"/>
+          <w:lang w:val="es-MX"/>
+        </w:rPr>
+        <w:lastRenderedPageBreak/>
+        <w:t>INTRODUCCIÓN</w:t>
+      </w:r>
+    </w:p>
+    <w:p>
+      <w:pPr>
+        <w:jc w:val="both"/>
+        <w:rPr>
+          <w:rFonts w:ascii="Arial" w:hAnsi="Arial" w:cs="Arial"/>
+          <w:sz w:val="24"/>
+          <w:szCs w:val="24"/>
+          <w:lang w:val="es-MX"/>
+        </w:rPr>
+      </w:pPr>
+      <w:r>
+        <w:rPr>
+          <w:rFonts w:ascii="Arial" w:hAnsi="Arial" w:cs="Arial"/>
+          <w:sz w:val="24"/>
+          <w:szCs w:val="24"/>
+          <w:lang w:val="es-MX"/>
+        </w:rPr>
+        <w:t>En Guatemala, el Ministerio de Salud Pública y Asistencia Social (MSPAS) es la entidad encargada de garantizar el acceso a los servicios de salud de la población, entre ellos los programas de inmunización. El departamento de San Marcos está conformado por 30 municipios cuyos centros de salud dependen del control adecuado de sus existencias de vacunas para garantizar la cobertura de inmunización. En este contexto se desarrolla el presente anteproyecto, orientado al diseño de una aplicación web centralizada</w:t>
+      </w:r>
+      <w:r>
+        <w:rPr>
+          <w:rFonts w:ascii="Arial" w:hAnsi="Arial" w:cs="Arial"/>
+          <w:sz w:val="24"/>
+          <w:szCs w:val="24"/>
+          <w:lang w:val="es-MX"/>
+        </w:rPr>
+        <w:t xml:space="preserve"> y distrital</w:t>
+      </w:r>
+      <w:r>
+        <w:rPr>
+          <w:rFonts w:ascii="Arial" w:hAnsi="Arial" w:cs="Arial"/>
+          <w:sz w:val="24"/>
+          <w:szCs w:val="24"/>
+          <w:lang w:val="es-MX"/>
+        </w:rPr>
+        <w:t xml:space="preserve"> para la gestión, control y visualización de vacunas en los centros de salud del departamento.</w:t>
+      </w:r>
+    </w:p>
+    <w:p>
+      <w:pPr>
+        <w:jc w:val="both"/>
+        <w:rPr>
+          <w:rFonts w:ascii="Arial" w:hAnsi="Arial" w:cs="Arial"/>
+          <w:sz w:val="24"/>
+          <w:szCs w:val="24"/>
+          <w:lang w:val="es-MX"/>
+        </w:rPr>
+      </w:pPr>
+      <w:r>
+        <w:rPr>
+          <w:rFonts w:ascii="Arial" w:hAnsi="Arial" w:cs="Arial"/>
+          <w:sz w:val="24"/>
+          <w:szCs w:val="24"/>
+          <w:lang w:val="es-MX"/>
+        </w:rPr>
+        <w:t>El tema fue seleccionado debido a que la gestión de vacunas es un proceso crítico para la salud pública, ya que un control inadecuado de las existencias puede derivar en desabastecimiento o en la pérdida de dosis por vencimiento. Al identificar que los centros de salud del departamento aún dependen del registro físico en papel para esta labor, se consideró que el desarrollo de una herramienta tecnológica representa una oportunidad concreta para resolver un problema real que afecta directamente a la población.</w:t>
+      </w:r>
+    </w:p>
+    <w:p>
+      <w:pPr>
+        <w:jc w:val="both"/>
+        <w:rPr>
+          <w:rFonts w:ascii="Arial" w:hAnsi="Arial" w:cs="Arial"/>
+          <w:sz w:val="24"/>
+          <w:szCs w:val="24"/>
+          <w:lang w:val="es-MX"/>
+        </w:rPr>
+      </w:pPr>
+      <w:r>
+        <w:rPr>
+          <w:rFonts w:ascii="Arial" w:hAnsi="Arial" w:cs="Arial"/>
+          <w:sz w:val="24"/>
+          <w:szCs w:val="24"/>
+          <w:lang w:val="es-MX"/>
+        </w:rPr>
+        <w:t>La finalidad del estudio es resolver la falta de un sistema centralizado que permita a los centros de salud del departamento registrar y consultar la disponibilidad de vacunas de forma estandarizada y en tiempo real. A partir de esta necesidad, la investigación se orienta a definir qué funcionalidades debe incluir dicho sistema para apoyar la toma de decisiones de las autoridades de salud del departamento.</w:t>
+      </w:r>
+    </w:p>
+    <w:p>
+      <w:pPr>
+        <w:jc w:val="both"/>
+        <w:rPr>
+          <w:rFonts w:ascii="Arial" w:hAnsi="Arial" w:cs="Arial"/>
+          <w:sz w:val="24"/>
+          <w:szCs w:val="24"/>
+          <w:lang w:val="es-MX"/>
+        </w:rPr>
+      </w:pPr>
+      <w:r>
+        <w:rPr>
+          <w:rFonts w:ascii="Arial" w:hAnsi="Arial" w:cs="Arial"/>
+          <w:sz w:val="24"/>
+          <w:szCs w:val="24"/>
+          <w:lang w:val="es-MX"/>
+        </w:rPr>
+        <w:t xml:space="preserve">Para el desarrollo del proyecto se utilizará la metodología Scrum, organizada en cuatro </w:t>
+      </w:r>
+      <w:proofErr w:type="spellStart"/>
+      <w:r>
+        <w:rPr>
+          <w:rFonts w:ascii="Arial" w:hAnsi="Arial" w:cs="Arial"/>
+          <w:sz w:val="24"/>
+          <w:szCs w:val="24"/>
+          <w:lang w:val="es-MX"/>
+        </w:rPr>
+        <w:t>sprints</w:t>
+      </w:r>
+      <w:proofErr w:type="spellEnd"/>
+      <w:r>
+        <w:rPr>
+          <w:rFonts w:ascii="Arial" w:hAnsi="Arial" w:cs="Arial"/>
+          <w:sz w:val="24"/>
+          <w:szCs w:val="24"/>
+          <w:lang w:val="es-MX"/>
+        </w:rPr>
+        <w:t xml:space="preserve"> que abarcan desde el levantamiento de requerimientos y el diseño funcional del sistema, hasta el desarrollo, las pruebas y la elaboración de la documentación técnica y de usuario, favoreciendo un desarrollo iterativo y con validación constante.</w:t>
+      </w:r>
+    </w:p>
+    <w:p>
+      <w:pPr>
+        <w:jc w:val="both"/>
+        <w:rPr>
+          <w:rFonts w:ascii="Arial" w:hAnsi="Arial" w:cs="Arial"/>
+          <w:sz w:val="24"/>
+          <w:szCs w:val="24"/>
+          <w:lang w:val="es-MX"/>
+        </w:rPr>
+      </w:pPr>
+      <w:r>
+        <w:rPr>
+          <w:rFonts w:ascii="Arial" w:hAnsi="Arial" w:cs="Arial"/>
+          <w:sz w:val="24"/>
+          <w:szCs w:val="24"/>
+          <w:lang w:val="es-MX"/>
+        </w:rPr>
+        <w:t>Se espera que, al finalizar el proyecto, los centros de salud del departamento de San Marcos cuenten con una aplicación web que les permita registrar los movimientos de entrada y salida de vacunas, consultar su disponibilidad mediante una vista tipo tabla y un tablero de control, y recibir alertas automáticas ante niveles bajos de stock o próximos vencimientos, contribuyendo así a una gestión más eficiente y confiable de las vacunas en el departamento.</w:t>
+      </w:r>
+    </w:p>
+    <w:p>
+      <w:pPr>
+        <w:rPr>
+          <w:rFonts w:ascii="Arial" w:hAnsi="Arial" w:cs="Arial"/>
+          <w:sz w:val="24"/>
+          <w:szCs w:val="24"/>
+        </w:rPr>
+      </w:pPr>
+      <w:r>
+        <w:rPr>
+          <w:rFonts w:ascii="Arial" w:hAnsi="Arial" w:cs="Arial"/>
+          <w:sz w:val="24"/>
+          <w:szCs w:val="24"/>
+        </w:rPr>
+        <w:br w:type="page"/>
+      </w:r>
+    </w:p>
+    <w:p>
+      <w:pPr>
         <w:spacing w:line="276" w:lineRule="auto"/>
         <w:rPr>
           <w:rFonts w:ascii="Arial" w:hAnsi="Arial" w:cs="Arial"/>
@@ -3470,8 +3666,11 @@
         </w:rPr>
         <w:sectPr>
           <w:headerReference w:type="even" r:id="rId9"/>
-          <w:footerReference w:type="even" r:id="rId10"/>
-          <w:footerReference w:type="default" r:id="rId11"/>
+          <w:headerReference w:type="default" r:id="rId10"/>
+          <w:footerReference w:type="even" r:id="rId11"/>
+          <w:footerReference w:type="default" r:id="rId12"/>
+          <w:headerReference w:type="first" r:id="rId13"/>
+          <w:footerReference w:type="first" r:id="rId14"/>
           <w:pgSz w:w="12240" w:h="15840"/>
           <w:pgMar w:top="1417" w:right="1701" w:bottom="1417" w:left="1701" w:header="708" w:footer="708" w:gutter="0"/>
           <w:cols w:space="708"/>
@@ -5236,10 +5435,10 @@
           <w:szCs w:val="24"/>
         </w:rPr>
         <w:sectPr>
-          <w:headerReference w:type="even" r:id="rId12"/>
-          <w:headerReference w:type="default" r:id="rId13"/>
-          <w:footerReference w:type="even" r:id="rId14"/>
-          <w:footerReference w:type="default" r:id="rId15"/>
+          <w:headerReference w:type="even" r:id="rId15"/>
+          <w:headerReference w:type="default" r:id="rId16"/>
+          <w:footerReference w:type="even" r:id="rId17"/>
+          <w:footerReference w:type="default" r:id="rId18"/>
           <w:pgSz w:w="12240" w:h="15840"/>
           <w:pgMar w:top="1417" w:right="1701" w:bottom="1417" w:left="1701" w:header="708" w:footer="708" w:gutter="0"/>
           <w:pgNumType w:start="1"/>
@@ -5468,7 +5667,7 @@
                     </pic:cNvPicPr>
                   </pic:nvPicPr>
                   <pic:blipFill>
-                    <a:blip r:embed="rId16">
+                    <a:blip r:embed="rId19">
                       <a:extLst>
                         <a:ext uri="{28A0092B-C50C-407E-A947-70E740481C1C}">
                           <a14:useLocalDpi xmlns:a14="http://schemas.microsoft.com/office/drawing/2010/main" val="0"/>
@@ -5684,7 +5883,61 @@
           <w:szCs w:val="24"/>
           <w:lang w:val="es-MX"/>
         </w:rPr>
-        <w:t xml:space="preserve"> desarrollada con Node.js y Express.js, encargada de procesar las operaciones del sistema, tales como el registro de vacunas, la generación de alertas de bajo stock y de vencimiento, y la carga y descarga de formatos, además de aplicar las reglas de negocio correspondientes.</w:t>
+        <w:t xml:space="preserve"> desarrollada con Node.js y Express.js, encargada de procesar las operaciones del sistema, tales como </w:t>
+      </w:r>
+      <w:r>
+        <w:rPr>
+          <w:rFonts w:ascii="Arial" w:hAnsi="Arial" w:cs="Arial"/>
+          <w:sz w:val="24"/>
+          <w:szCs w:val="24"/>
+          <w:lang w:val="es-MX"/>
+        </w:rPr>
+        <w:t xml:space="preserve">la gestión de usuarios, </w:t>
+      </w:r>
+      <w:r>
+        <w:rPr>
+          <w:rFonts w:ascii="Arial" w:hAnsi="Arial" w:cs="Arial"/>
+          <w:sz w:val="24"/>
+          <w:szCs w:val="24"/>
+          <w:lang w:val="es-MX"/>
+        </w:rPr>
+        <w:t xml:space="preserve">el registro de </w:t>
+      </w:r>
+      <w:r>
+        <w:rPr>
+          <w:rFonts w:ascii="Arial" w:hAnsi="Arial" w:cs="Arial"/>
+          <w:sz w:val="24"/>
+          <w:szCs w:val="24"/>
+          <w:lang w:val="es-MX"/>
+        </w:rPr>
+        <w:t xml:space="preserve">movimientos de entradas y salidas de </w:t>
+      </w:r>
+      <w:r>
+        <w:rPr>
+          <w:rFonts w:ascii="Arial" w:hAnsi="Arial" w:cs="Arial"/>
+          <w:sz w:val="24"/>
+          <w:szCs w:val="24"/>
+          <w:lang w:val="es-MX"/>
+        </w:rPr>
+        <w:t xml:space="preserve">vacunas, </w:t>
+      </w:r>
+      <w:r>
+        <w:rPr>
+          <w:rFonts w:ascii="Arial" w:hAnsi="Arial" w:cs="Arial"/>
+          <w:sz w:val="24"/>
+          <w:szCs w:val="24"/>
+          <w:lang w:val="es-MX"/>
+        </w:rPr>
+        <w:t xml:space="preserve">y </w:t>
+      </w:r>
+      <w:r>
+        <w:rPr>
+          <w:rFonts w:ascii="Arial" w:hAnsi="Arial" w:cs="Arial"/>
+          <w:sz w:val="24"/>
+          <w:szCs w:val="24"/>
+          <w:lang w:val="es-MX"/>
+        </w:rPr>
+        <w:t>la generación de alertas de bajo stock y de vencimiento, además de aplicar las reglas de negocio correspondientes.</w:t>
       </w:r>
     </w:p>
     <w:p>
@@ -5705,6 +5958,7 @@
           <w:szCs w:val="24"/>
           <w:lang w:val="es-MX"/>
         </w:rPr>
+        <w:lastRenderedPageBreak/>
         <w:t xml:space="preserve">c. </w:t>
       </w:r>
       <w:r>
@@ -5746,7 +6000,6 @@
           <w:szCs w:val="24"/>
           <w:lang w:val="es-MX"/>
         </w:rPr>
-        <w:lastRenderedPageBreak/>
         <w:t xml:space="preserve">d. </w:t>
       </w:r>
       <w:r>
@@ -6036,30 +6289,6 @@
           <w:lang w:val="es-MX"/>
         </w:rPr>
         <w:t>El diagrama de contexto proporciona una perspectiva general del sistema, centrándose en las entradas y salidas de información con respecto a los diferentes actores que interactuarán con la aplicación, sin profundizar en los módulos internos.</w:t>
-      </w:r>
-    </w:p>
-    <w:p>
-      <w:pPr>
-        <w:spacing w:line="276" w:lineRule="auto"/>
-        <w:ind w:firstLine="708"/>
-        <w:jc w:val="center"/>
-        <w:rPr>
-          <w:rFonts w:ascii="Arial" w:hAnsi="Arial" w:cs="Arial"/>
-          <w:sz w:val="24"/>
-          <w:szCs w:val="24"/>
-          <w:lang w:val="es-MX"/>
-        </w:rPr>
-      </w:pPr>
-      <w:r>
-        <w:rPr>
-          <w:rFonts w:ascii="Arial" w:hAnsi="Arial" w:cs="Arial"/>
-          <w:b/>
-          <w:bCs/>
-          <w:sz w:val="24"/>
-          <w:szCs w:val="24"/>
-          <w:lang w:val="es-MX"/>
-        </w:rPr>
-        <w:t>Ilustración 2.2: Diagrama de contexto del sistema</w:t>
       </w:r>
     </w:p>
     <w:p>
@@ -6099,7 +6328,7 @@
                     </pic:cNvPicPr>
                   </pic:nvPicPr>
                   <pic:blipFill>
-                    <a:blip r:embed="rId17">
+                    <a:blip r:embed="rId20">
                       <a:extLst>
                         <a:ext uri="{28A0092B-C50C-407E-A947-70E740481C1C}">
                           <a14:useLocalDpi xmlns:a14="http://schemas.microsoft.com/office/drawing/2010/main" val="0"/>
@@ -6252,7 +6481,71 @@
           <w:szCs w:val="24"/>
           <w:lang w:val="es-MX"/>
         </w:rPr>
-        <w:t xml:space="preserve"> personal autorizado en cada centro de salud municipal, quien podrá registrar y actualizar la información de las vacunas disponibles en su centro, así como descargar y cargar el formato estandarizado.</w:t>
+        <w:t xml:space="preserve"> personal autorizado en cada centro de salud municipal, quien podrá registrar </w:t>
+      </w:r>
+      <w:r>
+        <w:rPr>
+          <w:rFonts w:ascii="Arial" w:hAnsi="Arial" w:cs="Arial"/>
+          <w:sz w:val="24"/>
+          <w:szCs w:val="24"/>
+          <w:lang w:val="es-MX"/>
+        </w:rPr>
+        <w:t xml:space="preserve">los movimientos de entrada </w:t>
+      </w:r>
+      <w:r>
+        <w:rPr>
+          <w:rFonts w:ascii="Arial" w:hAnsi="Arial" w:cs="Arial"/>
+          <w:sz w:val="24"/>
+          <w:szCs w:val="24"/>
+          <w:lang w:val="es-MX"/>
+        </w:rPr>
+        <w:t xml:space="preserve">y </w:t>
+      </w:r>
+      <w:r>
+        <w:rPr>
+          <w:rFonts w:ascii="Arial" w:hAnsi="Arial" w:cs="Arial"/>
+          <w:sz w:val="24"/>
+          <w:szCs w:val="24"/>
+          <w:lang w:val="es-MX"/>
+        </w:rPr>
+        <w:t>salida</w:t>
+      </w:r>
+      <w:r>
+        <w:rPr>
+          <w:rFonts w:ascii="Arial" w:hAnsi="Arial" w:cs="Arial"/>
+          <w:sz w:val="24"/>
+          <w:szCs w:val="24"/>
+          <w:lang w:val="es-MX"/>
+        </w:rPr>
+        <w:t xml:space="preserve"> de las </w:t>
+      </w:r>
+      <w:r>
+        <w:rPr>
+          <w:rFonts w:ascii="Arial" w:hAnsi="Arial" w:cs="Arial"/>
+          <w:sz w:val="24"/>
+          <w:szCs w:val="24"/>
+          <w:lang w:val="es-MX"/>
+        </w:rPr>
+        <w:lastRenderedPageBreak/>
+        <w:t xml:space="preserve">vacunas disponibles en su centro, así como </w:t>
+      </w:r>
+      <w:r>
+        <w:rPr>
+          <w:rFonts w:ascii="Arial" w:hAnsi="Arial" w:cs="Arial"/>
+          <w:sz w:val="24"/>
+          <w:szCs w:val="24"/>
+          <w:lang w:val="es-MX"/>
+        </w:rPr>
+        <w:t>consultar la información correspondiente a su centro de salud</w:t>
+      </w:r>
+      <w:r>
+        <w:rPr>
+          <w:rFonts w:ascii="Arial" w:hAnsi="Arial" w:cs="Arial"/>
+          <w:sz w:val="24"/>
+          <w:szCs w:val="24"/>
+          <w:lang w:val="es-MX"/>
+        </w:rPr>
+        <w:t>.</w:t>
       </w:r>
     </w:p>
     <w:p>
@@ -6273,7 +6566,6 @@
           <w:szCs w:val="24"/>
           <w:lang w:val="es-MX"/>
         </w:rPr>
-        <w:lastRenderedPageBreak/>
         <w:t xml:space="preserve">b. </w:t>
       </w:r>
       <w:r>
@@ -6362,26 +6654,107 @@
     </w:p>
     <w:p>
       <w:pPr>
+        <w:pStyle w:val="Descripcin"/>
+        <w:keepNext/>
         <w:spacing w:line="276" w:lineRule="auto"/>
-        <w:ind w:firstLine="708"/>
         <w:jc w:val="center"/>
-        <w:rPr>
-          <w:rFonts w:ascii="Arial" w:hAnsi="Arial" w:cs="Arial"/>
-          <w:sz w:val="24"/>
-          <w:szCs w:val="24"/>
-          <w:lang w:val="es-MX"/>
-        </w:rPr>
-      </w:pPr>
-      <w:r>
-        <w:rPr>
-          <w:rFonts w:ascii="Arial" w:hAnsi="Arial" w:cs="Arial"/>
-          <w:b/>
-          <w:bCs/>
-          <w:sz w:val="24"/>
-          <w:szCs w:val="24"/>
-          <w:lang w:val="es-MX"/>
-        </w:rPr>
-        <w:t>Ilustración 2.3: Diagrama de flujo del sistema</w:t>
+      </w:pPr>
+      <w:r>
+        <w:rPr>
+          <w:lang w:val="es-MX"/>
+        </w:rPr>
+        <w:drawing>
+          <wp:anchor distT="0" distB="0" distL="114300" distR="114300" simplePos="0" relativeHeight="251664384" behindDoc="0" locked="0" layoutInCell="1" allowOverlap="1" wp14:anchorId="292B36EF" wp14:editId="599B5A93">
+            <wp:simplePos x="0" y="0"/>
+            <wp:positionH relativeFrom="margin">
+              <wp:posOffset>256032</wp:posOffset>
+            </wp:positionH>
+            <wp:positionV relativeFrom="paragraph">
+              <wp:posOffset>158496</wp:posOffset>
+            </wp:positionV>
+            <wp:extent cx="5120640" cy="4353560"/>
+            <wp:effectExtent l="0" t="0" r="3810" b="8890"/>
+            <wp:wrapTopAndBottom/>
+            <wp:docPr id="1200819320" name="Imagen 8"/>
+            <wp:cNvGraphicFramePr>
+              <a:graphicFrameLocks xmlns:a="http://schemas.openxmlformats.org/drawingml/2006/main" noChangeAspect="1"/>
+            </wp:cNvGraphicFramePr>
+            <a:graphic xmlns:a="http://schemas.openxmlformats.org/drawingml/2006/main">
+              <a:graphicData uri="http://schemas.openxmlformats.org/drawingml/2006/picture">
+                <pic:pic xmlns:pic="http://schemas.openxmlformats.org/drawingml/2006/picture">
+                  <pic:nvPicPr>
+                    <pic:cNvPr id="0" name="Picture 30"/>
+                    <pic:cNvPicPr>
+                      <a:picLocks noChangeAspect="1" noChangeArrowheads="1"/>
+                    </pic:cNvPicPr>
+                  </pic:nvPicPr>
+                  <pic:blipFill>
+                    <a:blip r:embed="rId21" cstate="print">
+                      <a:extLst>
+                        <a:ext uri="{28A0092B-C50C-407E-A947-70E740481C1C}">
+                          <a14:useLocalDpi xmlns:a14="http://schemas.microsoft.com/office/drawing/2010/main" val="0"/>
+                        </a:ext>
+                      </a:extLst>
+                    </a:blip>
+                    <a:srcRect/>
+                    <a:stretch>
+                      <a:fillRect/>
+                    </a:stretch>
+                  </pic:blipFill>
+                  <pic:spPr bwMode="auto">
+                    <a:xfrm>
+                      <a:off x="0" y="0"/>
+                      <a:ext cx="5120640" cy="4353560"/>
+                    </a:xfrm>
+                    <a:prstGeom prst="rect">
+                      <a:avLst/>
+                    </a:prstGeom>
+                    <a:noFill/>
+                    <a:ln>
+                      <a:noFill/>
+                    </a:ln>
+                  </pic:spPr>
+                </pic:pic>
+              </a:graphicData>
+            </a:graphic>
+            <wp14:sizeRelH relativeFrom="margin">
+              <wp14:pctWidth>0</wp14:pctWidth>
+            </wp14:sizeRelH>
+            <wp14:sizeRelV relativeFrom="margin">
+              <wp14:pctHeight>0</wp14:pctHeight>
+            </wp14:sizeRelV>
+          </wp:anchor>
+        </w:drawing>
+      </w:r>
+      <w:r>
+        <w:t>Ilustración 2.</w:t>
+      </w:r>
+      <w:r>
+        <w:t>3</w:t>
+      </w:r>
+      <w:r>
+        <w:t xml:space="preserve">: Diagrama de </w:t>
+      </w:r>
+      <w:r>
+        <w:t>flujo</w:t>
+      </w:r>
+      <w:r>
+        <w:t xml:space="preserve"> del sistema</w:t>
+      </w:r>
+    </w:p>
+    <w:p>
+      <w:pPr>
+        <w:pStyle w:val="Descripcin"/>
+        <w:spacing w:line="276" w:lineRule="auto"/>
+        <w:jc w:val="center"/>
+        <w:rPr>
+          <w:rFonts w:ascii="Arial" w:hAnsi="Arial" w:cs="Arial"/>
+          <w:sz w:val="24"/>
+          <w:szCs w:val="24"/>
+        </w:rPr>
+      </w:pPr>
+      <w:r>
+        <w:t>Fuente: Los autores mediante draw.io</w:t>
       </w:r>
     </w:p>
     <w:p>
@@ -6399,30 +6772,6 @@
       <w:r>
         <w:rPr>
           <w:rFonts w:ascii="Arial" w:hAnsi="Arial" w:cs="Arial"/>
-          <w:b/>
-          <w:bCs/>
-          <w:sz w:val="24"/>
-          <w:szCs w:val="24"/>
-          <w:lang w:val="es-MX"/>
-        </w:rPr>
-        <w:t>[PENDIENTE — diagrama a elaborar en draw.io]</w:t>
-      </w:r>
-    </w:p>
-    <w:p>
-      <w:pPr>
-        <w:spacing w:line="276" w:lineRule="auto"/>
-        <w:ind w:firstLine="708"/>
-        <w:jc w:val="both"/>
-        <w:rPr>
-          <w:rFonts w:ascii="Arial" w:hAnsi="Arial" w:cs="Arial"/>
-          <w:sz w:val="24"/>
-          <w:szCs w:val="24"/>
-          <w:lang w:val="es-MX"/>
-        </w:rPr>
-      </w:pPr>
-      <w:r>
-        <w:rPr>
-          <w:rFonts w:ascii="Arial" w:hAnsi="Arial" w:cs="Arial"/>
           <w:sz w:val="24"/>
           <w:szCs w:val="24"/>
           <w:lang w:val="es-MX"/>
@@ -6436,7 +6785,17 @@
           <w:szCs w:val="24"/>
           <w:lang w:val="es-MX"/>
         </w:rPr>
-        <w:t xml:space="preserve"> el usuario final ingresa sus credenciales de acceso; si estas son correctas, podrá acceder a los módulos del sistema según su rol (registro y actualización de vacunas para el personal de cada centro de salud, o consulta y visualización consolidada para las autoridades del Centro de Salud de San Marcos); si las credenciales son incorrectas, el sistema deberá mostrar un mensaje de error y permitir un nuevo intento. En caso de que el personal no cuente con credenciales, el administrador del sistema deberá realizar el registro correspondiente.</w:t>
+        <w:t xml:space="preserve"> el usuario final ingresa sus credenciales de acceso; si estas son correctas, podrá acceder a los módulos del sistema según su rol (registro y actualización de vacunas para el personal de cada centro de salud, o consulta y visualización consolidada para las autoridades </w:t>
+      </w:r>
+      <w:r>
+        <w:rPr>
+          <w:rFonts w:ascii="Arial" w:hAnsi="Arial" w:cs="Arial"/>
+          <w:sz w:val="24"/>
+          <w:szCs w:val="24"/>
+          <w:lang w:val="es-MX"/>
+        </w:rPr>
+        <w:lastRenderedPageBreak/>
+        <w:t>del Centro de Salud de San Marcos); si las credenciales son incorrectas, el sistema deberá mostrar un mensaje de error y permitir un nuevo intento. En caso de que el personal no cuente con credenciales, el administrador del sistema deberá realizar el registro correspondiente.</w:t>
       </w:r>
     </w:p>
     <w:p>
@@ -6687,7 +7046,6 @@
           <w:szCs w:val="24"/>
           <w:lang w:val="es-MX"/>
         </w:rPr>
-        <w:lastRenderedPageBreak/>
         <w:t>Inicio de sesión:</w:t>
       </w:r>
       <w:r>
@@ -6915,6 +7273,7 @@
           <w:szCs w:val="24"/>
           <w:lang w:val="es-MX"/>
         </w:rPr>
+        <w:lastRenderedPageBreak/>
         <w:t>Lleva la bitácora de las acciones realizadas dentro del sistema, separada en dos registros según su naturaleza:</w:t>
       </w:r>
     </w:p>
@@ -7177,7 +7536,6 @@
           <w:szCs w:val="24"/>
           <w:lang w:val="es-MX"/>
         </w:rPr>
-        <w:lastRenderedPageBreak/>
         <w:t>Filtros de búsqueda:</w:t>
       </w:r>
       <w:r>
@@ -7275,19 +7633,6 @@
     </w:p>
     <w:p>
       <w:pPr>
-        <w:spacing w:line="276" w:lineRule="auto"/>
-        <w:ind w:left="720"/>
-        <w:jc w:val="both"/>
-        <w:rPr>
-          <w:rFonts w:ascii="Arial" w:hAnsi="Arial" w:cs="Arial"/>
-          <w:sz w:val="24"/>
-          <w:szCs w:val="24"/>
-          <w:lang w:val="es-MX"/>
-        </w:rPr>
-      </w:pPr>
-    </w:p>
-    <w:p>
-      <w:pPr>
         <w:spacing w:after="0" w:line="276" w:lineRule="auto"/>
         <w:ind w:firstLine="708"/>
         <w:jc w:val="both"/>
@@ -7437,6 +7782,7 @@
           <w:szCs w:val="24"/>
           <w:lang w:val="es-MX"/>
         </w:rPr>
+        <w:lastRenderedPageBreak/>
         <w:t>Reporte consolidado departamental:</w:t>
       </w:r>
       <w:r>
@@ -7532,15 +7878,7 @@
           <w:rFonts w:ascii="Arial" w:eastAsiaTheme="minorHAnsi" w:hAnsi="Arial" w:cs="Arial"/>
           <w:lang w:val="es-419" w:eastAsia="es-GT"/>
         </w:rPr>
-        <w:t xml:space="preserve"> Owner será representado por el integrante encargado de priorizar los requerimientos del sistema, considerando las necesidades del centro de salud y los objetivos del proyecto. El Scrum Master será el responsable de </w:t>
-      </w:r>
-      <w:r>
-        <w:rPr>
-          <w:rFonts w:ascii="Arial" w:eastAsiaTheme="minorHAnsi" w:hAnsi="Arial" w:cs="Arial"/>
-          <w:lang w:val="es-419" w:eastAsia="es-GT"/>
-        </w:rPr>
-        <w:lastRenderedPageBreak/>
-        <w:t xml:space="preserve">coordinar el cumplimiento de la metodología, organizar las reuniones y apoyar al equipo en la eliminación de obstáculos. Los </w:t>
+        <w:t xml:space="preserve"> Owner será representado por el integrante encargado de priorizar los requerimientos del sistema, considerando las necesidades del centro de salud y los objetivos del proyecto. El Scrum Master será el responsable de coordinar el cumplimiento de la metodología, organizar las reuniones y apoyar al equipo en la eliminación de obstáculos. Los </w:t>
       </w:r>
       <w:proofErr w:type="spellStart"/>
       <w:r>
@@ -7606,7 +7944,35 @@
           <w:rFonts w:ascii="Arial" w:eastAsiaTheme="minorHAnsi" w:hAnsi="Arial" w:cs="Arial"/>
           <w:lang w:val="es-419" w:eastAsia="es-GT"/>
         </w:rPr>
-        <w:t xml:space="preserve"> Backlog contendrá la lista priorizada de funcionalidades del sistema, tales como autenticación de usuarios, registro de vacunas, descarga de formatos, carga de información, vista tipo tabla y consultas. El Sprint Backlog incluirá las tareas seleccionadas para cada ciclo de trabajo. El Incremento representará el avance funcional obtenido al finalizar cada sprint.</w:t>
+        <w:t xml:space="preserve"> Backlog contendrá la lista priorizada de funcionalidades del sistema, tales como autenticación de usuarios, registro de vacunas, </w:t>
+      </w:r>
+      <w:r>
+        <w:rPr>
+          <w:rFonts w:ascii="Arial" w:eastAsiaTheme="minorHAnsi" w:hAnsi="Arial" w:cs="Arial"/>
+          <w:lang w:val="es-419" w:eastAsia="es-GT"/>
+        </w:rPr>
+        <w:t>gestión</w:t>
+      </w:r>
+      <w:r>
+        <w:rPr>
+          <w:rFonts w:ascii="Arial" w:eastAsiaTheme="minorHAnsi" w:hAnsi="Arial" w:cs="Arial"/>
+          <w:lang w:val="es-419" w:eastAsia="es-GT"/>
+        </w:rPr>
+        <w:t xml:space="preserve"> de </w:t>
+      </w:r>
+      <w:r>
+        <w:rPr>
+          <w:rFonts w:ascii="Arial" w:eastAsiaTheme="minorHAnsi" w:hAnsi="Arial" w:cs="Arial"/>
+          <w:lang w:val="es-419" w:eastAsia="es-GT"/>
+        </w:rPr>
+        <w:t>inventario</w:t>
+      </w:r>
+      <w:r>
+        <w:rPr>
+          <w:rFonts w:ascii="Arial" w:eastAsiaTheme="minorHAnsi" w:hAnsi="Arial" w:cs="Arial"/>
+          <w:lang w:val="es-419" w:eastAsia="es-GT"/>
+        </w:rPr>
+        <w:t>, vista tipo tabla y consultas. El Sprint Backlog incluirá las tareas seleccionadas para cada ciclo de trabajo. El Incremento representará el avance funcional obtenido al finalizar cada sprint.</w:t>
       </w:r>
     </w:p>
     <w:p>
@@ -7670,6 +8036,7 @@
         <w:rPr>
           <w:noProof/>
         </w:rPr>
+        <w:lastRenderedPageBreak/>
         <w:drawing>
           <wp:anchor distT="0" distB="0" distL="114300" distR="114300" simplePos="0" relativeHeight="251660288" behindDoc="0" locked="0" layoutInCell="1" allowOverlap="1" wp14:anchorId="5BA32D1D" wp14:editId="64E40909">
             <wp:simplePos x="0" y="0"/>
@@ -7696,7 +8063,7 @@
                     </pic:cNvPicPr>
                   </pic:nvPicPr>
                   <pic:blipFill>
-                    <a:blip r:embed="rId18">
+                    <a:blip r:embed="rId22">
                       <a:extLst>
                         <a:ext uri="{28A0092B-C50C-407E-A947-70E740481C1C}">
                           <a14:useLocalDpi xmlns:a14="http://schemas.microsoft.com/office/drawing/2010/main" val="0"/>
@@ -7811,7 +8178,6 @@
           <w:sz w:val="24"/>
           <w:szCs w:val="24"/>
         </w:rPr>
-        <w:lastRenderedPageBreak/>
         <w:t>En est</w:t>
       </w:r>
       <w:r>
@@ -7919,7 +8285,16 @@
           <w:sz w:val="24"/>
           <w:szCs w:val="24"/>
         </w:rPr>
-        <w:t xml:space="preserve"> se elaborará el diseño funcional de la aplicación web, incluyendo la estructura general del sistema, el modelo de datos, los módulos principales y el flujo de información. También se definirá el formato estandarizado para el registro de vacunas, considerando campos como municipio, centro de salud, tipo de vacuna, disponibilidad, población objetivo, cantidad, entre otros.</w:t>
+        <w:t xml:space="preserve"> se elaborará el diseño funcional de la aplicación web, incluyendo la estructura general del sistema, el modelo de datos, los módulos principales y el flujo de información. También se definirá el formato estandarizado para el registro </w:t>
+      </w:r>
+      <w:r>
+        <w:rPr>
+          <w:rFonts w:ascii="Arial" w:hAnsi="Arial" w:cs="Arial"/>
+          <w:sz w:val="24"/>
+          <w:szCs w:val="24"/>
+        </w:rPr>
+        <w:lastRenderedPageBreak/>
+        <w:t>de vacunas, considerando campos como municipio, centro de salud, tipo de vacuna, disponibilidad, población objetivo, cantidad, entre otros.</w:t>
       </w:r>
     </w:p>
     <w:p>
@@ -8009,16 +8384,39 @@
           <w:sz w:val="24"/>
           <w:szCs w:val="24"/>
         </w:rPr>
-        <w:t xml:space="preserve">En primer lugar, se desarrollarán los componentes base de la aplicación, tales como la interfaz principal, la conexión con la base de datos y la estructura de usuarios, lo cual permitirá contar con una base funcional sobre la cual se integrarán los demás módulos. A continuación, se trabajará en el módulo de registro de vacunas y en el formato estandarizado de ingreso de información, implementando los formularios necesarios para registrar vacunas disponibles, asociarlas con un centro de salud y clasificarlas según tipo y población objetivo; también se trabajará en la generación o descarga del formato en hoja de cálculo. Finalmente, se desarrollará la vista tipo tabla, donde se visualizará la información consolidada de </w:t>
-      </w:r>
-      <w:r>
-        <w:rPr>
-          <w:rFonts w:ascii="Arial" w:hAnsi="Arial" w:cs="Arial"/>
-          <w:sz w:val="24"/>
-          <w:szCs w:val="24"/>
-        </w:rPr>
-        <w:lastRenderedPageBreak/>
-        <w:t>las vacunas registradas, permitiendo consultar los datos por municipio, tipo de vacuna, población objetivo y cantidad disponible, e incorporando filtros de búsqueda para facilitar el análisis de la información.</w:t>
+        <w:t xml:space="preserve">En primer lugar, se desarrollarán los componentes base de la aplicación, tales como la interfaz principal, la conexión con la base de datos y la estructura de usuarios, lo cual permitirá contar con una base funcional sobre la cual se integrarán los demás módulos. A continuación, se trabajará en el módulo de registro de vacunas y en el formato estandarizado de ingreso de información, implementando los formularios necesarios para registrar vacunas disponibles, asociarlas con un centro de salud y clasificarlas según tipo y población objetivo; también se </w:t>
+      </w:r>
+      <w:r>
+        <w:rPr>
+          <w:rFonts w:ascii="Arial" w:hAnsi="Arial" w:cs="Arial"/>
+          <w:sz w:val="24"/>
+          <w:szCs w:val="24"/>
+        </w:rPr>
+        <w:t>desarrollará el módulo</w:t>
+      </w:r>
+      <w:r>
+        <w:rPr>
+          <w:rFonts w:ascii="Arial" w:hAnsi="Arial" w:cs="Arial"/>
+          <w:sz w:val="24"/>
+          <w:szCs w:val="24"/>
+        </w:rPr>
+        <w:t xml:space="preserve"> de </w:t>
+      </w:r>
+      <w:r>
+        <w:rPr>
+          <w:rFonts w:ascii="Arial" w:hAnsi="Arial" w:cs="Arial"/>
+          <w:sz w:val="24"/>
+          <w:szCs w:val="24"/>
+        </w:rPr>
+        <w:t>gestión de inventario para el registro de los movimientos de entrada y salida de vacunas</w:t>
+      </w:r>
+      <w:r>
+        <w:rPr>
+          <w:rFonts w:ascii="Arial" w:hAnsi="Arial" w:cs="Arial"/>
+          <w:sz w:val="24"/>
+          <w:szCs w:val="24"/>
+        </w:rPr>
+        <w:t>. Finalmente, se desarrollará la vista tipo tabla, donde se visualizará la información consolidada de las vacunas registradas, permitiendo consultar los datos por municipio, tipo de vacuna, población objetivo y cantidad disponible, e incorporando filtros de búsqueda para facilitar el análisis de la información.</w:t>
       </w:r>
     </w:p>
     <w:p>
@@ -8060,7 +8458,23 @@
           <w:sz w:val="24"/>
           <w:szCs w:val="24"/>
         </w:rPr>
-        <w:t xml:space="preserve"> de desarrollo para facilitar la estructura del proyecto, gestor de base de datos para almacenar la información de usuarios, vacunas, centros de salud, tipos de vacuna y población objetivo, sistema de control de versiones para guardar los cambios realizados y llevar un mejor control del avance durante el desarrollo, librerías para el manejo de archivos en hoja de cálculo que permitan generar, descargar o exportar formatos organizados de información, y pruebas funcionales para verificar que el ingreso de datos, la asociación con centros de salud, la descarga del formato, la tabla y los filtros de búsqueda funcionen correctamente.</w:t>
+        <w:t xml:space="preserve"> de desarrollo para facilitar la estructura del proyecto, gestor de base de datos para almacenar la información de usuarios, vacunas, centros de salud, tipos de vacuna y población objetivo, sistema de control de versiones para guardar los cambios realizados y llevar un mejor control del avance durante el desarrollo, y pruebas funcionales para verificar que el ingreso de datos, la asociación con centros de salud, </w:t>
+      </w:r>
+      <w:r>
+        <w:rPr>
+          <w:rFonts w:ascii="Arial" w:hAnsi="Arial" w:cs="Arial"/>
+          <w:sz w:val="24"/>
+          <w:szCs w:val="24"/>
+        </w:rPr>
+        <w:t>el registro de movimientos de entrada y salida</w:t>
+      </w:r>
+      <w:r>
+        <w:rPr>
+          <w:rFonts w:ascii="Arial" w:hAnsi="Arial" w:cs="Arial"/>
+          <w:sz w:val="24"/>
+          <w:szCs w:val="24"/>
+        </w:rPr>
+        <w:t>, la tabla y los filtros de búsqueda funcionen correctamente.</w:t>
       </w:r>
     </w:p>
     <w:p>
@@ -8095,7 +8509,16 @@
           <w:sz w:val="24"/>
           <w:szCs w:val="24"/>
         </w:rPr>
-        <w:t>En este último sprint se elaborará la documentación técnica y el manual de usuario del sistema, en los cuales se detallarán las funciones principales, el proceso de registro y consulta de vacunas, los roles de acceso y la configuración básica necesaria para el mantenimiento del sistema.</w:t>
+        <w:t xml:space="preserve">En este último sprint se elaborará la documentación técnica y el manual de usuario del sistema, en los cuales se detallarán las funciones principales, el proceso </w:t>
+      </w:r>
+      <w:r>
+        <w:rPr>
+          <w:rFonts w:ascii="Arial" w:hAnsi="Arial" w:cs="Arial"/>
+          <w:sz w:val="24"/>
+          <w:szCs w:val="24"/>
+        </w:rPr>
+        <w:lastRenderedPageBreak/>
+        <w:t>de registro y consulta de vacunas, los roles de acceso y la configuración básica necesaria para el mantenimiento del sistema.</w:t>
       </w:r>
     </w:p>
     <w:p>
@@ -8115,7 +8538,39 @@
           <w:sz w:val="24"/>
           <w:szCs w:val="24"/>
         </w:rPr>
-        <w:t>Asimismo, se realizarán pruebas funcionales del sistema para verificar que los módulos desarrollados cumplan con los objetivos propuestos. Se evaluará el registro de información, la actualización de datos, la descarga de formatos, la visualización tipo tabla y la correcta integración con la base de datos. Con base en los resultados, se realizarán los ajustes finales antes de la entrega del proyecto.</w:t>
+        <w:t xml:space="preserve">Asimismo, se realizarán pruebas funcionales del sistema para verificar que los módulos desarrollados cumplan con los objetivos propuestos. Se evaluará el registro de información, la actualización de datos, </w:t>
+      </w:r>
+      <w:r>
+        <w:rPr>
+          <w:rFonts w:ascii="Arial" w:hAnsi="Arial" w:cs="Arial"/>
+          <w:sz w:val="24"/>
+          <w:szCs w:val="24"/>
+        </w:rPr>
+        <w:t>el registro</w:t>
+      </w:r>
+      <w:r>
+        <w:rPr>
+          <w:rFonts w:ascii="Arial" w:hAnsi="Arial" w:cs="Arial"/>
+          <w:sz w:val="24"/>
+          <w:szCs w:val="24"/>
+        </w:rPr>
+        <w:t xml:space="preserve"> de </w:t>
+      </w:r>
+      <w:r>
+        <w:rPr>
+          <w:rFonts w:ascii="Arial" w:hAnsi="Arial" w:cs="Arial"/>
+          <w:sz w:val="24"/>
+          <w:szCs w:val="24"/>
+        </w:rPr>
+        <w:t>movimientos de inventario</w:t>
+      </w:r>
+      <w:r>
+        <w:rPr>
+          <w:rFonts w:ascii="Arial" w:hAnsi="Arial" w:cs="Arial"/>
+          <w:sz w:val="24"/>
+          <w:szCs w:val="24"/>
+        </w:rPr>
+        <w:t>, la visualización tipo tabla y la correcta integración con la base de datos. Con base en los resultados, se realizarán los ajustes finales antes de la entrega del proyecto.</w:t>
       </w:r>
     </w:p>
     <w:p>
@@ -8139,7 +8594,7 @@
           <w:sz w:val="24"/>
           <w:szCs w:val="24"/>
         </w:rPr>
-        <w:t>Herramientas a utilizar: documentación técnica para dejar explicado el funcionamiento del sistema, los ajustes realizados y los aspectos importantes del proyecto, casos de prueba para revisar que cada módulo del sistema funcione correctamente, pruebas con usuarios para comprobar que el registro, actualización, descarga de formatos y visualización tipo tabla sean fáciles de usar, revisión de errores para identificar fallos antes de la entrega final, y formularios de retroalimentación para recopilar opiniones y sugerencias de mejora.</w:t>
+        <w:t>Herramientas a utilizar: documentación técnica para dejar explicado el funcionamiento del sistema, los ajustes realizados y los aspectos importantes del proyecto, casos de prueba para revisar que cada módulo del sistema funcione correctamente, pruebas con usuarios para comprobar que el registro, actualización y visualización tipo tabla sean fáciles de usar, revisión de errores para identificar fallos antes de la entrega final, y formularios de retroalimentación para recopilar opiniones y sugerencias de mejora.</w:t>
       </w:r>
     </w:p>
     <w:p>
@@ -8185,16 +8640,7 @@
           <w:sz w:val="24"/>
           <w:szCs w:val="24"/>
         </w:rPr>
-        <w:t xml:space="preserve">. Este análisis permite verificar que la propuesta </w:t>
-      </w:r>
-      <w:r>
-        <w:rPr>
-          <w:rFonts w:ascii="Arial" w:hAnsi="Arial" w:cs="Arial"/>
-          <w:sz w:val="24"/>
-          <w:szCs w:val="24"/>
-        </w:rPr>
-        <w:lastRenderedPageBreak/>
-        <w:t>cuenta con los recursos tecnológicos, humanos y financieros necesarios para su implementación, así como el respaldo institucional y el marco legal que garanticen su correcto funcionamiento dentro de los centros de salud involucrados</w:t>
+        <w:t>. Este análisis permite verificar que la propuesta cuenta con los recursos tecnológicos, humanos y financieros necesarios para su implementación, así como el respaldo institucional y el marco legal que garanticen su correcto funcionamiento dentro de los centros de salud involucrados</w:t>
       </w:r>
       <w:r>
         <w:rPr>
@@ -8365,7 +8811,16 @@
           <w:sz w:val="24"/>
           <w:szCs w:val="24"/>
         </w:rPr>
-        <w:t>Desde el punto de vista del almacenamiento, la información de vacunas puede organizarse en una base de datos relacional, permitiendo registrar municipios, centros de salud, tipos de vacunas, cantidades disponibles y población objetivo. Esta estructura permitirá consultas ordenadas y una visualización clara de los datos, lo cual responde directamente a la necesidad de centralización planteada en el proyecto.</w:t>
+        <w:t xml:space="preserve">Desde el punto de vista del almacenamiento, la información de vacunas puede organizarse en una base de datos relacional, permitiendo registrar municipios, centros de salud, tipos de vacunas, cantidades disponibles y población objetivo. </w:t>
+      </w:r>
+      <w:r>
+        <w:rPr>
+          <w:rFonts w:ascii="Arial" w:hAnsi="Arial" w:cs="Arial"/>
+          <w:sz w:val="24"/>
+          <w:szCs w:val="24"/>
+        </w:rPr>
+        <w:lastRenderedPageBreak/>
+        <w:t>Esta estructura permitirá consultas ordenadas y una visualización clara de los datos, lo cual responde directamente a la necesidad de centralización planteada en el proyecto.</w:t>
       </w:r>
     </w:p>
     <w:p>
@@ -8452,16 +8907,7 @@
           <w:sz w:val="24"/>
           <w:szCs w:val="24"/>
         </w:rPr>
-        <w:t xml:space="preserve">Para garantizar su uso adecuado, será necesario capacitar al personal encargado del registro de vacunas. Esta capacitación deberá enfocarse en el ingreso de información, descarga de formatos, actualización de registros y consulta de la vista tipo tabla. Al tratarse de una aplicación web, el proceso de aprendizaje </w:t>
-      </w:r>
-      <w:r>
-        <w:rPr>
-          <w:rFonts w:ascii="Arial" w:hAnsi="Arial" w:cs="Arial"/>
-          <w:sz w:val="24"/>
-          <w:szCs w:val="24"/>
-        </w:rPr>
-        <w:lastRenderedPageBreak/>
-        <w:t>debe ser sencillo ya que la interfaz se diseñará de forma clara, accesible y orientada a las tareas principales del usuario.</w:t>
+        <w:t>Para garantizar su uso adecuado, será necesario capacitar al personal encargado del registro de vacunas. Esta capacitación deberá enfocarse en el ingreso de información, actualización de registros y consulta de la vista tipo tabla. Al tratarse de una aplicación web, el proceso de aprendizaje debe ser sencillo ya que la interfaz se diseñará de forma clara, accesible y orientada a las tareas principales del usuario.</w:t>
       </w:r>
     </w:p>
     <w:p>
@@ -8521,7 +8967,16 @@
           <w:sz w:val="24"/>
           <w:szCs w:val="24"/>
         </w:rPr>
-        <w:t>En consecuencia, considerando que el sistema responde a una necesidad operativa real, que su interfaz está orientada a facilitar el aprendizaje del personal mediante capacitación, y que se identificó receptividad y disposición por parte del personal del Centro de Salud de San Marcos hacia la propuesta, se concluye que el proyecto es operativamente factible para su implementación en los centros de salud del departamento de San Marcos</w:t>
+        <w:t xml:space="preserve">En consecuencia, considerando que el sistema responde a una necesidad operativa real, que su interfaz está orientada a facilitar el aprendizaje del personal mediante capacitación, y que se identificó receptividad y disposición por parte del personal del Centro de Salud de San Marcos hacia la propuesta, se concluye que </w:t>
+      </w:r>
+      <w:r>
+        <w:rPr>
+          <w:rFonts w:ascii="Arial" w:hAnsi="Arial" w:cs="Arial"/>
+          <w:sz w:val="24"/>
+          <w:szCs w:val="24"/>
+        </w:rPr>
+        <w:lastRenderedPageBreak/>
+        <w:t>el proyecto es operativamente factible para su implementación en los centros de salud del departamento de San Marcos</w:t>
       </w:r>
       <w:r>
         <w:rPr>
@@ -8632,7 +9087,6 @@
           <w:sz w:val="24"/>
           <w:szCs w:val="24"/>
         </w:rPr>
-        <w:lastRenderedPageBreak/>
         <w:t xml:space="preserve">Por ende, considerando que el desarrollo del sistema se apoya en herramientas de bajo costo o gratuitas, que la mano de obra será aportada por el equipo desarrollador y que los gastos de alojamiento serán cubiertos en su totalidad durante </w:t>
       </w:r>
       <w:r>
@@ -8954,7 +9408,7 @@
                     <pic:cNvPicPr/>
                   </pic:nvPicPr>
                   <pic:blipFill>
-                    <a:blip r:embed="rId19"/>
+                    <a:blip r:embed="rId23"/>
                     <a:stretch>
                       <a:fillRect/>
                     </a:stretch>
@@ -9081,7 +9535,7 @@
                     <pic:cNvPicPr/>
                   </pic:nvPicPr>
                   <pic:blipFill>
-                    <a:blip r:embed="rId20">
+                    <a:blip r:embed="rId24">
                       <a:extLst>
                         <a:ext uri="{28A0092B-C50C-407E-A947-70E740481C1C}">
                           <a14:useLocalDpi xmlns:a14="http://schemas.microsoft.com/office/drawing/2010/main" val="0"/>
@@ -9144,7 +9598,7 @@
       </w:pPr>
     </w:p>
     <w:sectPr>
-      <w:headerReference w:type="default" r:id="rId21"/>
+      <w:headerReference w:type="default" r:id="rId25"/>
       <w:pgSz w:w="12240" w:h="15840"/>
       <w:pgMar w:top="1417" w:right="1701" w:bottom="1417" w:left="1701" w:header="708" w:footer="708" w:gutter="0"/>
       <w:pgNumType w:start="5"/>
@@ -9218,6 +9672,16 @@
 </file>
 
 <file path=word/footer3.xml><?xml version="1.0" encoding="utf-8"?>
+<w:ftr xmlns:wpc="http://schemas.microsoft.com/office/word/2010/wordprocessingCanvas" xmlns:cx="http://schemas.microsoft.com/office/drawing/2014/chartex" xmlns:cx1="http://schemas.microsoft.com/office/drawing/2015/9/8/chartex" xmlns:cx2="http://schemas.microsoft.com/office/drawing/2015/10/21/chartex" xmlns:cx3="http://schemas.microsoft.com/office/drawing/2016/5/9/chartex" xmlns:cx4="http://schemas.microsoft.com/office/drawing/2016/5/10/chartex" xmlns:cx5="http://schemas.microsoft.com/office/drawing/2016/5/11/chartex" xmlns:cx6="http://schemas.microsoft.com/office/drawing/2016/5/12/chartex" xmlns:cx7="http://schemas.microsoft.com/office/drawing/2016/5/13/chartex" xmlns:cx8="http://schemas.microsoft.com/office/drawing/2016/5/14/chartex" xmlns:mc="http://schemas.openxmlformats.org/markup-compatibility/2006" xmlns:aink="http://schemas.microsoft.com/office/drawing/2016/ink" xmlns:am3d="http://schemas.microsoft.com/office/drawing/2017/model3d" xmlns:o="urn:schemas-microsoft-com:office:office" xmlns:oel="http://schemas.microsoft.com/office/2019/extlst" xmlns:r="http://schemas.openxmlformats.org/officeDocument/2006/relationships" xmlns:m="http://schemas.openxmlformats.org/officeDocument/2006/math" xmlns:v="urn:schemas-microsoft-com:vml" xmlns:wp14="http://schemas.microsoft.com/office/word/2010/wordprocessingDrawing" xmlns:wp="http://schemas.openxmlformats.org/drawingml/2006/wordprocessingDrawing" xmlns:w10="urn:schemas-microsoft-com:office:word" xmlns:w="http://schemas.openxmlformats.org/wordprocessingml/2006/main" xmlns:w14="http://schemas.microsoft.com/office/word/2010/wordml" xmlns:w15="http://schemas.microsoft.com/office/word/2012/wordml" xmlns:w16cei="http://schemas.microsoft.com/office/word/2026/wordml/cei" xmlns:w16cex="http://schemas.microsoft.com/office/word/2018/wordml/cex" xmlns:w16cid="http://schemas.microsoft.com/office/word/2016/wordml/cid" xmlns:w16="http://schemas.microsoft.com/office/word/2018/wordml" xmlns:w16du="http://schemas.microsoft.com/office/word/2023/wordml/word16du" xmlns:w16sdtdh="http://schemas.microsoft.com/office/word/2020/wordml/sdtdatahash" xmlns:w16sdtfl="http://schemas.microsoft.com/office/word/2024/wordml/sdtformatlock" xmlns:w16se="http://schemas.microsoft.com/office/word/2015/wordml/symex" xmlns:wpg="http://schemas.microsoft.com/office/word/2010/wordprocessingGroup" xmlns:wpi="http://schemas.microsoft.com/office/word/2010/wordprocessingInk" xmlns:wne="http://schemas.microsoft.com/office/word/2006/wordml" xmlns:wps="http://schemas.microsoft.com/office/word/2010/wordprocessingShape" mc:Ignorable="w14 w15 w16se w16cid w16 w16cex w16sdtdh w16sdtfl w16du wp14">
+  <w:p>
+    <w:pPr>
+      <w:pStyle w:val="Piedepgina"/>
+    </w:pPr>
+  </w:p>
+</w:ftr>
+</file>
+
+<file path=word/footer4.xml><?xml version="1.0" encoding="utf-8"?>
 <w:ftr xmlns:wpc="http://schemas.microsoft.com/office/word/2010/wordprocessingCanvas" xmlns:cx="http://schemas.microsoft.com/office/drawing/2014/chartex" xmlns:cx1="http://schemas.microsoft.com/office/drawing/2015/9/8/chartex" xmlns:cx2="http://schemas.microsoft.com/office/drawing/2015/10/21/chartex" xmlns:cx3="http://schemas.microsoft.com/office/drawing/2016/5/9/chartex" xmlns:cx4="http://schemas.microsoft.com/office/drawing/2016/5/10/chartex" xmlns:cx5="http://schemas.microsoft.com/office/drawing/2016/5/11/chartex" xmlns:cx6="http://schemas.microsoft.com/office/drawing/2016/5/12/chartex" xmlns:cx7="http://schemas.microsoft.com/office/drawing/2016/5/13/chartex" xmlns:cx8="http://schemas.microsoft.com/office/drawing/2016/5/14/chartex" xmlns:mc="http://schemas.openxmlformats.org/markup-compatibility/2006" xmlns:aink="http://schemas.microsoft.com/office/drawing/2016/ink" xmlns:am3d="http://schemas.microsoft.com/office/drawing/2017/model3d" xmlns:o="urn:schemas-microsoft-com:office:office" xmlns:oel="http://schemas.microsoft.com/office/2019/extlst" xmlns:r="http://schemas.openxmlformats.org/officeDocument/2006/relationships" xmlns:m="http://schemas.openxmlformats.org/officeDocument/2006/math" xmlns:v="urn:schemas-microsoft-com:vml" xmlns:wp14="http://schemas.microsoft.com/office/word/2010/wordprocessingDrawing" xmlns:wp="http://schemas.openxmlformats.org/drawingml/2006/wordprocessingDrawing" xmlns:w10="urn:schemas-microsoft-com:office:word" xmlns:w="http://schemas.openxmlformats.org/wordprocessingml/2006/main" xmlns:w14="http://schemas.microsoft.com/office/word/2010/wordml" xmlns:w15="http://schemas.microsoft.com/office/word/2012/wordml" xmlns:w16cei="http://schemas.microsoft.com/office/word/2026/wordml/cei" xmlns:w16cex="http://schemas.microsoft.com/office/word/2018/wordml/cex" xmlns:w16cid="http://schemas.microsoft.com/office/word/2016/wordml/cid" xmlns:w16="http://schemas.microsoft.com/office/word/2018/wordml" xmlns:w16du="http://schemas.microsoft.com/office/word/2023/wordml/word16du" xmlns:w16sdtdh="http://schemas.microsoft.com/office/word/2020/wordml/sdtdatahash" xmlns:w16sdtfl="http://schemas.microsoft.com/office/word/2024/wordml/sdtformatlock" xmlns:w16se="http://schemas.microsoft.com/office/word/2015/wordml/symex" xmlns:wpg="http://schemas.microsoft.com/office/word/2010/wordprocessingGroup" xmlns:wpi="http://schemas.microsoft.com/office/word/2010/wordprocessingInk" xmlns:wne="http://schemas.microsoft.com/office/word/2006/wordml" xmlns:wps="http://schemas.microsoft.com/office/word/2010/wordprocessingShape" mc:Ignorable="w14 w15 w16se w16cid w16 w16cex w16sdtdh w16sdtfl w16du wp14">
   <w:sdt>
     <w:sdtPr>
@@ -9262,7 +9726,7 @@
 </w:ftr>
 </file>
 
-<file path=word/footer4.xml><?xml version="1.0" encoding="utf-8"?>
+<file path=word/footer5.xml><?xml version="1.0" encoding="utf-8"?>
 <w:ftr xmlns:wpc="http://schemas.microsoft.com/office/word/2010/wordprocessingCanvas" xmlns:cx="http://schemas.microsoft.com/office/drawing/2014/chartex" xmlns:cx1="http://schemas.microsoft.com/office/drawing/2015/9/8/chartex" xmlns:cx2="http://schemas.microsoft.com/office/drawing/2015/10/21/chartex" xmlns:cx3="http://schemas.microsoft.com/office/drawing/2016/5/9/chartex" xmlns:cx4="http://schemas.microsoft.com/office/drawing/2016/5/10/chartex" xmlns:cx5="http://schemas.microsoft.com/office/drawing/2016/5/11/chartex" xmlns:cx6="http://schemas.microsoft.com/office/drawing/2016/5/12/chartex" xmlns:cx7="http://schemas.microsoft.com/office/drawing/2016/5/13/chartex" xmlns:cx8="http://schemas.microsoft.com/office/drawing/2016/5/14/chartex" xmlns:mc="http://schemas.openxmlformats.org/markup-compatibility/2006" xmlns:aink="http://schemas.microsoft.com/office/drawing/2016/ink" xmlns:am3d="http://schemas.microsoft.com/office/drawing/2017/model3d" xmlns:o="urn:schemas-microsoft-com:office:office" xmlns:oel="http://schemas.microsoft.com/office/2019/extlst" xmlns:r="http://schemas.openxmlformats.org/officeDocument/2006/relationships" xmlns:m="http://schemas.openxmlformats.org/officeDocument/2006/math" xmlns:v="urn:schemas-microsoft-com:vml" xmlns:wp14="http://schemas.microsoft.com/office/word/2010/wordprocessingDrawing" xmlns:wp="http://schemas.openxmlformats.org/drawingml/2006/wordprocessingDrawing" xmlns:w10="urn:schemas-microsoft-com:office:word" xmlns:w="http://schemas.openxmlformats.org/wordprocessingml/2006/main" xmlns:w14="http://schemas.microsoft.com/office/word/2010/wordml" xmlns:w15="http://schemas.microsoft.com/office/word/2012/wordml" xmlns:w16cei="http://schemas.microsoft.com/office/word/2026/wordml/cei" xmlns:w16cex="http://schemas.microsoft.com/office/word/2018/wordml/cex" xmlns:w16cid="http://schemas.microsoft.com/office/word/2016/wordml/cid" xmlns:w16="http://schemas.microsoft.com/office/word/2018/wordml" xmlns:w16du="http://schemas.microsoft.com/office/word/2023/wordml/word16du" xmlns:w16sdtdh="http://schemas.microsoft.com/office/word/2020/wordml/sdtdatahash" xmlns:w16sdtfl="http://schemas.microsoft.com/office/word/2024/wordml/sdtformatlock" xmlns:w16se="http://schemas.microsoft.com/office/word/2015/wordml/symex" xmlns:wpg="http://schemas.microsoft.com/office/word/2010/wordprocessingGroup" xmlns:wpi="http://schemas.microsoft.com/office/word/2010/wordprocessingInk" xmlns:wne="http://schemas.microsoft.com/office/word/2006/wordml" xmlns:wps="http://schemas.microsoft.com/office/word/2010/wordprocessingShape" mc:Ignorable="w14 w15 w16se w16cid w16 w16cex w16sdtdh w16sdtfl w16du wp14">
   <w:sdt>
     <w:sdtPr>
@@ -9356,6 +9820,26 @@
   <w:p>
     <w:pPr>
       <w:pStyle w:val="Encabezado"/>
+    </w:pPr>
+  </w:p>
+</w:hdr>
+</file>
+
+<file path=word/header3.xml><?xml version="1.0" encoding="utf-8"?>
+<w:hdr xmlns:wpc="http://schemas.microsoft.com/office/word/2010/wordprocessingCanvas" xmlns:cx="http://schemas.microsoft.com/office/drawing/2014/chartex" xmlns:cx1="http://schemas.microsoft.com/office/drawing/2015/9/8/chartex" xmlns:cx2="http://schemas.microsoft.com/office/drawing/2015/10/21/chartex" xmlns:cx3="http://schemas.microsoft.com/office/drawing/2016/5/9/chartex" xmlns:cx4="http://schemas.microsoft.com/office/drawing/2016/5/10/chartex" xmlns:cx5="http://schemas.microsoft.com/office/drawing/2016/5/11/chartex" xmlns:cx6="http://schemas.microsoft.com/office/drawing/2016/5/12/chartex" xmlns:cx7="http://schemas.microsoft.com/office/drawing/2016/5/13/chartex" xmlns:cx8="http://schemas.microsoft.com/office/drawing/2016/5/14/chartex" xmlns:mc="http://schemas.openxmlformats.org/markup-compatibility/2006" xmlns:aink="http://schemas.microsoft.com/office/drawing/2016/ink" xmlns:am3d="http://schemas.microsoft.com/office/drawing/2017/model3d" xmlns:o="urn:schemas-microsoft-com:office:office" xmlns:oel="http://schemas.microsoft.com/office/2019/extlst" xmlns:r="http://schemas.openxmlformats.org/officeDocument/2006/relationships" xmlns:m="http://schemas.openxmlformats.org/officeDocument/2006/math" xmlns:v="urn:schemas-microsoft-com:vml" xmlns:wp14="http://schemas.microsoft.com/office/word/2010/wordprocessingDrawing" xmlns:wp="http://schemas.openxmlformats.org/drawingml/2006/wordprocessingDrawing" xmlns:w10="urn:schemas-microsoft-com:office:word" xmlns:w="http://schemas.openxmlformats.org/wordprocessingml/2006/main" xmlns:w14="http://schemas.microsoft.com/office/word/2010/wordml" xmlns:w15="http://schemas.microsoft.com/office/word/2012/wordml" xmlns:w16cei="http://schemas.microsoft.com/office/word/2026/wordml/cei" xmlns:w16cex="http://schemas.microsoft.com/office/word/2018/wordml/cex" xmlns:w16cid="http://schemas.microsoft.com/office/word/2016/wordml/cid" xmlns:w16="http://schemas.microsoft.com/office/word/2018/wordml" xmlns:w16du="http://schemas.microsoft.com/office/word/2023/wordml/word16du" xmlns:w16sdtdh="http://schemas.microsoft.com/office/word/2020/wordml/sdtdatahash" xmlns:w16sdtfl="http://schemas.microsoft.com/office/word/2024/wordml/sdtformatlock" xmlns:w16se="http://schemas.microsoft.com/office/word/2015/wordml/symex" xmlns:wpg="http://schemas.microsoft.com/office/word/2010/wordprocessingGroup" xmlns:wpi="http://schemas.microsoft.com/office/word/2010/wordprocessingInk" xmlns:wne="http://schemas.microsoft.com/office/word/2006/wordml" xmlns:wps="http://schemas.microsoft.com/office/word/2010/wordprocessingShape" mc:Ignorable="w14 w15 w16se w16cid w16 w16cex w16sdtdh w16sdtfl w16du wp14">
+  <w:p>
+    <w:pPr>
+      <w:pStyle w:val="Encabezado"/>
+    </w:pPr>
+  </w:p>
+</w:hdr>
+</file>
+
+<file path=word/header4.xml><?xml version="1.0" encoding="utf-8"?>
+<w:hdr xmlns:wpc="http://schemas.microsoft.com/office/word/2010/wordprocessingCanvas" xmlns:cx="http://schemas.microsoft.com/office/drawing/2014/chartex" xmlns:cx1="http://schemas.microsoft.com/office/drawing/2015/9/8/chartex" xmlns:cx2="http://schemas.microsoft.com/office/drawing/2015/10/21/chartex" xmlns:cx3="http://schemas.microsoft.com/office/drawing/2016/5/9/chartex" xmlns:cx4="http://schemas.microsoft.com/office/drawing/2016/5/10/chartex" xmlns:cx5="http://schemas.microsoft.com/office/drawing/2016/5/11/chartex" xmlns:cx6="http://schemas.microsoft.com/office/drawing/2016/5/12/chartex" xmlns:cx7="http://schemas.microsoft.com/office/drawing/2016/5/13/chartex" xmlns:cx8="http://schemas.microsoft.com/office/drawing/2016/5/14/chartex" xmlns:mc="http://schemas.openxmlformats.org/markup-compatibility/2006" xmlns:aink="http://schemas.microsoft.com/office/drawing/2016/ink" xmlns:am3d="http://schemas.microsoft.com/office/drawing/2017/model3d" xmlns:o="urn:schemas-microsoft-com:office:office" xmlns:oel="http://schemas.microsoft.com/office/2019/extlst" xmlns:r="http://schemas.openxmlformats.org/officeDocument/2006/relationships" xmlns:m="http://schemas.openxmlformats.org/officeDocument/2006/math" xmlns:v="urn:schemas-microsoft-com:vml" xmlns:wp14="http://schemas.microsoft.com/office/word/2010/wordprocessingDrawing" xmlns:wp="http://schemas.openxmlformats.org/drawingml/2006/wordprocessingDrawing" xmlns:w10="urn:schemas-microsoft-com:office:word" xmlns:w="http://schemas.openxmlformats.org/wordprocessingml/2006/main" xmlns:w14="http://schemas.microsoft.com/office/word/2010/wordml" xmlns:w15="http://schemas.microsoft.com/office/word/2012/wordml" xmlns:w16cei="http://schemas.microsoft.com/office/word/2026/wordml/cei" xmlns:w16cex="http://schemas.microsoft.com/office/word/2018/wordml/cex" xmlns:w16cid="http://schemas.microsoft.com/office/word/2016/wordml/cid" xmlns:w16="http://schemas.microsoft.com/office/word/2018/wordml" xmlns:w16du="http://schemas.microsoft.com/office/word/2023/wordml/word16du" xmlns:w16sdtdh="http://schemas.microsoft.com/office/word/2020/wordml/sdtdatahash" xmlns:w16sdtfl="http://schemas.microsoft.com/office/word/2024/wordml/sdtformatlock" xmlns:w16se="http://schemas.microsoft.com/office/word/2015/wordml/symex" xmlns:wpg="http://schemas.microsoft.com/office/word/2010/wordprocessingGroup" xmlns:wpi="http://schemas.microsoft.com/office/word/2010/wordprocessingInk" xmlns:wne="http://schemas.microsoft.com/office/word/2006/wordml" xmlns:wps="http://schemas.microsoft.com/office/word/2010/wordprocessingShape" mc:Ignorable="w14 w15 w16se w16cid w16 w16cex w16sdtdh w16sdtfl w16du wp14">
+  <w:p>
+    <w:pPr>
+      <w:pStyle w:val="Encabezado"/>
       <w:pBdr>
         <w:bottom w:val="single" w:sz="4" w:space="1" w:color="auto"/>
       </w:pBdr>
@@ -9366,14 +9850,14 @@
         <w:rPr>
           <w:noProof/>
         </w:rPr>
-        <w:t>Método</w:t>
+        <w:t>Planteamiento del problema</w:t>
       </w:r>
     </w:fldSimple>
   </w:p>
 </w:hdr>
 </file>
 
-<file path=word/header3.xml><?xml version="1.0" encoding="utf-8"?>
+<file path=word/header5.xml><?xml version="1.0" encoding="utf-8"?>
 <w:hdr xmlns:wpc="http://schemas.microsoft.com/office/word/2010/wordprocessingCanvas" xmlns:cx="http://schemas.microsoft.com/office/drawing/2014/chartex" xmlns:cx1="http://schemas.microsoft.com/office/drawing/2015/9/8/chartex" xmlns:cx2="http://schemas.microsoft.com/office/drawing/2015/10/21/chartex" xmlns:cx3="http://schemas.microsoft.com/office/drawing/2016/5/9/chartex" xmlns:cx4="http://schemas.microsoft.com/office/drawing/2016/5/10/chartex" xmlns:cx5="http://schemas.microsoft.com/office/drawing/2016/5/11/chartex" xmlns:cx6="http://schemas.microsoft.com/office/drawing/2016/5/12/chartex" xmlns:cx7="http://schemas.microsoft.com/office/drawing/2016/5/13/chartex" xmlns:cx8="http://schemas.microsoft.com/office/drawing/2016/5/14/chartex" xmlns:mc="http://schemas.openxmlformats.org/markup-compatibility/2006" xmlns:aink="http://schemas.microsoft.com/office/drawing/2016/ink" xmlns:am3d="http://schemas.microsoft.com/office/drawing/2017/model3d" xmlns:o="urn:schemas-microsoft-com:office:office" xmlns:oel="http://schemas.microsoft.com/office/2019/extlst" xmlns:r="http://schemas.openxmlformats.org/officeDocument/2006/relationships" xmlns:m="http://schemas.openxmlformats.org/officeDocument/2006/math" xmlns:v="urn:schemas-microsoft-com:vml" xmlns:wp14="http://schemas.microsoft.com/office/word/2010/wordprocessingDrawing" xmlns:wp="http://schemas.openxmlformats.org/drawingml/2006/wordprocessingDrawing" xmlns:w10="urn:schemas-microsoft-com:office:word" xmlns:w="http://schemas.openxmlformats.org/wordprocessingml/2006/main" xmlns:w14="http://schemas.microsoft.com/office/word/2010/wordml" xmlns:w15="http://schemas.microsoft.com/office/word/2012/wordml" xmlns:w16cei="http://schemas.microsoft.com/office/word/2026/wordml/cei" xmlns:w16cex="http://schemas.microsoft.com/office/word/2018/wordml/cex" xmlns:w16cid="http://schemas.microsoft.com/office/word/2016/wordml/cid" xmlns:w16="http://schemas.microsoft.com/office/word/2018/wordml" xmlns:w16du="http://schemas.microsoft.com/office/word/2023/wordml/word16du" xmlns:w16sdtdh="http://schemas.microsoft.com/office/word/2020/wordml/sdtdatahash" xmlns:w16sdtfl="http://schemas.microsoft.com/office/word/2024/wordml/sdtformatlock" xmlns:w16se="http://schemas.microsoft.com/office/word/2015/wordml/symex" xmlns:wpg="http://schemas.microsoft.com/office/word/2010/wordprocessingGroup" xmlns:wpi="http://schemas.microsoft.com/office/word/2010/wordprocessingInk" xmlns:wne="http://schemas.microsoft.com/office/word/2006/wordml" xmlns:wps="http://schemas.microsoft.com/office/word/2010/wordprocessingShape" mc:Ignorable="w14 w15 w16se w16cid w16 w16cex w16sdtdh w16sdtfl w16du wp14">
   <w:p>
     <w:pPr>
@@ -9389,7 +9873,7 @@
 </w:hdr>
 </file>
 
-<file path=word/header4.xml><?xml version="1.0" encoding="utf-8"?>
+<file path=word/header6.xml><?xml version="1.0" encoding="utf-8"?>
 <w:hdr xmlns:wpc="http://schemas.microsoft.com/office/word/2010/wordprocessingCanvas" xmlns:cx="http://schemas.microsoft.com/office/drawing/2014/chartex" xmlns:cx1="http://schemas.microsoft.com/office/drawing/2015/9/8/chartex" xmlns:cx2="http://schemas.microsoft.com/office/drawing/2015/10/21/chartex" xmlns:cx3="http://schemas.microsoft.com/office/drawing/2016/5/9/chartex" xmlns:cx4="http://schemas.microsoft.com/office/drawing/2016/5/10/chartex" xmlns:cx5="http://schemas.microsoft.com/office/drawing/2016/5/11/chartex" xmlns:cx6="http://schemas.microsoft.com/office/drawing/2016/5/12/chartex" xmlns:cx7="http://schemas.microsoft.com/office/drawing/2016/5/13/chartex" xmlns:cx8="http://schemas.microsoft.com/office/drawing/2016/5/14/chartex" xmlns:mc="http://schemas.openxmlformats.org/markup-compatibility/2006" xmlns:aink="http://schemas.microsoft.com/office/drawing/2016/ink" xmlns:am3d="http://schemas.microsoft.com/office/drawing/2017/model3d" xmlns:o="urn:schemas-microsoft-com:office:office" xmlns:oel="http://schemas.microsoft.com/office/2019/extlst" xmlns:r="http://schemas.openxmlformats.org/officeDocument/2006/relationships" xmlns:m="http://schemas.openxmlformats.org/officeDocument/2006/math" xmlns:v="urn:schemas-microsoft-com:vml" xmlns:wp14="http://schemas.microsoft.com/office/word/2010/wordprocessingDrawing" xmlns:wp="http://schemas.openxmlformats.org/drawingml/2006/wordprocessingDrawing" xmlns:w10="urn:schemas-microsoft-com:office:word" xmlns:w="http://schemas.openxmlformats.org/wordprocessingml/2006/main" xmlns:w14="http://schemas.microsoft.com/office/word/2010/wordml" xmlns:w15="http://schemas.microsoft.com/office/word/2012/wordml" xmlns:w16cei="http://schemas.microsoft.com/office/word/2026/wordml/cei" xmlns:w16cex="http://schemas.microsoft.com/office/word/2018/wordml/cex" xmlns:w16cid="http://schemas.microsoft.com/office/word/2016/wordml/cid" xmlns:w16="http://schemas.microsoft.com/office/word/2018/wordml" xmlns:w16du="http://schemas.microsoft.com/office/word/2023/wordml/word16du" xmlns:w16sdtdh="http://schemas.microsoft.com/office/word/2020/wordml/sdtdatahash" xmlns:w16sdtfl="http://schemas.microsoft.com/office/word/2024/wordml/sdtformatlock" xmlns:w16se="http://schemas.microsoft.com/office/word/2015/wordml/symex" xmlns:wpg="http://schemas.microsoft.com/office/word/2010/wordprocessingGroup" xmlns:wpi="http://schemas.microsoft.com/office/word/2010/wordprocessingInk" xmlns:wne="http://schemas.microsoft.com/office/word/2006/wordml" xmlns:wps="http://schemas.microsoft.com/office/word/2010/wordprocessingShape" mc:Ignorable="w14 w15 w16se w16cid w16 w16cex w16sdtdh w16sdtfl w16du wp14">
   <w:p>
     <w:pPr>

</xml_diff>

<commit_message>
Corrección del índice específico
</commit_message>
<xml_diff>
--- a/Propuesta - Vacunas.docx
+++ b/Propuesta - Vacunas.docx
@@ -467,7 +467,7 @@
           <w:sz w:val="24"/>
           <w:szCs w:val="24"/>
         </w:rPr>
-        <w:t>CHRISTIAN JOSÉ RAMÍREZ SOLANO</w:t>
+        <w:t>ANDREA GABRIELA LÓPEZ HIDALGO</w:t>
       </w:r>
     </w:p>
     <w:p>
@@ -489,7 +489,7 @@
           <w:sz w:val="24"/>
           <w:szCs w:val="24"/>
         </w:rPr>
-        <w:t>202308041</w:t>
+        <w:t>202308101</w:t>
       </w:r>
     </w:p>
     <w:p>
@@ -515,7 +515,7 @@
           <w:sz w:val="24"/>
           <w:szCs w:val="24"/>
         </w:rPr>
-        <w:t>LUIS EMMANUEL SUÁREZ MENCHÚ</w:t>
+        <w:t>CHRISTIAN JOSÉ RAMÍREZ SOLANO</w:t>
       </w:r>
     </w:p>
     <w:p>
@@ -537,7 +537,7 @@
           <w:sz w:val="24"/>
           <w:szCs w:val="24"/>
         </w:rPr>
-        <w:t>202308019</w:t>
+        <w:t>202308041</w:t>
       </w:r>
     </w:p>
     <w:p>
@@ -611,7 +611,7 @@
           <w:sz w:val="24"/>
           <w:szCs w:val="24"/>
         </w:rPr>
-        <w:t>ANDREA GABRIELA LÓPEZ HIDALGO</w:t>
+        <w:t>LUIS EMMANUEL SUÁREZ MENCHÚ</w:t>
       </w:r>
     </w:p>
     <w:p>
@@ -633,7 +633,7 @@
           <w:sz w:val="24"/>
           <w:szCs w:val="24"/>
         </w:rPr>
-        <w:t>202308101</w:t>
+        <w:t>202308019</w:t>
       </w:r>
     </w:p>
     <w:p>
@@ -692,7 +692,7 @@
           <w:sz w:val="24"/>
           <w:szCs w:val="24"/>
         </w:rPr>
-        <w:t>JULIO</w:t>
+        <w:t>AGOSTO</w:t>
       </w:r>
       <w:r>
         <w:rPr>
@@ -2027,7 +2027,7 @@
                 <w:noProof/>
                 <w:webHidden/>
               </w:rPr>
-              <w:t>5</w:t>
+              <w:t>9</w:t>
             </w:r>
             <w:r>
               <w:rPr>
@@ -2131,7 +2131,7 @@
                 <w:noProof/>
                 <w:webHidden/>
               </w:rPr>
-              <w:t>5</w:t>
+              <w:t>9</w:t>
             </w:r>
             <w:r>
               <w:rPr>
@@ -2235,7 +2235,7 @@
                 <w:noProof/>
                 <w:webHidden/>
               </w:rPr>
-              <w:t>7</w:t>
+              <w:t>15</w:t>
             </w:r>
             <w:r>
               <w:rPr>
@@ -2339,7 +2339,7 @@
                 <w:noProof/>
                 <w:webHidden/>
               </w:rPr>
-              <w:t>8</w:t>
+              <w:t>16</w:t>
             </w:r>
             <w:r>
               <w:rPr>
@@ -2443,7 +2443,7 @@
                 <w:noProof/>
                 <w:webHidden/>
               </w:rPr>
-              <w:t>9</w:t>
+              <w:t>16</w:t>
             </w:r>
             <w:r>
               <w:rPr>
@@ -2547,7 +2547,7 @@
                 <w:noProof/>
                 <w:webHidden/>
               </w:rPr>
-              <w:t>9</w:t>
+              <w:t>17</w:t>
             </w:r>
             <w:r>
               <w:rPr>
@@ -2651,7 +2651,7 @@
                 <w:noProof/>
                 <w:webHidden/>
               </w:rPr>
-              <w:t>10</w:t>
+              <w:t>18</w:t>
             </w:r>
             <w:r>
               <w:rPr>
@@ -2755,7 +2755,7 @@
                 <w:noProof/>
                 <w:webHidden/>
               </w:rPr>
-              <w:t>10</w:t>
+              <w:t>18</w:t>
             </w:r>
             <w:r>
               <w:rPr>
@@ -2859,7 +2859,7 @@
                 <w:noProof/>
                 <w:webHidden/>
               </w:rPr>
-              <w:t>10</w:t>
+              <w:t>18</w:t>
             </w:r>
             <w:r>
               <w:rPr>
@@ -2963,7 +2963,7 @@
                 <w:noProof/>
                 <w:webHidden/>
               </w:rPr>
-              <w:t>11</w:t>
+              <w:t>19</w:t>
             </w:r>
             <w:r>
               <w:rPr>
@@ -3067,7 +3067,7 @@
                 <w:noProof/>
                 <w:webHidden/>
               </w:rPr>
-              <w:t>11</w:t>
+              <w:t>20</w:t>
             </w:r>
             <w:r>
               <w:rPr>
@@ -3171,7 +3171,7 @@
                 <w:noProof/>
                 <w:webHidden/>
               </w:rPr>
-              <w:t>12</w:t>
+              <w:t>21</w:t>
             </w:r>
             <w:r>
               <w:rPr>
@@ -3275,7 +3275,7 @@
                 <w:noProof/>
                 <w:webHidden/>
               </w:rPr>
-              <w:t>13</w:t>
+              <w:t>23</w:t>
             </w:r>
             <w:r>
               <w:rPr>
@@ -3379,7 +3379,7 @@
                 <w:noProof/>
                 <w:webHidden/>
               </w:rPr>
-              <w:t>13</w:t>
+              <w:t>24</w:t>
             </w:r>
             <w:r>
               <w:rPr>
@@ -3422,12 +3422,805 @@
     </w:p>
     <w:p>
       <w:pPr>
-        <w:rPr>
-          <w:rFonts w:ascii="Arial" w:hAnsi="Arial" w:cs="Arial"/>
-          <w:sz w:val="24"/>
-          <w:szCs w:val="24"/>
-        </w:rPr>
-      </w:pPr>
+        <w:ind w:left="708" w:hanging="708"/>
+        <w:rPr>
+          <w:rFonts w:ascii="Arial" w:hAnsi="Arial" w:cs="Arial"/>
+          <w:sz w:val="24"/>
+          <w:szCs w:val="24"/>
+        </w:rPr>
+      </w:pPr>
+    </w:p>
+    <w:p>
+      <w:pPr>
+        <w:ind w:left="708" w:hanging="708"/>
+        <w:rPr>
+          <w:rFonts w:ascii="Arial" w:hAnsi="Arial" w:cs="Arial"/>
+          <w:sz w:val="24"/>
+          <w:szCs w:val="24"/>
+        </w:rPr>
+      </w:pPr>
+    </w:p>
+    <w:p>
+      <w:pPr>
+        <w:ind w:left="708" w:hanging="708"/>
+        <w:rPr>
+          <w:rFonts w:ascii="Arial" w:hAnsi="Arial" w:cs="Arial"/>
+          <w:sz w:val="24"/>
+          <w:szCs w:val="24"/>
+        </w:rPr>
+      </w:pPr>
+    </w:p>
+    <w:p>
+      <w:pPr>
+        <w:ind w:left="708" w:hanging="708"/>
+        <w:rPr>
+          <w:rFonts w:ascii="Arial" w:hAnsi="Arial" w:cs="Arial"/>
+          <w:sz w:val="24"/>
+          <w:szCs w:val="24"/>
+        </w:rPr>
+      </w:pPr>
+    </w:p>
+    <w:p>
+      <w:pPr>
+        <w:ind w:left="708" w:hanging="708"/>
+        <w:rPr>
+          <w:rFonts w:ascii="Arial" w:hAnsi="Arial" w:cs="Arial"/>
+          <w:sz w:val="24"/>
+          <w:szCs w:val="24"/>
+        </w:rPr>
+      </w:pPr>
+    </w:p>
+    <w:p>
+      <w:pPr>
+        <w:ind w:left="708" w:hanging="708"/>
+        <w:rPr>
+          <w:rFonts w:ascii="Arial" w:hAnsi="Arial" w:cs="Arial"/>
+          <w:sz w:val="24"/>
+          <w:szCs w:val="24"/>
+        </w:rPr>
+      </w:pPr>
+    </w:p>
+    <w:p>
+      <w:pPr>
+        <w:ind w:left="708" w:hanging="708"/>
+        <w:rPr>
+          <w:rFonts w:ascii="Arial" w:hAnsi="Arial" w:cs="Arial"/>
+          <w:sz w:val="24"/>
+          <w:szCs w:val="24"/>
+        </w:rPr>
+      </w:pPr>
+    </w:p>
+    <w:p>
+      <w:pPr>
+        <w:ind w:left="708" w:hanging="708"/>
+        <w:rPr>
+          <w:rFonts w:ascii="Arial" w:hAnsi="Arial" w:cs="Arial"/>
+          <w:sz w:val="24"/>
+          <w:szCs w:val="24"/>
+        </w:rPr>
+      </w:pPr>
+    </w:p>
+    <w:p>
+      <w:pPr>
+        <w:ind w:left="708" w:hanging="708"/>
+        <w:rPr>
+          <w:rFonts w:ascii="Arial" w:hAnsi="Arial" w:cs="Arial"/>
+          <w:sz w:val="24"/>
+          <w:szCs w:val="24"/>
+        </w:rPr>
+      </w:pPr>
+    </w:p>
+    <w:p>
+      <w:pPr>
+        <w:ind w:left="708" w:hanging="708"/>
+        <w:jc w:val="center"/>
+        <w:rPr>
+          <w:rFonts w:ascii="Arial" w:hAnsi="Arial" w:cs="Arial"/>
+          <w:b/>
+          <w:bCs/>
+          <w:sz w:val="24"/>
+          <w:szCs w:val="24"/>
+        </w:rPr>
+      </w:pPr>
+      <w:r>
+        <w:rPr>
+          <w:rFonts w:ascii="Arial" w:hAnsi="Arial" w:cs="Arial"/>
+          <w:b/>
+          <w:bCs/>
+          <w:sz w:val="24"/>
+          <w:szCs w:val="24"/>
+        </w:rPr>
+        <w:lastRenderedPageBreak/>
+        <w:t>INDICE ESPECÍFICO</w:t>
+      </w:r>
+    </w:p>
+    <w:p>
+      <w:pPr>
+        <w:rPr>
+          <w:rFonts w:ascii="Arial" w:hAnsi="Arial" w:cs="Arial"/>
+          <w:b/>
+          <w:bCs/>
+          <w:sz w:val="24"/>
+          <w:szCs w:val="24"/>
+        </w:rPr>
+      </w:pPr>
+      <w:r>
+        <w:rPr>
+          <w:rFonts w:ascii="Arial" w:hAnsi="Arial" w:cs="Arial"/>
+          <w:b/>
+          <w:bCs/>
+          <w:sz w:val="24"/>
+          <w:szCs w:val="24"/>
+        </w:rPr>
+        <w:t>Listado de ilustraciones</w:t>
+      </w:r>
+    </w:p>
+    <w:p>
+      <w:pPr>
+        <w:pStyle w:val="Tabladeilustraciones"/>
+        <w:tabs>
+          <w:tab w:val="right" w:leader="dot" w:pos="8828"/>
+        </w:tabs>
+        <w:rPr>
+          <w:rFonts w:eastAsiaTheme="minorEastAsia"/>
+          <w:noProof/>
+          <w:lang w:eastAsia="es-GT"/>
+        </w:rPr>
+      </w:pPr>
+      <w:r>
+        <w:rPr>
+          <w:rFonts w:ascii="Arial" w:hAnsi="Arial" w:cs="Arial"/>
+          <w:sz w:val="24"/>
+          <w:szCs w:val="24"/>
+        </w:rPr>
+        <w:fldChar w:fldCharType="begin"/>
+      </w:r>
+      <w:r>
+        <w:rPr>
+          <w:rFonts w:ascii="Arial" w:hAnsi="Arial" w:cs="Arial"/>
+          <w:sz w:val="24"/>
+          <w:szCs w:val="24"/>
+        </w:rPr>
+        <w:instrText xml:space="preserve"> TOC \h \z \c "Ilustración " </w:instrText>
+      </w:r>
+      <w:r>
+        <w:rPr>
+          <w:rFonts w:ascii="Arial" w:hAnsi="Arial" w:cs="Arial"/>
+          <w:sz w:val="24"/>
+          <w:szCs w:val="24"/>
+        </w:rPr>
+        <w:fldChar w:fldCharType="separate"/>
+      </w:r>
+      <w:hyperlink r:id="rId9" w:anchor="_Toc236942817" w:history="1">
+        <w:r>
+          <w:rPr>
+            <w:rStyle w:val="Hipervnculo"/>
+            <w:noProof/>
+          </w:rPr>
+          <w:t xml:space="preserve">Ilustración  </w:t>
+        </w:r>
+        <w:r>
+          <w:rPr>
+            <w:rStyle w:val="Hipervnculo"/>
+            <w:noProof/>
+          </w:rPr>
+          <w:t>2.1</w:t>
+        </w:r>
+        <w:r>
+          <w:rPr>
+            <w:rStyle w:val="Hipervnculo"/>
+            <w:noProof/>
+          </w:rPr>
+          <w:t xml:space="preserve"> Diagrama de bloques del proyecto</w:t>
+        </w:r>
+        <w:r>
+          <w:rPr>
+            <w:noProof/>
+            <w:webHidden/>
+          </w:rPr>
+          <w:tab/>
+        </w:r>
+        <w:r>
+          <w:rPr>
+            <w:noProof/>
+            <w:webHidden/>
+          </w:rPr>
+          <w:fldChar w:fldCharType="begin"/>
+        </w:r>
+        <w:r>
+          <w:rPr>
+            <w:noProof/>
+            <w:webHidden/>
+          </w:rPr>
+          <w:instrText xml:space="preserve"> PAGEREF _Toc236942817 \h </w:instrText>
+        </w:r>
+        <w:r>
+          <w:rPr>
+            <w:noProof/>
+            <w:webHidden/>
+          </w:rPr>
+        </w:r>
+        <w:r>
+          <w:rPr>
+            <w:noProof/>
+            <w:webHidden/>
+          </w:rPr>
+          <w:fldChar w:fldCharType="separate"/>
+        </w:r>
+        <w:r>
+          <w:rPr>
+            <w:noProof/>
+            <w:webHidden/>
+          </w:rPr>
+          <w:t>10</w:t>
+        </w:r>
+        <w:r>
+          <w:rPr>
+            <w:noProof/>
+            <w:webHidden/>
+          </w:rPr>
+          <w:fldChar w:fldCharType="end"/>
+        </w:r>
+      </w:hyperlink>
+    </w:p>
+    <w:p>
+      <w:pPr>
+        <w:pStyle w:val="Tabladeilustraciones"/>
+        <w:tabs>
+          <w:tab w:val="right" w:leader="dot" w:pos="8828"/>
+        </w:tabs>
+        <w:rPr>
+          <w:rFonts w:eastAsiaTheme="minorEastAsia"/>
+          <w:noProof/>
+          <w:lang w:eastAsia="es-GT"/>
+        </w:rPr>
+      </w:pPr>
+      <w:hyperlink r:id="rId10" w:anchor="_Toc236942819" w:history="1">
+        <w:r>
+          <w:rPr>
+            <w:rStyle w:val="Hipervnculo"/>
+            <w:noProof/>
+          </w:rPr>
+          <w:t>Ilustración  2</w:t>
+        </w:r>
+        <w:r>
+          <w:rPr>
+            <w:rStyle w:val="Hipervnculo"/>
+            <w:noProof/>
+          </w:rPr>
+          <w:t>.2</w:t>
+        </w:r>
+        <w:r>
+          <w:rPr>
+            <w:rStyle w:val="Hipervnculo"/>
+            <w:noProof/>
+          </w:rPr>
+          <w:t xml:space="preserve"> Diagrama de contexto del sistema</w:t>
+        </w:r>
+        <w:r>
+          <w:rPr>
+            <w:noProof/>
+            <w:webHidden/>
+          </w:rPr>
+          <w:tab/>
+        </w:r>
+        <w:r>
+          <w:rPr>
+            <w:noProof/>
+            <w:webHidden/>
+          </w:rPr>
+          <w:fldChar w:fldCharType="begin"/>
+        </w:r>
+        <w:r>
+          <w:rPr>
+            <w:noProof/>
+            <w:webHidden/>
+          </w:rPr>
+          <w:instrText xml:space="preserve"> PAGEREF _Toc236942819 \h </w:instrText>
+        </w:r>
+        <w:r>
+          <w:rPr>
+            <w:noProof/>
+            <w:webHidden/>
+          </w:rPr>
+        </w:r>
+        <w:r>
+          <w:rPr>
+            <w:noProof/>
+            <w:webHidden/>
+          </w:rPr>
+          <w:fldChar w:fldCharType="separate"/>
+        </w:r>
+        <w:r>
+          <w:rPr>
+            <w:noProof/>
+            <w:webHidden/>
+          </w:rPr>
+          <w:t>11</w:t>
+        </w:r>
+        <w:r>
+          <w:rPr>
+            <w:noProof/>
+            <w:webHidden/>
+          </w:rPr>
+          <w:fldChar w:fldCharType="end"/>
+        </w:r>
+      </w:hyperlink>
+    </w:p>
+    <w:p>
+      <w:pPr>
+        <w:pStyle w:val="Tabladeilustraciones"/>
+        <w:tabs>
+          <w:tab w:val="right" w:leader="dot" w:pos="8828"/>
+        </w:tabs>
+        <w:rPr>
+          <w:rFonts w:eastAsiaTheme="minorEastAsia"/>
+          <w:noProof/>
+          <w:lang w:eastAsia="es-GT"/>
+        </w:rPr>
+      </w:pPr>
+      <w:hyperlink r:id="rId11" w:anchor="_Toc236942821" w:history="1">
+        <w:r>
+          <w:rPr>
+            <w:rStyle w:val="Hipervnculo"/>
+            <w:noProof/>
+          </w:rPr>
+          <w:t xml:space="preserve">Ilustración  </w:t>
+        </w:r>
+        <w:r>
+          <w:rPr>
+            <w:rStyle w:val="Hipervnculo"/>
+            <w:noProof/>
+          </w:rPr>
+          <w:t>2.</w:t>
+        </w:r>
+        <w:r>
+          <w:rPr>
+            <w:rStyle w:val="Hipervnculo"/>
+            <w:noProof/>
+          </w:rPr>
+          <w:t>3 Diagrama de flujo del sistema</w:t>
+        </w:r>
+        <w:r>
+          <w:rPr>
+            <w:noProof/>
+            <w:webHidden/>
+          </w:rPr>
+          <w:tab/>
+        </w:r>
+        <w:r>
+          <w:rPr>
+            <w:noProof/>
+            <w:webHidden/>
+          </w:rPr>
+          <w:fldChar w:fldCharType="begin"/>
+        </w:r>
+        <w:r>
+          <w:rPr>
+            <w:noProof/>
+            <w:webHidden/>
+          </w:rPr>
+          <w:instrText xml:space="preserve"> PAGEREF _Toc236942821 \h </w:instrText>
+        </w:r>
+        <w:r>
+          <w:rPr>
+            <w:noProof/>
+            <w:webHidden/>
+          </w:rPr>
+        </w:r>
+        <w:r>
+          <w:rPr>
+            <w:noProof/>
+            <w:webHidden/>
+          </w:rPr>
+          <w:fldChar w:fldCharType="separate"/>
+        </w:r>
+        <w:r>
+          <w:rPr>
+            <w:noProof/>
+            <w:webHidden/>
+          </w:rPr>
+          <w:t>12</w:t>
+        </w:r>
+        <w:r>
+          <w:rPr>
+            <w:noProof/>
+            <w:webHidden/>
+          </w:rPr>
+          <w:fldChar w:fldCharType="end"/>
+        </w:r>
+      </w:hyperlink>
+    </w:p>
+    <w:p>
+      <w:pPr>
+        <w:pStyle w:val="Tabladeilustraciones"/>
+        <w:tabs>
+          <w:tab w:val="right" w:leader="dot" w:pos="8828"/>
+        </w:tabs>
+        <w:rPr>
+          <w:rStyle w:val="Hipervnculo"/>
+          <w:noProof/>
+        </w:rPr>
+      </w:pPr>
+      <w:hyperlink r:id="rId12" w:anchor="_Toc236942823" w:history="1">
+        <w:r>
+          <w:rPr>
+            <w:rStyle w:val="Hipervnculo"/>
+            <w:noProof/>
+          </w:rPr>
+          <w:t xml:space="preserve">Ilustración  </w:t>
+        </w:r>
+        <w:r>
+          <w:rPr>
+            <w:rStyle w:val="Hipervnculo"/>
+            <w:noProof/>
+          </w:rPr>
+          <w:t>2.</w:t>
+        </w:r>
+        <w:r>
+          <w:rPr>
+            <w:rStyle w:val="Hipervnculo"/>
+            <w:noProof/>
+          </w:rPr>
+          <w:t>4 lustración 2.3. Diagrama de Gantt del proyecto</w:t>
+        </w:r>
+        <w:r>
+          <w:rPr>
+            <w:noProof/>
+            <w:webHidden/>
+          </w:rPr>
+          <w:tab/>
+        </w:r>
+        <w:r>
+          <w:rPr>
+            <w:noProof/>
+            <w:webHidden/>
+          </w:rPr>
+          <w:fldChar w:fldCharType="begin"/>
+        </w:r>
+        <w:r>
+          <w:rPr>
+            <w:noProof/>
+            <w:webHidden/>
+          </w:rPr>
+          <w:instrText xml:space="preserve"> PAGEREF _Toc236942823 \h </w:instrText>
+        </w:r>
+        <w:r>
+          <w:rPr>
+            <w:noProof/>
+            <w:webHidden/>
+          </w:rPr>
+        </w:r>
+        <w:r>
+          <w:rPr>
+            <w:noProof/>
+            <w:webHidden/>
+          </w:rPr>
+          <w:fldChar w:fldCharType="separate"/>
+        </w:r>
+        <w:r>
+          <w:rPr>
+            <w:noProof/>
+            <w:webHidden/>
+          </w:rPr>
+          <w:t>24</w:t>
+        </w:r>
+        <w:r>
+          <w:rPr>
+            <w:noProof/>
+            <w:webHidden/>
+          </w:rPr>
+          <w:fldChar w:fldCharType="end"/>
+        </w:r>
+      </w:hyperlink>
+    </w:p>
+    <w:p/>
+    <w:p>
+      <w:pPr>
+        <w:rPr>
+          <w:rFonts w:ascii="Arial" w:hAnsi="Arial" w:cs="Arial"/>
+          <w:b/>
+          <w:sz w:val="24"/>
+          <w:szCs w:val="24"/>
+        </w:rPr>
+      </w:pPr>
+      <w:r>
+        <w:rPr>
+          <w:rFonts w:ascii="Arial" w:hAnsi="Arial" w:cs="Arial"/>
+          <w:b/>
+          <w:sz w:val="24"/>
+          <w:szCs w:val="24"/>
+        </w:rPr>
+        <w:t>Listado de tablas</w:t>
+      </w:r>
+    </w:p>
+    <w:p>
+      <w:pPr>
+        <w:tabs>
+          <w:tab w:val="right" w:leader="dot" w:pos="8828"/>
+        </w:tabs>
+        <w:rPr>
+          <w:rFonts w:eastAsiaTheme="minorEastAsia"/>
+          <w:noProof/>
+          <w:lang w:eastAsia="es-GT"/>
+        </w:rPr>
+      </w:pPr>
+      <w:r>
+        <w:rPr>
+          <w:rFonts w:ascii="Arial" w:hAnsi="Arial" w:cs="Arial"/>
+          <w:sz w:val="24"/>
+          <w:szCs w:val="24"/>
+        </w:rPr>
+        <w:fldChar w:fldCharType="begin"/>
+      </w:r>
+      <w:r>
+        <w:rPr>
+          <w:rFonts w:ascii="Arial" w:hAnsi="Arial" w:cs="Arial"/>
+          <w:sz w:val="24"/>
+          <w:szCs w:val="24"/>
+        </w:rPr>
+        <w:instrText xml:space="preserve"> TOC \h \z \c "Tabla" </w:instrText>
+      </w:r>
+      <w:r>
+        <w:rPr>
+          <w:rFonts w:ascii="Arial" w:hAnsi="Arial" w:cs="Arial"/>
+          <w:sz w:val="24"/>
+          <w:szCs w:val="24"/>
+        </w:rPr>
+        <w:fldChar w:fldCharType="separate"/>
+      </w:r>
+      <w:hyperlink w:anchor="_Toc236943086" w:history="1">
+        <w:r>
+          <w:rPr>
+            <w:rStyle w:val="Hipervnculo"/>
+            <w:noProof/>
+          </w:rPr>
+          <w:t xml:space="preserve">Tabla </w:t>
+        </w:r>
+        <w:r>
+          <w:rPr>
+            <w:rStyle w:val="Hipervnculo"/>
+            <w:noProof/>
+          </w:rPr>
+          <w:t>2.</w:t>
+        </w:r>
+        <w:r>
+          <w:rPr>
+            <w:rStyle w:val="Hipervnculo"/>
+            <w:noProof/>
+          </w:rPr>
+          <w:t>1 Presupuesto del proyecto</w:t>
+        </w:r>
+        <w:r>
+          <w:rPr>
+            <w:noProof/>
+            <w:webHidden/>
+          </w:rPr>
+          <w:tab/>
+        </w:r>
+        <w:r>
+          <w:rPr>
+            <w:noProof/>
+            <w:webHidden/>
+          </w:rPr>
+          <w:fldChar w:fldCharType="begin"/>
+        </w:r>
+        <w:r>
+          <w:rPr>
+            <w:noProof/>
+            <w:webHidden/>
+          </w:rPr>
+          <w:instrText xml:space="preserve"> PAGEREF _Toc236943086 \h </w:instrText>
+        </w:r>
+        <w:r>
+          <w:rPr>
+            <w:noProof/>
+            <w:webHidden/>
+          </w:rPr>
+        </w:r>
+        <w:r>
+          <w:rPr>
+            <w:noProof/>
+            <w:webHidden/>
+          </w:rPr>
+          <w:fldChar w:fldCharType="separate"/>
+        </w:r>
+        <w:r>
+          <w:rPr>
+            <w:noProof/>
+            <w:webHidden/>
+          </w:rPr>
+          <w:t>23</w:t>
+        </w:r>
+        <w:r>
+          <w:rPr>
+            <w:noProof/>
+            <w:webHidden/>
+          </w:rPr>
+          <w:fldChar w:fldCharType="end"/>
+        </w:r>
+      </w:hyperlink>
+    </w:p>
+    <w:p>
+      <w:pPr>
+        <w:rPr>
+          <w:rFonts w:ascii="Arial" w:hAnsi="Arial" w:cs="Arial"/>
+          <w:b/>
+          <w:sz w:val="24"/>
+          <w:szCs w:val="24"/>
+        </w:rPr>
+      </w:pPr>
+      <w:r>
+        <w:rPr>
+          <w:rFonts w:ascii="Arial" w:hAnsi="Arial" w:cs="Arial"/>
+          <w:sz w:val="24"/>
+          <w:szCs w:val="24"/>
+        </w:rPr>
+        <w:fldChar w:fldCharType="end"/>
+      </w:r>
+    </w:p>
+    <w:p>
+      <w:pPr>
+        <w:rPr>
+          <w:rFonts w:ascii="Arial" w:hAnsi="Arial" w:cs="Arial"/>
+          <w:b/>
+          <w:sz w:val="24"/>
+          <w:szCs w:val="24"/>
+        </w:rPr>
+      </w:pPr>
+      <w:r>
+        <w:rPr>
+          <w:rFonts w:ascii="Arial" w:hAnsi="Arial" w:cs="Arial"/>
+          <w:b/>
+          <w:sz w:val="24"/>
+          <w:szCs w:val="24"/>
+        </w:rPr>
+        <w:t>Listado de imágenes</w:t>
+      </w:r>
+    </w:p>
+    <w:p>
+      <w:pPr>
+        <w:tabs>
+          <w:tab w:val="right" w:leader="dot" w:pos="8828"/>
+        </w:tabs>
+        <w:rPr>
+          <w:rFonts w:eastAsiaTheme="minorEastAsia"/>
+          <w:noProof/>
+          <w:lang w:eastAsia="es-GT"/>
+        </w:rPr>
+      </w:pPr>
+      <w:r>
+        <w:rPr>
+          <w:rFonts w:ascii="Arial" w:hAnsi="Arial" w:cs="Arial"/>
+          <w:sz w:val="24"/>
+          <w:szCs w:val="24"/>
+        </w:rPr>
+        <w:fldChar w:fldCharType="begin"/>
+      </w:r>
+      <w:r>
+        <w:rPr>
+          <w:rFonts w:ascii="Arial" w:hAnsi="Arial" w:cs="Arial"/>
+          <w:sz w:val="24"/>
+          <w:szCs w:val="24"/>
+        </w:rPr>
+        <w:instrText xml:space="preserve"> TOC \h \z \c "Imágen" </w:instrText>
+      </w:r>
+      <w:r>
+        <w:rPr>
+          <w:rFonts w:ascii="Arial" w:hAnsi="Arial" w:cs="Arial"/>
+          <w:sz w:val="24"/>
+          <w:szCs w:val="24"/>
+        </w:rPr>
+        <w:fldChar w:fldCharType="separate"/>
+      </w:r>
+      <w:hyperlink r:id="rId13" w:anchor="_Toc236943127" w:history="1">
+        <w:r>
+          <w:rPr>
+            <w:rStyle w:val="Hipervnculo"/>
+            <w:noProof/>
+          </w:rPr>
+          <w:t xml:space="preserve">Imágen </w:t>
+        </w:r>
+        <w:r>
+          <w:rPr>
+            <w:rStyle w:val="Hipervnculo"/>
+            <w:noProof/>
+          </w:rPr>
+          <w:t>2.</w:t>
+        </w:r>
+        <w:r>
+          <w:rPr>
+            <w:rStyle w:val="Hipervnculo"/>
+            <w:noProof/>
+          </w:rPr>
+          <w:t>1 Metodología Scrum</w:t>
+        </w:r>
+        <w:r>
+          <w:rPr>
+            <w:noProof/>
+            <w:webHidden/>
+          </w:rPr>
+          <w:tab/>
+        </w:r>
+        <w:r>
+          <w:rPr>
+            <w:noProof/>
+            <w:webHidden/>
+          </w:rPr>
+          <w:fldChar w:fldCharType="begin"/>
+        </w:r>
+        <w:r>
+          <w:rPr>
+            <w:noProof/>
+            <w:webHidden/>
+          </w:rPr>
+          <w:instrText xml:space="preserve"> PAGEREF _Toc236943127 \h </w:instrText>
+        </w:r>
+        <w:r>
+          <w:rPr>
+            <w:noProof/>
+            <w:webHidden/>
+          </w:rPr>
+        </w:r>
+        <w:r>
+          <w:rPr>
+            <w:noProof/>
+            <w:webHidden/>
+          </w:rPr>
+          <w:fldChar w:fldCharType="separate"/>
+        </w:r>
+        <w:r>
+          <w:rPr>
+            <w:noProof/>
+            <w:webHidden/>
+          </w:rPr>
+          <w:t>16</w:t>
+        </w:r>
+        <w:r>
+          <w:rPr>
+            <w:noProof/>
+            <w:webHidden/>
+          </w:rPr>
+          <w:fldChar w:fldCharType="end"/>
+        </w:r>
+      </w:hyperlink>
+    </w:p>
+    <w:p>
+      <w:pPr>
+        <w:rPr>
+          <w:rFonts w:ascii="Arial" w:hAnsi="Arial" w:cs="Arial"/>
+          <w:b/>
+          <w:sz w:val="24"/>
+          <w:szCs w:val="24"/>
+        </w:rPr>
+      </w:pPr>
+      <w:r>
+        <w:rPr>
+          <w:rFonts w:ascii="Arial" w:hAnsi="Arial" w:cs="Arial"/>
+          <w:sz w:val="24"/>
+          <w:szCs w:val="24"/>
+        </w:rPr>
+        <w:fldChar w:fldCharType="end"/>
+      </w:r>
+    </w:p>
+    <w:p>
+      <w:pPr>
+        <w:rPr>
+          <w:rFonts w:ascii="Arial" w:hAnsi="Arial" w:cs="Arial"/>
+          <w:b/>
+          <w:bCs/>
+          <w:sz w:val="24"/>
+          <w:szCs w:val="24"/>
+        </w:rPr>
+      </w:pPr>
+      <w:r>
+        <w:rPr>
+          <w:rFonts w:ascii="Arial" w:hAnsi="Arial" w:cs="Arial"/>
+          <w:sz w:val="24"/>
+          <w:szCs w:val="24"/>
+        </w:rPr>
+        <w:fldChar w:fldCharType="end"/>
+      </w:r>
       <w:r>
         <w:rPr>
           <w:rFonts w:ascii="Arial" w:hAnsi="Arial" w:cs="Arial"/>
@@ -3531,23 +4324,7 @@
           <w:rFonts w:ascii="Arial" w:eastAsiaTheme="minorHAnsi" w:hAnsi="Arial" w:cs="Arial"/>
           <w:lang w:val="es-419" w:eastAsia="es-GT"/>
         </w:rPr>
-        <w:t xml:space="preserve">Para el desarrollo del proyecto se utilizará la metodología Scrum, organizada en cuatro </w:t>
-      </w:r>
-      <w:proofErr w:type="spellStart"/>
-      <w:r>
-        <w:rPr>
-          <w:rFonts w:ascii="Arial" w:eastAsiaTheme="minorHAnsi" w:hAnsi="Arial" w:cs="Arial"/>
-          <w:lang w:val="es-419" w:eastAsia="es-GT"/>
-        </w:rPr>
-        <w:t>sprints</w:t>
-      </w:r>
-      <w:proofErr w:type="spellEnd"/>
-      <w:r>
-        <w:rPr>
-          <w:rFonts w:ascii="Arial" w:eastAsiaTheme="minorHAnsi" w:hAnsi="Arial" w:cs="Arial"/>
-          <w:lang w:val="es-419" w:eastAsia="es-GT"/>
-        </w:rPr>
-        <w:t xml:space="preserve"> que abarcan desde el levantamiento de requerimientos y el diseño funcional del sistema, hasta el desarrollo, las pruebas y la elaboración de la documentación técnica y de usuario, favoreciendo un desarrollo iterativo y con validación constante.</w:t>
+        <w:t>Para el desarrollo del proyecto se utilizará la metodología Scrum, organizada en cuatro sprints que abarcan desde el levantamiento de requerimientos y el diseño funcional del sistema, hasta el desarrollo, las pruebas y la elaboración de la documentación técnica y de usuario, favoreciendo un desarrollo iterativo y con validación constante.</w:t>
       </w:r>
     </w:p>
     <w:p>
@@ -3634,12 +4411,8 @@
           <w:szCs w:val="24"/>
         </w:rPr>
         <w:sectPr>
-          <w:headerReference w:type="even" r:id="rId9"/>
-          <w:headerReference w:type="default" r:id="rId10"/>
-          <w:footerReference w:type="even" r:id="rId11"/>
-          <w:footerReference w:type="default" r:id="rId12"/>
-          <w:headerReference w:type="first" r:id="rId13"/>
-          <w:footerReference w:type="first" r:id="rId14"/>
+          <w:footerReference w:type="even" r:id="rId14"/>
+          <w:footerReference w:type="default" r:id="rId15"/>
           <w:pgSz w:w="12240" w:h="15840"/>
           <w:pgMar w:top="1417" w:right="1701" w:bottom="1417" w:left="1701" w:header="708" w:footer="708" w:gutter="0"/>
           <w:cols w:space="708"/>
@@ -4687,19 +5460,8 @@
           <w:bCs/>
           <w:lang w:val="es-419" w:eastAsia="es-GT"/>
         </w:rPr>
-        <w:t xml:space="preserve">Open </w:t>
-      </w:r>
-      <w:proofErr w:type="spellStart"/>
-      <w:r>
-        <w:rPr>
-          <w:rFonts w:ascii="Arial" w:eastAsiaTheme="minorHAnsi" w:hAnsi="Arial" w:cs="Arial"/>
-          <w:b/>
-          <w:bCs/>
-          <w:lang w:val="es-419" w:eastAsia="es-GT"/>
-        </w:rPr>
-        <w:t>mSupply</w:t>
-      </w:r>
-      <w:proofErr w:type="spellEnd"/>
+        <w:t>Open mSupply</w:t>
+      </w:r>
     </w:p>
     <w:p>
       <w:pPr>
@@ -4716,39 +5478,7 @@
           <w:rFonts w:ascii="Arial" w:eastAsiaTheme="minorHAnsi" w:hAnsi="Arial" w:cs="Arial"/>
           <w:lang w:val="es-GT" w:eastAsia="es-GT"/>
         </w:rPr>
-        <w:t>Es un sistema de información para la gestión logística (LMIS, por sus siglas en inglés) de código abierto, bajo licencia AGPL, utilizado en más de 30 países para apoyar el registro, la distribución y el despacho de productos médicos desde bodegas nacionales hasta clínicas remotas (</w:t>
-      </w:r>
-      <w:proofErr w:type="spellStart"/>
-      <w:r>
-        <w:rPr>
-          <w:rFonts w:ascii="Arial" w:eastAsiaTheme="minorHAnsi" w:hAnsi="Arial" w:cs="Arial"/>
-          <w:lang w:val="es-GT" w:eastAsia="es-GT"/>
-        </w:rPr>
-        <w:t>mSupply</w:t>
-      </w:r>
-      <w:proofErr w:type="spellEnd"/>
-      <w:r>
-        <w:rPr>
-          <w:rFonts w:ascii="Arial" w:eastAsiaTheme="minorHAnsi" w:hAnsi="Arial" w:cs="Arial"/>
-          <w:lang w:val="es-GT" w:eastAsia="es-GT"/>
-        </w:rPr>
-        <w:t xml:space="preserve"> </w:t>
-      </w:r>
-      <w:proofErr w:type="spellStart"/>
-      <w:r>
-        <w:rPr>
-          <w:rFonts w:ascii="Arial" w:eastAsiaTheme="minorHAnsi" w:hAnsi="Arial" w:cs="Arial"/>
-          <w:lang w:val="es-GT" w:eastAsia="es-GT"/>
-        </w:rPr>
-        <w:t>Foundation</w:t>
-      </w:r>
-      <w:proofErr w:type="spellEnd"/>
-      <w:r>
-        <w:rPr>
-          <w:rFonts w:ascii="Arial" w:eastAsiaTheme="minorHAnsi" w:hAnsi="Arial" w:cs="Arial"/>
-          <w:lang w:val="es-GT" w:eastAsia="es-GT"/>
-        </w:rPr>
-        <w:t>, s.f.). Incluye un módulo específico de cadena de frío que permite monitorear el estado de los refrigeradores y dar seguimiento al historial de cada lote de vacunas desde su adquisición hasta su aplicación. Sin embargo, al tratarse de una plataforma diseñada para cadenas de suministro nacionales de varios niveles, su implementación requiere infraestructura de servidor propia y personal con conocimientos técnicos para instalarla, configurarla y mantenerla, y no cuenta con un proveedor local en Guatemala que brinde soporte o capacitación. Estas condiciones representan una barrera considerable para su adopción directa por parte de los centros de salud del departamento de San Marcos, donde no se cuenta con personal técnico dedicado a la administración de este tipo de sistemas.</w:t>
+        <w:t>Es un sistema de información para la gestión logística (LMIS, por sus siglas en inglés) de código abierto, bajo licencia AGPL, utilizado en más de 30 países para apoyar el registro, la distribución y el despacho de productos médicos desde bodegas nacionales hasta clínicas remotas (mSupply Foundation, s.f.). Incluye un módulo específico de cadena de frío que permite monitorear el estado de los refrigeradores y dar seguimiento al historial de cada lote de vacunas desde su adquisición hasta su aplicación. Sin embargo, al tratarse de una plataforma diseñada para cadenas de suministro nacionales de varios niveles, su implementación requiere infraestructura de servidor propia y personal con conocimientos técnicos para instalarla, configurarla y mantenerla, y no cuenta con un proveedor local en Guatemala que brinde soporte o capacitación. Estas condiciones representan una barrera considerable para su adopción directa por parte de los centros de salud del departamento de San Marcos, donde no se cuenta con personal técnico dedicado a la administración de este tipo de sistemas.</w:t>
       </w:r>
     </w:p>
     <w:p>
@@ -5447,10 +6177,10 @@
           <w:szCs w:val="24"/>
         </w:rPr>
         <w:sectPr>
-          <w:headerReference w:type="even" r:id="rId15"/>
-          <w:headerReference w:type="default" r:id="rId16"/>
-          <w:footerReference w:type="even" r:id="rId17"/>
-          <w:footerReference w:type="default" r:id="rId18"/>
+          <w:headerReference w:type="even" r:id="rId16"/>
+          <w:headerReference w:type="default" r:id="rId17"/>
+          <w:footerReference w:type="even" r:id="rId18"/>
+          <w:footerReference w:type="default" r:id="rId19"/>
           <w:pgSz w:w="12240" w:h="15840"/>
           <w:pgMar w:top="1417" w:right="1701" w:bottom="1417" w:left="1701" w:header="708" w:footer="708" w:gutter="0"/>
           <w:pgNumType w:start="1"/>
@@ -5640,33 +6370,17 @@
       </w:pPr>
       <w:r>
         <w:rPr>
-          <w:rFonts w:ascii="Arial" w:hAnsi="Arial" w:cs="Arial"/>
-          <w:sz w:val="24"/>
-          <w:szCs w:val="24"/>
-        </w:rPr>
-        <w:t>El diagrama de bloques brinda una representación simplificada de los principales componentes que integran el sistema y cómo se encuentran interconectados de forma general.</w:t>
-      </w:r>
-    </w:p>
-    <w:p>
-      <w:pPr>
-        <w:pStyle w:val="Descripcin"/>
-        <w:keepNext/>
-        <w:spacing w:line="276" w:lineRule="auto"/>
-        <w:jc w:val="center"/>
-      </w:pPr>
-      <w:r>
-        <w:rPr>
           <w:noProof/>
           <w:lang w:val="es-MX"/>
         </w:rPr>
         <w:drawing>
-          <wp:anchor distT="0" distB="0" distL="114300" distR="114300" simplePos="0" relativeHeight="251662336" behindDoc="0" locked="0" layoutInCell="1" allowOverlap="1" wp14:anchorId="21723FBC" wp14:editId="705B3B79">
+          <wp:anchor distT="0" distB="0" distL="114300" distR="114300" simplePos="0" relativeHeight="251662336" behindDoc="0" locked="0" layoutInCell="1" allowOverlap="1" wp14:anchorId="21723FBC" wp14:editId="200D1E6E">
             <wp:simplePos x="0" y="0"/>
             <wp:positionH relativeFrom="margin">
               <wp:posOffset>-635</wp:posOffset>
             </wp:positionH>
             <wp:positionV relativeFrom="paragraph">
-              <wp:posOffset>398780</wp:posOffset>
+              <wp:posOffset>972820</wp:posOffset>
             </wp:positionV>
             <wp:extent cx="5948045" cy="2616200"/>
             <wp:effectExtent l="0" t="0" r="0" b="0"/>
@@ -5685,7 +6399,7 @@
                     </pic:cNvPicPr>
                   </pic:nvPicPr>
                   <pic:blipFill>
-                    <a:blip r:embed="rId19">
+                    <a:blip r:embed="rId20">
                       <a:extLst>
                         <a:ext uri="{28A0092B-C50C-407E-A947-70E740481C1C}">
                           <a14:useLocalDpi xmlns:a14="http://schemas.microsoft.com/office/drawing/2010/main" val="0"/>
@@ -5723,14 +6437,273 @@
         </w:drawing>
       </w:r>
       <w:r>
-        <w:t>Ilustración 2.1: Diagrama de bloques del proyecto</w:t>
+        <w:rPr>
+          <w:noProof/>
+        </w:rPr>
+        <mc:AlternateContent>
+          <mc:Choice Requires="wps">
+            <w:drawing>
+              <wp:anchor distT="0" distB="0" distL="114300" distR="114300" simplePos="0" relativeHeight="251666432" behindDoc="0" locked="0" layoutInCell="1" allowOverlap="1" wp14:anchorId="22590094" wp14:editId="3F0586A4">
+                <wp:simplePos x="0" y="0"/>
+                <wp:positionH relativeFrom="margin">
+                  <wp:align>left</wp:align>
+                </wp:positionH>
+                <wp:positionV relativeFrom="paragraph">
+                  <wp:posOffset>569595</wp:posOffset>
+                </wp:positionV>
+                <wp:extent cx="5948045" cy="266700"/>
+                <wp:effectExtent l="0" t="0" r="0" b="0"/>
+                <wp:wrapTopAndBottom/>
+                <wp:docPr id="1" name="Cuadro de texto 1"/>
+                <wp:cNvGraphicFramePr/>
+                <a:graphic xmlns:a="http://schemas.openxmlformats.org/drawingml/2006/main">
+                  <a:graphicData uri="http://schemas.microsoft.com/office/word/2010/wordprocessingShape">
+                    <wps:wsp>
+                      <wps:cNvSpPr txBox="1"/>
+                      <wps:spPr>
+                        <a:xfrm>
+                          <a:off x="0" y="0"/>
+                          <a:ext cx="5948045" cy="266700"/>
+                        </a:xfrm>
+                        <a:prstGeom prst="rect">
+                          <a:avLst/>
+                        </a:prstGeom>
+                        <a:solidFill>
+                          <a:prstClr val="white"/>
+                        </a:solidFill>
+                        <a:ln>
+                          <a:noFill/>
+                        </a:ln>
+                      </wps:spPr>
+                      <wps:txbx>
+                        <w:txbxContent>
+                          <w:p>
+                            <w:pPr>
+                              <w:pStyle w:val="Descripcin"/>
+                              <w:jc w:val="center"/>
+                              <w:rPr>
+                                <w:noProof/>
+                                <w:lang w:val="es-MX"/>
+                              </w:rPr>
+                            </w:pPr>
+                            <w:bookmarkStart w:id="34" w:name="_Toc236942481"/>
+                            <w:bookmarkStart w:id="35" w:name="_Toc236942817"/>
+                            <w:r>
+                              <w:t xml:space="preserve">Ilustración </w:t>
+                            </w:r>
+                            <w:r>
+                              <w:t xml:space="preserve">2.1 </w:t>
+                            </w:r>
+                            <w:r>
+                              <w:t>Diagrama de bloques del proyecto</w:t>
+                            </w:r>
+                            <w:bookmarkEnd w:id="35"/>
+                          </w:p>
+                          <w:p>
+                            <w:pPr>
+                              <w:pStyle w:val="Descripcin"/>
+                              <w:jc w:val="center"/>
+                              <w:rPr>
+                                <w:noProof/>
+                                <w:lang w:val="es-MX"/>
+                              </w:rPr>
+                            </w:pPr>
+                          </w:p>
+                          <w:p/>
+                          <w:p>
+                            <w:pPr>
+                              <w:pStyle w:val="Descripcin"/>
+                              <w:jc w:val="center"/>
+                              <w:rPr>
+                                <w:noProof/>
+                                <w:lang w:val="es-MX"/>
+                              </w:rPr>
+                            </w:pPr>
+                            <w:bookmarkStart w:id="36" w:name="_Toc236942818"/>
+                            <w:r>
+                              <w:t xml:space="preserve">Ilustración  </w:t>
+                            </w:r>
+                            <w:fldSimple w:instr=" SEQ Ilustración_ \* ARABIC ">
+                              <w:r>
+                                <w:rPr>
+                                  <w:noProof/>
+                                </w:rPr>
+                                <w:t>2</w:t>
+                              </w:r>
+                            </w:fldSimple>
+                            <w:r>
+                              <w:t xml:space="preserve"> </w:t>
+                            </w:r>
+                            <w:r>
+                              <w:t>Diagrama de contexto del sistema</w:t>
+                            </w:r>
+                            <w:r>
+                              <w:t xml:space="preserve">Ilustración  </w:t>
+                            </w:r>
+                            <w:fldSimple w:instr=" SEQ Ilustración_ \* ARABIC ">
+                              <w:r>
+                                <w:rPr>
+                                  <w:noProof/>
+                                </w:rPr>
+                                <w:t>1</w:t>
+                              </w:r>
+                            </w:fldSimple>
+                            <w:r>
+                              <w:t xml:space="preserve"> </w:t>
+                            </w:r>
+                            <w:r>
+                              <w:t>Diagrama de bloques del proyecto</w:t>
+                            </w:r>
+                            <w:bookmarkEnd w:id="34"/>
+                            <w:bookmarkEnd w:id="36"/>
+                          </w:p>
+                          <w:p>
+                            <w:pPr>
+                              <w:pStyle w:val="Descripcin"/>
+                              <w:jc w:val="center"/>
+                              <w:rPr>
+                                <w:noProof/>
+                                <w:lang w:val="es-MX"/>
+                              </w:rPr>
+                            </w:pPr>
+                          </w:p>
+                        </w:txbxContent>
+                      </wps:txbx>
+                      <wps:bodyPr rot="0" spcFirstLastPara="0" vertOverflow="overflow" horzOverflow="overflow" vert="horz" wrap="square" lIns="0" tIns="0" rIns="0" bIns="0" numCol="1" spcCol="0" rtlCol="0" fromWordArt="0" anchor="t" anchorCtr="0" forceAA="0" compatLnSpc="1">
+                        <a:prstTxWarp prst="textNoShape">
+                          <a:avLst/>
+                        </a:prstTxWarp>
+                        <a:noAutofit/>
+                      </wps:bodyPr>
+                    </wps:wsp>
+                  </a:graphicData>
+                </a:graphic>
+                <wp14:sizeRelV relativeFrom="margin">
+                  <wp14:pctHeight>0</wp14:pctHeight>
+                </wp14:sizeRelV>
+              </wp:anchor>
+            </w:drawing>
+          </mc:Choice>
+          <mc:Fallback>
+            <w:pict>
+              <v:shapetype w14:anchorId="22590094" id="_x0000_t202" coordsize="21600,21600" o:spt="202" path="m,l,21600r21600,l21600,xe">
+                <v:stroke joinstyle="miter"/>
+                <v:path gradientshapeok="t" o:connecttype="rect"/>
+              </v:shapetype>
+              <v:shape id="Cuadro de texto 1" o:spid="_x0000_s1026" type="#_x0000_t202" style="position:absolute;left:0;text-align:left;margin-left:0;margin-top:44.85pt;width:468.35pt;height:21pt;z-index:251666432;visibility:visible;mso-wrap-style:square;mso-height-percent:0;mso-wrap-distance-left:9pt;mso-wrap-distance-top:0;mso-wrap-distance-right:9pt;mso-wrap-distance-bottom:0;mso-position-horizontal:left;mso-position-horizontal-relative:margin;mso-position-vertical:absolute;mso-position-vertical-relative:text;mso-height-percent:0;mso-height-relative:margin;v-text-anchor:top" o:gfxdata="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" stroked="f">
+                <v:textbox inset="0,0,0,0">
+                  <w:txbxContent>
+                    <w:p>
+                      <w:pPr>
+                        <w:pStyle w:val="Descripcin"/>
+                        <w:jc w:val="center"/>
+                        <w:rPr>
+                          <w:noProof/>
+                          <w:lang w:val="es-MX"/>
+                        </w:rPr>
+                      </w:pPr>
+                      <w:bookmarkStart w:id="37" w:name="_Toc236942481"/>
+                      <w:bookmarkStart w:id="38" w:name="_Toc236942817"/>
+                      <w:r>
+                        <w:t xml:space="preserve">Ilustración </w:t>
+                      </w:r>
+                      <w:r>
+                        <w:t xml:space="preserve">2.1 </w:t>
+                      </w:r>
+                      <w:r>
+                        <w:t>Diagrama de bloques del proyecto</w:t>
+                      </w:r>
+                      <w:bookmarkEnd w:id="38"/>
+                    </w:p>
+                    <w:p>
+                      <w:pPr>
+                        <w:pStyle w:val="Descripcin"/>
+                        <w:jc w:val="center"/>
+                        <w:rPr>
+                          <w:noProof/>
+                          <w:lang w:val="es-MX"/>
+                        </w:rPr>
+                      </w:pPr>
+                    </w:p>
+                    <w:p/>
+                    <w:p>
+                      <w:pPr>
+                        <w:pStyle w:val="Descripcin"/>
+                        <w:jc w:val="center"/>
+                        <w:rPr>
+                          <w:noProof/>
+                          <w:lang w:val="es-MX"/>
+                        </w:rPr>
+                      </w:pPr>
+                      <w:bookmarkStart w:id="39" w:name="_Toc236942818"/>
+                      <w:r>
+                        <w:t xml:space="preserve">Ilustración  </w:t>
+                      </w:r>
+                      <w:fldSimple w:instr=" SEQ Ilustración_ \* ARABIC ">
+                        <w:r>
+                          <w:rPr>
+                            <w:noProof/>
+                          </w:rPr>
+                          <w:t>2</w:t>
+                        </w:r>
+                      </w:fldSimple>
+                      <w:r>
+                        <w:t xml:space="preserve"> </w:t>
+                      </w:r>
+                      <w:r>
+                        <w:t>Diagrama de contexto del sistema</w:t>
+                      </w:r>
+                      <w:r>
+                        <w:t xml:space="preserve">Ilustración  </w:t>
+                      </w:r>
+                      <w:fldSimple w:instr=" SEQ Ilustración_ \* ARABIC ">
+                        <w:r>
+                          <w:rPr>
+                            <w:noProof/>
+                          </w:rPr>
+                          <w:t>1</w:t>
+                        </w:r>
+                      </w:fldSimple>
+                      <w:r>
+                        <w:t xml:space="preserve"> </w:t>
+                      </w:r>
+                      <w:r>
+                        <w:t>Diagrama de bloques del proyecto</w:t>
+                      </w:r>
+                      <w:bookmarkEnd w:id="37"/>
+                      <w:bookmarkEnd w:id="39"/>
+                    </w:p>
+                    <w:p>
+                      <w:pPr>
+                        <w:pStyle w:val="Descripcin"/>
+                        <w:jc w:val="center"/>
+                        <w:rPr>
+                          <w:noProof/>
+                          <w:lang w:val="es-MX"/>
+                        </w:rPr>
+                      </w:pPr>
+                    </w:p>
+                  </w:txbxContent>
+                </v:textbox>
+                <w10:wrap type="topAndBottom" anchorx="margin"/>
+              </v:shape>
+            </w:pict>
+          </mc:Fallback>
+        </mc:AlternateContent>
+      </w:r>
+      <w:r>
+        <w:rPr>
+          <w:rFonts w:ascii="Arial" w:hAnsi="Arial" w:cs="Arial"/>
+          <w:sz w:val="24"/>
+          <w:szCs w:val="24"/>
+        </w:rPr>
+        <w:t>El diagrama de bloques brinda una representación simplificada de los principales componentes que integran el sistema y cómo se encuentran interconectados de forma general.</w:t>
       </w:r>
     </w:p>
     <w:p>
       <w:pPr>
         <w:pStyle w:val="Descripcin"/>
         <w:spacing w:line="276" w:lineRule="auto"/>
-        <w:jc w:val="center"/>
       </w:pPr>
     </w:p>
     <w:p>
@@ -5807,47 +6780,7 @@
           <w:szCs w:val="24"/>
           <w:lang w:val="es-MX"/>
         </w:rPr>
-        <w:t xml:space="preserve"> desarrollada con </w:t>
-      </w:r>
-      <w:proofErr w:type="spellStart"/>
-      <w:r>
-        <w:rPr>
-          <w:rFonts w:ascii="Arial" w:hAnsi="Arial" w:cs="Arial"/>
-          <w:sz w:val="24"/>
-          <w:szCs w:val="24"/>
-          <w:lang w:val="es-MX"/>
-        </w:rPr>
-        <w:t>React</w:t>
-      </w:r>
-      <w:proofErr w:type="spellEnd"/>
-      <w:r>
-        <w:rPr>
-          <w:rFonts w:ascii="Arial" w:hAnsi="Arial" w:cs="Arial"/>
-          <w:sz w:val="24"/>
-          <w:szCs w:val="24"/>
-          <w:lang w:val="es-MX"/>
-        </w:rPr>
-        <w:t xml:space="preserve"> y </w:t>
-      </w:r>
-      <w:proofErr w:type="spellStart"/>
-      <w:r>
-        <w:rPr>
-          <w:rFonts w:ascii="Arial" w:hAnsi="Arial" w:cs="Arial"/>
-          <w:sz w:val="24"/>
-          <w:szCs w:val="24"/>
-          <w:lang w:val="es-MX"/>
-        </w:rPr>
-        <w:t>Tailwind</w:t>
-      </w:r>
-      <w:proofErr w:type="spellEnd"/>
-      <w:r>
-        <w:rPr>
-          <w:rFonts w:ascii="Arial" w:hAnsi="Arial" w:cs="Arial"/>
-          <w:sz w:val="24"/>
-          <w:szCs w:val="24"/>
-          <w:lang w:val="es-MX"/>
-        </w:rPr>
-        <w:t xml:space="preserve"> para el diseño, es el medio mediante el cual el personal de los centros de salud y las autoridades del Centro de Salud de San Marcos interactuarán con el sistema a través de un navegador web.</w:t>
+        <w:t xml:space="preserve"> desarrollada con React y Tailwind para el diseño, es el medio mediante el cual el personal de los centros de salud y las autoridades del Centro de Salud de San Marcos interactuarán con el sistema a través de un navegador web.</w:t>
       </w:r>
     </w:p>
     <w:p>
@@ -6072,27 +7005,7 @@
           <w:szCs w:val="24"/>
           <w:lang w:val="es-MX"/>
         </w:rPr>
-        <w:t xml:space="preserve"> mediante </w:t>
-      </w:r>
-      <w:proofErr w:type="spellStart"/>
-      <w:r>
-        <w:rPr>
-          <w:rFonts w:ascii="Arial" w:hAnsi="Arial" w:cs="Arial"/>
-          <w:sz w:val="24"/>
-          <w:szCs w:val="24"/>
-          <w:lang w:val="es-MX"/>
-        </w:rPr>
-        <w:t>DigitalOcean</w:t>
-      </w:r>
-      <w:proofErr w:type="spellEnd"/>
-      <w:r>
-        <w:rPr>
-          <w:rFonts w:ascii="Arial" w:hAnsi="Arial" w:cs="Arial"/>
-          <w:sz w:val="24"/>
-          <w:szCs w:val="24"/>
-          <w:lang w:val="es-MX"/>
-        </w:rPr>
-        <w:t>, encargado de proveer la infraestructura necesaria y brindar el enlace para que el usuario final pueda acceder al sistema a través de internet.</w:t>
+        <w:t xml:space="preserve"> mediante DigitalOcean, encargado de proveer la infraestructura necesaria y brindar el enlace para que el usuario final pueda acceder al sistema a través de internet.</w:t>
       </w:r>
     </w:p>
     <w:p>
@@ -6129,47 +7042,7 @@
           <w:szCs w:val="24"/>
           <w:lang w:val="es-MX"/>
         </w:rPr>
-        <w:t xml:space="preserve"> creada a través de un </w:t>
-      </w:r>
-      <w:proofErr w:type="spellStart"/>
-      <w:r>
-        <w:rPr>
-          <w:rFonts w:ascii="Arial" w:hAnsi="Arial" w:cs="Arial"/>
-          <w:sz w:val="24"/>
-          <w:szCs w:val="24"/>
-          <w:lang w:val="es-MX"/>
-        </w:rPr>
-        <w:t>droplet</w:t>
-      </w:r>
-      <w:proofErr w:type="spellEnd"/>
-      <w:r>
-        <w:rPr>
-          <w:rFonts w:ascii="Arial" w:hAnsi="Arial" w:cs="Arial"/>
-          <w:sz w:val="24"/>
-          <w:szCs w:val="24"/>
-          <w:lang w:val="es-MX"/>
-        </w:rPr>
-        <w:t xml:space="preserve"> de </w:t>
-      </w:r>
-      <w:proofErr w:type="spellStart"/>
-      <w:r>
-        <w:rPr>
-          <w:rFonts w:ascii="Arial" w:hAnsi="Arial" w:cs="Arial"/>
-          <w:sz w:val="24"/>
-          <w:szCs w:val="24"/>
-          <w:lang w:val="es-MX"/>
-        </w:rPr>
-        <w:t>DigitalOcean</w:t>
-      </w:r>
-      <w:proofErr w:type="spellEnd"/>
-      <w:r>
-        <w:rPr>
-          <w:rFonts w:ascii="Arial" w:hAnsi="Arial" w:cs="Arial"/>
-          <w:sz w:val="24"/>
-          <w:szCs w:val="24"/>
-          <w:lang w:val="es-MX"/>
-        </w:rPr>
-        <w:t xml:space="preserve"> con distribución Linux, que provee el entorno básico para la configuración y el funcionamiento del sistema.</w:t>
+        <w:t xml:space="preserve"> creada a través de un droplet de DigitalOcean con distribución Linux, que provee el entorno básico para la configuración y el funcionamiento del sistema.</w:t>
       </w:r>
     </w:p>
     <w:p>
@@ -6258,6 +7131,239 @@
           <w:lang w:val="es-MX"/>
         </w:rPr>
       </w:pPr>
+      <w:r>
+        <w:rPr>
+          <w:noProof/>
+        </w:rPr>
+        <mc:AlternateContent>
+          <mc:Choice Requires="wps">
+            <w:drawing>
+              <wp:anchor distT="0" distB="0" distL="114300" distR="114300" simplePos="0" relativeHeight="251668480" behindDoc="0" locked="0" layoutInCell="1" allowOverlap="1" wp14:anchorId="1BD46EF5" wp14:editId="535851A6">
+                <wp:simplePos x="0" y="0"/>
+                <wp:positionH relativeFrom="column">
+                  <wp:posOffset>-29845</wp:posOffset>
+                </wp:positionH>
+                <wp:positionV relativeFrom="paragraph">
+                  <wp:posOffset>808355</wp:posOffset>
+                </wp:positionV>
+                <wp:extent cx="6013450" cy="125095"/>
+                <wp:effectExtent l="0" t="0" r="6350" b="8255"/>
+                <wp:wrapTopAndBottom/>
+                <wp:docPr id="5" name="Cuadro de texto 5"/>
+                <wp:cNvGraphicFramePr/>
+                <a:graphic xmlns:a="http://schemas.openxmlformats.org/drawingml/2006/main">
+                  <a:graphicData uri="http://schemas.microsoft.com/office/word/2010/wordprocessingShape">
+                    <wps:wsp>
+                      <wps:cNvSpPr txBox="1"/>
+                      <wps:spPr>
+                        <a:xfrm>
+                          <a:off x="0" y="0"/>
+                          <a:ext cx="6013450" cy="125095"/>
+                        </a:xfrm>
+                        <a:prstGeom prst="rect">
+                          <a:avLst/>
+                        </a:prstGeom>
+                        <a:solidFill>
+                          <a:prstClr val="white"/>
+                        </a:solidFill>
+                        <a:ln>
+                          <a:noFill/>
+                        </a:ln>
+                      </wps:spPr>
+                      <wps:txbx>
+                        <w:txbxContent>
+                          <w:p>
+                            <w:pPr>
+                              <w:pStyle w:val="Descripcin"/>
+                              <w:jc w:val="center"/>
+                              <w:rPr>
+                                <w:noProof/>
+                                <w:lang w:val="es-MX"/>
+                              </w:rPr>
+                            </w:pPr>
+                            <w:bookmarkStart w:id="40" w:name="_Toc236942482"/>
+                            <w:bookmarkStart w:id="41" w:name="_Toc236942819"/>
+                            <w:r>
+                              <w:t xml:space="preserve">Ilustración  </w:t>
+                            </w:r>
+                            <w:fldSimple w:instr=" SEQ Ilustración_ \* ARABIC ">
+                              <w:r>
+                                <w:rPr>
+                                  <w:noProof/>
+                                </w:rPr>
+                                <w:t>2</w:t>
+                              </w:r>
+                            </w:fldSimple>
+                            <w:r>
+                              <w:t>.2</w:t>
+                            </w:r>
+                            <w:r>
+                              <w:t xml:space="preserve"> </w:t>
+                            </w:r>
+                            <w:r>
+                              <w:t>Diagrama de contexto del sistema</w:t>
+                            </w:r>
+                            <w:bookmarkEnd w:id="41"/>
+                          </w:p>
+                          <w:p/>
+                          <w:p>
+                            <w:pPr>
+                              <w:pStyle w:val="Descripcin"/>
+                              <w:jc w:val="center"/>
+                              <w:rPr>
+                                <w:noProof/>
+                                <w:lang w:val="es-MX"/>
+                              </w:rPr>
+                            </w:pPr>
+                            <w:bookmarkStart w:id="42" w:name="_Toc236942820"/>
+                            <w:r>
+                              <w:t xml:space="preserve">Ilustración  </w:t>
+                            </w:r>
+                            <w:fldSimple w:instr=" SEQ Ilustración_ \* ARABIC ">
+                              <w:r>
+                                <w:rPr>
+                                  <w:noProof/>
+                                </w:rPr>
+                                <w:t>3</w:t>
+                              </w:r>
+                            </w:fldSimple>
+                            <w:r>
+                              <w:t xml:space="preserve"> </w:t>
+                            </w:r>
+                            <w:r>
+                              <w:t>Diagrama de flujo del sistema</w:t>
+                            </w:r>
+                            <w:r>
+                              <w:t xml:space="preserve">Ilustración  </w:t>
+                            </w:r>
+                            <w:fldSimple w:instr=" SEQ Ilustración_ \* ARABIC ">
+                              <w:r>
+                                <w:rPr>
+                                  <w:noProof/>
+                                </w:rPr>
+                                <w:t>2</w:t>
+                              </w:r>
+                            </w:fldSimple>
+                            <w:r>
+                              <w:t xml:space="preserve"> </w:t>
+                            </w:r>
+                            <w:r>
+                              <w:t>Diagrama de contexto del sistema</w:t>
+                            </w:r>
+                            <w:bookmarkEnd w:id="40"/>
+                            <w:bookmarkEnd w:id="42"/>
+                          </w:p>
+                        </w:txbxContent>
+                      </wps:txbx>
+                      <wps:bodyPr rot="0" spcFirstLastPara="0" vertOverflow="overflow" horzOverflow="overflow" vert="horz" wrap="square" lIns="0" tIns="0" rIns="0" bIns="0" numCol="1" spcCol="0" rtlCol="0" fromWordArt="0" anchor="t" anchorCtr="0" forceAA="0" compatLnSpc="1">
+                        <a:prstTxWarp prst="textNoShape">
+                          <a:avLst/>
+                        </a:prstTxWarp>
+                        <a:noAutofit/>
+                      </wps:bodyPr>
+                    </wps:wsp>
+                  </a:graphicData>
+                </a:graphic>
+                <wp14:sizeRelV relativeFrom="margin">
+                  <wp14:pctHeight>0</wp14:pctHeight>
+                </wp14:sizeRelV>
+              </wp:anchor>
+            </w:drawing>
+          </mc:Choice>
+          <mc:Fallback>
+            <w:pict>
+              <v:shape w14:anchorId="1BD46EF5" id="Cuadro de texto 5" o:spid="_x0000_s1027" type="#_x0000_t202" style="position:absolute;left:0;text-align:left;margin-left:-2.35pt;margin-top:63.65pt;width:473.5pt;height:9.85pt;z-index:251668480;visibility:visible;mso-wrap-style:square;mso-height-percent:0;mso-wrap-distance-left:9pt;mso-wrap-distance-top:0;mso-wrap-distance-right:9pt;mso-wrap-distance-bottom:0;mso-position-horizontal:absolute;mso-position-horizontal-relative:text;mso-position-vertical:absolute;mso-position-vertical-relative:text;mso-height-percent:0;mso-height-relative:margin;v-text-anchor:top" o:gfxdata="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" stroked="f">
+                <v:textbox inset="0,0,0,0">
+                  <w:txbxContent>
+                    <w:p>
+                      <w:pPr>
+                        <w:pStyle w:val="Descripcin"/>
+                        <w:jc w:val="center"/>
+                        <w:rPr>
+                          <w:noProof/>
+                          <w:lang w:val="es-MX"/>
+                        </w:rPr>
+                      </w:pPr>
+                      <w:bookmarkStart w:id="43" w:name="_Toc236942482"/>
+                      <w:bookmarkStart w:id="44" w:name="_Toc236942819"/>
+                      <w:r>
+                        <w:t xml:space="preserve">Ilustración  </w:t>
+                      </w:r>
+                      <w:fldSimple w:instr=" SEQ Ilustración_ \* ARABIC ">
+                        <w:r>
+                          <w:rPr>
+                            <w:noProof/>
+                          </w:rPr>
+                          <w:t>2</w:t>
+                        </w:r>
+                      </w:fldSimple>
+                      <w:r>
+                        <w:t>.2</w:t>
+                      </w:r>
+                      <w:r>
+                        <w:t xml:space="preserve"> </w:t>
+                      </w:r>
+                      <w:r>
+                        <w:t>Diagrama de contexto del sistema</w:t>
+                      </w:r>
+                      <w:bookmarkEnd w:id="44"/>
+                    </w:p>
+                    <w:p/>
+                    <w:p>
+                      <w:pPr>
+                        <w:pStyle w:val="Descripcin"/>
+                        <w:jc w:val="center"/>
+                        <w:rPr>
+                          <w:noProof/>
+                          <w:lang w:val="es-MX"/>
+                        </w:rPr>
+                      </w:pPr>
+                      <w:bookmarkStart w:id="45" w:name="_Toc236942820"/>
+                      <w:r>
+                        <w:t xml:space="preserve">Ilustración  </w:t>
+                      </w:r>
+                      <w:fldSimple w:instr=" SEQ Ilustración_ \* ARABIC ">
+                        <w:r>
+                          <w:rPr>
+                            <w:noProof/>
+                          </w:rPr>
+                          <w:t>3</w:t>
+                        </w:r>
+                      </w:fldSimple>
+                      <w:r>
+                        <w:t xml:space="preserve"> </w:t>
+                      </w:r>
+                      <w:r>
+                        <w:t>Diagrama de flujo del sistema</w:t>
+                      </w:r>
+                      <w:r>
+                        <w:t xml:space="preserve">Ilustración  </w:t>
+                      </w:r>
+                      <w:fldSimple w:instr=" SEQ Ilustración_ \* ARABIC ">
+                        <w:r>
+                          <w:rPr>
+                            <w:noProof/>
+                          </w:rPr>
+                          <w:t>2</w:t>
+                        </w:r>
+                      </w:fldSimple>
+                      <w:r>
+                        <w:t xml:space="preserve"> </w:t>
+                      </w:r>
+                      <w:r>
+                        <w:t>Diagrama de contexto del sistema</w:t>
+                      </w:r>
+                      <w:bookmarkEnd w:id="43"/>
+                      <w:bookmarkEnd w:id="45"/>
+                    </w:p>
+                  </w:txbxContent>
+                </v:textbox>
+                <w10:wrap type="topAndBottom"/>
+              </v:shape>
+            </w:pict>
+          </mc:Fallback>
+        </mc:AlternateContent>
+      </w:r>
       <w:r>
         <w:rPr>
           <w:rFonts w:ascii="Arial" w:hAnsi="Arial" w:cs="Arial"/>
@@ -6306,7 +7412,7 @@
                     </pic:cNvPicPr>
                   </pic:nvPicPr>
                   <pic:blipFill>
-                    <a:blip r:embed="rId20">
+                    <a:blip r:embed="rId21">
                       <a:extLst>
                         <a:ext uri="{28A0092B-C50C-407E-A947-70E740481C1C}">
                           <a14:useLocalDpi xmlns:a14="http://schemas.microsoft.com/office/drawing/2010/main" val="0"/>
@@ -6343,9 +7449,6 @@
           </wp:anchor>
         </w:drawing>
       </w:r>
-      <w:r>
-        <w:t>Ilustración 2.2: Diagrama de contexto del sistema</w:t>
-      </w:r>
     </w:p>
     <w:p>
       <w:pPr>
@@ -6528,6 +7631,7 @@
           <w:szCs w:val="24"/>
           <w:lang w:val="es-MX"/>
         </w:rPr>
+        <w:lastRenderedPageBreak/>
         <w:t>Autoridades del Centro de Salud de San Marcos:</w:t>
       </w:r>
       <w:r>
@@ -6537,17 +7641,7 @@
           <w:szCs w:val="24"/>
           <w:lang w:val="es-MX"/>
         </w:rPr>
-        <w:t xml:space="preserve"> encargadas de consultar la información consolidada de todos los municipios mediante la vista tipo </w:t>
-      </w:r>
-      <w:r>
-        <w:rPr>
-          <w:rFonts w:ascii="Arial" w:hAnsi="Arial" w:cs="Arial"/>
-          <w:sz w:val="24"/>
-          <w:szCs w:val="24"/>
-          <w:lang w:val="es-MX"/>
-        </w:rPr>
-        <w:lastRenderedPageBreak/>
-        <w:t>tabla y el tablero de control, con el fin de apoyar la toma de decisiones y la planificación de la distribución de vacunas.</w:t>
+        <w:t xml:space="preserve"> encargadas de consultar la información consolidada de todos los municipios mediante la vista tipo tabla y el tablero de control, con el fin de apoyar la toma de decisiones y la planificación de la distribución de vacunas.</w:t>
       </w:r>
     </w:p>
     <w:p>
@@ -6602,6 +7696,205 @@
       </w:pPr>
       <w:r>
         <w:rPr>
+          <w:noProof/>
+        </w:rPr>
+        <mc:AlternateContent>
+          <mc:Choice Requires="wps">
+            <w:drawing>
+              <wp:anchor distT="0" distB="0" distL="114300" distR="114300" simplePos="0" relativeHeight="251670528" behindDoc="0" locked="0" layoutInCell="1" allowOverlap="1" wp14:anchorId="4AF6B1F9" wp14:editId="4AAB93A1">
+                <wp:simplePos x="0" y="0"/>
+                <wp:positionH relativeFrom="column">
+                  <wp:posOffset>316865</wp:posOffset>
+                </wp:positionH>
+                <wp:positionV relativeFrom="paragraph">
+                  <wp:posOffset>710565</wp:posOffset>
+                </wp:positionV>
+                <wp:extent cx="5120640" cy="270510"/>
+                <wp:effectExtent l="0" t="0" r="3810" b="0"/>
+                <wp:wrapTopAndBottom/>
+                <wp:docPr id="6" name="Cuadro de texto 6"/>
+                <wp:cNvGraphicFramePr/>
+                <a:graphic xmlns:a="http://schemas.openxmlformats.org/drawingml/2006/main">
+                  <a:graphicData uri="http://schemas.microsoft.com/office/word/2010/wordprocessingShape">
+                    <wps:wsp>
+                      <wps:cNvSpPr txBox="1"/>
+                      <wps:spPr>
+                        <a:xfrm>
+                          <a:off x="0" y="0"/>
+                          <a:ext cx="5120640" cy="270510"/>
+                        </a:xfrm>
+                        <a:prstGeom prst="rect">
+                          <a:avLst/>
+                        </a:prstGeom>
+                        <a:solidFill>
+                          <a:prstClr val="white"/>
+                        </a:solidFill>
+                        <a:ln>
+                          <a:noFill/>
+                        </a:ln>
+                      </wps:spPr>
+                      <wps:txbx>
+                        <w:txbxContent>
+                          <w:p>
+                            <w:pPr>
+                              <w:pStyle w:val="Descripcin"/>
+                              <w:jc w:val="center"/>
+                              <w:rPr>
+                                <w:noProof/>
+                                <w:lang w:val="es-MX"/>
+                              </w:rPr>
+                            </w:pPr>
+                            <w:bookmarkStart w:id="46" w:name="_Toc236942483"/>
+                            <w:bookmarkStart w:id="47" w:name="_Toc236942821"/>
+                            <w:r>
+                              <w:t>Ilustración 2</w:t>
+                            </w:r>
+                            <w:r>
+                              <w:t>.</w:t>
+                            </w:r>
+                            <w:fldSimple w:instr=" SEQ Ilustración_ \* ARABIC ">
+                              <w:r>
+                                <w:rPr>
+                                  <w:noProof/>
+                                </w:rPr>
+                                <w:t>3</w:t>
+                              </w:r>
+                            </w:fldSimple>
+                            <w:r>
+                              <w:t xml:space="preserve"> </w:t>
+                            </w:r>
+                            <w:r>
+                              <w:t>Diagrama de flujo del sistema</w:t>
+                            </w:r>
+                            <w:bookmarkEnd w:id="47"/>
+                          </w:p>
+                          <w:p/>
+                          <w:p>
+                            <w:pPr>
+                              <w:pStyle w:val="Descripcin"/>
+                              <w:jc w:val="center"/>
+                              <w:rPr>
+                                <w:noProof/>
+                                <w:lang w:val="es-MX"/>
+                              </w:rPr>
+                            </w:pPr>
+                            <w:bookmarkStart w:id="48" w:name="_Toc236942822"/>
+                            <w:r>
+                              <w:t xml:space="preserve">Ilustración  </w:t>
+                            </w:r>
+                            <w:fldSimple w:instr=" SEQ Ilustración_ \* ARABIC ">
+                              <w:r>
+                                <w:rPr>
+                                  <w:noProof/>
+                                </w:rPr>
+                                <w:t>3</w:t>
+                              </w:r>
+                            </w:fldSimple>
+                            <w:r>
+                              <w:t xml:space="preserve"> </w:t>
+                            </w:r>
+                            <w:r>
+                              <w:t>Diagrama de flujo del sistema</w:t>
+                            </w:r>
+                            <w:bookmarkEnd w:id="46"/>
+                            <w:bookmarkEnd w:id="48"/>
+                          </w:p>
+                        </w:txbxContent>
+                      </wps:txbx>
+                      <wps:bodyPr rot="0" spcFirstLastPara="0" vertOverflow="overflow" horzOverflow="overflow" vert="horz" wrap="square" lIns="0" tIns="0" rIns="0" bIns="0" numCol="1" spcCol="0" rtlCol="0" fromWordArt="0" anchor="t" anchorCtr="0" forceAA="0" compatLnSpc="1">
+                        <a:prstTxWarp prst="textNoShape">
+                          <a:avLst/>
+                        </a:prstTxWarp>
+                        <a:noAutofit/>
+                      </wps:bodyPr>
+                    </wps:wsp>
+                  </a:graphicData>
+                </a:graphic>
+                <wp14:sizeRelV relativeFrom="margin">
+                  <wp14:pctHeight>0</wp14:pctHeight>
+                </wp14:sizeRelV>
+              </wp:anchor>
+            </w:drawing>
+          </mc:Choice>
+          <mc:Fallback>
+            <w:pict>
+              <v:shape w14:anchorId="4AF6B1F9" id="Cuadro de texto 6" o:spid="_x0000_s1028" type="#_x0000_t202" style="position:absolute;left:0;text-align:left;margin-left:24.95pt;margin-top:55.95pt;width:403.2pt;height:21.3pt;z-index:251670528;visibility:visible;mso-wrap-style:square;mso-height-percent:0;mso-wrap-distance-left:9pt;mso-wrap-distance-top:0;mso-wrap-distance-right:9pt;mso-wrap-distance-bottom:0;mso-position-horizontal:absolute;mso-position-horizontal-relative:text;mso-position-vertical:absolute;mso-position-vertical-relative:text;mso-height-percent:0;mso-height-relative:margin;v-text-anchor:top" o:gfxdata="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" stroked="f">
+                <v:textbox inset="0,0,0,0">
+                  <w:txbxContent>
+                    <w:p>
+                      <w:pPr>
+                        <w:pStyle w:val="Descripcin"/>
+                        <w:jc w:val="center"/>
+                        <w:rPr>
+                          <w:noProof/>
+                          <w:lang w:val="es-MX"/>
+                        </w:rPr>
+                      </w:pPr>
+                      <w:bookmarkStart w:id="49" w:name="_Toc236942483"/>
+                      <w:bookmarkStart w:id="50" w:name="_Toc236942821"/>
+                      <w:r>
+                        <w:t>Ilustración 2</w:t>
+                      </w:r>
+                      <w:r>
+                        <w:t>.</w:t>
+                      </w:r>
+                      <w:fldSimple w:instr=" SEQ Ilustración_ \* ARABIC ">
+                        <w:r>
+                          <w:rPr>
+                            <w:noProof/>
+                          </w:rPr>
+                          <w:t>3</w:t>
+                        </w:r>
+                      </w:fldSimple>
+                      <w:r>
+                        <w:t xml:space="preserve"> </w:t>
+                      </w:r>
+                      <w:r>
+                        <w:t>Diagrama de flujo del sistema</w:t>
+                      </w:r>
+                      <w:bookmarkEnd w:id="50"/>
+                    </w:p>
+                    <w:p/>
+                    <w:p>
+                      <w:pPr>
+                        <w:pStyle w:val="Descripcin"/>
+                        <w:jc w:val="center"/>
+                        <w:rPr>
+                          <w:noProof/>
+                          <w:lang w:val="es-MX"/>
+                        </w:rPr>
+                      </w:pPr>
+                      <w:bookmarkStart w:id="51" w:name="_Toc236942822"/>
+                      <w:r>
+                        <w:t xml:space="preserve">Ilustración  </w:t>
+                      </w:r>
+                      <w:fldSimple w:instr=" SEQ Ilustración_ \* ARABIC ">
+                        <w:r>
+                          <w:rPr>
+                            <w:noProof/>
+                          </w:rPr>
+                          <w:t>3</w:t>
+                        </w:r>
+                      </w:fldSimple>
+                      <w:r>
+                        <w:t xml:space="preserve"> </w:t>
+                      </w:r>
+                      <w:r>
+                        <w:t>Diagrama de flujo del sistema</w:t>
+                      </w:r>
+                      <w:bookmarkEnd w:id="49"/>
+                      <w:bookmarkEnd w:id="51"/>
+                    </w:p>
+                  </w:txbxContent>
+                </v:textbox>
+                <w10:wrap type="topAndBottom"/>
+              </v:shape>
+            </w:pict>
+          </mc:Fallback>
+        </mc:AlternateContent>
+      </w:r>
+      <w:r>
+        <w:rPr>
           <w:rFonts w:ascii="Arial" w:hAnsi="Arial" w:cs="Arial"/>
           <w:sz w:val="24"/>
           <w:szCs w:val="24"/>
@@ -6615,7 +7908,6 @@
         <w:pStyle w:val="Descripcin"/>
         <w:keepNext/>
         <w:spacing w:line="276" w:lineRule="auto"/>
-        <w:jc w:val="center"/>
       </w:pPr>
       <w:r>
         <w:rPr>
@@ -6648,7 +7940,7 @@
                     </pic:cNvPicPr>
                   </pic:nvPicPr>
                   <pic:blipFill>
-                    <a:blip r:embed="rId21" cstate="print">
+                    <a:blip r:embed="rId22" cstate="print">
                       <a:extLst>
                         <a:ext uri="{28A0092B-C50C-407E-A947-70E740481C1C}">
                           <a14:useLocalDpi xmlns:a14="http://schemas.microsoft.com/office/drawing/2010/main" val="0"/>
@@ -6685,9 +7977,6 @@
           </wp:anchor>
         </w:drawing>
       </w:r>
-      <w:r>
-        <w:t>Ilustración 2.3: Diagrama de flujo del sistema</w:t>
-      </w:r>
     </w:p>
     <w:p>
       <w:pPr>
@@ -6732,7 +8021,17 @@
           <w:szCs w:val="24"/>
           <w:lang w:val="es-MX"/>
         </w:rPr>
-        <w:t xml:space="preserve"> el usuario final ingresa sus credenciales de acceso; si estas son correctas, podrá acceder a los módulos del sistema según su rol (registro y actualización de vacunas para el personal de cada centro de salud, o consulta y visualización consolidada para las autoridades del Centro de Salud de San Marcos); si las credenciales son incorrectas, el sistema deberá mostrar un mensaje de error y permitir un nuevo intento. En caso de que el personal no cuente con credenciales, el administrador del sistema deberá realizar el registro correspondiente.</w:t>
+        <w:t xml:space="preserve"> el usuario final ingresa sus credenciales de acceso; si estas son correctas, podrá acceder a los módulos del sistema según su rol (registro y actualización de vacunas para el personal de cada centro de salud, o consulta y visualización consolidada para las autoridades del Centro de Salud de San Marcos); si las credenciales son incorrectas, el sistema </w:t>
+      </w:r>
+      <w:r>
+        <w:rPr>
+          <w:rFonts w:ascii="Arial" w:hAnsi="Arial" w:cs="Arial"/>
+          <w:sz w:val="24"/>
+          <w:szCs w:val="24"/>
+          <w:lang w:val="es-MX"/>
+        </w:rPr>
+        <w:lastRenderedPageBreak/>
+        <w:t>deberá mostrar un mensaje de error y permitir un nuevo intento. En caso de que el personal no cuente con credenciales, el administrador del sistema deberá realizar el registro correspondiente.</w:t>
       </w:r>
     </w:p>
     <w:p>
@@ -6757,7 +8056,6 @@
           <w:szCs w:val="24"/>
           <w:lang w:val="es-MX"/>
         </w:rPr>
-        <w:lastRenderedPageBreak/>
         <w:t>2.1.2 Descripción de módulos</w:t>
       </w:r>
     </w:p>
@@ -7174,6 +8472,7 @@
           <w:szCs w:val="24"/>
           <w:lang w:val="es-MX"/>
         </w:rPr>
+        <w:lastRenderedPageBreak/>
         <w:t xml:space="preserve">c. </w:t>
       </w:r>
       <w:r>
@@ -7252,7 +8551,6 @@
           <w:szCs w:val="24"/>
           <w:lang w:val="es-MX"/>
         </w:rPr>
-        <w:lastRenderedPageBreak/>
         <w:t>Bitácora de usuarios:</w:t>
       </w:r>
       <w:r>
@@ -7729,6 +9027,7 @@
           <w:szCs w:val="24"/>
           <w:lang w:val="es-MX"/>
         </w:rPr>
+        <w:lastRenderedPageBreak/>
         <w:t>Reporte consolidado departamental:</w:t>
       </w:r>
       <w:r>
@@ -7753,15 +9052,14 @@
         </w:tabs>
         <w:ind w:left="357" w:hanging="357"/>
       </w:pPr>
-      <w:bookmarkStart w:id="34" w:name="_Toc236848976"/>
-      <w:r>
-        <w:lastRenderedPageBreak/>
+      <w:bookmarkStart w:id="52" w:name="_Toc236848976"/>
+      <w:r>
         <w:t xml:space="preserve">  </w:t>
       </w:r>
       <w:r>
         <w:t>Método</w:t>
       </w:r>
-      <w:bookmarkEnd w:id="34"/>
+      <w:bookmarkEnd w:id="52"/>
     </w:p>
     <w:p>
       <w:pPr>
@@ -7778,39 +9076,7 @@
           <w:rFonts w:ascii="Arial" w:eastAsiaTheme="minorHAnsi" w:hAnsi="Arial" w:cs="Arial"/>
           <w:lang w:val="es-419" w:eastAsia="es-GT"/>
         </w:rPr>
-        <w:t xml:space="preserve">Para el desarrollo del proyecto se utilizará la metodología Scrum, debido a que permite organizar el trabajo en ciclos cortos e incrementales, conocidos como </w:t>
-      </w:r>
-      <w:proofErr w:type="spellStart"/>
-      <w:r>
-        <w:rPr>
-          <w:rFonts w:ascii="Arial" w:eastAsiaTheme="minorHAnsi" w:hAnsi="Arial" w:cs="Arial"/>
-          <w:lang w:val="es-419" w:eastAsia="es-GT"/>
-        </w:rPr>
-        <w:t>sprints</w:t>
-      </w:r>
-      <w:proofErr w:type="spellEnd"/>
-      <w:r>
-        <w:rPr>
-          <w:rFonts w:ascii="Arial" w:eastAsiaTheme="minorHAnsi" w:hAnsi="Arial" w:cs="Arial"/>
-          <w:lang w:val="es-419" w:eastAsia="es-GT"/>
-        </w:rPr>
-        <w:t xml:space="preserve">. Según </w:t>
-      </w:r>
-      <w:proofErr w:type="spellStart"/>
-      <w:r>
-        <w:rPr>
-          <w:rFonts w:ascii="Arial" w:eastAsiaTheme="minorHAnsi" w:hAnsi="Arial" w:cs="Arial"/>
-          <w:lang w:val="es-419" w:eastAsia="es-GT"/>
-        </w:rPr>
-        <w:t>Schwaber</w:t>
-      </w:r>
-      <w:proofErr w:type="spellEnd"/>
-      <w:r>
-        <w:rPr>
-          <w:rFonts w:ascii="Arial" w:eastAsiaTheme="minorHAnsi" w:hAnsi="Arial" w:cs="Arial"/>
-          <w:lang w:val="es-419" w:eastAsia="es-GT"/>
-        </w:rPr>
-        <w:t xml:space="preserve"> y Sutherland (2020), autores de la Guía de Scrum, este es un marco de trabajo ligero que ayuda a las personas, equipos y organizaciones a generar valor mediante soluciones adaptables para problemas complejos, a través de dichos ciclos cortos e iterativos. Esta metodología resulta adecuada para proyectos de software en los que se requiere flexibilidad, revisión constante y adaptación a cambios durante el proceso de desarrollo. La elección de Scrum responde a la naturaleza del proyecto, ya que el desarrollo de una aplicación web para centros de salud requiere validaciones frecuentes, definición progresiva de funcionalidades y revisión constante de los módulos implementados. Esto favorece la reducción de errores, mejora la comunicación del equipo y permite entregar incrementos funcionales durante el desarrollo.</w:t>
+        <w:t>Para el desarrollo del proyecto se utilizará la metodología Scrum, debido a que permite organizar el trabajo en ciclos cortos e incrementales, conocidos como sprints. Según Schwaber y Sutherland (2020), autores de la Guía de Scrum, este es un marco de trabajo ligero que ayuda a las personas, equipos y organizaciones a generar valor mediante soluciones adaptables para problemas complejos, a través de dichos ciclos cortos e iterativos. Esta metodología resulta adecuada para proyectos de software en los que se requiere flexibilidad, revisión constante y adaptación a cambios durante el proceso de desarrollo. La elección de Scrum responde a la naturaleza del proyecto, ya que el desarrollo de una aplicación web para centros de salud requiere validaciones frecuentes, definición progresiva de funcionalidades y revisión constante de los módulos implementados. Esto favorece la reducción de errores, mejora la comunicación del equipo y permite entregar incrementos funcionales durante el desarrollo.</w:t>
       </w:r>
     </w:p>
     <w:p>
@@ -7828,55 +9094,7 @@
           <w:rFonts w:ascii="Arial" w:eastAsiaTheme="minorHAnsi" w:hAnsi="Arial" w:cs="Arial"/>
           <w:lang w:val="es-419" w:eastAsia="es-GT"/>
         </w:rPr>
-        <w:t xml:space="preserve">El rol de </w:t>
-      </w:r>
-      <w:proofErr w:type="spellStart"/>
-      <w:r>
-        <w:rPr>
-          <w:rFonts w:ascii="Arial" w:eastAsiaTheme="minorHAnsi" w:hAnsi="Arial" w:cs="Arial"/>
-          <w:lang w:val="es-419" w:eastAsia="es-GT"/>
-        </w:rPr>
-        <w:t>Product</w:t>
-      </w:r>
-      <w:proofErr w:type="spellEnd"/>
-      <w:r>
-        <w:rPr>
-          <w:rFonts w:ascii="Arial" w:eastAsiaTheme="minorHAnsi" w:hAnsi="Arial" w:cs="Arial"/>
-          <w:lang w:val="es-419" w:eastAsia="es-GT"/>
-        </w:rPr>
-        <w:t xml:space="preserve"> </w:t>
-      </w:r>
-      <w:proofErr w:type="spellStart"/>
-      <w:r>
-        <w:rPr>
-          <w:rFonts w:ascii="Arial" w:eastAsiaTheme="minorHAnsi" w:hAnsi="Arial" w:cs="Arial"/>
-          <w:lang w:val="es-419" w:eastAsia="es-GT"/>
-        </w:rPr>
-        <w:t>Owner</w:t>
-      </w:r>
-      <w:proofErr w:type="spellEnd"/>
-      <w:r>
-        <w:rPr>
-          <w:rFonts w:ascii="Arial" w:eastAsiaTheme="minorHAnsi" w:hAnsi="Arial" w:cs="Arial"/>
-          <w:lang w:val="es-419" w:eastAsia="es-GT"/>
-        </w:rPr>
-        <w:t xml:space="preserve"> será representado por el integrante encargado de priorizar los requerimientos del sistema, considerando las necesidades del centro de salud y los objetivos del proyecto. El Scrum Master será el responsable de coordinar el cumplimiento de la metodología, organizar las reuniones y apoyar al equipo en la eliminación de obstáculos. Los </w:t>
-      </w:r>
-      <w:proofErr w:type="spellStart"/>
-      <w:r>
-        <w:rPr>
-          <w:rFonts w:ascii="Arial" w:eastAsiaTheme="minorHAnsi" w:hAnsi="Arial" w:cs="Arial"/>
-          <w:lang w:val="es-419" w:eastAsia="es-GT"/>
-        </w:rPr>
-        <w:t>Developers</w:t>
-      </w:r>
-      <w:proofErr w:type="spellEnd"/>
-      <w:r>
-        <w:rPr>
-          <w:rFonts w:ascii="Arial" w:eastAsiaTheme="minorHAnsi" w:hAnsi="Arial" w:cs="Arial"/>
-          <w:lang w:val="es-419" w:eastAsia="es-GT"/>
-        </w:rPr>
-        <w:t xml:space="preserve"> serán los integrantes encargados del análisis, diseño, programación, pruebas y documentación del sistema.</w:t>
+        <w:t>El rol de Product Owner será representado por el integrante encargado de priorizar los requerimientos del sistema, considerando las necesidades del centro de salud y los objetivos del proyecto. El Scrum Master será el responsable de coordinar el cumplimiento de la metodología, organizar las reuniones y apoyar al equipo en la eliminación de obstáculos. Los Developers serán los integrantes encargados del análisis, diseño, programación, pruebas y documentación del sistema.</w:t>
       </w:r>
     </w:p>
     <w:p>
@@ -7894,39 +9112,7 @@
           <w:rFonts w:ascii="Arial" w:eastAsiaTheme="minorHAnsi" w:hAnsi="Arial" w:cs="Arial"/>
           <w:lang w:val="es-419" w:eastAsia="es-GT"/>
         </w:rPr>
-        <w:t xml:space="preserve">Las principales herramientas de Scrum que se utilizarán en el proyecto serán el </w:t>
-      </w:r>
-      <w:proofErr w:type="spellStart"/>
-      <w:r>
-        <w:rPr>
-          <w:rFonts w:ascii="Arial" w:eastAsiaTheme="minorHAnsi" w:hAnsi="Arial" w:cs="Arial"/>
-          <w:lang w:val="es-419" w:eastAsia="es-GT"/>
-        </w:rPr>
-        <w:t>Product</w:t>
-      </w:r>
-      <w:proofErr w:type="spellEnd"/>
-      <w:r>
-        <w:rPr>
-          <w:rFonts w:ascii="Arial" w:eastAsiaTheme="minorHAnsi" w:hAnsi="Arial" w:cs="Arial"/>
-          <w:lang w:val="es-419" w:eastAsia="es-GT"/>
-        </w:rPr>
-        <w:t xml:space="preserve"> Backlog, el Sprint Backlog y el Incremento. El </w:t>
-      </w:r>
-      <w:proofErr w:type="spellStart"/>
-      <w:r>
-        <w:rPr>
-          <w:rFonts w:ascii="Arial" w:eastAsiaTheme="minorHAnsi" w:hAnsi="Arial" w:cs="Arial"/>
-          <w:lang w:val="es-419" w:eastAsia="es-GT"/>
-        </w:rPr>
-        <w:t>Product</w:t>
-      </w:r>
-      <w:proofErr w:type="spellEnd"/>
-      <w:r>
-        <w:rPr>
-          <w:rFonts w:ascii="Arial" w:eastAsiaTheme="minorHAnsi" w:hAnsi="Arial" w:cs="Arial"/>
-          <w:lang w:val="es-419" w:eastAsia="es-GT"/>
-        </w:rPr>
-        <w:t xml:space="preserve"> Backlog contendrá la lista priorizada de funcionalidades del sistema, tales como autenticación de usuarios, registro de vacunas, </w:t>
+        <w:t xml:space="preserve">Las principales herramientas de Scrum que se utilizarán en el proyecto serán el Product Backlog, el Sprint Backlog y el Incremento. El Product Backlog contendrá la lista priorizada de funcionalidades del sistema, tales como autenticación de usuarios, registro de vacunas, </w:t>
       </w:r>
       <w:r>
         <w:rPr>
@@ -7972,39 +9158,7 @@
           <w:rFonts w:ascii="Arial" w:eastAsiaTheme="minorHAnsi" w:hAnsi="Arial" w:cs="Arial"/>
           <w:lang w:val="es-419" w:eastAsia="es-GT"/>
         </w:rPr>
-        <w:t xml:space="preserve">Esta metodología se desarrollará a lo largo de cuatro </w:t>
-      </w:r>
-      <w:proofErr w:type="spellStart"/>
-      <w:r>
-        <w:rPr>
-          <w:rFonts w:ascii="Arial" w:eastAsiaTheme="minorHAnsi" w:hAnsi="Arial" w:cs="Arial"/>
-          <w:lang w:val="es-419" w:eastAsia="es-GT"/>
-        </w:rPr>
-        <w:t>Sprints</w:t>
-      </w:r>
-      <w:proofErr w:type="spellEnd"/>
-      <w:r>
-        <w:rPr>
-          <w:rFonts w:ascii="Arial" w:eastAsiaTheme="minorHAnsi" w:hAnsi="Arial" w:cs="Arial"/>
-          <w:lang w:val="es-419" w:eastAsia="es-GT"/>
-        </w:rPr>
-        <w:t xml:space="preserve"> adaptadas al contexto del proyecto, manteniendo relación directa con los objetivos específicos establecidos en el capítulo uno, verificando que se cumpla cada uno de ellos. Estos </w:t>
-      </w:r>
-      <w:proofErr w:type="spellStart"/>
-      <w:r>
-        <w:rPr>
-          <w:rFonts w:ascii="Arial" w:eastAsiaTheme="minorHAnsi" w:hAnsi="Arial" w:cs="Arial"/>
-          <w:lang w:val="es-419" w:eastAsia="es-GT"/>
-        </w:rPr>
-        <w:t>Sprints</w:t>
-      </w:r>
-      <w:proofErr w:type="spellEnd"/>
-      <w:r>
-        <w:rPr>
-          <w:rFonts w:ascii="Arial" w:eastAsiaTheme="minorHAnsi" w:hAnsi="Arial" w:cs="Arial"/>
-          <w:lang w:val="es-419" w:eastAsia="es-GT"/>
-        </w:rPr>
-        <w:t xml:space="preserve"> permitirán organizar el desarrollo de la aplicación web desde el levantamiento de requerimientos hasta la validación del sistema con usuarios.</w:t>
+        <w:t>Esta metodología se desarrollará a lo largo de cuatro Sprints adaptadas al contexto del proyecto, manteniendo relación directa con los objetivos específicos establecidos en el capítulo uno, verificando que se cumpla cada uno de ellos. Estos Sprints permitirán organizar el desarrollo de la aplicación web desde el levantamiento de requerimientos hasta la validación del sistema con usuarios.</w:t>
       </w:r>
     </w:p>
     <w:p>
@@ -8012,15 +9166,208 @@
         <w:pStyle w:val="Descripcin"/>
         <w:keepNext/>
         <w:spacing w:line="276" w:lineRule="auto"/>
-        <w:jc w:val="center"/>
       </w:pPr>
       <w:r>
         <w:rPr>
           <w:noProof/>
         </w:rPr>
         <w:lastRenderedPageBreak/>
+        <mc:AlternateContent>
+          <mc:Choice Requires="wps">
+            <w:drawing>
+              <wp:anchor distT="0" distB="0" distL="114300" distR="114300" simplePos="0" relativeHeight="251672576" behindDoc="0" locked="0" layoutInCell="1" allowOverlap="1" wp14:anchorId="409FBDCE" wp14:editId="56721984">
+                <wp:simplePos x="0" y="0"/>
+                <wp:positionH relativeFrom="column">
+                  <wp:posOffset>704850</wp:posOffset>
+                </wp:positionH>
+                <wp:positionV relativeFrom="paragraph">
+                  <wp:posOffset>3175</wp:posOffset>
+                </wp:positionV>
+                <wp:extent cx="4191000" cy="304800"/>
+                <wp:effectExtent l="0" t="0" r="0" b="0"/>
+                <wp:wrapTopAndBottom/>
+                <wp:docPr id="10" name="Cuadro de texto 10"/>
+                <wp:cNvGraphicFramePr/>
+                <a:graphic xmlns:a="http://schemas.openxmlformats.org/drawingml/2006/main">
+                  <a:graphicData uri="http://schemas.microsoft.com/office/word/2010/wordprocessingShape">
+                    <wps:wsp>
+                      <wps:cNvSpPr txBox="1"/>
+                      <wps:spPr>
+                        <a:xfrm>
+                          <a:off x="0" y="0"/>
+                          <a:ext cx="4191000" cy="304800"/>
+                        </a:xfrm>
+                        <a:prstGeom prst="rect">
+                          <a:avLst/>
+                        </a:prstGeom>
+                        <a:solidFill>
+                          <a:prstClr val="white"/>
+                        </a:solidFill>
+                        <a:ln>
+                          <a:noFill/>
+                        </a:ln>
+                      </wps:spPr>
+                      <wps:txbx>
+                        <w:txbxContent>
+                          <w:p>
+                            <w:pPr>
+                              <w:pStyle w:val="Descripcin"/>
+                              <w:jc w:val="center"/>
+                              <w:rPr>
+                                <w:noProof/>
+                              </w:rPr>
+                            </w:pPr>
+                            <w:bookmarkStart w:id="53" w:name="_Toc236943127"/>
+                            <w:r>
+                              <w:t xml:space="preserve">Imágen </w:t>
+                            </w:r>
+                            <w:r>
+                              <w:t>2.</w:t>
+                            </w:r>
+                            <w:fldSimple w:instr=" SEQ Imágen \* ARABIC ">
+                              <w:r>
+                                <w:rPr>
+                                  <w:noProof/>
+                                </w:rPr>
+                                <w:t>1</w:t>
+                              </w:r>
+                            </w:fldSimple>
+                            <w:r>
+                              <w:t xml:space="preserve"> </w:t>
+                            </w:r>
+                            <w:r>
+                              <w:t>Metodología Scrum</w:t>
+                            </w:r>
+                            <w:bookmarkEnd w:id="53"/>
+                          </w:p>
+                          <w:p/>
+                          <w:p>
+                            <w:pPr>
+                              <w:pStyle w:val="Descripcin"/>
+                              <w:jc w:val="center"/>
+                              <w:rPr>
+                                <w:noProof/>
+                              </w:rPr>
+                            </w:pPr>
+                            <w:bookmarkStart w:id="54" w:name="_Toc236943128"/>
+                            <w:r>
+                              <w:t xml:space="preserve">Imágen </w:t>
+                            </w:r>
+                            <w:fldSimple w:instr=" SEQ Imágen \* ARABIC ">
+                              <w:r>
+                                <w:rPr>
+                                  <w:noProof/>
+                                </w:rPr>
+                                <w:t>1</w:t>
+                              </w:r>
+                            </w:fldSimple>
+                            <w:r>
+                              <w:t xml:space="preserve"> </w:t>
+                            </w:r>
+                            <w:r>
+                              <w:t>Metodología Scrum</w:t>
+                            </w:r>
+                            <w:bookmarkEnd w:id="54"/>
+                          </w:p>
+                        </w:txbxContent>
+                      </wps:txbx>
+                      <wps:bodyPr rot="0" spcFirstLastPara="0" vertOverflow="overflow" horzOverflow="overflow" vert="horz" wrap="square" lIns="0" tIns="0" rIns="0" bIns="0" numCol="1" spcCol="0" rtlCol="0" fromWordArt="0" anchor="t" anchorCtr="0" forceAA="0" compatLnSpc="1">
+                        <a:prstTxWarp prst="textNoShape">
+                          <a:avLst/>
+                        </a:prstTxWarp>
+                        <a:noAutofit/>
+                      </wps:bodyPr>
+                    </wps:wsp>
+                  </a:graphicData>
+                </a:graphic>
+                <wp14:sizeRelH relativeFrom="margin">
+                  <wp14:pctWidth>0</wp14:pctWidth>
+                </wp14:sizeRelH>
+                <wp14:sizeRelV relativeFrom="margin">
+                  <wp14:pctHeight>0</wp14:pctHeight>
+                </wp14:sizeRelV>
+              </wp:anchor>
+            </w:drawing>
+          </mc:Choice>
+          <mc:Fallback>
+            <w:pict>
+              <v:shape w14:anchorId="409FBDCE" id="Cuadro de texto 10" o:spid="_x0000_s1029" type="#_x0000_t202" style="position:absolute;margin-left:55.5pt;margin-top:.25pt;width:330pt;height:24pt;z-index:251672576;visibility:visible;mso-wrap-style:square;mso-width-percent:0;mso-height-percent:0;mso-wrap-distance-left:9pt;mso-wrap-distance-top:0;mso-wrap-distance-right:9pt;mso-wrap-distance-bottom:0;mso-position-horizontal:absolute;mso-position-horizontal-relative:text;mso-position-vertical:absolute;mso-position-vertical-relative:text;mso-width-percent:0;mso-height-percent:0;mso-width-relative:margin;mso-height-relative:margin;v-text-anchor:top" o:gfxdata="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" stroked="f">
+                <v:textbox inset="0,0,0,0">
+                  <w:txbxContent>
+                    <w:p>
+                      <w:pPr>
+                        <w:pStyle w:val="Descripcin"/>
+                        <w:jc w:val="center"/>
+                        <w:rPr>
+                          <w:noProof/>
+                        </w:rPr>
+                      </w:pPr>
+                      <w:bookmarkStart w:id="55" w:name="_Toc236943127"/>
+                      <w:r>
+                        <w:t xml:space="preserve">Imágen </w:t>
+                      </w:r>
+                      <w:r>
+                        <w:t>2.</w:t>
+                      </w:r>
+                      <w:fldSimple w:instr=" SEQ Imágen \* ARABIC ">
+                        <w:r>
+                          <w:rPr>
+                            <w:noProof/>
+                          </w:rPr>
+                          <w:t>1</w:t>
+                        </w:r>
+                      </w:fldSimple>
+                      <w:r>
+                        <w:t xml:space="preserve"> </w:t>
+                      </w:r>
+                      <w:r>
+                        <w:t>Metodología Scrum</w:t>
+                      </w:r>
+                      <w:bookmarkEnd w:id="55"/>
+                    </w:p>
+                    <w:p/>
+                    <w:p>
+                      <w:pPr>
+                        <w:pStyle w:val="Descripcin"/>
+                        <w:jc w:val="center"/>
+                        <w:rPr>
+                          <w:noProof/>
+                        </w:rPr>
+                      </w:pPr>
+                      <w:bookmarkStart w:id="56" w:name="_Toc236943128"/>
+                      <w:r>
+                        <w:t xml:space="preserve">Imágen </w:t>
+                      </w:r>
+                      <w:fldSimple w:instr=" SEQ Imágen \* ARABIC ">
+                        <w:r>
+                          <w:rPr>
+                            <w:noProof/>
+                          </w:rPr>
+                          <w:t>1</w:t>
+                        </w:r>
+                      </w:fldSimple>
+                      <w:r>
+                        <w:t xml:space="preserve"> </w:t>
+                      </w:r>
+                      <w:r>
+                        <w:t>Metodología Scrum</w:t>
+                      </w:r>
+                      <w:bookmarkEnd w:id="56"/>
+                    </w:p>
+                  </w:txbxContent>
+                </v:textbox>
+                <w10:wrap type="topAndBottom"/>
+              </v:shape>
+            </w:pict>
+          </mc:Fallback>
+        </mc:AlternateContent>
+      </w:r>
+      <w:r>
+        <w:rPr>
+          <w:noProof/>
+        </w:rPr>
         <w:drawing>
-          <wp:anchor distT="0" distB="0" distL="114300" distR="114300" simplePos="0" relativeHeight="251660288" behindDoc="0" locked="0" layoutInCell="1" allowOverlap="1" wp14:anchorId="5BA32D1D" wp14:editId="64E40909">
+          <wp:anchor distT="0" distB="0" distL="114300" distR="114300" simplePos="0" relativeHeight="251660288" behindDoc="0" locked="0" layoutInCell="1" allowOverlap="1" wp14:anchorId="5BA32D1D" wp14:editId="33705CEF">
             <wp:simplePos x="0" y="0"/>
             <wp:positionH relativeFrom="margin">
               <wp:align>center</wp:align>
@@ -8045,7 +9392,7 @@
                     </pic:cNvPicPr>
                   </pic:nvPicPr>
                   <pic:blipFill>
-                    <a:blip r:embed="rId22">
+                    <a:blip r:embed="rId23">
                       <a:extLst>
                         <a:ext uri="{28A0092B-C50C-407E-A947-70E740481C1C}">
                           <a14:useLocalDpi xmlns:a14="http://schemas.microsoft.com/office/drawing/2010/main" val="0"/>
@@ -8082,25 +9429,6 @@
           </wp:anchor>
         </w:drawing>
       </w:r>
-      <w:r>
-        <w:t>Imagen</w:t>
-      </w:r>
-      <w:r>
-        <w:t xml:space="preserve"> 2.2</w:t>
-      </w:r>
-      <w:r>
-        <w:t xml:space="preserve"> </w:t>
-      </w:r>
-      <w:r>
-        <w:t>Metodología Scrum</w:t>
-      </w:r>
-    </w:p>
-    <w:p>
-      <w:pPr>
-        <w:keepNext/>
-        <w:spacing w:after="0" w:line="276" w:lineRule="auto"/>
-        <w:jc w:val="center"/>
-      </w:pPr>
     </w:p>
     <w:p>
       <w:pPr>
@@ -8129,19 +9457,11 @@
         </w:numPr>
         <w:spacing w:before="240" w:after="0" w:line="276" w:lineRule="auto"/>
       </w:pPr>
-      <w:bookmarkStart w:id="35" w:name="_Toc236848977"/>
-      <w:r>
-        <w:t xml:space="preserve">Sprint 1: levantamiento de requerimientos y definición del </w:t>
-      </w:r>
-      <w:proofErr w:type="spellStart"/>
-      <w:r>
-        <w:t>Product</w:t>
-      </w:r>
-      <w:proofErr w:type="spellEnd"/>
-      <w:r>
-        <w:t xml:space="preserve"> Backlog</w:t>
-      </w:r>
-      <w:bookmarkEnd w:id="35"/>
+      <w:bookmarkStart w:id="57" w:name="_Toc236848977"/>
+      <w:r>
+        <w:t>Sprint 1: levantamiento de requerimientos y definición del Product Backlog</w:t>
+      </w:r>
+      <w:bookmarkEnd w:id="57"/>
     </w:p>
     <w:p>
       <w:pPr>
@@ -8221,6 +9541,28 @@
     </w:p>
     <w:p>
       <w:pPr>
+        <w:spacing w:before="240" w:line="276" w:lineRule="auto"/>
+        <w:jc w:val="both"/>
+        <w:rPr>
+          <w:rFonts w:ascii="Arial" w:hAnsi="Arial" w:cs="Arial"/>
+          <w:sz w:val="24"/>
+          <w:szCs w:val="24"/>
+        </w:rPr>
+      </w:pPr>
+    </w:p>
+    <w:p>
+      <w:pPr>
+        <w:spacing w:before="240" w:line="276" w:lineRule="auto"/>
+        <w:jc w:val="both"/>
+        <w:rPr>
+          <w:rFonts w:ascii="Arial" w:hAnsi="Arial" w:cs="Arial"/>
+          <w:sz w:val="24"/>
+          <w:szCs w:val="24"/>
+        </w:rPr>
+      </w:pPr>
+    </w:p>
+    <w:p>
+      <w:pPr>
         <w:pStyle w:val="Ttulo3"/>
         <w:numPr>
           <w:ilvl w:val="0"/>
@@ -8228,11 +9570,12 @@
         </w:numPr>
         <w:spacing w:before="240" w:after="0" w:line="276" w:lineRule="auto"/>
       </w:pPr>
-      <w:bookmarkStart w:id="36" w:name="_Toc236848978"/>
-      <w:r>
+      <w:bookmarkStart w:id="58" w:name="_Toc236848978"/>
+      <w:r>
+        <w:lastRenderedPageBreak/>
         <w:t>Sprint 2: diseño funcional y diseño de la estructura del sistema</w:t>
       </w:r>
-      <w:bookmarkEnd w:id="36"/>
+      <w:bookmarkEnd w:id="58"/>
     </w:p>
     <w:p>
       <w:pPr>
@@ -8267,16 +9610,7 @@
           <w:sz w:val="24"/>
           <w:szCs w:val="24"/>
         </w:rPr>
-        <w:t xml:space="preserve"> se elaborará el diseño funcional de la aplicación web, incluyendo la estructura general del sistema, el modelo de datos, los módulos </w:t>
-      </w:r>
-      <w:r>
-        <w:rPr>
-          <w:rFonts w:ascii="Arial" w:hAnsi="Arial" w:cs="Arial"/>
-          <w:sz w:val="24"/>
-          <w:szCs w:val="24"/>
-        </w:rPr>
-        <w:lastRenderedPageBreak/>
-        <w:t>principales y el flujo de información. También se definirá el formato estandarizado para el registro de vacunas, considerando campos como municipio, centro de salud, tipo de vacuna, disponibilidad, población objetivo, cantidad, entre otros.</w:t>
+        <w:t xml:space="preserve"> se elaborará el diseño funcional de la aplicación web, incluyendo la estructura general del sistema, el modelo de datos, los módulos principales y el flujo de información. También se definirá el formato estandarizado para el registro de vacunas, considerando campos como municipio, centro de salud, tipo de vacuna, disponibilidad, población objetivo, cantidad, entre otros.</w:t>
       </w:r>
     </w:p>
     <w:p>
@@ -8323,11 +9657,11 @@
         </w:numPr>
         <w:spacing w:before="240" w:after="0" w:line="276" w:lineRule="auto"/>
       </w:pPr>
-      <w:bookmarkStart w:id="37" w:name="_Toc236848979"/>
+      <w:bookmarkStart w:id="59" w:name="_Toc236848979"/>
       <w:r>
         <w:t>Sprint 3: desarrollo del sistema</w:t>
       </w:r>
-      <w:bookmarkEnd w:id="37"/>
+      <w:bookmarkEnd w:id="59"/>
     </w:p>
     <w:p>
       <w:pPr>
@@ -8422,25 +9756,16 @@
           <w:sz w:val="24"/>
           <w:szCs w:val="24"/>
         </w:rPr>
-        <w:t xml:space="preserve">Herramientas a utilizar: entorno de desarrollo integrado para escribir y organizar el código del sistema, lenguaje de programación web para crear las funciones principales de la aplicación, </w:t>
-      </w:r>
-      <w:proofErr w:type="spellStart"/>
-      <w:r>
-        <w:rPr>
-          <w:rFonts w:ascii="Arial" w:hAnsi="Arial" w:cs="Arial"/>
-          <w:sz w:val="24"/>
-          <w:szCs w:val="24"/>
-        </w:rPr>
-        <w:t>framework</w:t>
-      </w:r>
-      <w:proofErr w:type="spellEnd"/>
-      <w:r>
-        <w:rPr>
-          <w:rFonts w:ascii="Arial" w:hAnsi="Arial" w:cs="Arial"/>
-          <w:sz w:val="24"/>
-          <w:szCs w:val="24"/>
-        </w:rPr>
-        <w:t xml:space="preserve"> de desarrollo para facilitar la estructura del proyecto, gestor de base de datos para almacenar la información de usuarios, vacunas, centros de salud, tipos de vacuna y población objetivo, sistema de control de versiones para guardar los cambios realizados y llevar un mejor control del avance durante el desarrollo, y pruebas funcionales para verificar que el ingreso de datos, la asociación con centros de salud, </w:t>
+        <w:t xml:space="preserve">Herramientas a utilizar: entorno de desarrollo integrado para escribir y organizar el código del sistema, lenguaje de programación web para crear las funciones principales de la aplicación, framework de desarrollo para facilitar la estructura del proyecto, gestor de base de datos para almacenar la información de usuarios, vacunas, centros de salud, tipos de vacuna y población objetivo, sistema de control de versiones para guardar los cambios realizados y llevar un mejor control del avance durante el desarrollo, y </w:t>
+      </w:r>
+      <w:r>
+        <w:rPr>
+          <w:rFonts w:ascii="Arial" w:hAnsi="Arial" w:cs="Arial"/>
+          <w:sz w:val="24"/>
+          <w:szCs w:val="24"/>
+        </w:rPr>
+        <w:lastRenderedPageBreak/>
+        <w:t xml:space="preserve">pruebas funcionales para verificar que el ingreso de datos, la asociación con centros de salud, </w:t>
       </w:r>
       <w:r>
         <w:rPr>
@@ -8468,12 +9793,11 @@
         </w:numPr>
         <w:spacing w:before="240" w:after="0" w:line="276" w:lineRule="auto"/>
       </w:pPr>
-      <w:bookmarkStart w:id="38" w:name="_Toc236848980"/>
-      <w:r>
-        <w:lastRenderedPageBreak/>
+      <w:bookmarkStart w:id="60" w:name="_Toc236848980"/>
+      <w:r>
         <w:t>Sprint 4: elaboración de manuales, pruebas, validación y ajustes finales</w:t>
       </w:r>
-      <w:bookmarkEnd w:id="38"/>
+      <w:bookmarkEnd w:id="60"/>
     </w:p>
     <w:p>
       <w:pPr>
@@ -8580,14 +9904,14 @@
         </w:numPr>
         <w:spacing w:before="240"/>
       </w:pPr>
-      <w:bookmarkStart w:id="39" w:name="_Toc236848981"/>
+      <w:bookmarkStart w:id="61" w:name="_Toc236848981"/>
       <w:r>
         <w:t xml:space="preserve"> </w:t>
       </w:r>
       <w:r>
         <w:t>Análisis de viabilidad</w:t>
       </w:r>
-      <w:bookmarkEnd w:id="39"/>
+      <w:bookmarkEnd w:id="61"/>
     </w:p>
     <w:p>
       <w:pPr>
@@ -8634,11 +9958,11 @@
         </w:numPr>
         <w:spacing w:before="240" w:after="0" w:line="276" w:lineRule="auto"/>
       </w:pPr>
-      <w:bookmarkStart w:id="40" w:name="_Toc236848982"/>
+      <w:bookmarkStart w:id="62" w:name="_Toc236848982"/>
       <w:r>
         <w:t>Factibilidad técnica</w:t>
       </w:r>
-      <w:bookmarkEnd w:id="40"/>
+      <w:bookmarkEnd w:id="62"/>
     </w:p>
     <w:p>
       <w:pPr>
@@ -8717,16 +10041,8 @@
           <w:sz w:val="24"/>
           <w:szCs w:val="24"/>
         </w:rPr>
-        <w:t xml:space="preserve">Asimismo, la aplicación puede desarrollarse mediante tecnologías actuales para la creación de interfaces web, gestión de datos y conexión con servidores. El sistema no requiere dispositivos especializados, ya que los usuarios podrán acceder </w:t>
-      </w:r>
-      <w:r>
-        <w:rPr>
-          <w:rFonts w:ascii="Arial" w:hAnsi="Arial" w:cs="Arial"/>
-          <w:sz w:val="24"/>
-          <w:szCs w:val="24"/>
-        </w:rPr>
         <w:lastRenderedPageBreak/>
-        <w:t>desde computadoras con conexión a internet,</w:t>
+        <w:t>Asimismo, la aplicación puede desarrollarse mediante tecnologías actuales para la creación de interfaces web, gestión de datos y conexión con servidores. El sistema no requiere dispositivos especializados, ya que los usuarios podrán acceder desde computadoras con conexión a internet,</w:t>
       </w:r>
       <w:r>
         <w:rPr>
@@ -8838,11 +10154,11 @@
         </w:numPr>
         <w:spacing w:after="0" w:line="276" w:lineRule="auto"/>
       </w:pPr>
-      <w:bookmarkStart w:id="41" w:name="_Toc236848983"/>
+      <w:bookmarkStart w:id="63" w:name="_Toc236848983"/>
       <w:r>
         <w:t>Factibilidad operativa</w:t>
       </w:r>
-      <w:bookmarkEnd w:id="41"/>
+      <w:bookmarkEnd w:id="63"/>
     </w:p>
     <w:p>
       <w:pPr>
@@ -8921,7 +10237,7 @@
           <w:sz w:val="24"/>
           <w:szCs w:val="24"/>
         </w:rPr>
-        <w:t xml:space="preserve">Además, la centralización de los datos facilitará el trabajo de las autoridades de salud, quienes podrán consultar información consolidada sin depender de reportes dispersos y desactualizados enviados por cada municipio. Esto permitirá mejorar la organización interna, la planificación y la toma de decisiones relacionadas </w:t>
+        <w:t xml:space="preserve">Además, la centralización de los datos facilitará el trabajo de las autoridades de salud, quienes podrán consultar información consolidada sin depender de </w:t>
       </w:r>
       <w:r>
         <w:rPr>
@@ -8930,7 +10246,7 @@
           <w:szCs w:val="24"/>
         </w:rPr>
         <w:lastRenderedPageBreak/>
-        <w:t>con la distribución de vacunas. También ayudará a tener una visión más completa del estado de disponibilidad de vacunas en los distintos centros de salud.</w:t>
+        <w:t>reportes dispersos y desactualizados enviados por cada municipio. Esto permitirá mejorar la organización interna, la planificación y la toma de decisiones relacionadas con la distribución de vacunas. También ayudará a tener una visión más completa del estado de disponibilidad de vacunas en los distintos centros de salud.</w:t>
       </w:r>
     </w:p>
     <w:p>
@@ -8982,11 +10298,11 @@
         </w:numPr>
         <w:spacing w:after="0" w:line="276" w:lineRule="auto"/>
       </w:pPr>
-      <w:bookmarkStart w:id="42" w:name="_Toc236848984"/>
+      <w:bookmarkStart w:id="64" w:name="_Toc236848984"/>
       <w:r>
         <w:t>Factibilidad económica</w:t>
       </w:r>
-      <w:bookmarkEnd w:id="42"/>
+      <w:bookmarkEnd w:id="64"/>
     </w:p>
     <w:p>
       <w:pPr>
@@ -9117,12 +10433,12 @@
         </w:numPr>
         <w:spacing w:after="0" w:line="276" w:lineRule="auto"/>
       </w:pPr>
-      <w:bookmarkStart w:id="43" w:name="_Toc236848985"/>
+      <w:bookmarkStart w:id="65" w:name="_Toc236848985"/>
       <w:r>
         <w:lastRenderedPageBreak/>
         <w:t>Factibilidad legal</w:t>
       </w:r>
-      <w:bookmarkEnd w:id="43"/>
+      <w:bookmarkEnd w:id="65"/>
     </w:p>
     <w:p>
       <w:pPr>
@@ -9326,12 +10642,12 @@
           <w:numId w:val="18"/>
         </w:numPr>
       </w:pPr>
-      <w:bookmarkStart w:id="44" w:name="_Toc236848986"/>
+      <w:bookmarkStart w:id="66" w:name="_Toc236848986"/>
       <w:r>
         <w:lastRenderedPageBreak/>
         <w:t>Estimación de costos</w:t>
       </w:r>
-      <w:bookmarkEnd w:id="44"/>
+      <w:bookmarkEnd w:id="66"/>
     </w:p>
     <w:p>
       <w:pPr>
@@ -9360,9 +10676,36 @@
         <w:spacing w:line="276" w:lineRule="auto"/>
         <w:jc w:val="center"/>
       </w:pPr>
-      <w:r>
-        <w:t>Tabla 2.1 Presupuesto del proyecto</w:t>
-      </w:r>
+    </w:p>
+    <w:p>
+      <w:pPr>
+        <w:pStyle w:val="Descripcin"/>
+        <w:keepNext/>
+        <w:spacing w:line="276" w:lineRule="auto"/>
+        <w:jc w:val="center"/>
+      </w:pPr>
+      <w:bookmarkStart w:id="67" w:name="_Toc236943086"/>
+      <w:r>
+        <w:t xml:space="preserve">Tabla </w:t>
+      </w:r>
+      <w:r>
+        <w:t>2.</w:t>
+      </w:r>
+      <w:fldSimple w:instr=" SEQ Tabla \* ARABIC ">
+        <w:r>
+          <w:rPr>
+            <w:noProof/>
+          </w:rPr>
+          <w:t>1</w:t>
+        </w:r>
+      </w:fldSimple>
+      <w:r>
+        <w:t xml:space="preserve"> </w:t>
+      </w:r>
+      <w:r>
+        <w:t>Presupuesto del proyecto</w:t>
+      </w:r>
+      <w:bookmarkEnd w:id="67"/>
     </w:p>
     <w:p>
       <w:pPr>
@@ -9390,7 +10733,7 @@
                     <pic:cNvPicPr/>
                   </pic:nvPicPr>
                   <pic:blipFill>
-                    <a:blip r:embed="rId23"/>
+                    <a:blip r:embed="rId24"/>
                     <a:stretch>
                       <a:fillRect/>
                     </a:stretch>
@@ -9438,11 +10781,11 @@
         <w:lastRenderedPageBreak/>
         <w:t xml:space="preserve"> </w:t>
       </w:r>
-      <w:bookmarkStart w:id="45" w:name="_Toc236848987"/>
+      <w:bookmarkStart w:id="68" w:name="_Toc236848987"/>
       <w:r>
         <w:t>Cronograma de actividades</w:t>
       </w:r>
-      <w:bookmarkEnd w:id="45"/>
+      <w:bookmarkEnd w:id="68"/>
     </w:p>
     <w:p>
       <w:pPr>
@@ -9457,29 +10800,154 @@
       </w:pPr>
       <w:r>
         <w:rPr>
-          <w:rFonts w:ascii="Arial" w:hAnsi="Arial" w:cs="Arial"/>
-          <w:sz w:val="24"/>
-          <w:szCs w:val="24"/>
-        </w:rPr>
-        <w:t xml:space="preserve">El desarrollo del proyecto se llevará a cabo en un periodo de cuatro meses (dieciséis semanas), distribuido en las fases descritas en el apartado de método: levantamiento de requerimientos, diseño del sistema, los cuatro </w:t>
-      </w:r>
-      <w:proofErr w:type="spellStart"/>
-      <w:r>
-        <w:rPr>
-          <w:rFonts w:ascii="Arial" w:hAnsi="Arial" w:cs="Arial"/>
-          <w:sz w:val="24"/>
-          <w:szCs w:val="24"/>
-        </w:rPr>
-        <w:t>Sprints</w:t>
-      </w:r>
-      <w:proofErr w:type="spellEnd"/>
-      <w:r>
-        <w:rPr>
-          <w:rFonts w:ascii="Arial" w:hAnsi="Arial" w:cs="Arial"/>
-          <w:sz w:val="24"/>
-          <w:szCs w:val="24"/>
-        </w:rPr>
-        <w:t xml:space="preserve"> de desarrollo, pruebas con usuarios, capacitación y documentación, y entrega final. A continuación, se presenta el cronograma de actividades mediante un diagrama de Gantt.</w:t>
+          <w:noProof/>
+        </w:rPr>
+        <mc:AlternateContent>
+          <mc:Choice Requires="wps">
+            <w:drawing>
+              <wp:anchor distT="0" distB="0" distL="114300" distR="114300" simplePos="0" relativeHeight="251674624" behindDoc="0" locked="0" layoutInCell="1" allowOverlap="1" wp14:anchorId="336D76A0" wp14:editId="3E22E747">
+                <wp:simplePos x="0" y="0"/>
+                <wp:positionH relativeFrom="column">
+                  <wp:posOffset>-284480</wp:posOffset>
+                </wp:positionH>
+                <wp:positionV relativeFrom="paragraph">
+                  <wp:posOffset>1396365</wp:posOffset>
+                </wp:positionV>
+                <wp:extent cx="6538595" cy="228600"/>
+                <wp:effectExtent l="0" t="0" r="0" b="0"/>
+                <wp:wrapTopAndBottom/>
+                <wp:docPr id="12" name="Cuadro de texto 12"/>
+                <wp:cNvGraphicFramePr/>
+                <a:graphic xmlns:a="http://schemas.openxmlformats.org/drawingml/2006/main">
+                  <a:graphicData uri="http://schemas.microsoft.com/office/word/2010/wordprocessingShape">
+                    <wps:wsp>
+                      <wps:cNvSpPr txBox="1"/>
+                      <wps:spPr>
+                        <a:xfrm>
+                          <a:off x="0" y="0"/>
+                          <a:ext cx="6538595" cy="228600"/>
+                        </a:xfrm>
+                        <a:prstGeom prst="rect">
+                          <a:avLst/>
+                        </a:prstGeom>
+                        <a:solidFill>
+                          <a:prstClr val="white"/>
+                        </a:solidFill>
+                        <a:ln>
+                          <a:noFill/>
+                        </a:ln>
+                      </wps:spPr>
+                      <wps:txbx>
+                        <w:txbxContent>
+                          <w:p>
+                            <w:pPr>
+                              <w:pStyle w:val="Descripcin"/>
+                              <w:keepNext/>
+                              <w:spacing w:line="276" w:lineRule="auto"/>
+                              <w:jc w:val="center"/>
+                            </w:pPr>
+                            <w:bookmarkStart w:id="69" w:name="_Toc236942823"/>
+                            <w:r>
+                              <w:t>Ilustración 2.</w:t>
+                            </w:r>
+                            <w:fldSimple w:instr=" SEQ Ilustración_ \* ARABIC ">
+                              <w:r>
+                                <w:rPr>
+                                  <w:noProof/>
+                                </w:rPr>
+                                <w:t>4</w:t>
+                              </w:r>
+                            </w:fldSimple>
+                            <w:r>
+                              <w:t xml:space="preserve"> </w:t>
+                            </w:r>
+                            <w:r>
+                              <w:t>lustración 2.3. Diagrama de Gantt del proyecto</w:t>
+                            </w:r>
+                            <w:bookmarkEnd w:id="69"/>
+                          </w:p>
+                          <w:p>
+                            <w:pPr>
+                              <w:pStyle w:val="Descripcin"/>
+                              <w:jc w:val="center"/>
+                              <w:rPr>
+                                <w:noProof/>
+                              </w:rPr>
+                            </w:pPr>
+                          </w:p>
+                        </w:txbxContent>
+                      </wps:txbx>
+                      <wps:bodyPr rot="0" spcFirstLastPara="0" vertOverflow="overflow" horzOverflow="overflow" vert="horz" wrap="square" lIns="0" tIns="0" rIns="0" bIns="0" numCol="1" spcCol="0" rtlCol="0" fromWordArt="0" anchor="t" anchorCtr="0" forceAA="0" compatLnSpc="1">
+                        <a:prstTxWarp prst="textNoShape">
+                          <a:avLst/>
+                        </a:prstTxWarp>
+                        <a:noAutofit/>
+                      </wps:bodyPr>
+                    </wps:wsp>
+                  </a:graphicData>
+                </a:graphic>
+                <wp14:sizeRelV relativeFrom="margin">
+                  <wp14:pctHeight>0</wp14:pctHeight>
+                </wp14:sizeRelV>
+              </wp:anchor>
+            </w:drawing>
+          </mc:Choice>
+          <mc:Fallback>
+            <w:pict>
+              <v:shape w14:anchorId="336D76A0" id="Cuadro de texto 12" o:spid="_x0000_s1030" type="#_x0000_t202" style="position:absolute;left:0;text-align:left;margin-left:-22.4pt;margin-top:109.95pt;width:514.85pt;height:18pt;z-index:251674624;visibility:visible;mso-wrap-style:square;mso-height-percent:0;mso-wrap-distance-left:9pt;mso-wrap-distance-top:0;mso-wrap-distance-right:9pt;mso-wrap-distance-bottom:0;mso-position-horizontal:absolute;mso-position-horizontal-relative:text;mso-position-vertical:absolute;mso-position-vertical-relative:text;mso-height-percent:0;mso-height-relative:margin;v-text-anchor:top" o:gfxdata="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" stroked="f">
+                <v:textbox inset="0,0,0,0">
+                  <w:txbxContent>
+                    <w:p>
+                      <w:pPr>
+                        <w:pStyle w:val="Descripcin"/>
+                        <w:keepNext/>
+                        <w:spacing w:line="276" w:lineRule="auto"/>
+                        <w:jc w:val="center"/>
+                      </w:pPr>
+                      <w:bookmarkStart w:id="70" w:name="_Toc236942823"/>
+                      <w:r>
+                        <w:t>Ilustración 2.</w:t>
+                      </w:r>
+                      <w:fldSimple w:instr=" SEQ Ilustración_ \* ARABIC ">
+                        <w:r>
+                          <w:rPr>
+                            <w:noProof/>
+                          </w:rPr>
+                          <w:t>4</w:t>
+                        </w:r>
+                      </w:fldSimple>
+                      <w:r>
+                        <w:t xml:space="preserve"> </w:t>
+                      </w:r>
+                      <w:r>
+                        <w:t>lustración 2.3. Diagrama de Gantt del proyecto</w:t>
+                      </w:r>
+                      <w:bookmarkEnd w:id="70"/>
+                    </w:p>
+                    <w:p>
+                      <w:pPr>
+                        <w:pStyle w:val="Descripcin"/>
+                        <w:jc w:val="center"/>
+                        <w:rPr>
+                          <w:noProof/>
+                        </w:rPr>
+                      </w:pPr>
+                    </w:p>
+                  </w:txbxContent>
+                </v:textbox>
+                <w10:wrap type="topAndBottom"/>
+              </v:shape>
+            </w:pict>
+          </mc:Fallback>
+        </mc:AlternateContent>
+      </w:r>
+      <w:r>
+        <w:rPr>
+          <w:rFonts w:ascii="Arial" w:hAnsi="Arial" w:cs="Arial"/>
+          <w:sz w:val="24"/>
+          <w:szCs w:val="24"/>
+        </w:rPr>
+        <w:t>El desarrollo del proyecto se llevará a cabo en un periodo de cuatro meses (dieciséis semanas), distribuido en las fases descritas en el apartado de método: levantamiento de requerimientos, diseño del sistema, los cuatro Sprints de desarrollo, pruebas con usuarios, capacitación y documentación, y entrega final. A continuación, se presenta el cronograma de actividades mediante un diagrama de Gantt.</w:t>
       </w:r>
     </w:p>
     <w:p>
@@ -9517,7 +10985,7 @@
                     <pic:cNvPicPr/>
                   </pic:nvPicPr>
                   <pic:blipFill>
-                    <a:blip r:embed="rId24">
+                    <a:blip r:embed="rId25">
                       <a:extLst>
                         <a:ext uri="{28A0092B-C50C-407E-A947-70E740481C1C}">
                           <a14:useLocalDpi xmlns:a14="http://schemas.microsoft.com/office/drawing/2010/main" val="0"/>
@@ -9549,9 +11017,6 @@
           </wp:anchor>
         </w:drawing>
       </w:r>
-      <w:r>
-        <w:t>Ilustración 2.3. Diagrama de Gantt del proyecto</w:t>
-      </w:r>
     </w:p>
     <w:p>
       <w:pPr>
@@ -9638,14 +11103,6 @@
     <w:p>
       <w:pPr>
         <w:spacing w:line="276" w:lineRule="auto"/>
-        <w:rPr>
-          <w:lang w:val="es-419" w:eastAsia="es-GT"/>
-        </w:rPr>
-      </w:pPr>
-    </w:p>
-    <w:p>
-      <w:pPr>
-        <w:spacing w:line="276" w:lineRule="auto"/>
         <w:jc w:val="center"/>
         <w:rPr>
           <w:rFonts w:ascii="Arial" w:hAnsi="Arial" w:cs="Arial"/>
@@ -9880,65 +11337,14 @@
           <w:lang w:val="es-419" w:eastAsia="es-GT"/>
         </w:rPr>
       </w:pPr>
-      <w:proofErr w:type="spellStart"/>
-      <w:r>
-        <w:rPr>
-          <w:rFonts w:ascii="Arial" w:hAnsi="Arial" w:cs="Arial"/>
-          <w:sz w:val="24"/>
-          <w:szCs w:val="24"/>
-          <w:lang w:val="es-419" w:eastAsia="es-GT"/>
-        </w:rPr>
-        <w:t>mSupply</w:t>
-      </w:r>
-      <w:proofErr w:type="spellEnd"/>
-      <w:r>
-        <w:rPr>
-          <w:rFonts w:ascii="Arial" w:hAnsi="Arial" w:cs="Arial"/>
-          <w:sz w:val="24"/>
-          <w:szCs w:val="24"/>
-          <w:lang w:val="es-419" w:eastAsia="es-GT"/>
-        </w:rPr>
-        <w:t xml:space="preserve"> </w:t>
-      </w:r>
-      <w:proofErr w:type="spellStart"/>
-      <w:r>
-        <w:rPr>
-          <w:rFonts w:ascii="Arial" w:hAnsi="Arial" w:cs="Arial"/>
-          <w:sz w:val="24"/>
-          <w:szCs w:val="24"/>
-          <w:lang w:val="es-419" w:eastAsia="es-GT"/>
-        </w:rPr>
-        <w:t>Foundation</w:t>
-      </w:r>
-      <w:proofErr w:type="spellEnd"/>
-      <w:r>
-        <w:rPr>
-          <w:rFonts w:ascii="Arial" w:hAnsi="Arial" w:cs="Arial"/>
-          <w:sz w:val="24"/>
-          <w:szCs w:val="24"/>
-          <w:lang w:val="es-419" w:eastAsia="es-GT"/>
-        </w:rPr>
-        <w:t xml:space="preserve">. (s.f.). Open </w:t>
-      </w:r>
-      <w:proofErr w:type="spellStart"/>
-      <w:r>
-        <w:rPr>
-          <w:rFonts w:ascii="Arial" w:hAnsi="Arial" w:cs="Arial"/>
-          <w:sz w:val="24"/>
-          <w:szCs w:val="24"/>
-          <w:lang w:val="es-419" w:eastAsia="es-GT"/>
-        </w:rPr>
-        <w:t>mSupply</w:t>
-      </w:r>
-      <w:proofErr w:type="spellEnd"/>
-      <w:r>
-        <w:rPr>
-          <w:rFonts w:ascii="Arial" w:hAnsi="Arial" w:cs="Arial"/>
-          <w:sz w:val="24"/>
-          <w:szCs w:val="24"/>
-          <w:lang w:val="es-419" w:eastAsia="es-GT"/>
-        </w:rPr>
-        <w:t xml:space="preserve"> — Documentación. https://docs.msupply.foundation/es/</w:t>
+      <w:r>
+        <w:rPr>
+          <w:rFonts w:ascii="Arial" w:hAnsi="Arial" w:cs="Arial"/>
+          <w:sz w:val="24"/>
+          <w:szCs w:val="24"/>
+          <w:lang w:val="es-419" w:eastAsia="es-GT"/>
+        </w:rPr>
+        <w:t>mSupply Foundation. (s.f.). Open mSupply — Documentación. https://docs.msupply.foundation/es/</w:t>
       </w:r>
     </w:p>
     <w:p>
@@ -9952,25 +11358,14 @@
           <w:lang w:val="es-419" w:eastAsia="es-GT"/>
         </w:rPr>
       </w:pPr>
-      <w:proofErr w:type="spellStart"/>
-      <w:r>
-        <w:rPr>
-          <w:rFonts w:ascii="Arial" w:hAnsi="Arial" w:cs="Arial"/>
-          <w:sz w:val="24"/>
-          <w:szCs w:val="24"/>
-          <w:lang w:val="es-419" w:eastAsia="es-GT"/>
-        </w:rPr>
-        <w:t>Schwaber</w:t>
-      </w:r>
-      <w:proofErr w:type="spellEnd"/>
-      <w:r>
-        <w:rPr>
-          <w:rFonts w:ascii="Arial" w:hAnsi="Arial" w:cs="Arial"/>
-          <w:sz w:val="24"/>
-          <w:szCs w:val="24"/>
-          <w:lang w:val="es-419" w:eastAsia="es-GT"/>
-        </w:rPr>
-        <w:t>, K. y Sutherland, J. (2020). La Guía de Scrum. https://scrumguides.org/</w:t>
+      <w:r>
+        <w:rPr>
+          <w:rFonts w:ascii="Arial" w:hAnsi="Arial" w:cs="Arial"/>
+          <w:sz w:val="24"/>
+          <w:szCs w:val="24"/>
+          <w:lang w:val="es-419" w:eastAsia="es-GT"/>
+        </w:rPr>
+        <w:t>Schwaber, K. y Sutherland, J. (2020). La Guía de Scrum. https://scrumguides.org/</w:t>
       </w:r>
     </w:p>
     <w:p>
@@ -9994,22 +11389,11 @@
         <w:t>Secretaría de Coordinación Ejecutiva de la Presidencia [SCEP]. (2023). Caracterización municipal: San Marcos.</w:t>
       </w:r>
     </w:p>
-    <w:p>
-      <w:pPr>
-        <w:spacing w:line="276" w:lineRule="auto"/>
-        <w:rPr>
-          <w:rFonts w:ascii="Arial" w:hAnsi="Arial" w:cs="Arial"/>
-          <w:sz w:val="24"/>
-          <w:szCs w:val="24"/>
-          <w:lang w:val="es-419" w:eastAsia="es-GT"/>
-        </w:rPr>
-      </w:pPr>
-    </w:p>
     <w:sectPr>
-      <w:headerReference w:type="default" r:id="rId25"/>
+      <w:headerReference w:type="default" r:id="rId26"/>
       <w:pgSz w:w="12240" w:h="15840"/>
       <w:pgMar w:top="1417" w:right="1701" w:bottom="1417" w:left="1701" w:header="708" w:footer="708" w:gutter="0"/>
-      <w:pgNumType w:start="5"/>
+      <w:pgNumType w:start="9"/>
       <w:cols w:space="708"/>
       <w:docGrid w:linePitch="360"/>
     </w:sectPr>
@@ -10080,16 +11464,6 @@
 </file>
 
 <file path=word/footer3.xml><?xml version="1.0" encoding="utf-8"?>
-<w:ftr xmlns:wpc="http://schemas.microsoft.com/office/word/2010/wordprocessingCanvas" xmlns:cx="http://schemas.microsoft.com/office/drawing/2014/chartex" xmlns:cx1="http://schemas.microsoft.com/office/drawing/2015/9/8/chartex" xmlns:cx2="http://schemas.microsoft.com/office/drawing/2015/10/21/chartex" xmlns:cx3="http://schemas.microsoft.com/office/drawing/2016/5/9/chartex" xmlns:cx4="http://schemas.microsoft.com/office/drawing/2016/5/10/chartex" xmlns:cx5="http://schemas.microsoft.com/office/drawing/2016/5/11/chartex" xmlns:cx6="http://schemas.microsoft.com/office/drawing/2016/5/12/chartex" xmlns:cx7="http://schemas.microsoft.com/office/drawing/2016/5/13/chartex" xmlns:cx8="http://schemas.microsoft.com/office/drawing/2016/5/14/chartex" xmlns:mc="http://schemas.openxmlformats.org/markup-compatibility/2006" xmlns:aink="http://schemas.microsoft.com/office/drawing/2016/ink" xmlns:am3d="http://schemas.microsoft.com/office/drawing/2017/model3d" xmlns:o="urn:schemas-microsoft-com:office:office" xmlns:r="http://schemas.openxmlformats.org/officeDocument/2006/relationships" xmlns:m="http://schemas.openxmlformats.org/officeDocument/2006/math" xmlns:v="urn:schemas-microsoft-com:vml" xmlns:wp14="http://schemas.microsoft.com/office/word/2010/wordprocessingDrawing" xmlns:wp="http://schemas.openxmlformats.org/drawingml/2006/wordprocessingDrawing" xmlns:w10="urn:schemas-microsoft-com:office:word" xmlns:w="http://schemas.openxmlformats.org/wordprocessingml/2006/main" xmlns:w14="http://schemas.microsoft.com/office/word/2010/wordml" xmlns:w15="http://schemas.microsoft.com/office/word/2012/wordml" xmlns:w16cex="http://schemas.microsoft.com/office/word/2018/wordml/cex" xmlns:w16cid="http://schemas.microsoft.com/office/word/2016/wordml/cid" xmlns:w16="http://schemas.microsoft.com/office/word/2018/wordml" xmlns:w16sdtdh="http://schemas.microsoft.com/office/word/2020/wordml/sdtdatahash" xmlns:w16se="http://schemas.microsoft.com/office/word/2015/wordml/symex" xmlns:wpg="http://schemas.microsoft.com/office/word/2010/wordprocessingGroup" xmlns:wpi="http://schemas.microsoft.com/office/word/2010/wordprocessingInk" xmlns:wne="http://schemas.microsoft.com/office/word/2006/wordml" xmlns:wps="http://schemas.microsoft.com/office/word/2010/wordprocessingShape" mc:Ignorable="w14 w15 w16se w16cid w16 w16cex w16sdtdh wp14">
-  <w:p>
-    <w:pPr>
-      <w:pStyle w:val="Piedepgina"/>
-    </w:pPr>
-  </w:p>
-</w:ftr>
-</file>
-
-<file path=word/footer4.xml><?xml version="1.0" encoding="utf-8"?>
 <w:ftr xmlns:wpc="http://schemas.microsoft.com/office/word/2010/wordprocessingCanvas" xmlns:cx="http://schemas.microsoft.com/office/drawing/2014/chartex" xmlns:cx1="http://schemas.microsoft.com/office/drawing/2015/9/8/chartex" xmlns:cx2="http://schemas.microsoft.com/office/drawing/2015/10/21/chartex" xmlns:cx3="http://schemas.microsoft.com/office/drawing/2016/5/9/chartex" xmlns:cx4="http://schemas.microsoft.com/office/drawing/2016/5/10/chartex" xmlns:cx5="http://schemas.microsoft.com/office/drawing/2016/5/11/chartex" xmlns:cx6="http://schemas.microsoft.com/office/drawing/2016/5/12/chartex" xmlns:cx7="http://schemas.microsoft.com/office/drawing/2016/5/13/chartex" xmlns:cx8="http://schemas.microsoft.com/office/drawing/2016/5/14/chartex" xmlns:mc="http://schemas.openxmlformats.org/markup-compatibility/2006" xmlns:aink="http://schemas.microsoft.com/office/drawing/2016/ink" xmlns:am3d="http://schemas.microsoft.com/office/drawing/2017/model3d" xmlns:o="urn:schemas-microsoft-com:office:office" xmlns:r="http://schemas.openxmlformats.org/officeDocument/2006/relationships" xmlns:m="http://schemas.openxmlformats.org/officeDocument/2006/math" xmlns:v="urn:schemas-microsoft-com:vml" xmlns:wp14="http://schemas.microsoft.com/office/word/2010/wordprocessingDrawing" xmlns:wp="http://schemas.openxmlformats.org/drawingml/2006/wordprocessingDrawing" xmlns:w10="urn:schemas-microsoft-com:office:word" xmlns:w="http://schemas.openxmlformats.org/wordprocessingml/2006/main" xmlns:w14="http://schemas.microsoft.com/office/word/2010/wordml" xmlns:w15="http://schemas.microsoft.com/office/word/2012/wordml" xmlns:w16cex="http://schemas.microsoft.com/office/word/2018/wordml/cex" xmlns:w16cid="http://schemas.microsoft.com/office/word/2016/wordml/cid" xmlns:w16="http://schemas.microsoft.com/office/word/2018/wordml" xmlns:w16sdtdh="http://schemas.microsoft.com/office/word/2020/wordml/sdtdatahash" xmlns:w16se="http://schemas.microsoft.com/office/word/2015/wordml/symex" xmlns:wpg="http://schemas.microsoft.com/office/word/2010/wordprocessingGroup" xmlns:wpi="http://schemas.microsoft.com/office/word/2010/wordprocessingInk" xmlns:wne="http://schemas.microsoft.com/office/word/2006/wordml" xmlns:wps="http://schemas.microsoft.com/office/word/2010/wordprocessingShape" mc:Ignorable="w14 w15 w16se w16cid w16 w16cex w16sdtdh wp14">
   <w:sdt>
     <w:sdtPr>
@@ -10135,7 +11509,7 @@
 </w:ftr>
 </file>
 
-<file path=word/footer5.xml><?xml version="1.0" encoding="utf-8"?>
+<file path=word/footer4.xml><?xml version="1.0" encoding="utf-8"?>
 <w:ftr xmlns:wpc="http://schemas.microsoft.com/office/word/2010/wordprocessingCanvas" xmlns:cx="http://schemas.microsoft.com/office/drawing/2014/chartex" xmlns:cx1="http://schemas.microsoft.com/office/drawing/2015/9/8/chartex" xmlns:cx2="http://schemas.microsoft.com/office/drawing/2015/10/21/chartex" xmlns:cx3="http://schemas.microsoft.com/office/drawing/2016/5/9/chartex" xmlns:cx4="http://schemas.microsoft.com/office/drawing/2016/5/10/chartex" xmlns:cx5="http://schemas.microsoft.com/office/drawing/2016/5/11/chartex" xmlns:cx6="http://schemas.microsoft.com/office/drawing/2016/5/12/chartex" xmlns:cx7="http://schemas.microsoft.com/office/drawing/2016/5/13/chartex" xmlns:cx8="http://schemas.microsoft.com/office/drawing/2016/5/14/chartex" xmlns:mc="http://schemas.openxmlformats.org/markup-compatibility/2006" xmlns:aink="http://schemas.microsoft.com/office/drawing/2016/ink" xmlns:am3d="http://schemas.microsoft.com/office/drawing/2017/model3d" xmlns:o="urn:schemas-microsoft-com:office:office" xmlns:r="http://schemas.openxmlformats.org/officeDocument/2006/relationships" xmlns:m="http://schemas.openxmlformats.org/officeDocument/2006/math" xmlns:v="urn:schemas-microsoft-com:vml" xmlns:wp14="http://schemas.microsoft.com/office/word/2010/wordprocessingDrawing" xmlns:wp="http://schemas.openxmlformats.org/drawingml/2006/wordprocessingDrawing" xmlns:w10="urn:schemas-microsoft-com:office:word" xmlns:w="http://schemas.openxmlformats.org/wordprocessingml/2006/main" xmlns:w14="http://schemas.microsoft.com/office/word/2010/wordml" xmlns:w15="http://schemas.microsoft.com/office/word/2012/wordml" xmlns:w16cex="http://schemas.microsoft.com/office/word/2018/wordml/cex" xmlns:w16cid="http://schemas.microsoft.com/office/word/2016/wordml/cid" xmlns:w16="http://schemas.microsoft.com/office/word/2018/wordml" xmlns:w16sdtdh="http://schemas.microsoft.com/office/word/2020/wordml/sdtdatahash" xmlns:w16se="http://schemas.microsoft.com/office/word/2015/wordml/symex" xmlns:wpg="http://schemas.microsoft.com/office/word/2010/wordprocessingGroup" xmlns:wpi="http://schemas.microsoft.com/office/word/2010/wordprocessingInk" xmlns:wne="http://schemas.microsoft.com/office/word/2006/wordml" xmlns:wps="http://schemas.microsoft.com/office/word/2010/wordprocessingShape" mc:Ignorable="w14 w15 w16se w16cid w16 w16cex w16sdtdh wp14">
   <w:sdt>
     <w:sdtPr>
@@ -10211,6 +11585,9 @@
   <w:p>
     <w:pPr>
       <w:pStyle w:val="Encabezado"/>
+      <w:pBdr>
+        <w:bottom w:val="single" w:sz="4" w:space="1" w:color="auto"/>
+      </w:pBdr>
       <w:jc w:val="right"/>
     </w:pPr>
     <w:fldSimple w:instr=" STYLEREF  &quot;Título 2&quot;  \* MERGEFORMAT ">
@@ -10218,7 +11595,7 @@
         <w:rPr>
           <w:noProof/>
         </w:rPr>
-        <w:t>Planteamiento del problema</w:t>
+        <w:t>Diseño</w:t>
       </w:r>
     </w:fldSimple>
   </w:p>
@@ -10226,48 +11603,6 @@
 </file>
 
 <file path=word/header2.xml><?xml version="1.0" encoding="utf-8"?>
-<w:hdr xmlns:wpc="http://schemas.microsoft.com/office/word/2010/wordprocessingCanvas" xmlns:cx="http://schemas.microsoft.com/office/drawing/2014/chartex" xmlns:cx1="http://schemas.microsoft.com/office/drawing/2015/9/8/chartex" xmlns:cx2="http://schemas.microsoft.com/office/drawing/2015/10/21/chartex" xmlns:cx3="http://schemas.microsoft.com/office/drawing/2016/5/9/chartex" xmlns:cx4="http://schemas.microsoft.com/office/drawing/2016/5/10/chartex" xmlns:cx5="http://schemas.microsoft.com/office/drawing/2016/5/11/chartex" xmlns:cx6="http://schemas.microsoft.com/office/drawing/2016/5/12/chartex" xmlns:cx7="http://schemas.microsoft.com/office/drawing/2016/5/13/chartex" xmlns:cx8="http://schemas.microsoft.com/office/drawing/2016/5/14/chartex" xmlns:mc="http://schemas.openxmlformats.org/markup-compatibility/2006" xmlns:aink="http://schemas.microsoft.com/office/drawing/2016/ink" xmlns:am3d="http://schemas.microsoft.com/office/drawing/2017/model3d" xmlns:o="urn:schemas-microsoft-com:office:office" xmlns:r="http://schemas.openxmlformats.org/officeDocument/2006/relationships" xmlns:m="http://schemas.openxmlformats.org/officeDocument/2006/math" xmlns:v="urn:schemas-microsoft-com:vml" xmlns:wp14="http://schemas.microsoft.com/office/word/2010/wordprocessingDrawing" xmlns:wp="http://schemas.openxmlformats.org/drawingml/2006/wordprocessingDrawing" xmlns:w10="urn:schemas-microsoft-com:office:word" xmlns:w="http://schemas.openxmlformats.org/wordprocessingml/2006/main" xmlns:w14="http://schemas.microsoft.com/office/word/2010/wordml" xmlns:w15="http://schemas.microsoft.com/office/word/2012/wordml" xmlns:w16cex="http://schemas.microsoft.com/office/word/2018/wordml/cex" xmlns:w16cid="http://schemas.microsoft.com/office/word/2016/wordml/cid" xmlns:w16="http://schemas.microsoft.com/office/word/2018/wordml" xmlns:w16sdtdh="http://schemas.microsoft.com/office/word/2020/wordml/sdtdatahash" xmlns:w16se="http://schemas.microsoft.com/office/word/2015/wordml/symex" xmlns:wpg="http://schemas.microsoft.com/office/word/2010/wordprocessingGroup" xmlns:wpi="http://schemas.microsoft.com/office/word/2010/wordprocessingInk" xmlns:wne="http://schemas.microsoft.com/office/word/2006/wordml" xmlns:wps="http://schemas.microsoft.com/office/word/2010/wordprocessingShape" mc:Ignorable="w14 w15 w16se w16cid w16 w16cex w16sdtdh wp14">
-  <w:p>
-    <w:pPr>
-      <w:pStyle w:val="Encabezado"/>
-    </w:pPr>
-  </w:p>
-</w:hdr>
-</file>
-
-<file path=word/header3.xml><?xml version="1.0" encoding="utf-8"?>
-<w:hdr xmlns:wpc="http://schemas.microsoft.com/office/word/2010/wordprocessingCanvas" xmlns:cx="http://schemas.microsoft.com/office/drawing/2014/chartex" xmlns:cx1="http://schemas.microsoft.com/office/drawing/2015/9/8/chartex" xmlns:cx2="http://schemas.microsoft.com/office/drawing/2015/10/21/chartex" xmlns:cx3="http://schemas.microsoft.com/office/drawing/2016/5/9/chartex" xmlns:cx4="http://schemas.microsoft.com/office/drawing/2016/5/10/chartex" xmlns:cx5="http://schemas.microsoft.com/office/drawing/2016/5/11/chartex" xmlns:cx6="http://schemas.microsoft.com/office/drawing/2016/5/12/chartex" xmlns:cx7="http://schemas.microsoft.com/office/drawing/2016/5/13/chartex" xmlns:cx8="http://schemas.microsoft.com/office/drawing/2016/5/14/chartex" xmlns:mc="http://schemas.openxmlformats.org/markup-compatibility/2006" xmlns:aink="http://schemas.microsoft.com/office/drawing/2016/ink" xmlns:am3d="http://schemas.microsoft.com/office/drawing/2017/model3d" xmlns:o="urn:schemas-microsoft-com:office:office" xmlns:r="http://schemas.openxmlformats.org/officeDocument/2006/relationships" xmlns:m="http://schemas.openxmlformats.org/officeDocument/2006/math" xmlns:v="urn:schemas-microsoft-com:vml" xmlns:wp14="http://schemas.microsoft.com/office/word/2010/wordprocessingDrawing" xmlns:wp="http://schemas.openxmlformats.org/drawingml/2006/wordprocessingDrawing" xmlns:w10="urn:schemas-microsoft-com:office:word" xmlns:w="http://schemas.openxmlformats.org/wordprocessingml/2006/main" xmlns:w14="http://schemas.microsoft.com/office/word/2010/wordml" xmlns:w15="http://schemas.microsoft.com/office/word/2012/wordml" xmlns:w16cex="http://schemas.microsoft.com/office/word/2018/wordml/cex" xmlns:w16cid="http://schemas.microsoft.com/office/word/2016/wordml/cid" xmlns:w16="http://schemas.microsoft.com/office/word/2018/wordml" xmlns:w16sdtdh="http://schemas.microsoft.com/office/word/2020/wordml/sdtdatahash" xmlns:w16se="http://schemas.microsoft.com/office/word/2015/wordml/symex" xmlns:wpg="http://schemas.microsoft.com/office/word/2010/wordprocessingGroup" xmlns:wpi="http://schemas.microsoft.com/office/word/2010/wordprocessingInk" xmlns:wne="http://schemas.microsoft.com/office/word/2006/wordml" xmlns:wps="http://schemas.microsoft.com/office/word/2010/wordprocessingShape" mc:Ignorable="w14 w15 w16se w16cid w16 w16cex w16sdtdh wp14">
-  <w:p>
-    <w:pPr>
-      <w:pStyle w:val="Encabezado"/>
-    </w:pPr>
-  </w:p>
-</w:hdr>
-</file>
-
-<file path=word/header4.xml><?xml version="1.0" encoding="utf-8"?>
-<w:hdr xmlns:wpc="http://schemas.microsoft.com/office/word/2010/wordprocessingCanvas" xmlns:cx="http://schemas.microsoft.com/office/drawing/2014/chartex" xmlns:cx1="http://schemas.microsoft.com/office/drawing/2015/9/8/chartex" xmlns:cx2="http://schemas.microsoft.com/office/drawing/2015/10/21/chartex" xmlns:cx3="http://schemas.microsoft.com/office/drawing/2016/5/9/chartex" xmlns:cx4="http://schemas.microsoft.com/office/drawing/2016/5/10/chartex" xmlns:cx5="http://schemas.microsoft.com/office/drawing/2016/5/11/chartex" xmlns:cx6="http://schemas.microsoft.com/office/drawing/2016/5/12/chartex" xmlns:cx7="http://schemas.microsoft.com/office/drawing/2016/5/13/chartex" xmlns:cx8="http://schemas.microsoft.com/office/drawing/2016/5/14/chartex" xmlns:mc="http://schemas.openxmlformats.org/markup-compatibility/2006" xmlns:aink="http://schemas.microsoft.com/office/drawing/2016/ink" xmlns:am3d="http://schemas.microsoft.com/office/drawing/2017/model3d" xmlns:o="urn:schemas-microsoft-com:office:office" xmlns:r="http://schemas.openxmlformats.org/officeDocument/2006/relationships" xmlns:m="http://schemas.openxmlformats.org/officeDocument/2006/math" xmlns:v="urn:schemas-microsoft-com:vml" xmlns:wp14="http://schemas.microsoft.com/office/word/2010/wordprocessingDrawing" xmlns:wp="http://schemas.openxmlformats.org/drawingml/2006/wordprocessingDrawing" xmlns:w10="urn:schemas-microsoft-com:office:word" xmlns:w="http://schemas.openxmlformats.org/wordprocessingml/2006/main" xmlns:w14="http://schemas.microsoft.com/office/word/2010/wordml" xmlns:w15="http://schemas.microsoft.com/office/word/2012/wordml" xmlns:w16cex="http://schemas.microsoft.com/office/word/2018/wordml/cex" xmlns:w16cid="http://schemas.microsoft.com/office/word/2016/wordml/cid" xmlns:w16="http://schemas.microsoft.com/office/word/2018/wordml" xmlns:w16sdtdh="http://schemas.microsoft.com/office/word/2020/wordml/sdtdatahash" xmlns:w16se="http://schemas.microsoft.com/office/word/2015/wordml/symex" xmlns:wpg="http://schemas.microsoft.com/office/word/2010/wordprocessingGroup" xmlns:wpi="http://schemas.microsoft.com/office/word/2010/wordprocessingInk" xmlns:wne="http://schemas.microsoft.com/office/word/2006/wordml" xmlns:wps="http://schemas.microsoft.com/office/word/2010/wordprocessingShape" mc:Ignorable="w14 w15 w16se w16cid w16 w16cex w16sdtdh wp14">
-  <w:p>
-    <w:pPr>
-      <w:pStyle w:val="Encabezado"/>
-      <w:pBdr>
-        <w:bottom w:val="single" w:sz="4" w:space="1" w:color="auto"/>
-      </w:pBdr>
-      <w:jc w:val="right"/>
-    </w:pPr>
-    <w:fldSimple w:instr=" STYLEREF  &quot;Título 2&quot;  \* MERGEFORMAT ">
-      <w:r>
-        <w:rPr>
-          <w:noProof/>
-        </w:rPr>
-        <w:t>Cronograma de actividades</w:t>
-      </w:r>
-    </w:fldSimple>
-  </w:p>
-</w:hdr>
-</file>
-
-<file path=word/header5.xml><?xml version="1.0" encoding="utf-8"?>
 <w:hdr xmlns:wpc="http://schemas.microsoft.com/office/word/2010/wordprocessingCanvas" xmlns:cx="http://schemas.microsoft.com/office/drawing/2014/chartex" xmlns:cx1="http://schemas.microsoft.com/office/drawing/2015/9/8/chartex" xmlns:cx2="http://schemas.microsoft.com/office/drawing/2015/10/21/chartex" xmlns:cx3="http://schemas.microsoft.com/office/drawing/2016/5/9/chartex" xmlns:cx4="http://schemas.microsoft.com/office/drawing/2016/5/10/chartex" xmlns:cx5="http://schemas.microsoft.com/office/drawing/2016/5/11/chartex" xmlns:cx6="http://schemas.microsoft.com/office/drawing/2016/5/12/chartex" xmlns:cx7="http://schemas.microsoft.com/office/drawing/2016/5/13/chartex" xmlns:cx8="http://schemas.microsoft.com/office/drawing/2016/5/14/chartex" xmlns:mc="http://schemas.openxmlformats.org/markup-compatibility/2006" xmlns:aink="http://schemas.microsoft.com/office/drawing/2016/ink" xmlns:am3d="http://schemas.microsoft.com/office/drawing/2017/model3d" xmlns:o="urn:schemas-microsoft-com:office:office" xmlns:r="http://schemas.openxmlformats.org/officeDocument/2006/relationships" xmlns:m="http://schemas.openxmlformats.org/officeDocument/2006/math" xmlns:v="urn:schemas-microsoft-com:vml" xmlns:wp14="http://schemas.microsoft.com/office/word/2010/wordprocessingDrawing" xmlns:wp="http://schemas.openxmlformats.org/drawingml/2006/wordprocessingDrawing" xmlns:w10="urn:schemas-microsoft-com:office:word" xmlns:w="http://schemas.openxmlformats.org/wordprocessingml/2006/main" xmlns:w14="http://schemas.microsoft.com/office/word/2010/wordml" xmlns:w15="http://schemas.microsoft.com/office/word/2012/wordml" xmlns:w16cex="http://schemas.microsoft.com/office/word/2018/wordml/cex" xmlns:w16cid="http://schemas.microsoft.com/office/word/2016/wordml/cid" xmlns:w16="http://schemas.microsoft.com/office/word/2018/wordml" xmlns:w16sdtdh="http://schemas.microsoft.com/office/word/2020/wordml/sdtdatahash" xmlns:w16se="http://schemas.microsoft.com/office/word/2015/wordml/symex" xmlns:wpg="http://schemas.microsoft.com/office/word/2010/wordprocessingGroup" xmlns:wpi="http://schemas.microsoft.com/office/word/2010/wordprocessingInk" xmlns:wne="http://schemas.microsoft.com/office/word/2006/wordml" xmlns:wps="http://schemas.microsoft.com/office/word/2010/wordprocessingShape" mc:Ignorable="w14 w15 w16se w16cid w16 w16cex w16sdtdh wp14">
   <w:p>
     <w:pPr>
@@ -10283,7 +11618,7 @@
 </w:hdr>
 </file>
 
-<file path=word/header6.xml><?xml version="1.0" encoding="utf-8"?>
+<file path=word/header3.xml><?xml version="1.0" encoding="utf-8"?>
 <w:hdr xmlns:wpc="http://schemas.microsoft.com/office/word/2010/wordprocessingCanvas" xmlns:cx="http://schemas.microsoft.com/office/drawing/2014/chartex" xmlns:cx1="http://schemas.microsoft.com/office/drawing/2015/9/8/chartex" xmlns:cx2="http://schemas.microsoft.com/office/drawing/2015/10/21/chartex" xmlns:cx3="http://schemas.microsoft.com/office/drawing/2016/5/9/chartex" xmlns:cx4="http://schemas.microsoft.com/office/drawing/2016/5/10/chartex" xmlns:cx5="http://schemas.microsoft.com/office/drawing/2016/5/11/chartex" xmlns:cx6="http://schemas.microsoft.com/office/drawing/2016/5/12/chartex" xmlns:cx7="http://schemas.microsoft.com/office/drawing/2016/5/13/chartex" xmlns:cx8="http://schemas.microsoft.com/office/drawing/2016/5/14/chartex" xmlns:mc="http://schemas.openxmlformats.org/markup-compatibility/2006" xmlns:aink="http://schemas.microsoft.com/office/drawing/2016/ink" xmlns:am3d="http://schemas.microsoft.com/office/drawing/2017/model3d" xmlns:o="urn:schemas-microsoft-com:office:office" xmlns:r="http://schemas.openxmlformats.org/officeDocument/2006/relationships" xmlns:m="http://schemas.openxmlformats.org/officeDocument/2006/math" xmlns:v="urn:schemas-microsoft-com:vml" xmlns:wp14="http://schemas.microsoft.com/office/word/2010/wordprocessingDrawing" xmlns:wp="http://schemas.openxmlformats.org/drawingml/2006/wordprocessingDrawing" xmlns:w10="urn:schemas-microsoft-com:office:word" xmlns:w="http://schemas.openxmlformats.org/wordprocessingml/2006/main" xmlns:w14="http://schemas.microsoft.com/office/word/2010/wordml" xmlns:w15="http://schemas.microsoft.com/office/word/2012/wordml" xmlns:w16cex="http://schemas.microsoft.com/office/word/2018/wordml/cex" xmlns:w16cid="http://schemas.microsoft.com/office/word/2016/wordml/cid" xmlns:w16="http://schemas.microsoft.com/office/word/2018/wordml" xmlns:w16sdtdh="http://schemas.microsoft.com/office/word/2020/wordml/sdtdatahash" xmlns:w16se="http://schemas.microsoft.com/office/word/2015/wordml/symex" xmlns:wpg="http://schemas.microsoft.com/office/word/2010/wordprocessingGroup" xmlns:wpi="http://schemas.microsoft.com/office/word/2010/wordprocessingInk" xmlns:wne="http://schemas.microsoft.com/office/word/2006/wordml" xmlns:wps="http://schemas.microsoft.com/office/word/2010/wordprocessingShape" mc:Ignorable="w14 w15 w16se w16cid w16 w16cex w16sdtdh wp14">
   <w:p>
     <w:pPr>
@@ -15904,6 +17239,17 @@
       <w:lang w:val="es-MX" w:eastAsia="es-MX"/>
     </w:rPr>
   </w:style>
+  <w:style w:type="paragraph" w:styleId="Tabladeilustraciones">
+    <w:name w:val="table of figures"/>
+    <w:basedOn w:val="Normal"/>
+    <w:next w:val="Normal"/>
+    <w:uiPriority w:val="99"/>
+    <w:unhideWhenUsed/>
+    <w:rsid w:val="004D3B01"/>
+    <w:pPr>
+      <w:spacing w:after="0"/>
+    </w:pPr>
+  </w:style>
 </w:styles>
 </file>
 

</xml_diff>

<commit_message>
Arreglo planteamiento del problema
</commit_message>
<xml_diff>
--- a/Propuesta - Vacunas.docx
+++ b/Propuesta - Vacunas.docx
@@ -1,6 +1,6 @@
 
 <file path=word/document.xml><?xml version="1.0" encoding="utf-8"?>
-<w:document xmlns:wpc="http://schemas.microsoft.com/office/word/2010/wordprocessingCanvas" xmlns:cx="http://schemas.microsoft.com/office/drawing/2014/chartex" xmlns:cx1="http://schemas.microsoft.com/office/drawing/2015/9/8/chartex" xmlns:cx2="http://schemas.microsoft.com/office/drawing/2015/10/21/chartex" xmlns:cx3="http://schemas.microsoft.com/office/drawing/2016/5/9/chartex" xmlns:cx4="http://schemas.microsoft.com/office/drawing/2016/5/10/chartex" xmlns:cx5="http://schemas.microsoft.com/office/drawing/2016/5/11/chartex" xmlns:cx6="http://schemas.microsoft.com/office/drawing/2016/5/12/chartex" xmlns:cx7="http://schemas.microsoft.com/office/drawing/2016/5/13/chartex" xmlns:cx8="http://schemas.microsoft.com/office/drawing/2016/5/14/chartex" xmlns:mc="http://schemas.openxmlformats.org/markup-compatibility/2006" xmlns:aink="http://schemas.microsoft.com/office/drawing/2016/ink" xmlns:am3d="http://schemas.microsoft.com/office/drawing/2017/model3d" xmlns:o="urn:schemas-microsoft-com:office:office" xmlns:oel="http://schemas.microsoft.com/office/2019/extlst" xmlns:r="http://schemas.openxmlformats.org/officeDocument/2006/relationships" xmlns:m="http://schemas.openxmlformats.org/officeDocument/2006/math" xmlns:v="urn:schemas-microsoft-com:vml" xmlns:wp14="http://schemas.microsoft.com/office/word/2010/wordprocessingDrawing" xmlns:wp="http://schemas.openxmlformats.org/drawingml/2006/wordprocessingDrawing" xmlns:w10="urn:schemas-microsoft-com:office:word" xmlns:w="http://schemas.openxmlformats.org/wordprocessingml/2006/main" xmlns:w14="http://schemas.microsoft.com/office/word/2010/wordml" xmlns:w15="http://schemas.microsoft.com/office/word/2012/wordml" xmlns:w16cex="http://schemas.microsoft.com/office/word/2018/wordml/cex" xmlns:w16cid="http://schemas.microsoft.com/office/word/2016/wordml/cid" xmlns:w16="http://schemas.microsoft.com/office/word/2018/wordml" xmlns:w16sdtdh="http://schemas.microsoft.com/office/word/2020/wordml/sdtdatahash" xmlns:w16se="http://schemas.microsoft.com/office/word/2015/wordml/symex" xmlns:wpg="http://schemas.microsoft.com/office/word/2010/wordprocessingGroup" xmlns:wpi="http://schemas.microsoft.com/office/word/2010/wordprocessingInk" xmlns:wne="http://schemas.microsoft.com/office/word/2006/wordml" xmlns:wps="http://schemas.microsoft.com/office/word/2010/wordprocessingShape" mc:Ignorable="w14 w15 w16se w16cid w16 w16cex w16sdtdh wp14">
+<w:document xmlns:wpc="http://schemas.microsoft.com/office/word/2010/wordprocessingCanvas" xmlns:cx="http://schemas.microsoft.com/office/drawing/2014/chartex" xmlns:cx1="http://schemas.microsoft.com/office/drawing/2015/9/8/chartex" xmlns:cx2="http://schemas.microsoft.com/office/drawing/2015/10/21/chartex" xmlns:cx3="http://schemas.microsoft.com/office/drawing/2016/5/9/chartex" xmlns:cx4="http://schemas.microsoft.com/office/drawing/2016/5/10/chartex" xmlns:cx5="http://schemas.microsoft.com/office/drawing/2016/5/11/chartex" xmlns:cx6="http://schemas.microsoft.com/office/drawing/2016/5/12/chartex" xmlns:cx7="http://schemas.microsoft.com/office/drawing/2016/5/13/chartex" xmlns:cx8="http://schemas.microsoft.com/office/drawing/2016/5/14/chartex" xmlns:mc="http://schemas.openxmlformats.org/markup-compatibility/2006" xmlns:aink="http://schemas.microsoft.com/office/drawing/2016/ink" xmlns:am3d="http://schemas.microsoft.com/office/drawing/2017/model3d" xmlns:o="urn:schemas-microsoft-com:office:office" xmlns:oel="http://schemas.microsoft.com/office/2019/extlst" xmlns:r="http://schemas.openxmlformats.org/officeDocument/2006/relationships" xmlns:m="http://schemas.openxmlformats.org/officeDocument/2006/math" xmlns:v="urn:schemas-microsoft-com:vml" xmlns:wp14="http://schemas.microsoft.com/office/word/2010/wordprocessingDrawing" xmlns:wp="http://schemas.openxmlformats.org/drawingml/2006/wordprocessingDrawing" xmlns:w10="urn:schemas-microsoft-com:office:word" xmlns:w="http://schemas.openxmlformats.org/wordprocessingml/2006/main" xmlns:w14="http://schemas.microsoft.com/office/word/2010/wordml" xmlns:w15="http://schemas.microsoft.com/office/word/2012/wordml" xmlns:w16cei="http://schemas.microsoft.com/office/word/2026/wordml/cei" xmlns:w16cex="http://schemas.microsoft.com/office/word/2018/wordml/cex" xmlns:w16cid="http://schemas.microsoft.com/office/word/2016/wordml/cid" xmlns:w16="http://schemas.microsoft.com/office/word/2018/wordml" xmlns:w16du="http://schemas.microsoft.com/office/word/2023/wordml/word16du" xmlns:w16sdtdh="http://schemas.microsoft.com/office/word/2020/wordml/sdtdatahash" xmlns:w16sdtfl="http://schemas.microsoft.com/office/word/2024/wordml/sdtformatlock" xmlns:w16se="http://schemas.microsoft.com/office/word/2015/wordml/symex" xmlns:wpg="http://schemas.microsoft.com/office/word/2010/wordprocessingGroup" xmlns:wpi="http://schemas.microsoft.com/office/word/2010/wordprocessingInk" xmlns:wne="http://schemas.microsoft.com/office/word/2006/wordml" xmlns:wps="http://schemas.microsoft.com/office/word/2010/wordprocessingShape" mc:Ignorable="w14 w15 w16se w16cid w16 w16cex w16sdtdh w16sdtfl w16du wp14">
   <w:body>
     <w:p>
       <w:pPr>
@@ -4473,7 +4473,7 @@
     <w:p>
       <w:pPr>
         <w:pStyle w:val="Textoindependiente"/>
-        <w:spacing w:before="240" w:line="276" w:lineRule="auto"/>
+        <w:spacing w:after="240" w:line="276" w:lineRule="auto"/>
         <w:ind w:left="0" w:firstLine="709"/>
         <w:rPr>
           <w:rFonts w:ascii="Arial" w:eastAsiaTheme="minorHAnsi" w:hAnsi="Arial" w:cs="Arial"/>
@@ -4485,13 +4485,27 @@
           <w:rFonts w:ascii="Arial" w:eastAsiaTheme="minorHAnsi" w:hAnsi="Arial" w:cs="Arial"/>
           <w:lang w:val="es-419" w:eastAsia="es-GT"/>
         </w:rPr>
-        <w:t>En Guatemala, el Ministerio de Salud Pública y Asistencia Social (MSPAS) es la entidad rectora encargada de formular las políticas y hacer cumplir el régimen jurídico relativo a la salud preventiva y curativa de la población (MSPAS, s.f.). Dentro de su estructura organizativa, la Dirección General de Salud concentra las funciones de epidemiología, salud ambiental y atención primaria, mientras que unidades especializadas, entre ellas la Unidad de Vacunación, son responsables de coordinar los programas de inmunización a nivel nacional. En este contexto, con la entrada en vigencia del Decreto 25-2024, Ley de Vacunación, el Estado guatemalteco fortaleció el marco legal en materia de inmunización, garantizando el acceso universal y gratuito a las vacunas para toda la población y estableciendo la obligación del MSPAS de actualizar anualmente un esquema nacional de vacunación adaptado a las necesidades epidemiológicas del país (Congreso de la República de Guatemala, Decreto 25-2024).</w:t>
+        <w:t xml:space="preserve">En Guatemala, el Ministerio de Salud Pública y Asistencia Social (MSPAS) es la entidad rectora encargada de formular las políticas y hacer cumplir el régimen jurídico relativo a la salud preventiva y curativa de la población (MSPAS, s.f.). Dentro de su estructura organizativa, la Dirección General de Salud concentra las funciones de epidemiología, salud ambiental y atención primaria, mientras que unidades especializadas, entre ellas la Unidad de Vacunación, son responsables de coordinar los programas de inmunización a nivel nacional. En este contexto, con la </w:t>
+      </w:r>
+      <w:r>
+        <w:rPr>
+          <w:rFonts w:ascii="Arial" w:eastAsiaTheme="minorHAnsi" w:hAnsi="Arial" w:cs="Arial"/>
+          <w:lang w:val="es-419" w:eastAsia="es-GT"/>
+        </w:rPr>
+        <w:t>entrada en vigor</w:t>
+      </w:r>
+      <w:r>
+        <w:rPr>
+          <w:rFonts w:ascii="Arial" w:eastAsiaTheme="minorHAnsi" w:hAnsi="Arial" w:cs="Arial"/>
+          <w:lang w:val="es-419" w:eastAsia="es-GT"/>
+        </w:rPr>
+        <w:t xml:space="preserve"> del Decreto 25-2024, Ley de Vacunación, el Estado guatemalteco fortaleció el marco legal en materia de inmunización, garantizando el acceso universal y gratuito a las vacunas para toda la población y estableciendo la obligación del MSPAS de actualizar anualmente un esquema nacional de vacunación adaptado a las necesidades epidemiológicas del país (Congreso de la República de Guatemala, Decreto 25-2024).</w:t>
       </w:r>
     </w:p>
     <w:p>
       <w:pPr>
         <w:pStyle w:val="Textoindependiente"/>
-        <w:spacing w:before="240" w:line="276" w:lineRule="auto"/>
+        <w:spacing w:after="240" w:line="276" w:lineRule="auto"/>
         <w:ind w:left="0" w:firstLine="709"/>
         <w:rPr>
           <w:rFonts w:ascii="Arial" w:eastAsiaTheme="minorHAnsi" w:hAnsi="Arial" w:cs="Arial"/>
@@ -4503,14 +4517,14 @@
           <w:rFonts w:ascii="Arial" w:eastAsiaTheme="minorHAnsi" w:hAnsi="Arial" w:cs="Arial"/>
           <w:lang w:val="es-419" w:eastAsia="es-GT"/>
         </w:rPr>
-        <w:t>Para la administración territorial de los servicios de salud, el país se encuentra dividido en 29 áreas de salud (MSPAS, 2018), cada una a cargo de una Dirección de Área de Salud responsable de la gerencia de los distritos municipales que la integran, así como de la coordinación de los establecimientos sanitarios de su jurisdicción, entre ellos hospitales, centros de salud, puestos de salud y unidades mínimas. Esta estructura busca garantizar que las políticas y programas definidos a nivel central, entre ellos el Programa Nacional de Inmunizaciones, se ejecuten de manera uniforme en cada uno de los departamentos del país.</w:t>
+        <w:t>Para la administración territorial de los servicios de salud, el país se encuentra organizado en Direcciones Departamentales de Redes Integradas de Servicios de Salud (DRISS), antes conocidas como Direcciones de Área de Salud, cada una responsable de la gerencia de los distritos municipales que la integran y de la coordinación de los establecimientos sanitarios de su jurisdicción. Esta estructura busca garantizar que las políticas y programas definidos a nivel central, entre ellos el Programa Nacional de Inmunizaciones, se ejecuten de manera uniforme en cada uno de los departamentos del país.</w:t>
       </w:r>
     </w:p>
     <w:p>
       <w:pPr>
         <w:pStyle w:val="Textoindependiente"/>
-        <w:spacing w:before="240" w:line="276" w:lineRule="auto"/>
-        <w:ind w:left="0" w:firstLine="708"/>
+        <w:spacing w:after="240" w:line="276" w:lineRule="auto"/>
+        <w:ind w:left="0" w:firstLine="709"/>
         <w:rPr>
           <w:rFonts w:ascii="Arial" w:eastAsiaTheme="minorHAnsi" w:hAnsi="Arial" w:cs="Arial"/>
           <w:lang w:val="es-419" w:eastAsia="es-GT"/>
@@ -4521,13 +4535,13 @@
           <w:rFonts w:ascii="Arial" w:eastAsiaTheme="minorHAnsi" w:hAnsi="Arial" w:cs="Arial"/>
           <w:lang w:val="es-419" w:eastAsia="es-GT"/>
         </w:rPr>
-        <w:t>El departamento de San Marcos, ubicado en la región suroccidental de Guatemala, está conformado por 30 municipios (SCEP, 2023) y es administrado en materia de salud por la Dirección de Área de Salud de San Marcos, con sede en la cabecera departamental. Esta dirección coordina los distritos municipales de salud correspondientes a cada municipio, así como los establecimientos que los integran, entre ellos el Hospital Nacional de San Marcos como centro de referencia hospitalaria departamental, además de los centros de salud, puestos de salud y unidades mínimas distribuidos en las distintas cabeceras municipales y comunidades rurales (MSPAS, s.f.). Debido a la extensión territorial del departamento y a la cantidad de establecimientos bajo su jurisdicción, la coordinación de procesos administrativos, entre ellos el control de insumos médicos como las vacunas, representa un reto logístico considerable para las autoridades departamentales de salud.</w:t>
+        <w:t>El departamento de San Marcos, ubicado en la región suroccidental de Guatemala, está conformado por 30 municipios (SCEP, 2023) y es administrado en materia de salud por la Dirección Departamental de Redes Integradas de Servicios de Salud de San Marcos (DRISS San Marcos), con sede en la cabecera departamental. Esta dirección coordina los distritos municipales de salud correspondientes a cada municipio, así como los establecimientos que los integran, entre ellos hospitales, centros de salud, puestos de salud y unidades mínimas distribuidos en las distintas cabeceras municipales y comunidades rurales.</w:t>
       </w:r>
     </w:p>
     <w:p>
       <w:pPr>
         <w:pStyle w:val="Textoindependiente"/>
-        <w:spacing w:before="240" w:line="276" w:lineRule="auto"/>
+        <w:spacing w:after="240" w:line="276" w:lineRule="auto"/>
         <w:ind w:left="0" w:firstLine="709"/>
         <w:rPr>
           <w:rFonts w:ascii="Arial" w:eastAsiaTheme="minorHAnsi" w:hAnsi="Arial" w:cs="Arial"/>
@@ -4539,7 +4553,7 @@
           <w:rFonts w:ascii="Arial" w:eastAsiaTheme="minorHAnsi" w:hAnsi="Arial" w:cs="Arial"/>
           <w:lang w:val="es-419" w:eastAsia="es-GT"/>
         </w:rPr>
-        <w:t xml:space="preserve">Si bien el MSPAS dispone del Sistema de Información Gerencial en Salud (SIGSA) para el registro y consulta de indicadores de vacunación a nivel nacional </w:t>
+        <w:t xml:space="preserve">Cada uno de los 30 municipios del departamento está obligado a reportar mensualmente a la DRISS San Marcos la cantidad de vacunas administradas a la población, mediante un formulario oficial del MSPAS conocido como "5C" o "Consolidado Mensual de Vacunación" (Formulario SIGSA-S5c). En este formulario, cada centro de salud registra, por tipo de vacuna, dosis, sexo y grupo de edad, la cantidad de personas del propio municipio que fueron vacunadas, la cantidad de personas de otros municipios que fueron vacunadas ahí, y el total de dosis </w:t>
       </w:r>
       <w:r>
         <w:rPr>
@@ -4547,27 +4561,31 @@
           <w:lang w:val="es-419" w:eastAsia="es-GT"/>
         </w:rPr>
         <w:lastRenderedPageBreak/>
-        <w:t>(MSPAS, s.f.), esta herramienta está orientada principalmente a la consolidación estadística de coberturas de vacunación por municipio, y no constituye un sistema operativo que permita a cada centro de salud registrar, controlar y visualizar en tiempo real la disponibilidad de sus propias existencias de vacunas. Esta necesidad no se encuentra cubierta de manera eficiente en la actualidad dentro de los centros de salud del departamento de San Marcos, los cuales carecen de un sistema centralizado</w:t>
-      </w:r>
-      <w:r>
+        <w:t>administradas (M. Solís, comunicación personal, 7 de agosto de 2026).</w:t>
+      </w:r>
+    </w:p>
+    <w:p>
+      <w:pPr>
+        <w:pStyle w:val="Textoindependiente"/>
+        <w:spacing w:after="240" w:line="276" w:lineRule="auto"/>
+        <w:ind w:left="0" w:firstLine="709"/>
         <w:rPr>
           <w:rFonts w:ascii="Arial" w:eastAsiaTheme="minorHAnsi" w:hAnsi="Arial" w:cs="Arial"/>
           <w:lang w:val="es-419" w:eastAsia="es-GT"/>
         </w:rPr>
-        <w:t xml:space="preserve"> y distrital</w:t>
-      </w:r>
+      </w:pPr>
       <w:r>
         <w:rPr>
           <w:rFonts w:ascii="Arial" w:eastAsiaTheme="minorHAnsi" w:hAnsi="Arial" w:cs="Arial"/>
           <w:lang w:val="es-419" w:eastAsia="es-GT"/>
         </w:rPr>
-        <w:t xml:space="preserve"> propio que permita registrar y consultar la disponibilidad de vacunas de forma estandarizada.</w:t>
+        <w:t>El formulario 5C, vigente desde 2014, ha quedado obsoleto frente a la cantidad de vacunas que se manejan actualmente, ya que su estructura no permite incorporar nuevos tipos de vacunas ni modificaciones en la manera en que estas se clasifican. Debido a esta limitación, no todos los centros de salud del departamento entregan la información en un formato verdaderamente estandarizado, ya que algunos elaboran informes personalizados para poder reflejar los cambios que el formulario oficial no contempla (M. Solís, comunicación personal, 7 de agosto de 2026).</w:t>
       </w:r>
     </w:p>
     <w:p>
       <w:pPr>
         <w:pStyle w:val="Textoindependiente"/>
-        <w:spacing w:before="240" w:line="276" w:lineRule="auto"/>
+        <w:spacing w:after="240" w:line="276" w:lineRule="auto"/>
         <w:ind w:left="0" w:firstLine="709"/>
         <w:rPr>
           <w:rFonts w:ascii="Arial" w:eastAsiaTheme="minorHAnsi" w:hAnsi="Arial" w:cs="Arial"/>
@@ -4579,13 +4597,13 @@
           <w:rFonts w:ascii="Arial" w:eastAsiaTheme="minorHAnsi" w:hAnsi="Arial" w:cs="Arial"/>
           <w:lang w:val="es-419" w:eastAsia="es-GT"/>
         </w:rPr>
-        <w:t>Actualmente, los centros de salud del departamento de San Marcos administran su información de manera independiente, utilizando formatos distintos y herramientas básicas, como hojas de cálculo aisladas, sin un formato unificado para el registro de vacunas. Cada centro maneja sus propios criterios para clasificar la información, lo cual impide la integración y consolidación de datos a nivel departamental. Esta situación provoca inconsistencias en los registros, duplicidad de información y dificultades para conocer con exactitud la cantidad de vacunas disponibles en cada municipio, así como su clasificación según la población a la que están destinadas, afectando directamente la confiabilidad de la información y la eficiencia de los procesos administrativos relacionados con su control.</w:t>
+        <w:t>Actualmente, la consolidación de esta información depende por completo de un proceso manual: la estadígrafa de la DRISS San Marcos recibe las 30 hojas 5C físicas y las digitaliza en tres archivos de Excel independientes, utilizados desde hace más de 15 años. El primero registra la producción de cada municipio a su propia población; el segundo, la producción brindada a personas de otros municipios; y el tercero consolida el total de vacunas administradas por cada centro, el cual es la base para generar el informe de cobertura mensual. Cabe destacar que SIGSA, el sistema oficial del MSPAS, no cubre esta necesidad, ya que está orientado a reportar las vacunas suministradas para su distribución y no las vacunas efectivamente administradas a la población (M. Solís, comunicación personal, 7 de agosto de 2026).</w:t>
       </w:r>
     </w:p>
     <w:p>
       <w:pPr>
         <w:pStyle w:val="Textoindependiente"/>
-        <w:spacing w:before="240" w:line="276" w:lineRule="auto"/>
+        <w:spacing w:after="240" w:line="276" w:lineRule="auto"/>
         <w:ind w:left="0" w:firstLine="709"/>
         <w:rPr>
           <w:rFonts w:ascii="Arial" w:eastAsiaTheme="minorHAnsi" w:hAnsi="Arial" w:cs="Arial"/>
@@ -4597,13 +4615,13 @@
           <w:rFonts w:ascii="Arial" w:eastAsiaTheme="minorHAnsi" w:hAnsi="Arial" w:cs="Arial"/>
           <w:lang w:val="es-419" w:eastAsia="es-GT"/>
         </w:rPr>
-        <w:t>Como consecuencia de esta problemática, se genera una gestión ineficiente de las vacunas, lo cual puede derivar en desabastecimiento en algunos centros de salud, mientras que en otros se presenta acumulación innecesaria de dosis, incluyendo dosis que llegan a vencerse por falta de visibilidad sobre sus fechas de caducidad. Esta falta de visibilidad impide una adecuada toma de decisiones por parte de las autoridades de salud, limitando la capacidad de respuesta ante campañas de vacunación, brotes epidemiológicos o necesidades específicas de la población, y dificulta la planificación estratégica para la distribución equitativa de vacunas dentro del departamento.</w:t>
+        <w:t>Al inicio de cada mes, la DRISS San Marcos cita a un representante de cada uno de los 30 municipios, a razón de 10 personas por día durante tres días, para que verifiquen que la estadígrafa digite correctamente los datos de sus hojas 5C en el primero de los tres archivos de Excel. Una vez recibida y verificada esta información, la estadígrafa dispone del resto del mes para completar los dos archivos restantes y consolidar el archivo de cobertura antes de que finalice el mes, el cual es el que utiliza la epidemióloga para las reuniones del consejo técnico. Este proceso representa una carga de trabajo considerable, concentrada casi en su totalidad en una sola persona. Al respecto, la estadígrafa encargada del proceso señaló que un sistema que automatizara este trabajo le permitiría reducir el tiempo invertido en el ingreso y revisión de la información, así como evitar las llamadas y las interrupciones a reuniones que debe atender actualmente para resolver dudas sobre el proceso (A. Floria, comunicación personal, 7 de agosto de 2026).</w:t>
       </w:r>
     </w:p>
     <w:p>
       <w:pPr>
         <w:pStyle w:val="Textoindependiente"/>
-        <w:spacing w:before="240" w:line="276" w:lineRule="auto"/>
+        <w:spacing w:after="240" w:line="276" w:lineRule="auto"/>
         <w:ind w:left="0" w:firstLine="709"/>
         <w:rPr>
           <w:rFonts w:ascii="Arial" w:eastAsiaTheme="minorHAnsi" w:hAnsi="Arial" w:cs="Arial"/>
@@ -4615,96 +4633,51 @@
           <w:rFonts w:ascii="Arial" w:eastAsiaTheme="minorHAnsi" w:hAnsi="Arial" w:cs="Arial"/>
           <w:lang w:val="es-419" w:eastAsia="es-GT"/>
         </w:rPr>
-        <w:t>Ante esta problemática, se propone el desarrollo de una aplicación web</w:t>
+        <w:t xml:space="preserve">El informe de cobertura resultante de este proceso es utilizado mensualmente por el área de epidemiología de la DRISS San Marcos para dar a conocer, durante reuniones multidisciplinarias, el avance de cada municipio frente a la meta de cobertura de vacunación definida por el MSPAS, la cual debe superar el 95% a nivel departamental de forma homogénea entre todos los municipios. Al </w:t>
       </w:r>
       <w:r>
         <w:rPr>
           <w:rFonts w:ascii="Arial" w:eastAsiaTheme="minorHAnsi" w:hAnsi="Arial" w:cs="Arial"/>
           <w:lang w:val="es-419" w:eastAsia="es-GT"/>
         </w:rPr>
-        <w:t xml:space="preserve">, </w:t>
-      </w:r>
-      <w:r>
+        <w:lastRenderedPageBreak/>
+        <w:t>depender de un proceso manual y propenso a errores, la generación oportuna y confiable de este informe se ve directamente afectada, dificultando el seguimiento adecuado del cumplimiento de esta meta.</w:t>
+      </w:r>
+    </w:p>
+    <w:p>
+      <w:pPr>
+        <w:pStyle w:val="Textoindependiente"/>
+        <w:spacing w:after="240" w:line="276" w:lineRule="auto"/>
+        <w:ind w:left="0" w:firstLine="709"/>
         <w:rPr>
           <w:rFonts w:ascii="Arial" w:eastAsiaTheme="minorHAnsi" w:hAnsi="Arial" w:cs="Arial"/>
           <w:lang w:val="es-419" w:eastAsia="es-GT"/>
         </w:rPr>
-        <w:t>que permita a los centros de salud del departamento</w:t>
-      </w:r>
+      </w:pPr>
       <w:r>
         <w:rPr>
           <w:rFonts w:ascii="Arial" w:eastAsiaTheme="minorHAnsi" w:hAnsi="Arial" w:cs="Arial"/>
           <w:lang w:val="es-419" w:eastAsia="es-GT"/>
         </w:rPr>
-        <w:t xml:space="preserve"> de San Marcos</w:t>
-      </w:r>
-      <w:r>
+        <w:t>Ante esta problemática, se propone el desarrollo de una aplicación web centralizada para la DRISS San Marcos, que permita a los centros de salud del departamento registrar directamente la producción de vacunación reportada en sus hojas 5C, sustituyendo el uso de los archivos de Excel utilizados actualmente y optimizando los tiempos de digitación y análisis de la información. El sistema estandarizará el registro por tipo de vacuna, dosis, sexo y grupo de edad, e incluirá un módulo para el registro de nuevos centros de salud e instituciones, como hospitales, que se integren al sistema, además de generar de forma automática el informe de cobertura mensual por municipio.</w:t>
+      </w:r>
+    </w:p>
+    <w:p>
+      <w:pPr>
+        <w:pStyle w:val="Textoindependiente"/>
+        <w:spacing w:after="240" w:line="276" w:lineRule="auto"/>
+        <w:ind w:left="0" w:firstLine="709"/>
         <w:rPr>
           <w:rFonts w:ascii="Arial" w:eastAsiaTheme="minorHAnsi" w:hAnsi="Arial" w:cs="Arial"/>
           <w:lang w:val="es-419" w:eastAsia="es-GT"/>
         </w:rPr>
-        <w:t xml:space="preserve"> registrar y consultar sus existencias de vacunas mediante un formato estandarizado, incluyendo el control de entradas y salidas, alertas de stock bajo y seguimiento a las fechas de vencimiento. El acceso al sistema se coordinará desde el centro de salud principal de la cabecera departamental, encargado de distribuir el enlace de la aplicación hacia los demás centros de salud municipales, quienes contarán cada uno con un encargado responsable del registro y actualización de la información.</w:t>
-      </w:r>
-    </w:p>
-    <w:p>
-      <w:pPr>
-        <w:pStyle w:val="Textoindependiente"/>
-        <w:spacing w:before="240" w:after="240" w:line="276" w:lineRule="auto"/>
-        <w:ind w:left="0" w:firstLine="709"/>
+      </w:pPr>
+      <w:r>
         <w:rPr>
           <w:rFonts w:ascii="Arial" w:eastAsiaTheme="minorHAnsi" w:hAnsi="Arial" w:cs="Arial"/>
           <w:lang w:val="es-419" w:eastAsia="es-GT"/>
         </w:rPr>
-      </w:pPr>
-      <w:r>
-        <w:rPr>
-          <w:rFonts w:ascii="Arial" w:eastAsiaTheme="minorHAnsi" w:hAnsi="Arial" w:cs="Arial"/>
-          <w:lang w:val="es-419" w:eastAsia="es-GT"/>
-        </w:rPr>
-        <w:t xml:space="preserve">La implementación de esta solución permitirá mejorar significativamente la organización, el control y la disponibilidad de la información relacionada con las vacunas. Se beneficiará directamente al personal encargado de la gestión </w:t>
-      </w:r>
-      <w:r>
-        <w:rPr>
-          <w:rFonts w:ascii="Arial" w:eastAsiaTheme="minorHAnsi" w:hAnsi="Arial" w:cs="Arial"/>
-          <w:lang w:val="es-419" w:eastAsia="es-GT"/>
-        </w:rPr>
-        <w:t>de estas</w:t>
-      </w:r>
-      <w:r>
-        <w:rPr>
-          <w:rFonts w:ascii="Arial" w:eastAsiaTheme="minorHAnsi" w:hAnsi="Arial" w:cs="Arial"/>
-          <w:lang w:val="es-419" w:eastAsia="es-GT"/>
-        </w:rPr>
-        <w:t>,</w:t>
-      </w:r>
-      <w:r>
-        <w:rPr>
-          <w:rFonts w:ascii="Arial" w:eastAsiaTheme="minorHAnsi" w:hAnsi="Arial" w:cs="Arial"/>
-          <w:lang w:val="es-419" w:eastAsia="es-GT"/>
-        </w:rPr>
-        <w:t xml:space="preserve"> </w:t>
-      </w:r>
-      <w:r>
-        <w:rPr>
-          <w:rFonts w:ascii="Arial" w:eastAsiaTheme="minorHAnsi" w:hAnsi="Arial" w:cs="Arial"/>
-          <w:lang w:val="es-419" w:eastAsia="es-GT"/>
-        </w:rPr>
-        <w:lastRenderedPageBreak/>
-        <w:t>así como a las autoridades de</w:t>
-      </w:r>
-      <w:r>
-        <w:rPr>
-          <w:rFonts w:ascii="Arial" w:eastAsiaTheme="minorHAnsi" w:hAnsi="Arial" w:cs="Arial"/>
-          <w:lang w:val="es-419" w:eastAsia="es-GT"/>
-        </w:rPr>
-        <w:t xml:space="preserve">l Centro de Salud de </w:t>
-      </w:r>
-      <w:r>
-        <w:rPr>
-          <w:rFonts w:ascii="Arial" w:eastAsiaTheme="minorHAnsi" w:hAnsi="Arial" w:cs="Arial"/>
-          <w:lang w:val="es-419" w:eastAsia="es-GT"/>
-        </w:rPr>
-        <w:t>San Marcos, responsables de la toma de decisiones, quienes podrán contar con datos confiables y actualizados en tiempo oportuno. En consecuencia, se contribuirá a una mejor distribución de las vacunas en el departamento, reduciendo el riesgo de desabastecimiento y de pérdida de dosis por vencimiento, y fortaleciendo la atención en salud para la población.</w:t>
+        <w:t>La implementación de esta solución permitirá reducir significativamente la carga de trabajo manual que actualmente recae sobre la estadígrafa de la DRISS San Marcos, agilizando además la revisión de la información por parte del encargado de tecnología antes de que esta llegue a la epidemióloga responsable del análisis. De esta manera, se espera contar con información de cobertura de vacunación más oportuna, confiable y estandarizada entre los 30 municipios del departamento, fortaleciendo el seguimiento del cumplimiento de las metas de cobertura establecidas por el MSPAS.</w:t>
       </w:r>
     </w:p>
     <w:p>
@@ -4715,9 +4688,6 @@
           <w:numId w:val="1"/>
         </w:numPr>
       </w:pPr>
-      <w:r>
-        <w:t xml:space="preserve"> </w:t>
-      </w:r>
       <w:bookmarkStart w:id="4" w:name="_Toc236848962"/>
       <w:r>
         <w:t>Antecedentes</w:t>
@@ -4898,6 +4868,7 @@
           <w:rFonts w:ascii="Arial" w:eastAsiaTheme="minorHAnsi" w:hAnsi="Arial" w:cs="Arial"/>
           <w:lang w:val="es-419" w:eastAsia="es-GT"/>
         </w:rPr>
+        <w:lastRenderedPageBreak/>
         <w:t xml:space="preserve">En los centros de salud del departamento de San Marcos también se utiliza el SIGSA para el registro de la vacunación aplicada a la población; sin embargo, para el control interno de las existencias de vacunas, hasta el momento el único método confirmado es el registro físico en hojas de papel, el cual constituye la principal causa de las dificultades que existen actualmente para el manejo de esta información. A </w:t>
       </w:r>
       <w:r>
@@ -4973,7 +4944,6 @@
           <w:rFonts w:ascii="Arial" w:eastAsiaTheme="minorHAnsi" w:hAnsi="Arial" w:cs="Arial"/>
           <w:lang w:val="es-419" w:eastAsia="es-GT"/>
         </w:rPr>
-        <w:lastRenderedPageBreak/>
         <w:t>El uso del registro físico, como único método, ha presentado dificultades para el manejo de la información, por las siguientes razones:</w:t>
       </w:r>
     </w:p>
@@ -5126,6 +5096,7 @@
           <w:bCs/>
           <w:lang w:val="es-419" w:eastAsia="es-GT"/>
         </w:rPr>
+        <w:lastRenderedPageBreak/>
         <w:t>Escuela de Ingeniería en Ciencias y Sistemas, Universidad de San Carlos de Guatemala. (2022). Software para el control de vacunación en Guatemala.</w:t>
       </w:r>
     </w:p>
@@ -5170,7 +5141,6 @@
           <w:bCs/>
           <w:lang w:val="es-419" w:eastAsia="es-GT"/>
         </w:rPr>
-        <w:lastRenderedPageBreak/>
         <w:t>Sistema web de ventas e inventario de la botica institucional de la Red de Salud Valle del Mantaro</w:t>
       </w:r>
       <w:r>
@@ -5279,7 +5249,15 @@
           <w:rFonts w:ascii="Arial" w:eastAsiaTheme="minorHAnsi" w:hAnsi="Arial" w:cs="Arial"/>
           <w:lang w:val="es-419" w:eastAsia="es-GT"/>
         </w:rPr>
-        <w:t>En el mercado se identificaron diversas herramientas relacionadas con el registro y control de vacunas, las cuales presentan una solución parcial al problema planteado, pero no pueden ser adoptadas directamente por los centros de salud del departamento de San Marcos debido a algunas de las siguientes limitaciones:</w:t>
+        <w:t xml:space="preserve">En el mercado se identificaron diversas herramientas relacionadas con el registro y control de vacunas, las cuales presentan una solución parcial al problema planteado, pero no pueden ser adoptadas directamente por los centros de salud del </w:t>
+      </w:r>
+      <w:r>
+        <w:rPr>
+          <w:rFonts w:ascii="Arial" w:eastAsiaTheme="minorHAnsi" w:hAnsi="Arial" w:cs="Arial"/>
+          <w:lang w:val="es-419" w:eastAsia="es-GT"/>
+        </w:rPr>
+        <w:lastRenderedPageBreak/>
+        <w:t>departamento de San Marcos debido a algunas de las siguientes limitaciones:</w:t>
       </w:r>
     </w:p>
     <w:p>
@@ -5406,15 +5384,7 @@
           <w:rFonts w:ascii="Arial" w:eastAsiaTheme="minorHAnsi" w:hAnsi="Arial" w:cs="Arial"/>
           <w:lang w:val="es-419" w:eastAsia="es-GT"/>
         </w:rPr>
-        <w:t xml:space="preserve"> las herramientas existentes permiten administrar determinados aspectos de la vacunación, ninguna responde completamente a las necesidades del proyecto. A continuación, se describen algunas de las principales herramientas identificadas y se analiza su </w:t>
-      </w:r>
-      <w:r>
-        <w:rPr>
-          <w:rFonts w:ascii="Arial" w:eastAsiaTheme="minorHAnsi" w:hAnsi="Arial" w:cs="Arial"/>
-          <w:lang w:val="es-419" w:eastAsia="es-GT"/>
-        </w:rPr>
-        <w:lastRenderedPageBreak/>
-        <w:t>relación con la problemática planteada.</w:t>
+        <w:t xml:space="preserve"> las herramientas existentes permiten administrar determinados aspectos de la vacunación, ninguna responde completamente a las necesidades del proyecto. A continuación, se describen algunas de las principales herramientas identificadas y se analiza su relación con la problemática planteada.</w:t>
       </w:r>
     </w:p>
     <w:p>
@@ -5545,7 +5515,15 @@
           <w:rFonts w:ascii="Arial" w:eastAsiaTheme="minorHAnsi" w:hAnsi="Arial" w:cs="Arial"/>
           <w:lang w:val="es-GT" w:eastAsia="es-GT"/>
         </w:rPr>
-        <w:t>, s.f.). Incluye un módulo específico de cadena de frío que permite monitorear el estado de los refrigeradores y dar seguimiento al historial de cada lote de vacunas desde su adquisición hasta su aplicación. Sin embargo, al tratarse de una plataforma diseñada para cadenas de suministro nacionales de varios niveles, su implementación requiere infraestructura de servidor propia y personal con conocimientos técnicos para instalarla, configurarla y mantenerla, y no cuenta con un proveedor local en Guatemala que brinde soporte o capacitación. Estas condiciones representan una barrera considerable para su adopción directa por parte de los centros de salud del departamento de San Marcos, donde no se cuenta con personal técnico dedicado a la administración de este tipo de sistemas.</w:t>
+        <w:t xml:space="preserve">, s.f.). Incluye un módulo específico de cadena de frío que permite monitorear el estado de los refrigeradores y dar seguimiento al historial de cada lote de vacunas desde su adquisición hasta su aplicación. Sin embargo, al tratarse de una plataforma diseñada para cadenas de suministro nacionales de varios niveles, su implementación requiere infraestructura de servidor propia y personal con </w:t>
+      </w:r>
+      <w:r>
+        <w:rPr>
+          <w:rFonts w:ascii="Arial" w:eastAsiaTheme="minorHAnsi" w:hAnsi="Arial" w:cs="Arial"/>
+          <w:lang w:val="es-GT" w:eastAsia="es-GT"/>
+        </w:rPr>
+        <w:lastRenderedPageBreak/>
+        <w:t>conocimientos técnicos para instalarla, configurarla y mantenerla, y no cuenta con un proveedor local en Guatemala que brinde soporte o capacitación. Estas condiciones representan una barrera considerable para su adopción directa por parte de los centros de salud del departamento de San Marcos, donde no se cuenta con personal técnico dedicado a la administración de este tipo de sistemas.</w:t>
       </w:r>
     </w:p>
     <w:p>
@@ -5589,15 +5567,7 @@
           <w:rFonts w:ascii="Arial" w:eastAsiaTheme="minorHAnsi" w:hAnsi="Arial" w:cs="Arial"/>
           <w:lang w:val="es-419" w:eastAsia="es-GT"/>
         </w:rPr>
-        <w:t xml:space="preserve">En Colombia, el Ministerio de Salud utiliza el aplicativo PAIWEB como sistema único de información del Programa Ampliado de Inmunizaciones, el cual incluye un módulo de cadena de frío para la consulta y el registro del inventario de los biológicos e insumos utilizados en la vacunación (Ministerio de Salud y Protección Social de Colombia, s.f.). Aunque este módulo demuestra que es posible integrar el control de inventario de vacunas dentro de un sistema nacional de información, se trata de una plataforma diseñada y operada a nivel de país por el gobierno colombiano, por lo que no está disponible ni es adaptable para su uso por parte de un </w:t>
-      </w:r>
-      <w:r>
-        <w:rPr>
-          <w:rFonts w:ascii="Arial" w:eastAsiaTheme="minorHAnsi" w:hAnsi="Arial" w:cs="Arial"/>
-          <w:lang w:val="es-419" w:eastAsia="es-GT"/>
-        </w:rPr>
-        <w:lastRenderedPageBreak/>
-        <w:t>departamento de Guatemala como San Marcos.</w:t>
+        <w:t>En Colombia, el Ministerio de Salud utiliza el aplicativo PAIWEB como sistema único de información del Programa Ampliado de Inmunizaciones, el cual incluye un módulo de cadena de frío para la consulta y el registro del inventario de los biológicos e insumos utilizados en la vacunación (Ministerio de Salud y Protección Social de Colombia, s.f.). Aunque este módulo demuestra que es posible integrar el control de inventario de vacunas dentro de un sistema nacional de información, se trata de una plataforma diseñada y operada a nivel de país por el gobierno colombiano, por lo que no está disponible ni es adaptable para su uso por parte de un departamento de Guatemala como San Marcos.</w:t>
       </w:r>
     </w:p>
     <w:p>
@@ -5704,6 +5674,7 @@
           <w:rFonts w:ascii="Arial" w:eastAsiaTheme="minorHAnsi" w:hAnsi="Arial" w:cs="Arial"/>
           <w:lang w:val="es-419" w:eastAsia="es-GT"/>
         </w:rPr>
+        <w:lastRenderedPageBreak/>
         <w:t>Con la implementación del sistema web en los centros de salud del departamento de San Marcos, se beneficiará al personal encargado del registro</w:t>
       </w:r>
       <w:r>
@@ -5761,15 +5732,7 @@
           <w:rFonts w:ascii="Arial" w:eastAsiaTheme="minorHAnsi" w:hAnsi="Arial" w:cs="Arial"/>
           <w:lang w:val="es-419" w:eastAsia="es-GT"/>
         </w:rPr>
-        <w:t xml:space="preserve"> </w:t>
-      </w:r>
-      <w:r>
-        <w:rPr>
-          <w:rFonts w:ascii="Arial" w:eastAsiaTheme="minorHAnsi" w:hAnsi="Arial" w:cs="Arial"/>
-          <w:lang w:val="es-419" w:eastAsia="es-GT"/>
-        </w:rPr>
-        <w:lastRenderedPageBreak/>
-        <w:t>el personal de cada centro de salud capacitado en su uso, y las existencias de vacunas de todos los municipios integradas en la plataforma. Posterior a esto, el sistema podrá operar de manera óptima, evidenciando la mejora en el control y la disponibilidad de información sobre las vacunas en el departamento de San Marcos.</w:t>
+        <w:t xml:space="preserve"> el personal de cada centro de salud capacitado en su uso, y las existencias de vacunas de todos los municipios integradas en la plataforma. Posterior a esto, el sistema podrá operar de manera óptima, evidenciando la mejora en el control y la disponibilidad de información sobre las vacunas en el departamento de San Marcos.</w:t>
       </w:r>
     </w:p>
     <w:p>
@@ -6142,6 +6105,7 @@
           <w:rFonts w:ascii="Arial" w:eastAsiaTheme="minorHAnsi" w:hAnsi="Arial" w:cs="Arial"/>
           <w:lang w:val="es-419" w:eastAsia="es-GT"/>
         </w:rPr>
+        <w:lastRenderedPageBreak/>
         <w:t>Desarrollar la interfaz de usuario del sistema, integrando un módulo de exportación de reportes en formatos de datos estructurados, con el propósito de facilitar el análisis de la información al personal de salud.</w:t>
       </w:r>
     </w:p>
@@ -6590,51 +6554,25 @@
                             <w:r>
                               <w:t xml:space="preserve">Ilustración  </w:t>
                             </w:r>
-                            <w:r>
-                              <w:fldChar w:fldCharType="begin"/>
-                            </w:r>
-                            <w:r>
-                              <w:instrText xml:space="preserve"> SEQ Ilustración_ \* ARABIC </w:instrText>
-                            </w:r>
-                            <w:r>
-                              <w:fldChar w:fldCharType="separate"/>
-                            </w:r>
-                            <w:r>
-                              <w:rPr>
-                                <w:noProof/>
-                              </w:rPr>
-                              <w:t>2</w:t>
-                            </w:r>
-                            <w:r>
-                              <w:rPr>
-                                <w:noProof/>
-                              </w:rPr>
-                              <w:fldChar w:fldCharType="end"/>
-                            </w:r>
+                            <w:fldSimple w:instr=" SEQ Ilustración_ \* ARABIC ">
+                              <w:r>
+                                <w:rPr>
+                                  <w:noProof/>
+                                </w:rPr>
+                                <w:t>2</w:t>
+                              </w:r>
+                            </w:fldSimple>
                             <w:r>
                               <w:t xml:space="preserve"> Diagrama de contexto del sistemaIlustración  </w:t>
                             </w:r>
-                            <w:r>
-                              <w:fldChar w:fldCharType="begin"/>
-                            </w:r>
-                            <w:r>
-                              <w:instrText xml:space="preserve"> SEQ Ilustración_ \* ARABIC </w:instrText>
-                            </w:r>
-                            <w:r>
-                              <w:fldChar w:fldCharType="separate"/>
-                            </w:r>
-                            <w:r>
-                              <w:rPr>
-                                <w:noProof/>
-                              </w:rPr>
-                              <w:t>1</w:t>
-                            </w:r>
-                            <w:r>
-                              <w:rPr>
-                                <w:noProof/>
-                              </w:rPr>
-                              <w:fldChar w:fldCharType="end"/>
-                            </w:r>
+                            <w:fldSimple w:instr=" SEQ Ilustración_ \* ARABIC ">
+                              <w:r>
+                                <w:rPr>
+                                  <w:noProof/>
+                                </w:rPr>
+                                <w:t>1</w:t>
+                              </w:r>
+                            </w:fldSimple>
                             <w:r>
                               <w:t xml:space="preserve"> Diagrama de bloques del proyecto</w:t>
                             </w:r>
@@ -6723,51 +6661,25 @@
                       <w:r>
                         <w:t xml:space="preserve">Ilustración  </w:t>
                       </w:r>
-                      <w:r>
-                        <w:fldChar w:fldCharType="begin"/>
-                      </w:r>
-                      <w:r>
-                        <w:instrText xml:space="preserve"> SEQ Ilustración_ \* ARABIC </w:instrText>
-                      </w:r>
-                      <w:r>
-                        <w:fldChar w:fldCharType="separate"/>
-                      </w:r>
-                      <w:r>
-                        <w:rPr>
-                          <w:noProof/>
-                        </w:rPr>
-                        <w:t>2</w:t>
-                      </w:r>
-                      <w:r>
-                        <w:rPr>
-                          <w:noProof/>
-                        </w:rPr>
-                        <w:fldChar w:fldCharType="end"/>
-                      </w:r>
+                      <w:fldSimple w:instr=" SEQ Ilustración_ \* ARABIC ">
+                        <w:r>
+                          <w:rPr>
+                            <w:noProof/>
+                          </w:rPr>
+                          <w:t>2</w:t>
+                        </w:r>
+                      </w:fldSimple>
                       <w:r>
                         <w:t xml:space="preserve"> Diagrama de contexto del sistemaIlustración  </w:t>
                       </w:r>
-                      <w:r>
-                        <w:fldChar w:fldCharType="begin"/>
-                      </w:r>
-                      <w:r>
-                        <w:instrText xml:space="preserve"> SEQ Ilustración_ \* ARABIC </w:instrText>
-                      </w:r>
-                      <w:r>
-                        <w:fldChar w:fldCharType="separate"/>
-                      </w:r>
-                      <w:r>
-                        <w:rPr>
-                          <w:noProof/>
-                        </w:rPr>
-                        <w:t>1</w:t>
-                      </w:r>
-                      <w:r>
-                        <w:rPr>
-                          <w:noProof/>
-                        </w:rPr>
-                        <w:fldChar w:fldCharType="end"/>
-                      </w:r>
+                      <w:fldSimple w:instr=" SEQ Ilustración_ \* ARABIC ">
+                        <w:r>
+                          <w:rPr>
+                            <w:noProof/>
+                          </w:rPr>
+                          <w:t>1</w:t>
+                        </w:r>
+                      </w:fldSimple>
                       <w:r>
                         <w:t xml:space="preserve"> Diagrama de bloques del proyecto</w:t>
                       </w:r>
@@ -7387,27 +7299,14 @@
                             <w:r>
                               <w:t xml:space="preserve">Ilustración  </w:t>
                             </w:r>
-                            <w:r>
-                              <w:fldChar w:fldCharType="begin"/>
-                            </w:r>
-                            <w:r>
-                              <w:instrText xml:space="preserve"> SEQ Ilustración_ \* ARABIC </w:instrText>
-                            </w:r>
-                            <w:r>
-                              <w:fldChar w:fldCharType="separate"/>
-                            </w:r>
-                            <w:r>
-                              <w:rPr>
-                                <w:noProof/>
-                              </w:rPr>
-                              <w:t>2</w:t>
-                            </w:r>
-                            <w:r>
-                              <w:rPr>
-                                <w:noProof/>
-                              </w:rPr>
-                              <w:fldChar w:fldCharType="end"/>
-                            </w:r>
+                            <w:fldSimple w:instr=" SEQ Ilustración_ \* ARABIC ">
+                              <w:r>
+                                <w:rPr>
+                                  <w:noProof/>
+                                </w:rPr>
+                                <w:t>2</w:t>
+                              </w:r>
+                            </w:fldSimple>
                             <w:r>
                               <w:t>.2</w:t>
                             </w:r>
@@ -7430,57 +7329,28 @@
                             <w:r>
                               <w:t xml:space="preserve">Ilustración  </w:t>
                             </w:r>
-                            <w:r>
-                              <w:fldChar w:fldCharType="begin"/>
-                            </w:r>
-                            <w:r>
-                              <w:instrText xml:space="preserve"> SEQ Ilustración_ \* ARABIC </w:instrText>
-                            </w:r>
-                            <w:r>
-                              <w:fldChar w:fldCharType="separate"/>
-                            </w:r>
-                            <w:r>
-                              <w:rPr>
-                                <w:noProof/>
-                              </w:rPr>
-                              <w:t>3</w:t>
-                            </w:r>
-                            <w:r>
-                              <w:rPr>
-                                <w:noProof/>
-                              </w:rPr>
-                              <w:fldChar w:fldCharType="end"/>
-                            </w:r>
+                            <w:fldSimple w:instr=" SEQ Ilustración_ \* ARABIC ">
+                              <w:r>
+                                <w:rPr>
+                                  <w:noProof/>
+                                </w:rPr>
+                                <w:t>3</w:t>
+                              </w:r>
+                            </w:fldSimple>
                             <w:r>
                               <w:t xml:space="preserve"> </w:t>
                             </w:r>
                             <w:r>
-                              <w:t xml:space="preserve">Diagrama de flujo del </w:t>
+                              <w:t xml:space="preserve">Diagrama de flujo del sistemaIlustración  </w:t>
                             </w:r>
-                            <w:r>
-                              <w:t xml:space="preserve">sistemaIlustración  </w:t>
-                            </w:r>
-                            <w:r>
-                              <w:fldChar w:fldCharType="begin"/>
-                            </w:r>
-                            <w:r>
-                              <w:instrText xml:space="preserve"> SEQ Ilustración_ \* ARABIC </w:instrText>
-                            </w:r>
-                            <w:r>
-                              <w:fldChar w:fldCharType="separate"/>
-                            </w:r>
-                            <w:r>
-                              <w:rPr>
-                                <w:noProof/>
-                              </w:rPr>
-                              <w:t>2</w:t>
-                            </w:r>
-                            <w:r>
-                              <w:rPr>
-                                <w:noProof/>
-                              </w:rPr>
-                              <w:fldChar w:fldCharType="end"/>
-                            </w:r>
+                            <w:fldSimple w:instr=" SEQ Ilustración_ \* ARABIC ">
+                              <w:r>
+                                <w:rPr>
+                                  <w:noProof/>
+                                </w:rPr>
+                                <w:t>2</w:t>
+                              </w:r>
+                            </w:fldSimple>
                             <w:r>
                               <w:t xml:space="preserve"> Diagrama de contexto del sistema</w:t>
                             </w:r>
@@ -7523,27 +7393,14 @@
                       <w:r>
                         <w:t xml:space="preserve">Ilustración  </w:t>
                       </w:r>
-                      <w:r>
-                        <w:fldChar w:fldCharType="begin"/>
-                      </w:r>
-                      <w:r>
-                        <w:instrText xml:space="preserve"> SEQ Ilustración_ \* ARABIC </w:instrText>
-                      </w:r>
-                      <w:r>
-                        <w:fldChar w:fldCharType="separate"/>
-                      </w:r>
-                      <w:r>
-                        <w:rPr>
-                          <w:noProof/>
-                        </w:rPr>
-                        <w:t>2</w:t>
-                      </w:r>
-                      <w:r>
-                        <w:rPr>
-                          <w:noProof/>
-                        </w:rPr>
-                        <w:fldChar w:fldCharType="end"/>
-                      </w:r>
+                      <w:fldSimple w:instr=" SEQ Ilustración_ \* ARABIC ">
+                        <w:r>
+                          <w:rPr>
+                            <w:noProof/>
+                          </w:rPr>
+                          <w:t>2</w:t>
+                        </w:r>
+                      </w:fldSimple>
                       <w:r>
                         <w:t>.2</w:t>
                       </w:r>
@@ -7566,57 +7423,28 @@
                       <w:r>
                         <w:t xml:space="preserve">Ilustración  </w:t>
                       </w:r>
-                      <w:r>
-                        <w:fldChar w:fldCharType="begin"/>
-                      </w:r>
-                      <w:r>
-                        <w:instrText xml:space="preserve"> SEQ Ilustración_ \* ARABIC </w:instrText>
-                      </w:r>
-                      <w:r>
-                        <w:fldChar w:fldCharType="separate"/>
-                      </w:r>
-                      <w:r>
-                        <w:rPr>
-                          <w:noProof/>
-                        </w:rPr>
-                        <w:t>3</w:t>
-                      </w:r>
-                      <w:r>
-                        <w:rPr>
-                          <w:noProof/>
-                        </w:rPr>
-                        <w:fldChar w:fldCharType="end"/>
-                      </w:r>
+                      <w:fldSimple w:instr=" SEQ Ilustración_ \* ARABIC ">
+                        <w:r>
+                          <w:rPr>
+                            <w:noProof/>
+                          </w:rPr>
+                          <w:t>3</w:t>
+                        </w:r>
+                      </w:fldSimple>
                       <w:r>
                         <w:t xml:space="preserve"> </w:t>
                       </w:r>
                       <w:r>
-                        <w:t xml:space="preserve">Diagrama de flujo del </w:t>
+                        <w:t xml:space="preserve">Diagrama de flujo del sistemaIlustración  </w:t>
                       </w:r>
-                      <w:r>
-                        <w:t xml:space="preserve">sistemaIlustración  </w:t>
-                      </w:r>
-                      <w:r>
-                        <w:fldChar w:fldCharType="begin"/>
-                      </w:r>
-                      <w:r>
-                        <w:instrText xml:space="preserve"> SEQ Ilustración_ \* ARABIC </w:instrText>
-                      </w:r>
-                      <w:r>
-                        <w:fldChar w:fldCharType="separate"/>
-                      </w:r>
-                      <w:r>
-                        <w:rPr>
-                          <w:noProof/>
-                        </w:rPr>
-                        <w:t>2</w:t>
-                      </w:r>
-                      <w:r>
-                        <w:rPr>
-                          <w:noProof/>
-                        </w:rPr>
-                        <w:fldChar w:fldCharType="end"/>
-                      </w:r>
+                      <w:fldSimple w:instr=" SEQ Ilustración_ \* ARABIC ">
+                        <w:r>
+                          <w:rPr>
+                            <w:noProof/>
+                          </w:rPr>
+                          <w:t>2</w:t>
+                        </w:r>
+                      </w:fldSimple>
                       <w:r>
                         <w:t xml:space="preserve"> Diagrama de contexto del sistema</w:t>
                       </w:r>
@@ -8019,27 +7847,14 @@
                             <w:r>
                               <w:t>.</w:t>
                             </w:r>
-                            <w:r>
-                              <w:fldChar w:fldCharType="begin"/>
-                            </w:r>
-                            <w:r>
-                              <w:instrText xml:space="preserve"> SEQ Ilustración_ \* ARABIC </w:instrText>
-                            </w:r>
-                            <w:r>
-                              <w:fldChar w:fldCharType="separate"/>
-                            </w:r>
-                            <w:r>
-                              <w:rPr>
-                                <w:noProof/>
-                              </w:rPr>
-                              <w:t>3</w:t>
-                            </w:r>
-                            <w:r>
-                              <w:rPr>
-                                <w:noProof/>
-                              </w:rPr>
-                              <w:fldChar w:fldCharType="end"/>
-                            </w:r>
+                            <w:fldSimple w:instr=" SEQ Ilustración_ \* ARABIC ">
+                              <w:r>
+                                <w:rPr>
+                                  <w:noProof/>
+                                </w:rPr>
+                                <w:t>3</w:t>
+                              </w:r>
+                            </w:fldSimple>
                             <w:r>
                               <w:t xml:space="preserve"> </w:t>
                             </w:r>
@@ -8062,27 +7877,14 @@
                             <w:r>
                               <w:t xml:space="preserve">Ilustración  </w:t>
                             </w:r>
-                            <w:r>
-                              <w:fldChar w:fldCharType="begin"/>
-                            </w:r>
-                            <w:r>
-                              <w:instrText xml:space="preserve"> SEQ Ilustración_ \* ARABIC </w:instrText>
-                            </w:r>
-                            <w:r>
-                              <w:fldChar w:fldCharType="separate"/>
-                            </w:r>
-                            <w:r>
-                              <w:rPr>
-                                <w:noProof/>
-                              </w:rPr>
-                              <w:t>3</w:t>
-                            </w:r>
-                            <w:r>
-                              <w:rPr>
-                                <w:noProof/>
-                              </w:rPr>
-                              <w:fldChar w:fldCharType="end"/>
-                            </w:r>
+                            <w:fldSimple w:instr=" SEQ Ilustración_ \* ARABIC ">
+                              <w:r>
+                                <w:rPr>
+                                  <w:noProof/>
+                                </w:rPr>
+                                <w:t>3</w:t>
+                              </w:r>
+                            </w:fldSimple>
                             <w:r>
                               <w:t xml:space="preserve"> </w:t>
                             </w:r>
@@ -8131,27 +7933,14 @@
                       <w:r>
                         <w:t>.</w:t>
                       </w:r>
-                      <w:r>
-                        <w:fldChar w:fldCharType="begin"/>
-                      </w:r>
-                      <w:r>
-                        <w:instrText xml:space="preserve"> SEQ Ilustración_ \* ARABIC </w:instrText>
-                      </w:r>
-                      <w:r>
-                        <w:fldChar w:fldCharType="separate"/>
-                      </w:r>
-                      <w:r>
-                        <w:rPr>
-                          <w:noProof/>
-                        </w:rPr>
-                        <w:t>3</w:t>
-                      </w:r>
-                      <w:r>
-                        <w:rPr>
-                          <w:noProof/>
-                        </w:rPr>
-                        <w:fldChar w:fldCharType="end"/>
-                      </w:r>
+                      <w:fldSimple w:instr=" SEQ Ilustración_ \* ARABIC ">
+                        <w:r>
+                          <w:rPr>
+                            <w:noProof/>
+                          </w:rPr>
+                          <w:t>3</w:t>
+                        </w:r>
+                      </w:fldSimple>
                       <w:r>
                         <w:t xml:space="preserve"> </w:t>
                       </w:r>
@@ -8174,27 +7963,14 @@
                       <w:r>
                         <w:t xml:space="preserve">Ilustración  </w:t>
                       </w:r>
-                      <w:r>
-                        <w:fldChar w:fldCharType="begin"/>
-                      </w:r>
-                      <w:r>
-                        <w:instrText xml:space="preserve"> SEQ Ilustración_ \* ARABIC </w:instrText>
-                      </w:r>
-                      <w:r>
-                        <w:fldChar w:fldCharType="separate"/>
-                      </w:r>
-                      <w:r>
-                        <w:rPr>
-                          <w:noProof/>
-                        </w:rPr>
-                        <w:t>3</w:t>
-                      </w:r>
-                      <w:r>
-                        <w:rPr>
-                          <w:noProof/>
-                        </w:rPr>
-                        <w:fldChar w:fldCharType="end"/>
-                      </w:r>
+                      <w:fldSimple w:instr=" SEQ Ilustración_ \* ARABIC ">
+                        <w:r>
+                          <w:rPr>
+                            <w:noProof/>
+                          </w:rPr>
+                          <w:t>3</w:t>
+                        </w:r>
+                      </w:fldSimple>
                       <w:r>
                         <w:t xml:space="preserve"> </w:t>
                       </w:r>
@@ -9411,23 +9187,7 @@
           <w:rFonts w:ascii="Arial" w:eastAsiaTheme="minorHAnsi" w:hAnsi="Arial" w:cs="Arial"/>
           <w:lang w:val="es-419" w:eastAsia="es-GT"/>
         </w:rPr>
-        <w:t xml:space="preserve">. Según </w:t>
-      </w:r>
-      <w:proofErr w:type="spellStart"/>
-      <w:r>
-        <w:rPr>
-          <w:rFonts w:ascii="Arial" w:eastAsiaTheme="minorHAnsi" w:hAnsi="Arial" w:cs="Arial"/>
-          <w:lang w:val="es-419" w:eastAsia="es-GT"/>
-        </w:rPr>
-        <w:t>Schwaber</w:t>
-      </w:r>
-      <w:proofErr w:type="spellEnd"/>
-      <w:r>
-        <w:rPr>
-          <w:rFonts w:ascii="Arial" w:eastAsiaTheme="minorHAnsi" w:hAnsi="Arial" w:cs="Arial"/>
-          <w:lang w:val="es-419" w:eastAsia="es-GT"/>
-        </w:rPr>
-        <w:t xml:space="preserve"> y Sutherland (2020), autores de la Guía de Scrum, este es un marco de trabajo ligero que ayuda a las personas, equipos y organizaciones a generar valor mediante soluciones adaptables para problemas complejos, a través de dichos ciclos cortos e iterativos. Esta metodología resulta adecuada para proyectos de software en los que se requiere flexibilidad, revisión constante y adaptación a cambios durante el proceso de desarrollo. La elección de Scrum responde a la naturaleza del proyecto, ya que el desarrollo de una aplicación web para centros de salud requiere validaciones frecuentes, definición progresiva de funcionalidades y revisión constante de los módulos implementados. Esto favorece la reducción de errores, mejora la comunicación del equipo y permite entregar incrementos funcionales durante el desarrollo.</w:t>
+        <w:t>. Según Schwaber y Sutherland (2020), autores de la Guía de Scrum, este es un marco de trabajo ligero que ayuda a las personas, equipos y organizaciones a generar valor mediante soluciones adaptables para problemas complejos, a través de dichos ciclos cortos e iterativos. Esta metodología resulta adecuada para proyectos de software en los que se requiere flexibilidad, revisión constante y adaptación a cambios durante el proceso de desarrollo. La elección de Scrum responde a la naturaleza del proyecto, ya que el desarrollo de una aplicación web para centros de salud requiere validaciones frecuentes, definición progresiva de funcionalidades y revisión constante de los módulos implementados. Esto favorece la reducción de errores, mejora la comunicación del equipo y permite entregar incrementos funcionales durante el desarrollo.</w:t>
       </w:r>
     </w:p>
     <w:p>
@@ -9461,23 +9221,7 @@
           <w:rFonts w:ascii="Arial" w:eastAsiaTheme="minorHAnsi" w:hAnsi="Arial" w:cs="Arial"/>
           <w:lang w:val="es-419" w:eastAsia="es-GT"/>
         </w:rPr>
-        <w:t xml:space="preserve"> </w:t>
-      </w:r>
-      <w:proofErr w:type="spellStart"/>
-      <w:r>
-        <w:rPr>
-          <w:rFonts w:ascii="Arial" w:eastAsiaTheme="minorHAnsi" w:hAnsi="Arial" w:cs="Arial"/>
-          <w:lang w:val="es-419" w:eastAsia="es-GT"/>
-        </w:rPr>
-        <w:t>Owner</w:t>
-      </w:r>
-      <w:proofErr w:type="spellEnd"/>
-      <w:r>
-        <w:rPr>
-          <w:rFonts w:ascii="Arial" w:eastAsiaTheme="minorHAnsi" w:hAnsi="Arial" w:cs="Arial"/>
-          <w:lang w:val="es-419" w:eastAsia="es-GT"/>
-        </w:rPr>
-        <w:t xml:space="preserve"> será representado por el integrante encargado de priorizar los requerimientos del sistema, considerando las necesidades del centro de salud y los objetivos del proyecto. El Scrum Master será el responsable de coordinar el cumplimiento de la metodología, organizar las reuniones y apoyar al equipo en la eliminación de obstáculos. Los </w:t>
+        <w:t xml:space="preserve"> Owner será representado por el integrante encargado de priorizar los requerimientos del sistema, considerando las necesidades del centro de salud y los objetivos del proyecto. El Scrum Master será el responsable de coordinar el cumplimiento de la metodología, organizar las reuniones y apoyar al equipo en la eliminación de obstáculos. Los </w:t>
       </w:r>
       <w:proofErr w:type="spellStart"/>
       <w:r>
@@ -9687,27 +9431,14 @@
                             <w:r>
                               <w:t>2.</w:t>
                             </w:r>
-                            <w:r>
-                              <w:fldChar w:fldCharType="begin"/>
-                            </w:r>
-                            <w:r>
-                              <w:instrText xml:space="preserve"> SEQ Imágen \* ARABIC </w:instrText>
-                            </w:r>
-                            <w:r>
-                              <w:fldChar w:fldCharType="separate"/>
-                            </w:r>
-                            <w:r>
-                              <w:rPr>
-                                <w:noProof/>
-                              </w:rPr>
-                              <w:t>1</w:t>
-                            </w:r>
-                            <w:r>
-                              <w:rPr>
-                                <w:noProof/>
-                              </w:rPr>
-                              <w:fldChar w:fldCharType="end"/>
-                            </w:r>
+                            <w:fldSimple w:instr=" SEQ Imágen \* ARABIC ">
+                              <w:r>
+                                <w:rPr>
+                                  <w:noProof/>
+                                </w:rPr>
+                                <w:t>1</w:t>
+                              </w:r>
+                            </w:fldSimple>
                             <w:r>
                               <w:t xml:space="preserve"> Metodología Scrum</w:t>
                             </w:r>
@@ -9726,27 +9457,14 @@
                             <w:r>
                               <w:t xml:space="preserve">Imágen </w:t>
                             </w:r>
-                            <w:r>
-                              <w:fldChar w:fldCharType="begin"/>
-                            </w:r>
-                            <w:r>
-                              <w:instrText xml:space="preserve"> SEQ Imágen \* ARABIC </w:instrText>
-                            </w:r>
-                            <w:r>
-                              <w:fldChar w:fldCharType="separate"/>
-                            </w:r>
-                            <w:r>
-                              <w:rPr>
-                                <w:noProof/>
-                              </w:rPr>
-                              <w:t>1</w:t>
-                            </w:r>
-                            <w:r>
-                              <w:rPr>
-                                <w:noProof/>
-                              </w:rPr>
-                              <w:fldChar w:fldCharType="end"/>
-                            </w:r>
+                            <w:fldSimple w:instr=" SEQ Imágen \* ARABIC ">
+                              <w:r>
+                                <w:rPr>
+                                  <w:noProof/>
+                                </w:rPr>
+                                <w:t>1</w:t>
+                              </w:r>
+                            </w:fldSimple>
                             <w:r>
                               <w:t xml:space="preserve"> Metodología Scrum</w:t>
                             </w:r>
@@ -9792,27 +9510,14 @@
                       <w:r>
                         <w:t>2.</w:t>
                       </w:r>
-                      <w:r>
-                        <w:fldChar w:fldCharType="begin"/>
-                      </w:r>
-                      <w:r>
-                        <w:instrText xml:space="preserve"> SEQ Imágen \* ARABIC </w:instrText>
-                      </w:r>
-                      <w:r>
-                        <w:fldChar w:fldCharType="separate"/>
-                      </w:r>
-                      <w:r>
-                        <w:rPr>
-                          <w:noProof/>
-                        </w:rPr>
-                        <w:t>1</w:t>
-                      </w:r>
-                      <w:r>
-                        <w:rPr>
-                          <w:noProof/>
-                        </w:rPr>
-                        <w:fldChar w:fldCharType="end"/>
-                      </w:r>
+                      <w:fldSimple w:instr=" SEQ Imágen \* ARABIC ">
+                        <w:r>
+                          <w:rPr>
+                            <w:noProof/>
+                          </w:rPr>
+                          <w:t>1</w:t>
+                        </w:r>
+                      </w:fldSimple>
                       <w:r>
                         <w:t xml:space="preserve"> Metodología Scrum</w:t>
                       </w:r>
@@ -9831,27 +9536,14 @@
                       <w:r>
                         <w:t xml:space="preserve">Imágen </w:t>
                       </w:r>
-                      <w:r>
-                        <w:fldChar w:fldCharType="begin"/>
-                      </w:r>
-                      <w:r>
-                        <w:instrText xml:space="preserve"> SEQ Imágen \* ARABIC </w:instrText>
-                      </w:r>
-                      <w:r>
-                        <w:fldChar w:fldCharType="separate"/>
-                      </w:r>
-                      <w:r>
-                        <w:rPr>
-                          <w:noProof/>
-                        </w:rPr>
-                        <w:t>1</w:t>
-                      </w:r>
-                      <w:r>
-                        <w:rPr>
-                          <w:noProof/>
-                        </w:rPr>
-                        <w:fldChar w:fldCharType="end"/>
-                      </w:r>
+                      <w:fldSimple w:instr=" SEQ Imágen \* ARABIC ">
+                        <w:r>
+                          <w:rPr>
+                            <w:noProof/>
+                          </w:rPr>
+                          <w:t>1</w:t>
+                        </w:r>
+                      </w:fldSimple>
                       <w:r>
                         <w:t xml:space="preserve"> Metodología Scrum</w:t>
                       </w:r>
@@ -11220,27 +10912,14 @@
       <w:r>
         <w:t>2.</w:t>
       </w:r>
-      <w:r>
-        <w:fldChar w:fldCharType="begin"/>
-      </w:r>
-      <w:r>
-        <w:instrText xml:space="preserve"> SEQ Tabla \* ARABIC </w:instrText>
-      </w:r>
-      <w:r>
-        <w:fldChar w:fldCharType="separate"/>
-      </w:r>
-      <w:r>
-        <w:rPr>
-          <w:noProof/>
-        </w:rPr>
-        <w:t>1</w:t>
-      </w:r>
-      <w:r>
-        <w:rPr>
-          <w:noProof/>
-        </w:rPr>
-        <w:fldChar w:fldCharType="end"/>
-      </w:r>
+      <w:fldSimple w:instr=" SEQ Tabla \* ARABIC ">
+        <w:r>
+          <w:rPr>
+            <w:noProof/>
+          </w:rPr>
+          <w:t>1</w:t>
+        </w:r>
+      </w:fldSimple>
       <w:r>
         <w:t xml:space="preserve"> Presupuesto del proyecto</w:t>
       </w:r>
@@ -11389,27 +11068,14 @@
                             <w:r>
                               <w:t>Ilustración 2.</w:t>
                             </w:r>
-                            <w:r>
-                              <w:fldChar w:fldCharType="begin"/>
-                            </w:r>
-                            <w:r>
-                              <w:instrText xml:space="preserve"> SEQ Ilustración_ \* ARABIC </w:instrText>
-                            </w:r>
-                            <w:r>
-                              <w:fldChar w:fldCharType="separate"/>
-                            </w:r>
-                            <w:r>
-                              <w:rPr>
-                                <w:noProof/>
-                              </w:rPr>
-                              <w:t>4</w:t>
-                            </w:r>
-                            <w:r>
-                              <w:rPr>
-                                <w:noProof/>
-                              </w:rPr>
-                              <w:fldChar w:fldCharType="end"/>
-                            </w:r>
+                            <w:fldSimple w:instr=" SEQ Ilustración_ \* ARABIC ">
+                              <w:r>
+                                <w:rPr>
+                                  <w:noProof/>
+                                </w:rPr>
+                                <w:t>4</w:t>
+                              </w:r>
+                            </w:fldSimple>
                             <w:r>
                               <w:t xml:space="preserve"> lustración 2.3. Diagrama de Gantt del proyecto</w:t>
                             </w:r>
@@ -11457,27 +11123,14 @@
                       <w:r>
                         <w:t>Ilustración 2.</w:t>
                       </w:r>
-                      <w:r>
-                        <w:fldChar w:fldCharType="begin"/>
-                      </w:r>
-                      <w:r>
-                        <w:instrText xml:space="preserve"> SEQ Ilustración_ \* ARABIC </w:instrText>
-                      </w:r>
-                      <w:r>
-                        <w:fldChar w:fldCharType="separate"/>
-                      </w:r>
-                      <w:r>
-                        <w:rPr>
-                          <w:noProof/>
-                        </w:rPr>
-                        <w:t>4</w:t>
-                      </w:r>
-                      <w:r>
-                        <w:rPr>
-                          <w:noProof/>
-                        </w:rPr>
-                        <w:fldChar w:fldCharType="end"/>
-                      </w:r>
+                      <w:fldSimple w:instr=" SEQ Ilustración_ \* ARABIC ">
+                        <w:r>
+                          <w:rPr>
+                            <w:noProof/>
+                          </w:rPr>
+                          <w:t>4</w:t>
+                        </w:r>
+                      </w:fldSimple>
                       <w:r>
                         <w:t xml:space="preserve"> lustración 2.3. Diagrama de Gantt del proyecto</w:t>
                       </w:r>
@@ -12006,25 +11659,14 @@
           <w:lang w:val="es-419" w:eastAsia="es-GT"/>
         </w:rPr>
       </w:pPr>
-      <w:proofErr w:type="spellStart"/>
-      <w:r>
-        <w:rPr>
-          <w:rFonts w:ascii="Arial" w:hAnsi="Arial" w:cs="Arial"/>
-          <w:sz w:val="24"/>
-          <w:szCs w:val="24"/>
-          <w:lang w:val="es-419" w:eastAsia="es-GT"/>
-        </w:rPr>
-        <w:t>Schwaber</w:t>
-      </w:r>
-      <w:proofErr w:type="spellEnd"/>
-      <w:r>
-        <w:rPr>
-          <w:rFonts w:ascii="Arial" w:hAnsi="Arial" w:cs="Arial"/>
-          <w:sz w:val="24"/>
-          <w:szCs w:val="24"/>
-          <w:lang w:val="es-419" w:eastAsia="es-GT"/>
-        </w:rPr>
-        <w:t>, K. y Sutherland, J. (2020). La Guía de Scrum. https://scrumguides.org/</w:t>
+      <w:r>
+        <w:rPr>
+          <w:rFonts w:ascii="Arial" w:hAnsi="Arial" w:cs="Arial"/>
+          <w:sz w:val="24"/>
+          <w:szCs w:val="24"/>
+          <w:lang w:val="es-419" w:eastAsia="es-GT"/>
+        </w:rPr>
+        <w:t>Schwaber, K. y Sutherland, J. (2020). La Guía de Scrum. https://scrumguides.org/</w:t>
       </w:r>
     </w:p>
     <w:p>
@@ -12061,7 +11703,7 @@
 </file>
 
 <file path=word/endnotes.xml><?xml version="1.0" encoding="utf-8"?>
-<w:endnotes xmlns:wpc="http://schemas.microsoft.com/office/word/2010/wordprocessingCanvas" xmlns:cx="http://schemas.microsoft.com/office/drawing/2014/chartex" xmlns:cx1="http://schemas.microsoft.com/office/drawing/2015/9/8/chartex" xmlns:cx2="http://schemas.microsoft.com/office/drawing/2015/10/21/chartex" xmlns:cx3="http://schemas.microsoft.com/office/drawing/2016/5/9/chartex" xmlns:cx4="http://schemas.microsoft.com/office/drawing/2016/5/10/chartex" xmlns:cx5="http://schemas.microsoft.com/office/drawing/2016/5/11/chartex" xmlns:cx6="http://schemas.microsoft.com/office/drawing/2016/5/12/chartex" xmlns:cx7="http://schemas.microsoft.com/office/drawing/2016/5/13/chartex" xmlns:cx8="http://schemas.microsoft.com/office/drawing/2016/5/14/chartex" xmlns:mc="http://schemas.openxmlformats.org/markup-compatibility/2006" xmlns:aink="http://schemas.microsoft.com/office/drawing/2016/ink" xmlns:am3d="http://schemas.microsoft.com/office/drawing/2017/model3d" xmlns:o="urn:schemas-microsoft-com:office:office" xmlns:oel="http://schemas.microsoft.com/office/2019/extlst" xmlns:r="http://schemas.openxmlformats.org/officeDocument/2006/relationships" xmlns:m="http://schemas.openxmlformats.org/officeDocument/2006/math" xmlns:v="urn:schemas-microsoft-com:vml" xmlns:wp14="http://schemas.microsoft.com/office/word/2010/wordprocessingDrawing" xmlns:wp="http://schemas.openxmlformats.org/drawingml/2006/wordprocessingDrawing" xmlns:w10="urn:schemas-microsoft-com:office:word" xmlns:w="http://schemas.openxmlformats.org/wordprocessingml/2006/main" xmlns:w14="http://schemas.microsoft.com/office/word/2010/wordml" xmlns:w15="http://schemas.microsoft.com/office/word/2012/wordml" xmlns:w16cex="http://schemas.microsoft.com/office/word/2018/wordml/cex" xmlns:w16cid="http://schemas.microsoft.com/office/word/2016/wordml/cid" xmlns:w16="http://schemas.microsoft.com/office/word/2018/wordml" xmlns:w16sdtdh="http://schemas.microsoft.com/office/word/2020/wordml/sdtdatahash" xmlns:w16se="http://schemas.microsoft.com/office/word/2015/wordml/symex" xmlns:wpg="http://schemas.microsoft.com/office/word/2010/wordprocessingGroup" xmlns:wpi="http://schemas.microsoft.com/office/word/2010/wordprocessingInk" xmlns:wne="http://schemas.microsoft.com/office/word/2006/wordml" xmlns:wps="http://schemas.microsoft.com/office/word/2010/wordprocessingShape" mc:Ignorable="w14 w15 w16se w16cid w16 w16cex w16sdtdh wp14">
+<w:endnotes xmlns:wpc="http://schemas.microsoft.com/office/word/2010/wordprocessingCanvas" xmlns:cx="http://schemas.microsoft.com/office/drawing/2014/chartex" xmlns:cx1="http://schemas.microsoft.com/office/drawing/2015/9/8/chartex" xmlns:cx2="http://schemas.microsoft.com/office/drawing/2015/10/21/chartex" xmlns:cx3="http://schemas.microsoft.com/office/drawing/2016/5/9/chartex" xmlns:cx4="http://schemas.microsoft.com/office/drawing/2016/5/10/chartex" xmlns:cx5="http://schemas.microsoft.com/office/drawing/2016/5/11/chartex" xmlns:cx6="http://schemas.microsoft.com/office/drawing/2016/5/12/chartex" xmlns:cx7="http://schemas.microsoft.com/office/drawing/2016/5/13/chartex" xmlns:cx8="http://schemas.microsoft.com/office/drawing/2016/5/14/chartex" xmlns:mc="http://schemas.openxmlformats.org/markup-compatibility/2006" xmlns:aink="http://schemas.microsoft.com/office/drawing/2016/ink" xmlns:am3d="http://schemas.microsoft.com/office/drawing/2017/model3d" xmlns:o="urn:schemas-microsoft-com:office:office" xmlns:oel="http://schemas.microsoft.com/office/2019/extlst" xmlns:r="http://schemas.openxmlformats.org/officeDocument/2006/relationships" xmlns:m="http://schemas.openxmlformats.org/officeDocument/2006/math" xmlns:v="urn:schemas-microsoft-com:vml" xmlns:wp14="http://schemas.microsoft.com/office/word/2010/wordprocessingDrawing" xmlns:wp="http://schemas.openxmlformats.org/drawingml/2006/wordprocessingDrawing" xmlns:w10="urn:schemas-microsoft-com:office:word" xmlns:w="http://schemas.openxmlformats.org/wordprocessingml/2006/main" xmlns:w14="http://schemas.microsoft.com/office/word/2010/wordml" xmlns:w15="http://schemas.microsoft.com/office/word/2012/wordml" xmlns:w16cei="http://schemas.microsoft.com/office/word/2026/wordml/cei" xmlns:w16cex="http://schemas.microsoft.com/office/word/2018/wordml/cex" xmlns:w16cid="http://schemas.microsoft.com/office/word/2016/wordml/cid" xmlns:w16="http://schemas.microsoft.com/office/word/2018/wordml" xmlns:w16du="http://schemas.microsoft.com/office/word/2023/wordml/word16du" xmlns:w16sdtdh="http://schemas.microsoft.com/office/word/2020/wordml/sdtdatahash" xmlns:w16sdtfl="http://schemas.microsoft.com/office/word/2024/wordml/sdtformatlock" xmlns:w16se="http://schemas.microsoft.com/office/word/2015/wordml/symex" xmlns:wpg="http://schemas.microsoft.com/office/word/2010/wordprocessingGroup" xmlns:wpi="http://schemas.microsoft.com/office/word/2010/wordprocessingInk" xmlns:wne="http://schemas.microsoft.com/office/word/2006/wordml" xmlns:wps="http://schemas.microsoft.com/office/word/2010/wordprocessingShape" mc:Ignorable="w14 w15 w16se w16cid w16 w16cex w16sdtdh w16sdtfl w16du wp14">
   <w:endnote w:type="separator" w:id="-1">
     <w:p>
       <w:pPr>
@@ -12086,7 +11728,7 @@
 </file>
 
 <file path=word/footer1.xml><?xml version="1.0" encoding="utf-8"?>
-<w:ftr xmlns:wpc="http://schemas.microsoft.com/office/word/2010/wordprocessingCanvas" xmlns:cx="http://schemas.microsoft.com/office/drawing/2014/chartex" xmlns:cx1="http://schemas.microsoft.com/office/drawing/2015/9/8/chartex" xmlns:cx2="http://schemas.microsoft.com/office/drawing/2015/10/21/chartex" xmlns:cx3="http://schemas.microsoft.com/office/drawing/2016/5/9/chartex" xmlns:cx4="http://schemas.microsoft.com/office/drawing/2016/5/10/chartex" xmlns:cx5="http://schemas.microsoft.com/office/drawing/2016/5/11/chartex" xmlns:cx6="http://schemas.microsoft.com/office/drawing/2016/5/12/chartex" xmlns:cx7="http://schemas.microsoft.com/office/drawing/2016/5/13/chartex" xmlns:cx8="http://schemas.microsoft.com/office/drawing/2016/5/14/chartex" xmlns:mc="http://schemas.openxmlformats.org/markup-compatibility/2006" xmlns:aink="http://schemas.microsoft.com/office/drawing/2016/ink" xmlns:am3d="http://schemas.microsoft.com/office/drawing/2017/model3d" xmlns:o="urn:schemas-microsoft-com:office:office" xmlns:oel="http://schemas.microsoft.com/office/2019/extlst" xmlns:r="http://schemas.openxmlformats.org/officeDocument/2006/relationships" xmlns:m="http://schemas.openxmlformats.org/officeDocument/2006/math" xmlns:v="urn:schemas-microsoft-com:vml" xmlns:wp14="http://schemas.microsoft.com/office/word/2010/wordprocessingDrawing" xmlns:wp="http://schemas.openxmlformats.org/drawingml/2006/wordprocessingDrawing" xmlns:w10="urn:schemas-microsoft-com:office:word" xmlns:w="http://schemas.openxmlformats.org/wordprocessingml/2006/main" xmlns:w14="http://schemas.microsoft.com/office/word/2010/wordml" xmlns:w15="http://schemas.microsoft.com/office/word/2012/wordml" xmlns:w16cex="http://schemas.microsoft.com/office/word/2018/wordml/cex" xmlns:w16cid="http://schemas.microsoft.com/office/word/2016/wordml/cid" xmlns:w16="http://schemas.microsoft.com/office/word/2018/wordml" xmlns:w16sdtdh="http://schemas.microsoft.com/office/word/2020/wordml/sdtdatahash" xmlns:w16se="http://schemas.microsoft.com/office/word/2015/wordml/symex" xmlns:wpg="http://schemas.microsoft.com/office/word/2010/wordprocessingGroup" xmlns:wpi="http://schemas.microsoft.com/office/word/2010/wordprocessingInk" xmlns:wne="http://schemas.microsoft.com/office/word/2006/wordml" xmlns:wps="http://schemas.microsoft.com/office/word/2010/wordprocessingShape" mc:Ignorable="w14 w15 w16se w16cid w16 w16cex w16sdtdh wp14">
+<w:ftr xmlns:wpc="http://schemas.microsoft.com/office/word/2010/wordprocessingCanvas" xmlns:cx="http://schemas.microsoft.com/office/drawing/2014/chartex" xmlns:cx1="http://schemas.microsoft.com/office/drawing/2015/9/8/chartex" xmlns:cx2="http://schemas.microsoft.com/office/drawing/2015/10/21/chartex" xmlns:cx3="http://schemas.microsoft.com/office/drawing/2016/5/9/chartex" xmlns:cx4="http://schemas.microsoft.com/office/drawing/2016/5/10/chartex" xmlns:cx5="http://schemas.microsoft.com/office/drawing/2016/5/11/chartex" xmlns:cx6="http://schemas.microsoft.com/office/drawing/2016/5/12/chartex" xmlns:cx7="http://schemas.microsoft.com/office/drawing/2016/5/13/chartex" xmlns:cx8="http://schemas.microsoft.com/office/drawing/2016/5/14/chartex" xmlns:mc="http://schemas.openxmlformats.org/markup-compatibility/2006" xmlns:aink="http://schemas.microsoft.com/office/drawing/2016/ink" xmlns:am3d="http://schemas.microsoft.com/office/drawing/2017/model3d" xmlns:o="urn:schemas-microsoft-com:office:office" xmlns:oel="http://schemas.microsoft.com/office/2019/extlst" xmlns:r="http://schemas.openxmlformats.org/officeDocument/2006/relationships" xmlns:m="http://schemas.openxmlformats.org/officeDocument/2006/math" xmlns:v="urn:schemas-microsoft-com:vml" xmlns:wp14="http://schemas.microsoft.com/office/word/2010/wordprocessingDrawing" xmlns:wp="http://schemas.openxmlformats.org/drawingml/2006/wordprocessingDrawing" xmlns:w10="urn:schemas-microsoft-com:office:word" xmlns:w="http://schemas.openxmlformats.org/wordprocessingml/2006/main" xmlns:w14="http://schemas.microsoft.com/office/word/2010/wordml" xmlns:w15="http://schemas.microsoft.com/office/word/2012/wordml" xmlns:w16cei="http://schemas.microsoft.com/office/word/2026/wordml/cei" xmlns:w16cex="http://schemas.microsoft.com/office/word/2018/wordml/cex" xmlns:w16cid="http://schemas.microsoft.com/office/word/2016/wordml/cid" xmlns:w16="http://schemas.microsoft.com/office/word/2018/wordml" xmlns:w16du="http://schemas.microsoft.com/office/word/2023/wordml/word16du" xmlns:w16sdtdh="http://schemas.microsoft.com/office/word/2020/wordml/sdtdatahash" xmlns:w16sdtfl="http://schemas.microsoft.com/office/word/2024/wordml/sdtformatlock" xmlns:w16se="http://schemas.microsoft.com/office/word/2015/wordml/symex" xmlns:wpg="http://schemas.microsoft.com/office/word/2010/wordprocessingGroup" xmlns:wpi="http://schemas.microsoft.com/office/word/2010/wordprocessingInk" xmlns:wne="http://schemas.microsoft.com/office/word/2006/wordml" xmlns:wps="http://schemas.microsoft.com/office/word/2010/wordprocessingShape" mc:Ignorable="w14 w15 w16se w16cid w16 w16cex w16sdtdh w16sdtfl w16du wp14">
   <w:p>
     <w:pPr>
       <w:pStyle w:val="Piedepgina"/>
@@ -12102,7 +11744,7 @@
 </file>
 
 <file path=word/footer2.xml><?xml version="1.0" encoding="utf-8"?>
-<w:ftr xmlns:wpc="http://schemas.microsoft.com/office/word/2010/wordprocessingCanvas" xmlns:cx="http://schemas.microsoft.com/office/drawing/2014/chartex" xmlns:cx1="http://schemas.microsoft.com/office/drawing/2015/9/8/chartex" xmlns:cx2="http://schemas.microsoft.com/office/drawing/2015/10/21/chartex" xmlns:cx3="http://schemas.microsoft.com/office/drawing/2016/5/9/chartex" xmlns:cx4="http://schemas.microsoft.com/office/drawing/2016/5/10/chartex" xmlns:cx5="http://schemas.microsoft.com/office/drawing/2016/5/11/chartex" xmlns:cx6="http://schemas.microsoft.com/office/drawing/2016/5/12/chartex" xmlns:cx7="http://schemas.microsoft.com/office/drawing/2016/5/13/chartex" xmlns:cx8="http://schemas.microsoft.com/office/drawing/2016/5/14/chartex" xmlns:mc="http://schemas.openxmlformats.org/markup-compatibility/2006" xmlns:aink="http://schemas.microsoft.com/office/drawing/2016/ink" xmlns:am3d="http://schemas.microsoft.com/office/drawing/2017/model3d" xmlns:o="urn:schemas-microsoft-com:office:office" xmlns:oel="http://schemas.microsoft.com/office/2019/extlst" xmlns:r="http://schemas.openxmlformats.org/officeDocument/2006/relationships" xmlns:m="http://schemas.openxmlformats.org/officeDocument/2006/math" xmlns:v="urn:schemas-microsoft-com:vml" xmlns:wp14="http://schemas.microsoft.com/office/word/2010/wordprocessingDrawing" xmlns:wp="http://schemas.openxmlformats.org/drawingml/2006/wordprocessingDrawing" xmlns:w10="urn:schemas-microsoft-com:office:word" xmlns:w="http://schemas.openxmlformats.org/wordprocessingml/2006/main" xmlns:w14="http://schemas.microsoft.com/office/word/2010/wordml" xmlns:w15="http://schemas.microsoft.com/office/word/2012/wordml" xmlns:w16cex="http://schemas.microsoft.com/office/word/2018/wordml/cex" xmlns:w16cid="http://schemas.microsoft.com/office/word/2016/wordml/cid" xmlns:w16="http://schemas.microsoft.com/office/word/2018/wordml" xmlns:w16sdtdh="http://schemas.microsoft.com/office/word/2020/wordml/sdtdatahash" xmlns:w16se="http://schemas.microsoft.com/office/word/2015/wordml/symex" xmlns:wpg="http://schemas.microsoft.com/office/word/2010/wordprocessingGroup" xmlns:wpi="http://schemas.microsoft.com/office/word/2010/wordprocessingInk" xmlns:wne="http://schemas.microsoft.com/office/word/2006/wordml" xmlns:wps="http://schemas.microsoft.com/office/word/2010/wordprocessingShape" mc:Ignorable="w14 w15 w16se w16cid w16 w16cex w16sdtdh wp14">
+<w:ftr xmlns:wpc="http://schemas.microsoft.com/office/word/2010/wordprocessingCanvas" xmlns:cx="http://schemas.microsoft.com/office/drawing/2014/chartex" xmlns:cx1="http://schemas.microsoft.com/office/drawing/2015/9/8/chartex" xmlns:cx2="http://schemas.microsoft.com/office/drawing/2015/10/21/chartex" xmlns:cx3="http://schemas.microsoft.com/office/drawing/2016/5/9/chartex" xmlns:cx4="http://schemas.microsoft.com/office/drawing/2016/5/10/chartex" xmlns:cx5="http://schemas.microsoft.com/office/drawing/2016/5/11/chartex" xmlns:cx6="http://schemas.microsoft.com/office/drawing/2016/5/12/chartex" xmlns:cx7="http://schemas.microsoft.com/office/drawing/2016/5/13/chartex" xmlns:cx8="http://schemas.microsoft.com/office/drawing/2016/5/14/chartex" xmlns:mc="http://schemas.openxmlformats.org/markup-compatibility/2006" xmlns:aink="http://schemas.microsoft.com/office/drawing/2016/ink" xmlns:am3d="http://schemas.microsoft.com/office/drawing/2017/model3d" xmlns:o="urn:schemas-microsoft-com:office:office" xmlns:oel="http://schemas.microsoft.com/office/2019/extlst" xmlns:r="http://schemas.openxmlformats.org/officeDocument/2006/relationships" xmlns:m="http://schemas.openxmlformats.org/officeDocument/2006/math" xmlns:v="urn:schemas-microsoft-com:vml" xmlns:wp14="http://schemas.microsoft.com/office/word/2010/wordprocessingDrawing" xmlns:wp="http://schemas.openxmlformats.org/drawingml/2006/wordprocessingDrawing" xmlns:w10="urn:schemas-microsoft-com:office:word" xmlns:w="http://schemas.openxmlformats.org/wordprocessingml/2006/main" xmlns:w14="http://schemas.microsoft.com/office/word/2010/wordml" xmlns:w15="http://schemas.microsoft.com/office/word/2012/wordml" xmlns:w16cei="http://schemas.microsoft.com/office/word/2026/wordml/cei" xmlns:w16cex="http://schemas.microsoft.com/office/word/2018/wordml/cex" xmlns:w16cid="http://schemas.microsoft.com/office/word/2016/wordml/cid" xmlns:w16="http://schemas.microsoft.com/office/word/2018/wordml" xmlns:w16du="http://schemas.microsoft.com/office/word/2023/wordml/word16du" xmlns:w16sdtdh="http://schemas.microsoft.com/office/word/2020/wordml/sdtdatahash" xmlns:w16sdtfl="http://schemas.microsoft.com/office/word/2024/wordml/sdtformatlock" xmlns:w16se="http://schemas.microsoft.com/office/word/2015/wordml/symex" xmlns:wpg="http://schemas.microsoft.com/office/word/2010/wordprocessingGroup" xmlns:wpi="http://schemas.microsoft.com/office/word/2010/wordprocessingInk" xmlns:wne="http://schemas.microsoft.com/office/word/2006/wordml" xmlns:wps="http://schemas.microsoft.com/office/word/2010/wordprocessingShape" mc:Ignorable="w14 w15 w16se w16cid w16 w16cex w16sdtdh w16sdtfl w16du wp14">
   <w:p>
     <w:pPr>
       <w:pStyle w:val="Piedepgina"/>
@@ -12123,7 +11765,7 @@
 </file>
 
 <file path=word/footer3.xml><?xml version="1.0" encoding="utf-8"?>
-<w:ftr xmlns:wpc="http://schemas.microsoft.com/office/word/2010/wordprocessingCanvas" xmlns:cx="http://schemas.microsoft.com/office/drawing/2014/chartex" xmlns:cx1="http://schemas.microsoft.com/office/drawing/2015/9/8/chartex" xmlns:cx2="http://schemas.microsoft.com/office/drawing/2015/10/21/chartex" xmlns:cx3="http://schemas.microsoft.com/office/drawing/2016/5/9/chartex" xmlns:cx4="http://schemas.microsoft.com/office/drawing/2016/5/10/chartex" xmlns:cx5="http://schemas.microsoft.com/office/drawing/2016/5/11/chartex" xmlns:cx6="http://schemas.microsoft.com/office/drawing/2016/5/12/chartex" xmlns:cx7="http://schemas.microsoft.com/office/drawing/2016/5/13/chartex" xmlns:cx8="http://schemas.microsoft.com/office/drawing/2016/5/14/chartex" xmlns:mc="http://schemas.openxmlformats.org/markup-compatibility/2006" xmlns:aink="http://schemas.microsoft.com/office/drawing/2016/ink" xmlns:am3d="http://schemas.microsoft.com/office/drawing/2017/model3d" xmlns:o="urn:schemas-microsoft-com:office:office" xmlns:oel="http://schemas.microsoft.com/office/2019/extlst" xmlns:r="http://schemas.openxmlformats.org/officeDocument/2006/relationships" xmlns:m="http://schemas.openxmlformats.org/officeDocument/2006/math" xmlns:v="urn:schemas-microsoft-com:vml" xmlns:wp14="http://schemas.microsoft.com/office/word/2010/wordprocessingDrawing" xmlns:wp="http://schemas.openxmlformats.org/drawingml/2006/wordprocessingDrawing" xmlns:w10="urn:schemas-microsoft-com:office:word" xmlns:w="http://schemas.openxmlformats.org/wordprocessingml/2006/main" xmlns:w14="http://schemas.microsoft.com/office/word/2010/wordml" xmlns:w15="http://schemas.microsoft.com/office/word/2012/wordml" xmlns:w16cex="http://schemas.microsoft.com/office/word/2018/wordml/cex" xmlns:w16cid="http://schemas.microsoft.com/office/word/2016/wordml/cid" xmlns:w16="http://schemas.microsoft.com/office/word/2018/wordml" xmlns:w16sdtdh="http://schemas.microsoft.com/office/word/2020/wordml/sdtdatahash" xmlns:w16se="http://schemas.microsoft.com/office/word/2015/wordml/symex" xmlns:wpg="http://schemas.microsoft.com/office/word/2010/wordprocessingGroup" xmlns:wpi="http://schemas.microsoft.com/office/word/2010/wordprocessingInk" xmlns:wne="http://schemas.microsoft.com/office/word/2006/wordml" xmlns:wps="http://schemas.microsoft.com/office/word/2010/wordprocessingShape" mc:Ignorable="w14 w15 w16se w16cid w16 w16cex w16sdtdh wp14">
+<w:ftr xmlns:wpc="http://schemas.microsoft.com/office/word/2010/wordprocessingCanvas" xmlns:cx="http://schemas.microsoft.com/office/drawing/2014/chartex" xmlns:cx1="http://schemas.microsoft.com/office/drawing/2015/9/8/chartex" xmlns:cx2="http://schemas.microsoft.com/office/drawing/2015/10/21/chartex" xmlns:cx3="http://schemas.microsoft.com/office/drawing/2016/5/9/chartex" xmlns:cx4="http://schemas.microsoft.com/office/drawing/2016/5/10/chartex" xmlns:cx5="http://schemas.microsoft.com/office/drawing/2016/5/11/chartex" xmlns:cx6="http://schemas.microsoft.com/office/drawing/2016/5/12/chartex" xmlns:cx7="http://schemas.microsoft.com/office/drawing/2016/5/13/chartex" xmlns:cx8="http://schemas.microsoft.com/office/drawing/2016/5/14/chartex" xmlns:mc="http://schemas.openxmlformats.org/markup-compatibility/2006" xmlns:aink="http://schemas.microsoft.com/office/drawing/2016/ink" xmlns:am3d="http://schemas.microsoft.com/office/drawing/2017/model3d" xmlns:o="urn:schemas-microsoft-com:office:office" xmlns:oel="http://schemas.microsoft.com/office/2019/extlst" xmlns:r="http://schemas.openxmlformats.org/officeDocument/2006/relationships" xmlns:m="http://schemas.openxmlformats.org/officeDocument/2006/math" xmlns:v="urn:schemas-microsoft-com:vml" xmlns:wp14="http://schemas.microsoft.com/office/word/2010/wordprocessingDrawing" xmlns:wp="http://schemas.openxmlformats.org/drawingml/2006/wordprocessingDrawing" xmlns:w10="urn:schemas-microsoft-com:office:word" xmlns:w="http://schemas.openxmlformats.org/wordprocessingml/2006/main" xmlns:w14="http://schemas.microsoft.com/office/word/2010/wordml" xmlns:w15="http://schemas.microsoft.com/office/word/2012/wordml" xmlns:w16cei="http://schemas.microsoft.com/office/word/2026/wordml/cei" xmlns:w16cex="http://schemas.microsoft.com/office/word/2018/wordml/cex" xmlns:w16cid="http://schemas.microsoft.com/office/word/2016/wordml/cid" xmlns:w16="http://schemas.microsoft.com/office/word/2018/wordml" xmlns:w16du="http://schemas.microsoft.com/office/word/2023/wordml/word16du" xmlns:w16sdtdh="http://schemas.microsoft.com/office/word/2020/wordml/sdtdatahash" xmlns:w16sdtfl="http://schemas.microsoft.com/office/word/2024/wordml/sdtformatlock" xmlns:w16se="http://schemas.microsoft.com/office/word/2015/wordml/symex" xmlns:wpg="http://schemas.microsoft.com/office/word/2010/wordprocessingGroup" xmlns:wpi="http://schemas.microsoft.com/office/word/2010/wordprocessingInk" xmlns:wne="http://schemas.microsoft.com/office/word/2006/wordml" xmlns:wps="http://schemas.microsoft.com/office/word/2010/wordprocessingShape" mc:Ignorable="w14 w15 w16se w16cid w16 w16cex w16sdtdh w16sdtfl w16du wp14">
   <w:sdt>
     <w:sdtPr>
       <w:id w:val="802434642"/>
@@ -12168,7 +11810,7 @@
 </file>
 
 <file path=word/footer4.xml><?xml version="1.0" encoding="utf-8"?>
-<w:ftr xmlns:wpc="http://schemas.microsoft.com/office/word/2010/wordprocessingCanvas" xmlns:cx="http://schemas.microsoft.com/office/drawing/2014/chartex" xmlns:cx1="http://schemas.microsoft.com/office/drawing/2015/9/8/chartex" xmlns:cx2="http://schemas.microsoft.com/office/drawing/2015/10/21/chartex" xmlns:cx3="http://schemas.microsoft.com/office/drawing/2016/5/9/chartex" xmlns:cx4="http://schemas.microsoft.com/office/drawing/2016/5/10/chartex" xmlns:cx5="http://schemas.microsoft.com/office/drawing/2016/5/11/chartex" xmlns:cx6="http://schemas.microsoft.com/office/drawing/2016/5/12/chartex" xmlns:cx7="http://schemas.microsoft.com/office/drawing/2016/5/13/chartex" xmlns:cx8="http://schemas.microsoft.com/office/drawing/2016/5/14/chartex" xmlns:mc="http://schemas.openxmlformats.org/markup-compatibility/2006" xmlns:aink="http://schemas.microsoft.com/office/drawing/2016/ink" xmlns:am3d="http://schemas.microsoft.com/office/drawing/2017/model3d" xmlns:o="urn:schemas-microsoft-com:office:office" xmlns:oel="http://schemas.microsoft.com/office/2019/extlst" xmlns:r="http://schemas.openxmlformats.org/officeDocument/2006/relationships" xmlns:m="http://schemas.openxmlformats.org/officeDocument/2006/math" xmlns:v="urn:schemas-microsoft-com:vml" xmlns:wp14="http://schemas.microsoft.com/office/word/2010/wordprocessingDrawing" xmlns:wp="http://schemas.openxmlformats.org/drawingml/2006/wordprocessingDrawing" xmlns:w10="urn:schemas-microsoft-com:office:word" xmlns:w="http://schemas.openxmlformats.org/wordprocessingml/2006/main" xmlns:w14="http://schemas.microsoft.com/office/word/2010/wordml" xmlns:w15="http://schemas.microsoft.com/office/word/2012/wordml" xmlns:w16cex="http://schemas.microsoft.com/office/word/2018/wordml/cex" xmlns:w16cid="http://schemas.microsoft.com/office/word/2016/wordml/cid" xmlns:w16="http://schemas.microsoft.com/office/word/2018/wordml" xmlns:w16sdtdh="http://schemas.microsoft.com/office/word/2020/wordml/sdtdatahash" xmlns:w16se="http://schemas.microsoft.com/office/word/2015/wordml/symex" xmlns:wpg="http://schemas.microsoft.com/office/word/2010/wordprocessingGroup" xmlns:wpi="http://schemas.microsoft.com/office/word/2010/wordprocessingInk" xmlns:wne="http://schemas.microsoft.com/office/word/2006/wordml" xmlns:wps="http://schemas.microsoft.com/office/word/2010/wordprocessingShape" mc:Ignorable="w14 w15 w16se w16cid w16 w16cex w16sdtdh wp14">
+<w:ftr xmlns:wpc="http://schemas.microsoft.com/office/word/2010/wordprocessingCanvas" xmlns:cx="http://schemas.microsoft.com/office/drawing/2014/chartex" xmlns:cx1="http://schemas.microsoft.com/office/drawing/2015/9/8/chartex" xmlns:cx2="http://schemas.microsoft.com/office/drawing/2015/10/21/chartex" xmlns:cx3="http://schemas.microsoft.com/office/drawing/2016/5/9/chartex" xmlns:cx4="http://schemas.microsoft.com/office/drawing/2016/5/10/chartex" xmlns:cx5="http://schemas.microsoft.com/office/drawing/2016/5/11/chartex" xmlns:cx6="http://schemas.microsoft.com/office/drawing/2016/5/12/chartex" xmlns:cx7="http://schemas.microsoft.com/office/drawing/2016/5/13/chartex" xmlns:cx8="http://schemas.microsoft.com/office/drawing/2016/5/14/chartex" xmlns:mc="http://schemas.openxmlformats.org/markup-compatibility/2006" xmlns:aink="http://schemas.microsoft.com/office/drawing/2016/ink" xmlns:am3d="http://schemas.microsoft.com/office/drawing/2017/model3d" xmlns:o="urn:schemas-microsoft-com:office:office" xmlns:oel="http://schemas.microsoft.com/office/2019/extlst" xmlns:r="http://schemas.openxmlformats.org/officeDocument/2006/relationships" xmlns:m="http://schemas.openxmlformats.org/officeDocument/2006/math" xmlns:v="urn:schemas-microsoft-com:vml" xmlns:wp14="http://schemas.microsoft.com/office/word/2010/wordprocessingDrawing" xmlns:wp="http://schemas.openxmlformats.org/drawingml/2006/wordprocessingDrawing" xmlns:w10="urn:schemas-microsoft-com:office:word" xmlns:w="http://schemas.openxmlformats.org/wordprocessingml/2006/main" xmlns:w14="http://schemas.microsoft.com/office/word/2010/wordml" xmlns:w15="http://schemas.microsoft.com/office/word/2012/wordml" xmlns:w16cei="http://schemas.microsoft.com/office/word/2026/wordml/cei" xmlns:w16cex="http://schemas.microsoft.com/office/word/2018/wordml/cex" xmlns:w16cid="http://schemas.microsoft.com/office/word/2016/wordml/cid" xmlns:w16="http://schemas.microsoft.com/office/word/2018/wordml" xmlns:w16du="http://schemas.microsoft.com/office/word/2023/wordml/word16du" xmlns:w16sdtdh="http://schemas.microsoft.com/office/word/2020/wordml/sdtdatahash" xmlns:w16sdtfl="http://schemas.microsoft.com/office/word/2024/wordml/sdtformatlock" xmlns:w16se="http://schemas.microsoft.com/office/word/2015/wordml/symex" xmlns:wpg="http://schemas.microsoft.com/office/word/2010/wordprocessingGroup" xmlns:wpi="http://schemas.microsoft.com/office/word/2010/wordprocessingInk" xmlns:wne="http://schemas.microsoft.com/office/word/2006/wordml" xmlns:wps="http://schemas.microsoft.com/office/word/2010/wordprocessingShape" mc:Ignorable="w14 w15 w16se w16cid w16 w16cex w16sdtdh w16sdtfl w16du wp14">
   <w:sdt>
     <w:sdtPr>
       <w:id w:val="-290974379"/>
@@ -12213,7 +11855,7 @@
 </file>
 
 <file path=word/footnotes.xml><?xml version="1.0" encoding="utf-8"?>
-<w:footnotes xmlns:wpc="http://schemas.microsoft.com/office/word/2010/wordprocessingCanvas" xmlns:cx="http://schemas.microsoft.com/office/drawing/2014/chartex" xmlns:cx1="http://schemas.microsoft.com/office/drawing/2015/9/8/chartex" xmlns:cx2="http://schemas.microsoft.com/office/drawing/2015/10/21/chartex" xmlns:cx3="http://schemas.microsoft.com/office/drawing/2016/5/9/chartex" xmlns:cx4="http://schemas.microsoft.com/office/drawing/2016/5/10/chartex" xmlns:cx5="http://schemas.microsoft.com/office/drawing/2016/5/11/chartex" xmlns:cx6="http://schemas.microsoft.com/office/drawing/2016/5/12/chartex" xmlns:cx7="http://schemas.microsoft.com/office/drawing/2016/5/13/chartex" xmlns:cx8="http://schemas.microsoft.com/office/drawing/2016/5/14/chartex" xmlns:mc="http://schemas.openxmlformats.org/markup-compatibility/2006" xmlns:aink="http://schemas.microsoft.com/office/drawing/2016/ink" xmlns:am3d="http://schemas.microsoft.com/office/drawing/2017/model3d" xmlns:o="urn:schemas-microsoft-com:office:office" xmlns:oel="http://schemas.microsoft.com/office/2019/extlst" xmlns:r="http://schemas.openxmlformats.org/officeDocument/2006/relationships" xmlns:m="http://schemas.openxmlformats.org/officeDocument/2006/math" xmlns:v="urn:schemas-microsoft-com:vml" xmlns:wp14="http://schemas.microsoft.com/office/word/2010/wordprocessingDrawing" xmlns:wp="http://schemas.openxmlformats.org/drawingml/2006/wordprocessingDrawing" xmlns:w10="urn:schemas-microsoft-com:office:word" xmlns:w="http://schemas.openxmlformats.org/wordprocessingml/2006/main" xmlns:w14="http://schemas.microsoft.com/office/word/2010/wordml" xmlns:w15="http://schemas.microsoft.com/office/word/2012/wordml" xmlns:w16cex="http://schemas.microsoft.com/office/word/2018/wordml/cex" xmlns:w16cid="http://schemas.microsoft.com/office/word/2016/wordml/cid" xmlns:w16="http://schemas.microsoft.com/office/word/2018/wordml" xmlns:w16sdtdh="http://schemas.microsoft.com/office/word/2020/wordml/sdtdatahash" xmlns:w16se="http://schemas.microsoft.com/office/word/2015/wordml/symex" xmlns:wpg="http://schemas.microsoft.com/office/word/2010/wordprocessingGroup" xmlns:wpi="http://schemas.microsoft.com/office/word/2010/wordprocessingInk" xmlns:wne="http://schemas.microsoft.com/office/word/2006/wordml" xmlns:wps="http://schemas.microsoft.com/office/word/2010/wordprocessingShape" mc:Ignorable="w14 w15 w16se w16cid w16 w16cex w16sdtdh wp14">
+<w:footnotes xmlns:wpc="http://schemas.microsoft.com/office/word/2010/wordprocessingCanvas" xmlns:cx="http://schemas.microsoft.com/office/drawing/2014/chartex" xmlns:cx1="http://schemas.microsoft.com/office/drawing/2015/9/8/chartex" xmlns:cx2="http://schemas.microsoft.com/office/drawing/2015/10/21/chartex" xmlns:cx3="http://schemas.microsoft.com/office/drawing/2016/5/9/chartex" xmlns:cx4="http://schemas.microsoft.com/office/drawing/2016/5/10/chartex" xmlns:cx5="http://schemas.microsoft.com/office/drawing/2016/5/11/chartex" xmlns:cx6="http://schemas.microsoft.com/office/drawing/2016/5/12/chartex" xmlns:cx7="http://schemas.microsoft.com/office/drawing/2016/5/13/chartex" xmlns:cx8="http://schemas.microsoft.com/office/drawing/2016/5/14/chartex" xmlns:mc="http://schemas.openxmlformats.org/markup-compatibility/2006" xmlns:aink="http://schemas.microsoft.com/office/drawing/2016/ink" xmlns:am3d="http://schemas.microsoft.com/office/drawing/2017/model3d" xmlns:o="urn:schemas-microsoft-com:office:office" xmlns:oel="http://schemas.microsoft.com/office/2019/extlst" xmlns:r="http://schemas.openxmlformats.org/officeDocument/2006/relationships" xmlns:m="http://schemas.openxmlformats.org/officeDocument/2006/math" xmlns:v="urn:schemas-microsoft-com:vml" xmlns:wp14="http://schemas.microsoft.com/office/word/2010/wordprocessingDrawing" xmlns:wp="http://schemas.openxmlformats.org/drawingml/2006/wordprocessingDrawing" xmlns:w10="urn:schemas-microsoft-com:office:word" xmlns:w="http://schemas.openxmlformats.org/wordprocessingml/2006/main" xmlns:w14="http://schemas.microsoft.com/office/word/2010/wordml" xmlns:w15="http://schemas.microsoft.com/office/word/2012/wordml" xmlns:w16cei="http://schemas.microsoft.com/office/word/2026/wordml/cei" xmlns:w16cex="http://schemas.microsoft.com/office/word/2018/wordml/cex" xmlns:w16cid="http://schemas.microsoft.com/office/word/2016/wordml/cid" xmlns:w16="http://schemas.microsoft.com/office/word/2018/wordml" xmlns:w16du="http://schemas.microsoft.com/office/word/2023/wordml/word16du" xmlns:w16sdtdh="http://schemas.microsoft.com/office/word/2020/wordml/sdtdatahash" xmlns:w16sdtfl="http://schemas.microsoft.com/office/word/2024/wordml/sdtformatlock" xmlns:w16se="http://schemas.microsoft.com/office/word/2015/wordml/symex" xmlns:wpg="http://schemas.microsoft.com/office/word/2010/wordprocessingGroup" xmlns:wpi="http://schemas.microsoft.com/office/word/2010/wordprocessingInk" xmlns:wne="http://schemas.microsoft.com/office/word/2006/wordml" xmlns:wps="http://schemas.microsoft.com/office/word/2010/wordprocessingShape" mc:Ignorable="w14 w15 w16se w16cid w16 w16cex w16sdtdh w16sdtfl w16du wp14">
   <w:footnote w:type="separator" w:id="-1">
     <w:p>
       <w:pPr>
@@ -12238,7 +11880,7 @@
 </file>
 
 <file path=word/header1.xml><?xml version="1.0" encoding="utf-8"?>
-<w:hdr xmlns:wpc="http://schemas.microsoft.com/office/word/2010/wordprocessingCanvas" xmlns:cx="http://schemas.microsoft.com/office/drawing/2014/chartex" xmlns:cx1="http://schemas.microsoft.com/office/drawing/2015/9/8/chartex" xmlns:cx2="http://schemas.microsoft.com/office/drawing/2015/10/21/chartex" xmlns:cx3="http://schemas.microsoft.com/office/drawing/2016/5/9/chartex" xmlns:cx4="http://schemas.microsoft.com/office/drawing/2016/5/10/chartex" xmlns:cx5="http://schemas.microsoft.com/office/drawing/2016/5/11/chartex" xmlns:cx6="http://schemas.microsoft.com/office/drawing/2016/5/12/chartex" xmlns:cx7="http://schemas.microsoft.com/office/drawing/2016/5/13/chartex" xmlns:cx8="http://schemas.microsoft.com/office/drawing/2016/5/14/chartex" xmlns:mc="http://schemas.openxmlformats.org/markup-compatibility/2006" xmlns:aink="http://schemas.microsoft.com/office/drawing/2016/ink" xmlns:am3d="http://schemas.microsoft.com/office/drawing/2017/model3d" xmlns:o="urn:schemas-microsoft-com:office:office" xmlns:oel="http://schemas.microsoft.com/office/2019/extlst" xmlns:r="http://schemas.openxmlformats.org/officeDocument/2006/relationships" xmlns:m="http://schemas.openxmlformats.org/officeDocument/2006/math" xmlns:v="urn:schemas-microsoft-com:vml" xmlns:wp14="http://schemas.microsoft.com/office/word/2010/wordprocessingDrawing" xmlns:wp="http://schemas.openxmlformats.org/drawingml/2006/wordprocessingDrawing" xmlns:w10="urn:schemas-microsoft-com:office:word" xmlns:w="http://schemas.openxmlformats.org/wordprocessingml/2006/main" xmlns:w14="http://schemas.microsoft.com/office/word/2010/wordml" xmlns:w15="http://schemas.microsoft.com/office/word/2012/wordml" xmlns:w16cex="http://schemas.microsoft.com/office/word/2018/wordml/cex" xmlns:w16cid="http://schemas.microsoft.com/office/word/2016/wordml/cid" xmlns:w16="http://schemas.microsoft.com/office/word/2018/wordml" xmlns:w16sdtdh="http://schemas.microsoft.com/office/word/2020/wordml/sdtdatahash" xmlns:w16se="http://schemas.microsoft.com/office/word/2015/wordml/symex" xmlns:wpg="http://schemas.microsoft.com/office/word/2010/wordprocessingGroup" xmlns:wpi="http://schemas.microsoft.com/office/word/2010/wordprocessingInk" xmlns:wne="http://schemas.microsoft.com/office/word/2006/wordml" xmlns:wps="http://schemas.microsoft.com/office/word/2010/wordprocessingShape" mc:Ignorable="w14 w15 w16se w16cid w16 w16cex w16sdtdh wp14">
+<w:hdr xmlns:wpc="http://schemas.microsoft.com/office/word/2010/wordprocessingCanvas" xmlns:cx="http://schemas.microsoft.com/office/drawing/2014/chartex" xmlns:cx1="http://schemas.microsoft.com/office/drawing/2015/9/8/chartex" xmlns:cx2="http://schemas.microsoft.com/office/drawing/2015/10/21/chartex" xmlns:cx3="http://schemas.microsoft.com/office/drawing/2016/5/9/chartex" xmlns:cx4="http://schemas.microsoft.com/office/drawing/2016/5/10/chartex" xmlns:cx5="http://schemas.microsoft.com/office/drawing/2016/5/11/chartex" xmlns:cx6="http://schemas.microsoft.com/office/drawing/2016/5/12/chartex" xmlns:cx7="http://schemas.microsoft.com/office/drawing/2016/5/13/chartex" xmlns:cx8="http://schemas.microsoft.com/office/drawing/2016/5/14/chartex" xmlns:mc="http://schemas.openxmlformats.org/markup-compatibility/2006" xmlns:aink="http://schemas.microsoft.com/office/drawing/2016/ink" xmlns:am3d="http://schemas.microsoft.com/office/drawing/2017/model3d" xmlns:o="urn:schemas-microsoft-com:office:office" xmlns:oel="http://schemas.microsoft.com/office/2019/extlst" xmlns:r="http://schemas.openxmlformats.org/officeDocument/2006/relationships" xmlns:m="http://schemas.openxmlformats.org/officeDocument/2006/math" xmlns:v="urn:schemas-microsoft-com:vml" xmlns:wp14="http://schemas.microsoft.com/office/word/2010/wordprocessingDrawing" xmlns:wp="http://schemas.openxmlformats.org/drawingml/2006/wordprocessingDrawing" xmlns:w10="urn:schemas-microsoft-com:office:word" xmlns:w="http://schemas.openxmlformats.org/wordprocessingml/2006/main" xmlns:w14="http://schemas.microsoft.com/office/word/2010/wordml" xmlns:w15="http://schemas.microsoft.com/office/word/2012/wordml" xmlns:w16cei="http://schemas.microsoft.com/office/word/2026/wordml/cei" xmlns:w16cex="http://schemas.microsoft.com/office/word/2018/wordml/cex" xmlns:w16cid="http://schemas.microsoft.com/office/word/2016/wordml/cid" xmlns:w16="http://schemas.microsoft.com/office/word/2018/wordml" xmlns:w16du="http://schemas.microsoft.com/office/word/2023/wordml/word16du" xmlns:w16sdtdh="http://schemas.microsoft.com/office/word/2020/wordml/sdtdatahash" xmlns:w16sdtfl="http://schemas.microsoft.com/office/word/2024/wordml/sdtformatlock" xmlns:w16se="http://schemas.microsoft.com/office/word/2015/wordml/symex" xmlns:wpg="http://schemas.microsoft.com/office/word/2010/wordprocessingGroup" xmlns:wpi="http://schemas.microsoft.com/office/word/2010/wordprocessingInk" xmlns:wne="http://schemas.microsoft.com/office/word/2006/wordml" xmlns:wps="http://schemas.microsoft.com/office/word/2010/wordprocessingShape" mc:Ignorable="w14 w15 w16se w16cid w16 w16cex w16sdtdh w16sdtfl w16du wp14">
   <w:p>
     <w:pPr>
       <w:pStyle w:val="Encabezado"/>
@@ -12252,7 +11894,7 @@
         <w:rPr>
           <w:noProof/>
         </w:rPr>
-        <w:t>Método</w:t>
+        <w:t>Diseño</w:t>
       </w:r>
     </w:fldSimple>
   </w:p>
@@ -12260,7 +11902,7 @@
 </file>
 
 <file path=word/header2.xml><?xml version="1.0" encoding="utf-8"?>
-<w:hdr xmlns:wpc="http://schemas.microsoft.com/office/word/2010/wordprocessingCanvas" xmlns:cx="http://schemas.microsoft.com/office/drawing/2014/chartex" xmlns:cx1="http://schemas.microsoft.com/office/drawing/2015/9/8/chartex" xmlns:cx2="http://schemas.microsoft.com/office/drawing/2015/10/21/chartex" xmlns:cx3="http://schemas.microsoft.com/office/drawing/2016/5/9/chartex" xmlns:cx4="http://schemas.microsoft.com/office/drawing/2016/5/10/chartex" xmlns:cx5="http://schemas.microsoft.com/office/drawing/2016/5/11/chartex" xmlns:cx6="http://schemas.microsoft.com/office/drawing/2016/5/12/chartex" xmlns:cx7="http://schemas.microsoft.com/office/drawing/2016/5/13/chartex" xmlns:cx8="http://schemas.microsoft.com/office/drawing/2016/5/14/chartex" xmlns:mc="http://schemas.openxmlformats.org/markup-compatibility/2006" xmlns:aink="http://schemas.microsoft.com/office/drawing/2016/ink" xmlns:am3d="http://schemas.microsoft.com/office/drawing/2017/model3d" xmlns:o="urn:schemas-microsoft-com:office:office" xmlns:oel="http://schemas.microsoft.com/office/2019/extlst" xmlns:r="http://schemas.openxmlformats.org/officeDocument/2006/relationships" xmlns:m="http://schemas.openxmlformats.org/officeDocument/2006/math" xmlns:v="urn:schemas-microsoft-com:vml" xmlns:wp14="http://schemas.microsoft.com/office/word/2010/wordprocessingDrawing" xmlns:wp="http://schemas.openxmlformats.org/drawingml/2006/wordprocessingDrawing" xmlns:w10="urn:schemas-microsoft-com:office:word" xmlns:w="http://schemas.openxmlformats.org/wordprocessingml/2006/main" xmlns:w14="http://schemas.microsoft.com/office/word/2010/wordml" xmlns:w15="http://schemas.microsoft.com/office/word/2012/wordml" xmlns:w16cex="http://schemas.microsoft.com/office/word/2018/wordml/cex" xmlns:w16cid="http://schemas.microsoft.com/office/word/2016/wordml/cid" xmlns:w16="http://schemas.microsoft.com/office/word/2018/wordml" xmlns:w16sdtdh="http://schemas.microsoft.com/office/word/2020/wordml/sdtdatahash" xmlns:w16se="http://schemas.microsoft.com/office/word/2015/wordml/symex" xmlns:wpg="http://schemas.microsoft.com/office/word/2010/wordprocessingGroup" xmlns:wpi="http://schemas.microsoft.com/office/word/2010/wordprocessingInk" xmlns:wne="http://schemas.microsoft.com/office/word/2006/wordml" xmlns:wps="http://schemas.microsoft.com/office/word/2010/wordprocessingShape" mc:Ignorable="w14 w15 w16se w16cid w16 w16cex w16sdtdh wp14">
+<w:hdr xmlns:wpc="http://schemas.microsoft.com/office/word/2010/wordprocessingCanvas" xmlns:cx="http://schemas.microsoft.com/office/drawing/2014/chartex" xmlns:cx1="http://schemas.microsoft.com/office/drawing/2015/9/8/chartex" xmlns:cx2="http://schemas.microsoft.com/office/drawing/2015/10/21/chartex" xmlns:cx3="http://schemas.microsoft.com/office/drawing/2016/5/9/chartex" xmlns:cx4="http://schemas.microsoft.com/office/drawing/2016/5/10/chartex" xmlns:cx5="http://schemas.microsoft.com/office/drawing/2016/5/11/chartex" xmlns:cx6="http://schemas.microsoft.com/office/drawing/2016/5/12/chartex" xmlns:cx7="http://schemas.microsoft.com/office/drawing/2016/5/13/chartex" xmlns:cx8="http://schemas.microsoft.com/office/drawing/2016/5/14/chartex" xmlns:mc="http://schemas.openxmlformats.org/markup-compatibility/2006" xmlns:aink="http://schemas.microsoft.com/office/drawing/2016/ink" xmlns:am3d="http://schemas.microsoft.com/office/drawing/2017/model3d" xmlns:o="urn:schemas-microsoft-com:office:office" xmlns:oel="http://schemas.microsoft.com/office/2019/extlst" xmlns:r="http://schemas.openxmlformats.org/officeDocument/2006/relationships" xmlns:m="http://schemas.openxmlformats.org/officeDocument/2006/math" xmlns:v="urn:schemas-microsoft-com:vml" xmlns:wp14="http://schemas.microsoft.com/office/word/2010/wordprocessingDrawing" xmlns:wp="http://schemas.openxmlformats.org/drawingml/2006/wordprocessingDrawing" xmlns:w10="urn:schemas-microsoft-com:office:word" xmlns:w="http://schemas.openxmlformats.org/wordprocessingml/2006/main" xmlns:w14="http://schemas.microsoft.com/office/word/2010/wordml" xmlns:w15="http://schemas.microsoft.com/office/word/2012/wordml" xmlns:w16cei="http://schemas.microsoft.com/office/word/2026/wordml/cei" xmlns:w16cex="http://schemas.microsoft.com/office/word/2018/wordml/cex" xmlns:w16cid="http://schemas.microsoft.com/office/word/2016/wordml/cid" xmlns:w16="http://schemas.microsoft.com/office/word/2018/wordml" xmlns:w16du="http://schemas.microsoft.com/office/word/2023/wordml/word16du" xmlns:w16sdtdh="http://schemas.microsoft.com/office/word/2020/wordml/sdtdatahash" xmlns:w16sdtfl="http://schemas.microsoft.com/office/word/2024/wordml/sdtformatlock" xmlns:w16se="http://schemas.microsoft.com/office/word/2015/wordml/symex" xmlns:wpg="http://schemas.microsoft.com/office/word/2010/wordprocessingGroup" xmlns:wpi="http://schemas.microsoft.com/office/word/2010/wordprocessingInk" xmlns:wne="http://schemas.microsoft.com/office/word/2006/wordml" xmlns:wps="http://schemas.microsoft.com/office/word/2010/wordprocessingShape" mc:Ignorable="w14 w15 w16se w16cid w16 w16cex w16sdtdh w16sdtfl w16du wp14">
   <w:p>
     <w:pPr>
       <w:pStyle w:val="Encabezado"/>
@@ -12276,7 +11918,7 @@
 </file>
 
 <file path=word/header3.xml><?xml version="1.0" encoding="utf-8"?>
-<w:hdr xmlns:wpc="http://schemas.microsoft.com/office/word/2010/wordprocessingCanvas" xmlns:cx="http://schemas.microsoft.com/office/drawing/2014/chartex" xmlns:cx1="http://schemas.microsoft.com/office/drawing/2015/9/8/chartex" xmlns:cx2="http://schemas.microsoft.com/office/drawing/2015/10/21/chartex" xmlns:cx3="http://schemas.microsoft.com/office/drawing/2016/5/9/chartex" xmlns:cx4="http://schemas.microsoft.com/office/drawing/2016/5/10/chartex" xmlns:cx5="http://schemas.microsoft.com/office/drawing/2016/5/11/chartex" xmlns:cx6="http://schemas.microsoft.com/office/drawing/2016/5/12/chartex" xmlns:cx7="http://schemas.microsoft.com/office/drawing/2016/5/13/chartex" xmlns:cx8="http://schemas.microsoft.com/office/drawing/2016/5/14/chartex" xmlns:mc="http://schemas.openxmlformats.org/markup-compatibility/2006" xmlns:aink="http://schemas.microsoft.com/office/drawing/2016/ink" xmlns:am3d="http://schemas.microsoft.com/office/drawing/2017/model3d" xmlns:o="urn:schemas-microsoft-com:office:office" xmlns:oel="http://schemas.microsoft.com/office/2019/extlst" xmlns:r="http://schemas.openxmlformats.org/officeDocument/2006/relationships" xmlns:m="http://schemas.openxmlformats.org/officeDocument/2006/math" xmlns:v="urn:schemas-microsoft-com:vml" xmlns:wp14="http://schemas.microsoft.com/office/word/2010/wordprocessingDrawing" xmlns:wp="http://schemas.openxmlformats.org/drawingml/2006/wordprocessingDrawing" xmlns:w10="urn:schemas-microsoft-com:office:word" xmlns:w="http://schemas.openxmlformats.org/wordprocessingml/2006/main" xmlns:w14="http://schemas.microsoft.com/office/word/2010/wordml" xmlns:w15="http://schemas.microsoft.com/office/word/2012/wordml" xmlns:w16cex="http://schemas.microsoft.com/office/word/2018/wordml/cex" xmlns:w16cid="http://schemas.microsoft.com/office/word/2016/wordml/cid" xmlns:w16="http://schemas.microsoft.com/office/word/2018/wordml" xmlns:w16sdtdh="http://schemas.microsoft.com/office/word/2020/wordml/sdtdatahash" xmlns:w16se="http://schemas.microsoft.com/office/word/2015/wordml/symex" xmlns:wpg="http://schemas.microsoft.com/office/word/2010/wordprocessingGroup" xmlns:wpi="http://schemas.microsoft.com/office/word/2010/wordprocessingInk" xmlns:wne="http://schemas.microsoft.com/office/word/2006/wordml" xmlns:wps="http://schemas.microsoft.com/office/word/2010/wordprocessingShape" mc:Ignorable="w14 w15 w16se w16cid w16 w16cex w16sdtdh wp14">
+<w:hdr xmlns:wpc="http://schemas.microsoft.com/office/word/2010/wordprocessingCanvas" xmlns:cx="http://schemas.microsoft.com/office/drawing/2014/chartex" xmlns:cx1="http://schemas.microsoft.com/office/drawing/2015/9/8/chartex" xmlns:cx2="http://schemas.microsoft.com/office/drawing/2015/10/21/chartex" xmlns:cx3="http://schemas.microsoft.com/office/drawing/2016/5/9/chartex" xmlns:cx4="http://schemas.microsoft.com/office/drawing/2016/5/10/chartex" xmlns:cx5="http://schemas.microsoft.com/office/drawing/2016/5/11/chartex" xmlns:cx6="http://schemas.microsoft.com/office/drawing/2016/5/12/chartex" xmlns:cx7="http://schemas.microsoft.com/office/drawing/2016/5/13/chartex" xmlns:cx8="http://schemas.microsoft.com/office/drawing/2016/5/14/chartex" xmlns:mc="http://schemas.openxmlformats.org/markup-compatibility/2006" xmlns:aink="http://schemas.microsoft.com/office/drawing/2016/ink" xmlns:am3d="http://schemas.microsoft.com/office/drawing/2017/model3d" xmlns:o="urn:schemas-microsoft-com:office:office" xmlns:oel="http://schemas.microsoft.com/office/2019/extlst" xmlns:r="http://schemas.openxmlformats.org/officeDocument/2006/relationships" xmlns:m="http://schemas.openxmlformats.org/officeDocument/2006/math" xmlns:v="urn:schemas-microsoft-com:vml" xmlns:wp14="http://schemas.microsoft.com/office/word/2010/wordprocessingDrawing" xmlns:wp="http://schemas.openxmlformats.org/drawingml/2006/wordprocessingDrawing" xmlns:w10="urn:schemas-microsoft-com:office:word" xmlns:w="http://schemas.openxmlformats.org/wordprocessingml/2006/main" xmlns:w14="http://schemas.microsoft.com/office/word/2010/wordml" xmlns:w15="http://schemas.microsoft.com/office/word/2012/wordml" xmlns:w16cei="http://schemas.microsoft.com/office/word/2026/wordml/cei" xmlns:w16cex="http://schemas.microsoft.com/office/word/2018/wordml/cex" xmlns:w16cid="http://schemas.microsoft.com/office/word/2016/wordml/cid" xmlns:w16="http://schemas.microsoft.com/office/word/2018/wordml" xmlns:w16du="http://schemas.microsoft.com/office/word/2023/wordml/word16du" xmlns:w16sdtdh="http://schemas.microsoft.com/office/word/2020/wordml/sdtdatahash" xmlns:w16sdtfl="http://schemas.microsoft.com/office/word/2024/wordml/sdtformatlock" xmlns:w16se="http://schemas.microsoft.com/office/word/2015/wordml/symex" xmlns:wpg="http://schemas.microsoft.com/office/word/2010/wordprocessingGroup" xmlns:wpi="http://schemas.microsoft.com/office/word/2010/wordprocessingInk" xmlns:wne="http://schemas.microsoft.com/office/word/2006/wordml" xmlns:wps="http://schemas.microsoft.com/office/word/2010/wordprocessingShape" mc:Ignorable="w14 w15 w16se w16cid w16 w16cex w16sdtdh w16sdtfl w16du wp14">
   <w:p>
     <w:pPr>
       <w:pStyle w:val="Encabezado"/>
@@ -12292,7 +11934,7 @@
 </file>
 
 <file path=word/numbering.xml><?xml version="1.0" encoding="utf-8"?>
-<w:numbering xmlns:wpc="http://schemas.microsoft.com/office/word/2010/wordprocessingCanvas" xmlns:cx="http://schemas.microsoft.com/office/drawing/2014/chartex" xmlns:cx1="http://schemas.microsoft.com/office/drawing/2015/9/8/chartex" xmlns:cx2="http://schemas.microsoft.com/office/drawing/2015/10/21/chartex" xmlns:cx3="http://schemas.microsoft.com/office/drawing/2016/5/9/chartex" xmlns:cx4="http://schemas.microsoft.com/office/drawing/2016/5/10/chartex" xmlns:cx5="http://schemas.microsoft.com/office/drawing/2016/5/11/chartex" xmlns:cx6="http://schemas.microsoft.com/office/drawing/2016/5/12/chartex" xmlns:cx7="http://schemas.microsoft.com/office/drawing/2016/5/13/chartex" xmlns:cx8="http://schemas.microsoft.com/office/drawing/2016/5/14/chartex" xmlns:mc="http://schemas.openxmlformats.org/markup-compatibility/2006" xmlns:aink="http://schemas.microsoft.com/office/drawing/2016/ink" xmlns:am3d="http://schemas.microsoft.com/office/drawing/2017/model3d" xmlns:o="urn:schemas-microsoft-com:office:office" xmlns:oel="http://schemas.microsoft.com/office/2019/extlst" xmlns:r="http://schemas.openxmlformats.org/officeDocument/2006/relationships" xmlns:m="http://schemas.openxmlformats.org/officeDocument/2006/math" xmlns:v="urn:schemas-microsoft-com:vml" xmlns:wp14="http://schemas.microsoft.com/office/word/2010/wordprocessingDrawing" xmlns:wp="http://schemas.openxmlformats.org/drawingml/2006/wordprocessingDrawing" xmlns:w10="urn:schemas-microsoft-com:office:word" xmlns:w="http://schemas.openxmlformats.org/wordprocessingml/2006/main" xmlns:w14="http://schemas.microsoft.com/office/word/2010/wordml" xmlns:w15="http://schemas.microsoft.com/office/word/2012/wordml" xmlns:w16cex="http://schemas.microsoft.com/office/word/2018/wordml/cex" xmlns:w16cid="http://schemas.microsoft.com/office/word/2016/wordml/cid" xmlns:w16="http://schemas.microsoft.com/office/word/2018/wordml" xmlns:w16sdtdh="http://schemas.microsoft.com/office/word/2020/wordml/sdtdatahash" xmlns:w16se="http://schemas.microsoft.com/office/word/2015/wordml/symex" xmlns:wpg="http://schemas.microsoft.com/office/word/2010/wordprocessingGroup" xmlns:wpi="http://schemas.microsoft.com/office/word/2010/wordprocessingInk" xmlns:wne="http://schemas.microsoft.com/office/word/2006/wordml" xmlns:wps="http://schemas.microsoft.com/office/word/2010/wordprocessingShape" mc:Ignorable="w14 w15 w16se w16cid w16 w16cex w16sdtdh wp14">
+<w:numbering xmlns:wpc="http://schemas.microsoft.com/office/word/2010/wordprocessingCanvas" xmlns:cx="http://schemas.microsoft.com/office/drawing/2014/chartex" xmlns:cx1="http://schemas.microsoft.com/office/drawing/2015/9/8/chartex" xmlns:cx2="http://schemas.microsoft.com/office/drawing/2015/10/21/chartex" xmlns:cx3="http://schemas.microsoft.com/office/drawing/2016/5/9/chartex" xmlns:cx4="http://schemas.microsoft.com/office/drawing/2016/5/10/chartex" xmlns:cx5="http://schemas.microsoft.com/office/drawing/2016/5/11/chartex" xmlns:cx6="http://schemas.microsoft.com/office/drawing/2016/5/12/chartex" xmlns:cx7="http://schemas.microsoft.com/office/drawing/2016/5/13/chartex" xmlns:cx8="http://schemas.microsoft.com/office/drawing/2016/5/14/chartex" xmlns:mc="http://schemas.openxmlformats.org/markup-compatibility/2006" xmlns:aink="http://schemas.microsoft.com/office/drawing/2016/ink" xmlns:am3d="http://schemas.microsoft.com/office/drawing/2017/model3d" xmlns:o="urn:schemas-microsoft-com:office:office" xmlns:oel="http://schemas.microsoft.com/office/2019/extlst" xmlns:r="http://schemas.openxmlformats.org/officeDocument/2006/relationships" xmlns:m="http://schemas.openxmlformats.org/officeDocument/2006/math" xmlns:v="urn:schemas-microsoft-com:vml" xmlns:wp14="http://schemas.microsoft.com/office/word/2010/wordprocessingDrawing" xmlns:wp="http://schemas.openxmlformats.org/drawingml/2006/wordprocessingDrawing" xmlns:w10="urn:schemas-microsoft-com:office:word" xmlns:w="http://schemas.openxmlformats.org/wordprocessingml/2006/main" xmlns:w14="http://schemas.microsoft.com/office/word/2010/wordml" xmlns:w15="http://schemas.microsoft.com/office/word/2012/wordml" xmlns:w16cei="http://schemas.microsoft.com/office/word/2026/wordml/cei" xmlns:w16cex="http://schemas.microsoft.com/office/word/2018/wordml/cex" xmlns:w16cid="http://schemas.microsoft.com/office/word/2016/wordml/cid" xmlns:w16="http://schemas.microsoft.com/office/word/2018/wordml" xmlns:w16du="http://schemas.microsoft.com/office/word/2023/wordml/word16du" xmlns:w16sdtdh="http://schemas.microsoft.com/office/word/2020/wordml/sdtdatahash" xmlns:w16sdtfl="http://schemas.microsoft.com/office/word/2024/wordml/sdtformatlock" xmlns:w16se="http://schemas.microsoft.com/office/word/2015/wordml/symex" xmlns:wpg="http://schemas.microsoft.com/office/word/2010/wordprocessingGroup" xmlns:wpi="http://schemas.microsoft.com/office/word/2010/wordprocessingInk" xmlns:wne="http://schemas.microsoft.com/office/word/2006/wordml" xmlns:wps="http://schemas.microsoft.com/office/word/2010/wordprocessingShape" mc:Ignorable="w14 w15 w16se w16cid w16 w16cex w16sdtdh w16sdtfl w16du wp14">
   <w:abstractNum w:abstractNumId="0" w15:restartNumberingAfterBreak="0">
     <w:nsid w:val="01C33CC2"/>
     <w:multiLevelType w:val="multilevel"/>
@@ -17141,7 +16783,7 @@
 </file>
 
 <file path=word/styles.xml><?xml version="1.0" encoding="utf-8"?>
-<w:styles xmlns:mc="http://schemas.openxmlformats.org/markup-compatibility/2006" xmlns:r="http://schemas.openxmlformats.org/officeDocument/2006/relationships" xmlns:w="http://schemas.openxmlformats.org/wordprocessingml/2006/main" xmlns:w14="http://schemas.microsoft.com/office/word/2010/wordml" xmlns:w15="http://schemas.microsoft.com/office/word/2012/wordml" xmlns:w16cex="http://schemas.microsoft.com/office/word/2018/wordml/cex" xmlns:w16cid="http://schemas.microsoft.com/office/word/2016/wordml/cid" xmlns:w16="http://schemas.microsoft.com/office/word/2018/wordml" xmlns:w16sdtdh="http://schemas.microsoft.com/office/word/2020/wordml/sdtdatahash" xmlns:w16se="http://schemas.microsoft.com/office/word/2015/wordml/symex" mc:Ignorable="w14 w15 w16se w16cid w16 w16cex w16sdtdh">
+<w:styles xmlns:mc="http://schemas.openxmlformats.org/markup-compatibility/2006" xmlns:r="http://schemas.openxmlformats.org/officeDocument/2006/relationships" xmlns:w="http://schemas.openxmlformats.org/wordprocessingml/2006/main" xmlns:w14="http://schemas.microsoft.com/office/word/2010/wordml" xmlns:w15="http://schemas.microsoft.com/office/word/2012/wordml" xmlns:w16cex="http://schemas.microsoft.com/office/word/2018/wordml/cex" xmlns:w16cid="http://schemas.microsoft.com/office/word/2016/wordml/cid" xmlns:w16="http://schemas.microsoft.com/office/word/2018/wordml" xmlns:w16du="http://schemas.microsoft.com/office/word/2023/wordml/word16du" xmlns:w16sdtdh="http://schemas.microsoft.com/office/word/2020/wordml/sdtdatahash" xmlns:w16sdtfl="http://schemas.microsoft.com/office/word/2024/wordml/sdtformatlock" xmlns:w16se="http://schemas.microsoft.com/office/word/2015/wordml/symex" mc:Ignorable="w14 w15 w16se w16cid w16 w16cex w16sdtdh w16sdtfl w16du">
   <w:docDefaults>
     <w:rPrDefault>
       <w:rPr>
@@ -17687,7 +17329,7 @@
       <w:szCs w:val="24"/>
     </w:rPr>
   </w:style>
-  <w:style w:type="character" w:styleId="Textoennegrita">
+  <w:style w:type="character" w:styleId="Fuerte">
     <w:name w:val="Strong"/>
     <w:basedOn w:val="Fuentedeprrafopredeter"/>
     <w:uiPriority w:val="22"/>

</xml_diff>

<commit_message>
Reenfoque entero solo falta la bibliografia
</commit_message>
<xml_diff>
--- a/Propuesta - Vacunas.docx
+++ b/Propuesta - Vacunas.docx
@@ -4266,7 +4266,7 @@
     <w:p>
       <w:pPr>
         <w:pStyle w:val="Textoindependiente"/>
-        <w:spacing w:after="240" w:line="276" w:lineRule="auto"/>
+        <w:spacing w:after="240" w:line="264" w:lineRule="auto"/>
         <w:ind w:left="0" w:firstLine="709"/>
         <w:rPr>
           <w:rFonts w:ascii="Arial" w:eastAsiaTheme="minorHAnsi" w:hAnsi="Arial" w:cs="Arial"/>
@@ -4278,13 +4278,13 @@
           <w:rFonts w:ascii="Arial" w:eastAsiaTheme="minorHAnsi" w:hAnsi="Arial" w:cs="Arial"/>
           <w:lang w:val="es-419" w:eastAsia="es-GT"/>
         </w:rPr>
-        <w:t>En Guatemala, el Ministerio de Salud Pública y Asistencia Social (MSPAS) es la entidad encargada de garantizar el acceso a los servicios de salud de la población, entre ellos los programas de inmunización. El departamento de San Marcos está conformado por 30 municipios cuyos centros de salud dependen del control adecuado de sus existencias de vacunas para garantizar la cobertura de inmunización. En este contexto se desarrolla el presente anteproyecto, orientado al diseño de una aplicación web centralizada y distrital para la gestión, control y visualización de vacunas en los centros de salud del departamento.</w:t>
+        <w:t>En Guatemala, el Ministerio de Salud Pública y Asistencia Social (MSPAS) es la entidad encargada de garantizar el acceso a los servicios de salud de la población, entre ellos los programas de inmunización. El departamento de San Marcos está conformado por 30 municipios que reportan mensualmente su producción de vacunación a la Dirección Departamental de Redes Integradas de Servicios de Salud de San Marcos (DRISS San Marcos), mediante un formulario físico conocido como 5C. En este contexto se desarrolla el presente anteproyecto, orientado al diseño de una aplicación web que centralice el registro de esta producción y automatice la generación de los informes de cobertura de vacunación del departamento.</w:t>
       </w:r>
     </w:p>
     <w:p>
       <w:pPr>
         <w:pStyle w:val="Textoindependiente"/>
-        <w:spacing w:after="240" w:line="276" w:lineRule="auto"/>
+        <w:spacing w:after="240" w:line="264" w:lineRule="auto"/>
         <w:ind w:left="0" w:firstLine="709"/>
         <w:rPr>
           <w:rFonts w:ascii="Arial" w:eastAsiaTheme="minorHAnsi" w:hAnsi="Arial" w:cs="Arial"/>
@@ -4296,13 +4296,13 @@
           <w:rFonts w:ascii="Arial" w:eastAsiaTheme="minorHAnsi" w:hAnsi="Arial" w:cs="Arial"/>
           <w:lang w:val="es-419" w:eastAsia="es-GT"/>
         </w:rPr>
-        <w:t>El tema fue seleccionado debido a que la gestión de vacunas es un proceso crítico para la salud pública, ya que un control inadecuado de las existencias puede derivar en desabastecimiento o en la pérdida de dosis por vencimiento. Al identificar que los centros de salud del departamento aún dependen del registro físico en papel para esta labor, se consideró que el desarrollo de una herramienta tecnológica representa una oportunidad concreta para resolver un problema real que afecta directamente a la población.</w:t>
+        <w:t>El tema fue seleccionado debido a que la generación oportuna y confiable del informe de cobertura de vacunación es un proceso crítico para la salud pública del departamento, ya que a partir de él se da seguimiento al cumplimiento de la meta de cobertura establecida por el MSPAS. Al identificar que la DRISS San Marcos aún depende de un formulario físico y de archivos de Excel para consolidar esta información, concentrando gran parte del trabajo en una sola persona, se consideró que el desarrollo de una herramienta tecnológica representa una oportunidad concreta para resolver un problema real que afecta directamente a la población del departamento.</w:t>
       </w:r>
     </w:p>
     <w:p>
       <w:pPr>
         <w:pStyle w:val="Textoindependiente"/>
-        <w:spacing w:after="240" w:line="276" w:lineRule="auto"/>
+        <w:spacing w:after="240" w:line="264" w:lineRule="auto"/>
         <w:ind w:left="0" w:firstLine="709"/>
         <w:rPr>
           <w:rFonts w:ascii="Arial" w:eastAsiaTheme="minorHAnsi" w:hAnsi="Arial" w:cs="Arial"/>
@@ -4314,13 +4314,13 @@
           <w:rFonts w:ascii="Arial" w:eastAsiaTheme="minorHAnsi" w:hAnsi="Arial" w:cs="Arial"/>
           <w:lang w:val="es-419" w:eastAsia="es-GT"/>
         </w:rPr>
-        <w:t>La finalidad del estudio es resolver la falta de un sistema centralizado que permita a los centros de salud del departamento registrar y consultar la disponibilidad de vacunas de forma estandarizada y en tiempo real. A partir de esta necesidad, la investigación se orienta a definir qué funcionalidades debe incluir dicho sistema para apoyar la toma de decisiones de las autoridades de salud del departamento.</w:t>
+        <w:t>La finalidad del estudio es resolver la falta de un sistema centralizado que permita a los centros de salud del departamento registrar su producción de vacunación de forma estandarizada y generar de manera automática los informes de cobertura mensual y anual. A partir de esta necesidad, la investigación se orienta a definir qué funcionalidades debe incluir dicho sistema para apoyar la labor de la DRISS San Marcos y de las autoridades responsables del seguimiento de la cobertura de vacunación.</w:t>
       </w:r>
     </w:p>
     <w:p>
       <w:pPr>
         <w:pStyle w:val="Textoindependiente"/>
-        <w:spacing w:after="240" w:line="276" w:lineRule="auto"/>
+        <w:spacing w:after="240" w:line="264" w:lineRule="auto"/>
         <w:ind w:left="0" w:firstLine="709"/>
         <w:rPr>
           <w:rFonts w:ascii="Arial" w:eastAsiaTheme="minorHAnsi" w:hAnsi="Arial" w:cs="Arial"/>
@@ -4338,7 +4338,7 @@
     <w:p>
       <w:pPr>
         <w:pStyle w:val="Textoindependiente"/>
-        <w:spacing w:after="240" w:line="276" w:lineRule="auto"/>
+        <w:spacing w:after="240" w:line="264" w:lineRule="auto"/>
         <w:ind w:left="0" w:firstLine="709"/>
         <w:rPr>
           <w:rFonts w:ascii="Arial" w:eastAsiaTheme="minorHAnsi" w:hAnsi="Arial" w:cs="Arial"/>
@@ -4350,24 +4350,14 @@
           <w:rFonts w:ascii="Arial" w:eastAsiaTheme="minorHAnsi" w:hAnsi="Arial" w:cs="Arial"/>
           <w:lang w:val="es-419" w:eastAsia="es-GT"/>
         </w:rPr>
-        <w:t>Se espera que, al finalizar el proyecto, los centros de salud del departamento de San Marcos cuenten con una aplicación web que les permita registrar los movimientos de entrada y salida de vacunas, consultar su disponibilidad mediante una vista tipo tabla y un tablero de control, y recibir alertas automáticas ante niveles bajos de stock o próximos vencimientos, contribuyendo así a una gestión más eficiente y confiable de las vacunas en el departamento.</w:t>
-      </w:r>
-    </w:p>
-    <w:p>
-      <w:pPr>
-        <w:rPr>
-          <w:rFonts w:ascii="Arial" w:hAnsi="Arial" w:cs="Arial"/>
-          <w:sz w:val="24"/>
-          <w:szCs w:val="24"/>
-        </w:rPr>
-      </w:pPr>
-      <w:r>
-        <w:rPr>
-          <w:rFonts w:ascii="Arial" w:hAnsi="Arial" w:cs="Arial"/>
-          <w:sz w:val="24"/>
-          <w:szCs w:val="24"/>
-        </w:rPr>
-        <w:br w:type="page"/>
+        <w:t>Se espera que, al finalizar el proyecto, la DRISS San Marcos cuente con una aplicación web que permita a los centros de salud del departamento registrar su producción de vacunación mediante un formulario 5C digital, consultar dicha información mediante una vista tipo tabla y un tablero de control, y generar de forma automática los informes de cobertura mensual y anual, contribuyendo así a un seguimiento más ágil y confiable de la cobertura de vacunación en el departamento</w:t>
+      </w:r>
+      <w:r>
+        <w:rPr>
+          <w:rFonts w:ascii="Arial" w:eastAsiaTheme="minorHAnsi" w:hAnsi="Arial" w:cs="Arial"/>
+          <w:lang w:val="es-419" w:eastAsia="es-GT"/>
+        </w:rPr>
+        <w:t>.</w:t>
       </w:r>
     </w:p>
     <w:p>
@@ -7224,12 +7214,85 @@
       </w:pPr>
       <w:r>
         <w:rPr>
+          <w:i/>
+          <w:iCs/>
+          <w:noProof/>
+          <w:color w:val="44546A" w:themeColor="text2"/>
+          <w:sz w:val="18"/>
+          <w:szCs w:val="18"/>
+          <w:lang w:val="es-MX"/>
+        </w:rPr>
+        <w:drawing>
+          <wp:anchor distT="0" distB="0" distL="114300" distR="114300" simplePos="0" relativeHeight="251675648" behindDoc="0" locked="0" layoutInCell="1" allowOverlap="1" wp14:anchorId="27B955F2" wp14:editId="3E39B67F">
+            <wp:simplePos x="0" y="0"/>
+            <wp:positionH relativeFrom="column">
+              <wp:posOffset>13912</wp:posOffset>
+            </wp:positionH>
+            <wp:positionV relativeFrom="paragraph">
+              <wp:posOffset>1081809</wp:posOffset>
+            </wp:positionV>
+            <wp:extent cx="5902325" cy="1765935"/>
+            <wp:effectExtent l="0" t="0" r="3175" b="5715"/>
+            <wp:wrapTopAndBottom/>
+            <wp:docPr id="800778585" name="Imagen 9"/>
+            <wp:cNvGraphicFramePr>
+              <a:graphicFrameLocks xmlns:a="http://schemas.openxmlformats.org/drawingml/2006/main" noChangeAspect="1"/>
+            </wp:cNvGraphicFramePr>
+            <a:graphic xmlns:a="http://schemas.openxmlformats.org/drawingml/2006/main">
+              <a:graphicData uri="http://schemas.openxmlformats.org/drawingml/2006/picture">
+                <pic:pic xmlns:pic="http://schemas.openxmlformats.org/drawingml/2006/picture">
+                  <pic:nvPicPr>
+                    <pic:cNvPr id="0" name="Picture 16"/>
+                    <pic:cNvPicPr>
+                      <a:picLocks noChangeAspect="1" noChangeArrowheads="1"/>
+                    </pic:cNvPicPr>
+                  </pic:nvPicPr>
+                  <pic:blipFill>
+                    <a:blip r:embed="rId25">
+                      <a:extLst>
+                        <a:ext uri="{28A0092B-C50C-407E-A947-70E740481C1C}">
+                          <a14:useLocalDpi xmlns:a14="http://schemas.microsoft.com/office/drawing/2010/main" val="0"/>
+                        </a:ext>
+                      </a:extLst>
+                    </a:blip>
+                    <a:srcRect/>
+                    <a:stretch>
+                      <a:fillRect/>
+                    </a:stretch>
+                  </pic:blipFill>
+                  <pic:spPr bwMode="auto">
+                    <a:xfrm>
+                      <a:off x="0" y="0"/>
+                      <a:ext cx="5902325" cy="1765935"/>
+                    </a:xfrm>
+                    <a:prstGeom prst="rect">
+                      <a:avLst/>
+                    </a:prstGeom>
+                    <a:noFill/>
+                    <a:ln>
+                      <a:noFill/>
+                    </a:ln>
+                  </pic:spPr>
+                </pic:pic>
+              </a:graphicData>
+            </a:graphic>
+            <wp14:sizeRelH relativeFrom="margin">
+              <wp14:pctWidth>0</wp14:pctWidth>
+            </wp14:sizeRelH>
+            <wp14:sizeRelV relativeFrom="margin">
+              <wp14:pctHeight>0</wp14:pctHeight>
+            </wp14:sizeRelV>
+          </wp:anchor>
+        </w:drawing>
+      </w:r>
+      <w:r>
+        <w:rPr>
           <w:noProof/>
         </w:rPr>
         <mc:AlternateContent>
           <mc:Choice Requires="wps">
             <w:drawing>
-              <wp:anchor distT="0" distB="0" distL="114300" distR="114300" simplePos="0" relativeHeight="251668480" behindDoc="0" locked="0" layoutInCell="1" allowOverlap="1" wp14:anchorId="1BD46EF5" wp14:editId="535851A6">
+              <wp:anchor distT="0" distB="0" distL="114300" distR="114300" simplePos="0" relativeHeight="251668480" behindDoc="0" locked="0" layoutInCell="1" allowOverlap="1" wp14:anchorId="1BD46EF5" wp14:editId="7B0FC2A2">
                 <wp:simplePos x="0" y="0"/>
                 <wp:positionH relativeFrom="column">
                   <wp:posOffset>-29845</wp:posOffset>
@@ -7449,79 +7512,19 @@
     </w:p>
     <w:p>
       <w:pPr>
-        <w:pStyle w:val="Descripcin"/>
-        <w:keepNext/>
         <w:spacing w:line="276" w:lineRule="auto"/>
-        <w:jc w:val="center"/>
-      </w:pPr>
-      <w:r>
-        <w:rPr>
+        <w:ind w:firstLine="708"/>
+        <w:jc w:val="both"/>
+        <w:rPr>
+          <w:i/>
+          <w:iCs/>
           <w:noProof/>
+          <w:color w:val="44546A" w:themeColor="text2"/>
+          <w:sz w:val="18"/>
+          <w:szCs w:val="18"/>
           <w:lang w:val="es-MX"/>
         </w:rPr>
-        <w:drawing>
-          <wp:anchor distT="0" distB="0" distL="114300" distR="114300" simplePos="0" relativeHeight="251663360" behindDoc="0" locked="0" layoutInCell="1" allowOverlap="1" wp14:anchorId="513C9186" wp14:editId="3D343675">
-            <wp:simplePos x="0" y="0"/>
-            <wp:positionH relativeFrom="margin">
-              <wp:posOffset>-635</wp:posOffset>
-            </wp:positionH>
-            <wp:positionV relativeFrom="paragraph">
-              <wp:posOffset>249555</wp:posOffset>
-            </wp:positionV>
-            <wp:extent cx="6013450" cy="1799590"/>
-            <wp:effectExtent l="0" t="0" r="6350" b="0"/>
-            <wp:wrapTopAndBottom/>
-            <wp:docPr id="1606384078" name="Imagen 6"/>
-            <wp:cNvGraphicFramePr>
-              <a:graphicFrameLocks xmlns:a="http://schemas.openxmlformats.org/drawingml/2006/main" noChangeAspect="1"/>
-            </wp:cNvGraphicFramePr>
-            <a:graphic xmlns:a="http://schemas.openxmlformats.org/drawingml/2006/main">
-              <a:graphicData uri="http://schemas.openxmlformats.org/drawingml/2006/picture">
-                <pic:pic xmlns:pic="http://schemas.openxmlformats.org/drawingml/2006/picture">
-                  <pic:nvPicPr>
-                    <pic:cNvPr id="0" name="Picture 23"/>
-                    <pic:cNvPicPr>
-                      <a:picLocks noChangeAspect="1" noChangeArrowheads="1"/>
-                    </pic:cNvPicPr>
-                  </pic:nvPicPr>
-                  <pic:blipFill>
-                    <a:blip r:embed="rId25">
-                      <a:extLst>
-                        <a:ext uri="{28A0092B-C50C-407E-A947-70E740481C1C}">
-                          <a14:useLocalDpi xmlns:a14="http://schemas.microsoft.com/office/drawing/2010/main" val="0"/>
-                        </a:ext>
-                      </a:extLst>
-                    </a:blip>
-                    <a:srcRect/>
-                    <a:stretch>
-                      <a:fillRect/>
-                    </a:stretch>
-                  </pic:blipFill>
-                  <pic:spPr bwMode="auto">
-                    <a:xfrm>
-                      <a:off x="0" y="0"/>
-                      <a:ext cx="6013450" cy="1799590"/>
-                    </a:xfrm>
-                    <a:prstGeom prst="rect">
-                      <a:avLst/>
-                    </a:prstGeom>
-                    <a:noFill/>
-                    <a:ln>
-                      <a:noFill/>
-                    </a:ln>
-                  </pic:spPr>
-                </pic:pic>
-              </a:graphicData>
-            </a:graphic>
-            <wp14:sizeRelH relativeFrom="margin">
-              <wp14:pctWidth>0</wp14:pctWidth>
-            </wp14:sizeRelH>
-            <wp14:sizeRelV relativeFrom="margin">
-              <wp14:pctHeight>0</wp14:pctHeight>
-            </wp14:sizeRelV>
-          </wp:anchor>
-        </w:drawing>
-      </w:r>
+      </w:pPr>
     </w:p>
     <w:p>
       <w:pPr>
@@ -8000,25 +8003,19 @@
         <w:pStyle w:val="Descripcin"/>
         <w:keepNext/>
         <w:spacing w:line="276" w:lineRule="auto"/>
-      </w:pPr>
-      <w:r>
-        <w:rPr>
-          <w:noProof/>
+        <w:rPr>
           <w:lang w:val="es-MX"/>
         </w:rPr>
+      </w:pPr>
+      <w:r>
+        <w:rPr>
+          <w:lang w:val="es-MX"/>
+        </w:rPr>
         <w:drawing>
-          <wp:anchor distT="0" distB="0" distL="114300" distR="114300" simplePos="0" relativeHeight="251664384" behindDoc="0" locked="0" layoutInCell="1" allowOverlap="1" wp14:anchorId="292B36EF" wp14:editId="599B5A93">
-            <wp:simplePos x="0" y="0"/>
-            <wp:positionH relativeFrom="margin">
-              <wp:posOffset>256032</wp:posOffset>
-            </wp:positionH>
-            <wp:positionV relativeFrom="paragraph">
-              <wp:posOffset>158496</wp:posOffset>
-            </wp:positionV>
-            <wp:extent cx="5120640" cy="4353560"/>
-            <wp:effectExtent l="0" t="0" r="3810" b="8890"/>
-            <wp:wrapTopAndBottom/>
-            <wp:docPr id="1200819320" name="Imagen 8"/>
+          <wp:inline distT="0" distB="0" distL="0" distR="0" wp14:anchorId="11DF6B6C" wp14:editId="15D289C5">
+            <wp:extent cx="5612130" cy="4772025"/>
+            <wp:effectExtent l="0" t="0" r="7620" b="9525"/>
+            <wp:docPr id="504345902" name="Imagen 13"/>
             <wp:cNvGraphicFramePr>
               <a:graphicFrameLocks xmlns:a="http://schemas.openxmlformats.org/drawingml/2006/main" noChangeAspect="1"/>
             </wp:cNvGraphicFramePr>
@@ -8026,7 +8023,7 @@
               <a:graphicData uri="http://schemas.openxmlformats.org/drawingml/2006/picture">
                 <pic:pic xmlns:pic="http://schemas.openxmlformats.org/drawingml/2006/picture">
                   <pic:nvPicPr>
-                    <pic:cNvPr id="0" name="Picture 30"/>
+                    <pic:cNvPr id="0" name="Picture 33"/>
                     <pic:cNvPicPr>
                       <a:picLocks noChangeAspect="1" noChangeArrowheads="1"/>
                     </pic:cNvPicPr>
@@ -8047,7 +8044,7 @@
                   <pic:spPr bwMode="auto">
                     <a:xfrm>
                       <a:off x="0" y="0"/>
-                      <a:ext cx="5120640" cy="4353560"/>
+                      <a:ext cx="5612130" cy="4772025"/>
                     </a:xfrm>
                     <a:prstGeom prst="rect">
                       <a:avLst/>
@@ -8060,13 +8057,7 @@
                 </pic:pic>
               </a:graphicData>
             </a:graphic>
-            <wp14:sizeRelH relativeFrom="margin">
-              <wp14:pctWidth>0</wp14:pctWidth>
-            </wp14:sizeRelH>
-            <wp14:sizeRelV relativeFrom="margin">
-              <wp14:pctHeight>0</wp14:pctHeight>
-            </wp14:sizeRelV>
-          </wp:anchor>
+          </wp:inline>
         </w:drawing>
       </w:r>
     </w:p>
@@ -8130,7 +8121,17 @@
           <w:szCs w:val="24"/>
           <w:lang w:val="es-MX"/>
         </w:rPr>
-        <w:t>); si las credenciales son incorrectas, el sistema deberá mostrar un mensaje de error y permitir un nuevo intento. En caso de que el personal no cuente con credenciales, el administrador del sistema deberá realizar el registro correspondiente.</w:t>
+        <w:t xml:space="preserve">); si las credenciales son incorrectas, el sistema deberá mostrar un mensaje de error y permitir un nuevo intento. En caso de que el personal </w:t>
+      </w:r>
+      <w:r>
+        <w:rPr>
+          <w:rFonts w:ascii="Arial" w:hAnsi="Arial" w:cs="Arial"/>
+          <w:sz w:val="24"/>
+          <w:szCs w:val="24"/>
+          <w:lang w:val="es-MX"/>
+        </w:rPr>
+        <w:lastRenderedPageBreak/>
+        <w:t>no cuente con credenciales, el administrador del sistema deberá realizar el registro correspondiente.</w:t>
       </w:r>
     </w:p>
     <w:p>
@@ -8155,7 +8156,6 @@
           <w:szCs w:val="24"/>
           <w:lang w:val="es-MX"/>
         </w:rPr>
-        <w:lastRenderedPageBreak/>
         <w:t>2.1.2 Descripción de módulos</w:t>
       </w:r>
     </w:p>
@@ -8702,6 +8702,7 @@
           <w:szCs w:val="24"/>
           <w:lang w:val="es-MX"/>
         </w:rPr>
+        <w:lastRenderedPageBreak/>
         <w:t xml:space="preserve">c. </w:t>
       </w:r>
       <w:r>
@@ -8733,16 +8734,7 @@
           <w:sz w:val="24"/>
           <w:szCs w:val="24"/>
         </w:rPr>
-        <w:t xml:space="preserve">Permite administrar el listado de centros de salud e instituciones, como hospitales, que reportan su producción de vacunación al sistema, de manera </w:t>
-      </w:r>
-      <w:r>
-        <w:rPr>
-          <w:rFonts w:ascii="Arial" w:hAnsi="Arial" w:cs="Arial"/>
-          <w:sz w:val="24"/>
-          <w:szCs w:val="24"/>
-        </w:rPr>
-        <w:lastRenderedPageBreak/>
-        <w:t>que sea posible incorporar fácilmente nuevos establecimientos conforme se integren a la DRISS San Marcos. Sus funcionalidades son</w:t>
+        <w:t>Permite administrar el listado de centros de salud e instituciones, como hospitales, que reportan su producción de vacunación al sistema, de manera que sea posible incorporar fácilmente nuevos establecimientos conforme se integren a la DRISS San Marcos. Sus funcionalidades son</w:t>
       </w:r>
       <w:r>
         <w:rPr>
@@ -9302,6 +9294,7 @@
           <w:szCs w:val="24"/>
           <w:lang w:val="es-MX"/>
         </w:rPr>
+        <w:lastRenderedPageBreak/>
         <w:t>Bitácora de producción de vacunación:</w:t>
       </w:r>
       <w:r>
@@ -9393,7 +9386,6 @@
           <w:szCs w:val="24"/>
           <w:lang w:val="es-MX"/>
         </w:rPr>
-        <w:lastRenderedPageBreak/>
         <w:t xml:space="preserve">f. </w:t>
       </w:r>
       <w:r>
@@ -9659,7 +9651,15 @@
           <w:rFonts w:ascii="Arial" w:eastAsiaTheme="minorHAnsi" w:hAnsi="Arial" w:cs="Arial"/>
           <w:lang w:val="es-419" w:eastAsia="es-GT"/>
         </w:rPr>
-        <w:t>El rol de Product Owner será representado por el integrante encargado de priorizar los requerimientos del sistema, considerando las necesidades del centro de salud y los objetivos del proyecto. El Scrum Master será el responsable de coordinar el cumplimiento de la metodología, organizar las reuniones y apoyar al equipo en la eliminación de obstáculos. Los Developers serán los integrantes encargados del análisis, diseño, programación, pruebas y documentación del sistema.</w:t>
+        <w:t xml:space="preserve">El rol de Product Owner será representado por el integrante encargado de priorizar los requerimientos del sistema, considerando las necesidades del centro de salud y los objetivos del proyecto. El Scrum Master será el responsable de coordinar el cumplimiento de la metodología, organizar las reuniones y apoyar al equipo en la eliminación de obstáculos. Los Developers serán los integrantes </w:t>
+      </w:r>
+      <w:r>
+        <w:rPr>
+          <w:rFonts w:ascii="Arial" w:eastAsiaTheme="minorHAnsi" w:hAnsi="Arial" w:cs="Arial"/>
+          <w:lang w:val="es-419" w:eastAsia="es-GT"/>
+        </w:rPr>
+        <w:lastRenderedPageBreak/>
+        <w:t>encargados del análisis, diseño, programación, pruebas y documentación del sistema.</w:t>
       </w:r>
     </w:p>
     <w:p>
@@ -9677,43 +9677,63 @@
           <w:rFonts w:ascii="Arial" w:eastAsiaTheme="minorHAnsi" w:hAnsi="Arial" w:cs="Arial"/>
           <w:lang w:val="es-419" w:eastAsia="es-GT"/>
         </w:rPr>
-        <w:t xml:space="preserve">Las principales herramientas de Scrum que se utilizarán en el proyecto serán el Product Backlog, el Sprint Backlog y el Incremento. El Product Backlog contendrá la lista priorizada de funcionalidades del sistema, tales como autenticación de </w:t>
+        <w:t xml:space="preserve">Las principales herramientas de Scrum que se utilizarán en el proyecto serán el Product Backlog, el Sprint Backlog y el Incremento. El Product Backlog contendrá la lista priorizada de funcionalidades del sistema, tales como autenticación de usuarios, registro de </w:t>
       </w:r>
       <w:r>
         <w:rPr>
           <w:rFonts w:ascii="Arial" w:eastAsiaTheme="minorHAnsi" w:hAnsi="Arial" w:cs="Arial"/>
           <w:lang w:val="es-419" w:eastAsia="es-GT"/>
         </w:rPr>
-        <w:lastRenderedPageBreak/>
-        <w:t xml:space="preserve">usuarios, registro de vacunas, </w:t>
+        <w:t>producción de vacunación</w:t>
       </w:r>
       <w:r>
         <w:rPr>
           <w:rFonts w:ascii="Arial" w:eastAsiaTheme="minorHAnsi" w:hAnsi="Arial" w:cs="Arial"/>
           <w:lang w:val="es-419" w:eastAsia="es-GT"/>
         </w:rPr>
-        <w:t>gestión</w:t>
+        <w:t xml:space="preserve">, </w:t>
       </w:r>
       <w:r>
         <w:rPr>
           <w:rFonts w:ascii="Arial" w:eastAsiaTheme="minorHAnsi" w:hAnsi="Arial" w:cs="Arial"/>
           <w:lang w:val="es-419" w:eastAsia="es-GT"/>
         </w:rPr>
-        <w:t xml:space="preserve"> de </w:t>
+        <w:t>gestión</w:t>
       </w:r>
       <w:r>
         <w:rPr>
           <w:rFonts w:ascii="Arial" w:eastAsiaTheme="minorHAnsi" w:hAnsi="Arial" w:cs="Arial"/>
           <w:lang w:val="es-419" w:eastAsia="es-GT"/>
         </w:rPr>
-        <w:t>inventario</w:t>
+        <w:t xml:space="preserve"> de </w:t>
       </w:r>
       <w:r>
         <w:rPr>
           <w:rFonts w:ascii="Arial" w:eastAsiaTheme="minorHAnsi" w:hAnsi="Arial" w:cs="Arial"/>
           <w:lang w:val="es-419" w:eastAsia="es-GT"/>
         </w:rPr>
-        <w:t>, vista tipo tabla y consultas. El Sprint Backlog incluirá las tareas seleccionadas para cada ciclo de trabajo. El Incremento representará el avance funcional obtenido al finalizar cada sprint.</w:t>
+        <w:t>centros de salud e instituciones</w:t>
+      </w:r>
+      <w:r>
+        <w:rPr>
+          <w:rFonts w:ascii="Arial" w:eastAsiaTheme="minorHAnsi" w:hAnsi="Arial" w:cs="Arial"/>
+          <w:lang w:val="es-419" w:eastAsia="es-GT"/>
+        </w:rPr>
+        <w:t xml:space="preserve">, vista tipo tabla y </w:t>
+      </w:r>
+      <w:r>
+        <w:rPr>
+          <w:rFonts w:ascii="Arial" w:eastAsiaTheme="minorHAnsi" w:hAnsi="Arial" w:cs="Arial"/>
+          <w:lang w:val="es-419" w:eastAsia="es-GT"/>
+        </w:rPr>
+        <w:t>generación de reportes de cobertura</w:t>
+      </w:r>
+      <w:r>
+        <w:rPr>
+          <w:rFonts w:ascii="Arial" w:eastAsiaTheme="minorHAnsi" w:hAnsi="Arial" w:cs="Arial"/>
+          <w:lang w:val="es-419" w:eastAsia="es-GT"/>
+        </w:rPr>
+        <w:t>. El Sprint Backlog incluirá las tareas seleccionadas para cada ciclo de trabajo. El Incremento representará el avance funcional obtenido al finalizar cada sprint.</w:t>
       </w:r>
     </w:p>
     <w:p>
@@ -10040,6 +10060,7 @@
           <w:sz w:val="24"/>
           <w:szCs w:val="24"/>
         </w:rPr>
+        <w:lastRenderedPageBreak/>
         <w:t>En est</w:t>
       </w:r>
       <w:r>
@@ -10056,7 +10077,71 @@
           <w:sz w:val="24"/>
           <w:szCs w:val="24"/>
         </w:rPr>
-        <w:t xml:space="preserve"> se identificarán las necesidades principales del sistema, tomando como base la problemática planteada en el Capítulo 1, donde se evidenció la ausencia de un sistema centralizado para el registro y consulta de vacunas en los centros de salud del departamento de San Marcos. Se definirán las funcionalidades prioritarias de la aplicación, los tipos de usuarios, los datos que deberá contener el formato de vacunas y los criterios mínimos para la visualización de la información.</w:t>
+        <w:t xml:space="preserve"> se identificarán las necesidades principales del sistema, tomando como base la problemática planteada en el Capítulo 1, donde se evidenció la ausencia de un sistema centralizado para el registro de </w:t>
+      </w:r>
+      <w:r>
+        <w:rPr>
+          <w:rFonts w:ascii="Arial" w:hAnsi="Arial" w:cs="Arial"/>
+          <w:sz w:val="24"/>
+          <w:szCs w:val="24"/>
+        </w:rPr>
+        <w:t>la producción</w:t>
+      </w:r>
+      <w:r>
+        <w:rPr>
+          <w:rFonts w:ascii="Arial" w:hAnsi="Arial" w:cs="Arial"/>
+          <w:sz w:val="24"/>
+          <w:szCs w:val="24"/>
+        </w:rPr>
+        <w:t xml:space="preserve"> de </w:t>
+      </w:r>
+      <w:r>
+        <w:rPr>
+          <w:rFonts w:ascii="Arial" w:hAnsi="Arial" w:cs="Arial"/>
+          <w:sz w:val="24"/>
+          <w:szCs w:val="24"/>
+        </w:rPr>
+        <w:t>vacunación y la generación</w:t>
+      </w:r>
+      <w:r>
+        <w:rPr>
+          <w:rFonts w:ascii="Arial" w:hAnsi="Arial" w:cs="Arial"/>
+          <w:sz w:val="24"/>
+          <w:szCs w:val="24"/>
+        </w:rPr>
+        <w:t xml:space="preserve"> de </w:t>
+      </w:r>
+      <w:r>
+        <w:rPr>
+          <w:rFonts w:ascii="Arial" w:hAnsi="Arial" w:cs="Arial"/>
+          <w:sz w:val="24"/>
+          <w:szCs w:val="24"/>
+        </w:rPr>
+        <w:t xml:space="preserve">reportes de cobertura en la DRISS </w:t>
+      </w:r>
+      <w:r>
+        <w:rPr>
+          <w:rFonts w:ascii="Arial" w:hAnsi="Arial" w:cs="Arial"/>
+          <w:sz w:val="24"/>
+          <w:szCs w:val="24"/>
+        </w:rPr>
+        <w:t xml:space="preserve">San Marcos. Se definirán las funcionalidades prioritarias de la aplicación, los tipos de usuarios, los </w:t>
+      </w:r>
+      <w:r>
+        <w:rPr>
+          <w:rFonts w:ascii="Arial" w:hAnsi="Arial" w:cs="Arial"/>
+          <w:sz w:val="24"/>
+          <w:szCs w:val="24"/>
+        </w:rPr>
+        <w:t>campos que deberá contener el formulario 5C digital</w:t>
+      </w:r>
+      <w:r>
+        <w:rPr>
+          <w:rFonts w:ascii="Arial" w:hAnsi="Arial" w:cs="Arial"/>
+          <w:sz w:val="24"/>
+          <w:szCs w:val="24"/>
+        </w:rPr>
+        <w:t xml:space="preserve"> y los criterios mínimos para la visualización de la información.</w:t>
       </w:r>
     </w:p>
     <w:p>
@@ -10080,7 +10165,6 @@
           <w:sz w:val="24"/>
           <w:szCs w:val="24"/>
         </w:rPr>
-        <w:lastRenderedPageBreak/>
         <w:t>Herramientas a utilizar</w:t>
       </w:r>
       <w:r>
@@ -10099,28 +10183,6 @@
         </w:rPr>
         <w:t>entrevistas o consultas con usuarios relacionados con el contexto del proyecto para conocer mejor sus necesidades, documentos de requerimientos para dejar claras las funciones principales del sistema, listas de funcionalidades para organizar lo que debe incluir la aplicación, hojas de cálculo para ordenar los datos importantes y herramientas de gestión de tareas para planificar las actividades y llevar control del avance del proyecto.</w:t>
       </w:r>
-    </w:p>
-    <w:p>
-      <w:pPr>
-        <w:spacing w:before="240" w:line="276" w:lineRule="auto"/>
-        <w:jc w:val="both"/>
-        <w:rPr>
-          <w:rFonts w:ascii="Arial" w:hAnsi="Arial" w:cs="Arial"/>
-          <w:sz w:val="24"/>
-          <w:szCs w:val="24"/>
-        </w:rPr>
-      </w:pPr>
-    </w:p>
-    <w:p>
-      <w:pPr>
-        <w:spacing w:before="240" w:line="276" w:lineRule="auto"/>
-        <w:jc w:val="both"/>
-        <w:rPr>
-          <w:rFonts w:ascii="Arial" w:hAnsi="Arial" w:cs="Arial"/>
-          <w:sz w:val="24"/>
-          <w:szCs w:val="24"/>
-        </w:rPr>
-      </w:pPr>
     </w:p>
     <w:p>
       <w:pPr>
@@ -10170,7 +10232,23 @@
           <w:sz w:val="24"/>
           <w:szCs w:val="24"/>
         </w:rPr>
-        <w:t xml:space="preserve"> se elaborará el diseño funcional de la aplicación web, incluyendo la estructura general del sistema, el modelo de datos, los módulos principales y el flujo de información. También se definirá el formato estandarizado para el registro de vacunas, considerando campos como municipio, centro de salud, tipo de vacuna, disponibilidad, población objetivo, cantidad, entre otros.</w:t>
+        <w:t xml:space="preserve"> se elaborará el diseño funcional de la aplicación web, incluyendo la estructura general del sistema, el modelo de datos, los módulos principales y el flujo de información. También se definirá el formato estandarizado para el registro de </w:t>
+      </w:r>
+      <w:r>
+        <w:rPr>
+          <w:rFonts w:ascii="Arial" w:hAnsi="Arial" w:cs="Arial"/>
+          <w:sz w:val="24"/>
+          <w:szCs w:val="24"/>
+        </w:rPr>
+        <w:t>producción de vacunación, considerando campos como municipio, centro de salud, tipo de vacuna, dosis, sexo, grupo de edad y cantidad de dosis administradas</w:t>
+      </w:r>
+      <w:r>
+        <w:rPr>
+          <w:rFonts w:ascii="Arial" w:hAnsi="Arial" w:cs="Arial"/>
+          <w:sz w:val="24"/>
+          <w:szCs w:val="24"/>
+        </w:rPr>
+        <w:t>, entre otros.</w:t>
       </w:r>
     </w:p>
     <w:p>
@@ -10240,7 +10318,23 @@
           <w:sz w:val="24"/>
           <w:szCs w:val="24"/>
         </w:rPr>
-        <w:t>Este sprint concentrará la mayor parte del desarrollo funcional de la aplicación, abarcando la creación de la estructura inicial del sistema, el módulo de registro de vacunas y la vista tipo tabla para la consulta de la información.</w:t>
+        <w:t xml:space="preserve">Este sprint concentrará la mayor parte del desarrollo funcional de la aplicación, abarcando la creación de la estructura inicial del sistema, </w:t>
+      </w:r>
+      <w:r>
+        <w:rPr>
+          <w:rFonts w:ascii="Arial" w:hAnsi="Arial" w:cs="Arial"/>
+          <w:sz w:val="24"/>
+          <w:szCs w:val="24"/>
+        </w:rPr>
+        <w:t>los módulos de producción de vacunación y de gestión de centros de salud e instituciones,</w:t>
+      </w:r>
+      <w:r>
+        <w:rPr>
+          <w:rFonts w:ascii="Arial" w:hAnsi="Arial" w:cs="Arial"/>
+          <w:sz w:val="24"/>
+          <w:szCs w:val="24"/>
+        </w:rPr>
+        <w:t xml:space="preserve"> y la vista tipo tabla para la consulta de la información.</w:t>
       </w:r>
     </w:p>
     <w:p>
@@ -10260,39 +10354,7 @@
           <w:sz w:val="24"/>
           <w:szCs w:val="24"/>
         </w:rPr>
-        <w:t xml:space="preserve">En primer lugar, se desarrollarán los componentes base de la aplicación, tales como la interfaz principal, la conexión con la base de datos y la estructura de usuarios, lo cual permitirá contar con una base funcional sobre la cual se integrarán los demás módulos. A continuación, se trabajará en el módulo de registro de vacunas y en el formato estandarizado de ingreso de información, implementando los formularios necesarios para registrar vacunas disponibles, asociarlas con un centro de salud y clasificarlas según tipo y población objetivo; también se </w:t>
-      </w:r>
-      <w:r>
-        <w:rPr>
-          <w:rFonts w:ascii="Arial" w:hAnsi="Arial" w:cs="Arial"/>
-          <w:sz w:val="24"/>
-          <w:szCs w:val="24"/>
-        </w:rPr>
-        <w:t>desarrollará el módulo</w:t>
-      </w:r>
-      <w:r>
-        <w:rPr>
-          <w:rFonts w:ascii="Arial" w:hAnsi="Arial" w:cs="Arial"/>
-          <w:sz w:val="24"/>
-          <w:szCs w:val="24"/>
-        </w:rPr>
-        <w:t xml:space="preserve"> de </w:t>
-      </w:r>
-      <w:r>
-        <w:rPr>
-          <w:rFonts w:ascii="Arial" w:hAnsi="Arial" w:cs="Arial"/>
-          <w:sz w:val="24"/>
-          <w:szCs w:val="24"/>
-        </w:rPr>
-        <w:t>gestión de inventario para el registro de los movimientos de entrada y salida de vacunas</w:t>
-      </w:r>
-      <w:r>
-        <w:rPr>
-          <w:rFonts w:ascii="Arial" w:hAnsi="Arial" w:cs="Arial"/>
-          <w:sz w:val="24"/>
-          <w:szCs w:val="24"/>
-        </w:rPr>
-        <w:t xml:space="preserve">. Finalmente, se desarrollará la vista tipo tabla, donde se visualizará la información consolidada de las vacunas registradas, permitiendo </w:t>
+        <w:t xml:space="preserve">En primer lugar, se desarrollarán los componentes base de la aplicación, tales como la interfaz principal, la conexión con la base de datos y la estructura de usuarios, lo cual permitirá contar con una base funcional sobre la cual se integrarán </w:t>
       </w:r>
       <w:r>
         <w:rPr>
@@ -10301,7 +10363,79 @@
           <w:szCs w:val="24"/>
         </w:rPr>
         <w:lastRenderedPageBreak/>
-        <w:t>consultar los datos por municipio, tipo de vacuna, población objetivo y cantidad disponible, e incorporando filtros de búsqueda para facilitar el análisis de la información.</w:t>
+        <w:t xml:space="preserve">los demás módulos. A continuación, se trabajará en el módulo de </w:t>
+      </w:r>
+      <w:r>
+        <w:rPr>
+          <w:rFonts w:ascii="Arial" w:hAnsi="Arial" w:cs="Arial"/>
+          <w:sz w:val="24"/>
+          <w:szCs w:val="24"/>
+        </w:rPr>
+        <w:t>producción de vacunación y en el formulario 5C digital</w:t>
+      </w:r>
+      <w:r>
+        <w:rPr>
+          <w:rFonts w:ascii="Arial" w:hAnsi="Arial" w:cs="Arial"/>
+          <w:sz w:val="24"/>
+          <w:szCs w:val="24"/>
+        </w:rPr>
+        <w:t xml:space="preserve">, implementando los formularios necesarios para registrar </w:t>
+      </w:r>
+      <w:r>
+        <w:rPr>
+          <w:rFonts w:ascii="Arial" w:hAnsi="Arial" w:cs="Arial"/>
+          <w:sz w:val="24"/>
+          <w:szCs w:val="24"/>
+        </w:rPr>
+        <w:t>la producción reportada por cada centro de salud, clasificarla según tipo de vacuna, dosis, sexo y grupo de edad, y distinguir entre población propia del municipio y población de otros municipios; también se desarrollará el módulo de gestión de centros de salud e institucione</w:t>
+      </w:r>
+      <w:r>
+        <w:rPr>
+          <w:rFonts w:ascii="Arial" w:hAnsi="Arial" w:cs="Arial"/>
+          <w:sz w:val="24"/>
+          <w:szCs w:val="24"/>
+        </w:rPr>
+        <w:t>s</w:t>
+      </w:r>
+      <w:r>
+        <w:rPr>
+          <w:rFonts w:ascii="Arial" w:hAnsi="Arial" w:cs="Arial"/>
+          <w:sz w:val="24"/>
+          <w:szCs w:val="24"/>
+        </w:rPr>
+        <w:t>. Finalmente, se desarrollará la vista tipo tabla, donde se visualizará la información consolidada de la</w:t>
+      </w:r>
+      <w:r>
+        <w:rPr>
+          <w:rFonts w:ascii="Arial" w:hAnsi="Arial" w:cs="Arial"/>
+          <w:sz w:val="24"/>
+          <w:szCs w:val="24"/>
+        </w:rPr>
+        <w:t xml:space="preserve"> producción registrada</w:t>
+      </w:r>
+      <w:r>
+        <w:rPr>
+          <w:rFonts w:ascii="Arial" w:hAnsi="Arial" w:cs="Arial"/>
+          <w:sz w:val="24"/>
+          <w:szCs w:val="24"/>
+        </w:rPr>
+        <w:t xml:space="preserve">, permitiendo consultar los datos por municipio, tipo de vacuna y </w:t>
+      </w:r>
+      <w:r>
+        <w:rPr>
+          <w:rFonts w:ascii="Arial" w:hAnsi="Arial" w:cs="Arial"/>
+          <w:sz w:val="24"/>
+          <w:szCs w:val="24"/>
+        </w:rPr>
+        <w:t>periodo</w:t>
+      </w:r>
+      <w:r>
+        <w:rPr>
+          <w:rFonts w:ascii="Arial" w:hAnsi="Arial" w:cs="Arial"/>
+          <w:sz w:val="24"/>
+          <w:szCs w:val="24"/>
+        </w:rPr>
+        <w:t>, e incorporando filtros de búsqueda para facilitar el análisis de la información.</w:t>
       </w:r>
     </w:p>
     <w:p>
@@ -10404,7 +10538,7 @@
           <w:sz w:val="24"/>
           <w:szCs w:val="24"/>
         </w:rPr>
-        <w:t>el registro</w:t>
+        <w:t>la generación</w:t>
       </w:r>
       <w:r>
         <w:rPr>
@@ -10420,7 +10554,23 @@
           <w:sz w:val="24"/>
           <w:szCs w:val="24"/>
         </w:rPr>
-        <w:t>movimientos de inventario</w:t>
+        <w:t>los informe</w:t>
+      </w:r>
+      <w:r>
+        <w:rPr>
+          <w:rFonts w:ascii="Arial" w:hAnsi="Arial" w:cs="Arial"/>
+          <w:sz w:val="24"/>
+          <w:szCs w:val="24"/>
+        </w:rPr>
+        <w:t xml:space="preserve">s de </w:t>
+      </w:r>
+      <w:r>
+        <w:rPr>
+          <w:rFonts w:ascii="Arial" w:hAnsi="Arial" w:cs="Arial"/>
+          <w:sz w:val="24"/>
+          <w:szCs w:val="24"/>
+        </w:rPr>
+        <w:t>cobertura</w:t>
       </w:r>
       <w:r>
         <w:rPr>
@@ -10466,6 +10616,7 @@
       </w:pPr>
       <w:bookmarkStart w:id="62" w:name="_Toc236848981"/>
       <w:r>
+        <w:lastRenderedPageBreak/>
         <w:t xml:space="preserve"> </w:t>
       </w:r>
       <w:r>
@@ -10490,16 +10641,23 @@
           <w:sz w:val="24"/>
           <w:szCs w:val="24"/>
         </w:rPr>
-        <w:t xml:space="preserve">Para determinar si el proyecto de la gestión de vacunas en los centros de salud del departamento de San Marcos puede ejecutarse de manera exitosa, se realizó un análisis de viabilidad fundamentado en la evaluación de las factibilidades </w:t>
-      </w:r>
-      <w:r>
-        <w:rPr>
-          <w:rFonts w:ascii="Arial" w:hAnsi="Arial" w:cs="Arial"/>
-          <w:sz w:val="24"/>
-          <w:szCs w:val="24"/>
-        </w:rPr>
-        <w:lastRenderedPageBreak/>
-        <w:t>técnica, operativa, económica, legal y ética</w:t>
+        <w:t xml:space="preserve">Para determinar si el proyecto de </w:t>
+      </w:r>
+      <w:r>
+        <w:rPr>
+          <w:rFonts w:ascii="Arial" w:hAnsi="Arial" w:cs="Arial"/>
+          <w:sz w:val="24"/>
+          <w:szCs w:val="24"/>
+        </w:rPr>
+        <w:t>registro de producción de vacunación y generación de reportes de cobertura en la DRISS</w:t>
+      </w:r>
+      <w:r>
+        <w:rPr>
+          <w:rFonts w:ascii="Arial" w:hAnsi="Arial" w:cs="Arial"/>
+          <w:sz w:val="24"/>
+          <w:szCs w:val="24"/>
+        </w:rPr>
+        <w:t xml:space="preserve"> San Marcos puede ejecutarse de manera exitosa, se realizó un análisis de viabilidad fundamentado en la evaluación de las factibilidades técnica, operativa, económica, legal y ética</w:t>
       </w:r>
       <w:r>
         <w:rPr>
@@ -10678,7 +10836,23 @@
           <w:sz w:val="24"/>
           <w:szCs w:val="24"/>
         </w:rPr>
-        <w:t>Desde el punto de vista del almacenamiento, la información de vacunas puede organizarse en una base de datos relacional, permitiendo registrar municipios, centros de salud, tipos de vacunas, cantidades disponibles y población objetivo. Esta estructura permitirá consultas ordenadas y una visualización clara de los datos, lo cual responde directamente a la necesidad de centralización planteada en el proyecto.</w:t>
+        <w:t xml:space="preserve">Desde el punto de vista del almacenamiento, la información de </w:t>
+      </w:r>
+      <w:r>
+        <w:rPr>
+          <w:rFonts w:ascii="Arial" w:hAnsi="Arial" w:cs="Arial"/>
+          <w:sz w:val="24"/>
+          <w:szCs w:val="24"/>
+        </w:rPr>
+        <w:t>producción de vacunación puede organizarse en una base de datos relacional, permitiendo registrar municipios, centros de salud e instituciones, tipos de vacunas, dosis, sexo y grupo de edad</w:t>
+      </w:r>
+      <w:r>
+        <w:rPr>
+          <w:rFonts w:ascii="Arial" w:hAnsi="Arial" w:cs="Arial"/>
+          <w:sz w:val="24"/>
+          <w:szCs w:val="24"/>
+        </w:rPr>
+        <w:t>. Esta estructura permitirá consultas ordenadas y una visualización clara de los datos, lo cual responde directamente a la necesidad de centralización planteada en el proyecto.</w:t>
       </w:r>
     </w:p>
     <w:p>
@@ -10745,7 +10919,32 @@
           <w:sz w:val="24"/>
           <w:szCs w:val="24"/>
         </w:rPr>
-        <w:t>El proyecto responde a una necesidad real en la gestión de información de vacunas. La aplicación permitirá que el personal autorizado de cada centro de salud registre y actualice los datos de manera ordenada, reduciendo la dependencia de registros manuales o archivos aislados. De esta manera, se podrá trabajar con información más clara, actualizada y fácil de consultar cuando sea necesario.</w:t>
+        <w:t xml:space="preserve">El proyecto responde a una necesidad real en </w:t>
+      </w:r>
+      <w:r>
+        <w:rPr>
+          <w:rFonts w:ascii="Arial" w:hAnsi="Arial" w:cs="Arial"/>
+          <w:sz w:val="24"/>
+          <w:szCs w:val="24"/>
+        </w:rPr>
+        <w:t>el registro de la producción de vacunación y la generación de reportes de cobertura</w:t>
+      </w:r>
+      <w:r>
+        <w:rPr>
+          <w:rFonts w:ascii="Arial" w:hAnsi="Arial" w:cs="Arial"/>
+          <w:sz w:val="24"/>
+          <w:szCs w:val="24"/>
+        </w:rPr>
+        <w:t xml:space="preserve">. La aplicación permitirá que el </w:t>
+      </w:r>
+      <w:r>
+        <w:rPr>
+          <w:rFonts w:ascii="Arial" w:hAnsi="Arial" w:cs="Arial"/>
+          <w:sz w:val="24"/>
+          <w:szCs w:val="24"/>
+        </w:rPr>
+        <w:lastRenderedPageBreak/>
+        <w:t>personal autorizado de cada centro de salud registre y actualice los datos de manera ordenada, reduciendo la dependencia de registros manuales o archivos aislados. De esta manera, se podrá trabajar con información más clara, actualizada y fácil de consultar cuando sea necesario.</w:t>
       </w:r>
     </w:p>
     <w:p>
@@ -10765,16 +10964,23 @@
           <w:sz w:val="24"/>
           <w:szCs w:val="24"/>
         </w:rPr>
-        <w:t xml:space="preserve">Para garantizar su uso adecuado, será necesario capacitar al personal encargado del registro de vacunas. Esta capacitación deberá enfocarse en el </w:t>
-      </w:r>
-      <w:r>
-        <w:rPr>
-          <w:rFonts w:ascii="Arial" w:hAnsi="Arial" w:cs="Arial"/>
-          <w:sz w:val="24"/>
-          <w:szCs w:val="24"/>
-        </w:rPr>
-        <w:lastRenderedPageBreak/>
-        <w:t>ingreso de información, actualización de registros y consulta de la vista tipo tabla. Al tratarse de una aplicación web, el proceso de aprendizaje debe ser sencillo ya que la interfaz se diseñará de forma clara, accesible y orientada a las tareas principales del usuario.</w:t>
+        <w:t>Para garantizar su uso adecuado, será necesario capacitar al personal encargado del registro de vacunas. Esta capacitación deberá enfocarse en el ingreso de información</w:t>
+      </w:r>
+      <w:r>
+        <w:rPr>
+          <w:rFonts w:ascii="Arial" w:hAnsi="Arial" w:cs="Arial"/>
+          <w:sz w:val="24"/>
+          <w:szCs w:val="24"/>
+        </w:rPr>
+        <w:t xml:space="preserve"> mediante el formulario 5C digital, la actualización de registros y la</w:t>
+      </w:r>
+      <w:r>
+        <w:rPr>
+          <w:rFonts w:ascii="Arial" w:hAnsi="Arial" w:cs="Arial"/>
+          <w:sz w:val="24"/>
+          <w:szCs w:val="24"/>
+        </w:rPr>
+        <w:t xml:space="preserve"> consulta de la vista tipo tabla. Al tratarse de una aplicación web, el proceso de aprendizaje debe ser sencillo ya que la interfaz se diseñará de forma clara, accesible y orientada a las tareas principales del usuario.</w:t>
       </w:r>
     </w:p>
     <w:p>
@@ -10794,7 +11000,39 @@
           <w:sz w:val="24"/>
           <w:szCs w:val="24"/>
         </w:rPr>
-        <w:t>Durante el levantamiento de información con el personal del Centro de Salud de San Marcos, se identificó una actitud positiva hacia la propuesta. El personal se mostró dispuesto a colaborar y manifestó interés en agilizar los procesos actuales de registro y control de vacunas, lo cual reduce el riesgo de que la herramienta caiga en desuso una vez implementada.</w:t>
+        <w:t xml:space="preserve">Durante el levantamiento de información con el personal de </w:t>
+      </w:r>
+      <w:r>
+        <w:rPr>
+          <w:rFonts w:ascii="Arial" w:hAnsi="Arial" w:cs="Arial"/>
+          <w:sz w:val="24"/>
+          <w:szCs w:val="24"/>
+        </w:rPr>
+        <w:t>la DRISS</w:t>
+      </w:r>
+      <w:r>
+        <w:rPr>
+          <w:rFonts w:ascii="Arial" w:hAnsi="Arial" w:cs="Arial"/>
+          <w:sz w:val="24"/>
+          <w:szCs w:val="24"/>
+        </w:rPr>
+        <w:t xml:space="preserve"> San Marcos, se identificó una actitud positiva hacia la propuesta. El personal se mostró dispuesto a colaborar y manifestó interés en agilizar los procesos actuales de registro de </w:t>
+      </w:r>
+      <w:r>
+        <w:rPr>
+          <w:rFonts w:ascii="Arial" w:hAnsi="Arial" w:cs="Arial"/>
+          <w:sz w:val="24"/>
+          <w:szCs w:val="24"/>
+        </w:rPr>
+        <w:t>producción de vacunación</w:t>
+      </w:r>
+      <w:r>
+        <w:rPr>
+          <w:rFonts w:ascii="Arial" w:hAnsi="Arial" w:cs="Arial"/>
+          <w:sz w:val="24"/>
+          <w:szCs w:val="24"/>
+        </w:rPr>
+        <w:t>, lo cual reduce el riesgo de que la herramienta caiga en desuso una vez implementada.</w:t>
       </w:r>
     </w:p>
     <w:p>
@@ -10814,7 +11052,71 @@
           <w:sz w:val="24"/>
           <w:szCs w:val="24"/>
         </w:rPr>
-        <w:t>Además, la centralización de los datos facilitará el trabajo de las autoridades de salud, quienes podrán consultar información consolidada sin depender de reportes dispersos y desactualizados enviados por cada municipio. Esto permitirá mejorar la organización interna, la planificación y la toma de decisiones relacionadas con la distribución de vacunas. También ayudará a tener una visión más completa del estado de disponibilidad de vacunas en los distintos centros de salud.</w:t>
+        <w:t xml:space="preserve">Además, la centralización de los datos facilitará el trabajo de las autoridades de salud, quienes podrán consultar información consolidada sin depender de reportes dispersos y desactualizados enviados por cada municipio. Esto permitirá mejorar la organización interna, la planificación y la toma de decisiones relacionadas con </w:t>
+      </w:r>
+      <w:r>
+        <w:rPr>
+          <w:rFonts w:ascii="Arial" w:hAnsi="Arial" w:cs="Arial"/>
+          <w:sz w:val="24"/>
+          <w:szCs w:val="24"/>
+        </w:rPr>
+        <w:t>el seguimiento de la cobertura de vacunación</w:t>
+      </w:r>
+      <w:r>
+        <w:rPr>
+          <w:rFonts w:ascii="Arial" w:hAnsi="Arial" w:cs="Arial"/>
+          <w:sz w:val="24"/>
+          <w:szCs w:val="24"/>
+        </w:rPr>
+        <w:t xml:space="preserve">. También ayudará a tener una visión más completa del </w:t>
+      </w:r>
+      <w:r>
+        <w:rPr>
+          <w:rFonts w:ascii="Arial" w:hAnsi="Arial" w:cs="Arial"/>
+          <w:sz w:val="24"/>
+          <w:szCs w:val="24"/>
+        </w:rPr>
+        <w:t>avance</w:t>
+      </w:r>
+      <w:r>
+        <w:rPr>
+          <w:rFonts w:ascii="Arial" w:hAnsi="Arial" w:cs="Arial"/>
+          <w:sz w:val="24"/>
+          <w:szCs w:val="24"/>
+        </w:rPr>
+        <w:t xml:space="preserve"> de </w:t>
+      </w:r>
+      <w:r>
+        <w:rPr>
+          <w:rFonts w:ascii="Arial" w:hAnsi="Arial" w:cs="Arial"/>
+          <w:sz w:val="24"/>
+          <w:szCs w:val="24"/>
+        </w:rPr>
+        <w:t>cada municipio frente a la meta</w:t>
+      </w:r>
+      <w:r>
+        <w:rPr>
+          <w:rFonts w:ascii="Arial" w:hAnsi="Arial" w:cs="Arial"/>
+          <w:sz w:val="24"/>
+          <w:szCs w:val="24"/>
+        </w:rPr>
+        <w:t xml:space="preserve"> de </w:t>
+      </w:r>
+      <w:r>
+        <w:rPr>
+          <w:rFonts w:ascii="Arial" w:hAnsi="Arial" w:cs="Arial"/>
+          <w:sz w:val="24"/>
+          <w:szCs w:val="24"/>
+        </w:rPr>
+        <w:t>cobertura establecida por el MSPAS</w:t>
+      </w:r>
+      <w:r>
+        <w:rPr>
+          <w:rFonts w:ascii="Arial" w:hAnsi="Arial" w:cs="Arial"/>
+          <w:sz w:val="24"/>
+          <w:szCs w:val="24"/>
+        </w:rPr>
+        <w:t>.</w:t>
       </w:r>
     </w:p>
     <w:p>
@@ -10834,7 +11136,23 @@
           <w:sz w:val="24"/>
           <w:szCs w:val="24"/>
         </w:rPr>
-        <w:t>En consecuencia, considerando que el sistema responde a una necesidad operativa real, que su interfaz está orientada a facilitar el aprendizaje del personal mediante capacitación, y que se identificó receptividad y disposición por parte del personal del Centro de Salud de San Marcos hacia la propuesta, se concluye que el proyecto es operativamente factible para su implementación en los centros de salud del departamento de San Marcos</w:t>
+        <w:t xml:space="preserve">En consecuencia, considerando que el sistema responde a una necesidad operativa real, que su interfaz está orientada a facilitar el aprendizaje del personal mediante capacitación, y que se identificó receptividad y disposición por parte del personal de </w:t>
+      </w:r>
+      <w:r>
+        <w:rPr>
+          <w:rFonts w:ascii="Arial" w:hAnsi="Arial" w:cs="Arial"/>
+          <w:sz w:val="24"/>
+          <w:szCs w:val="24"/>
+        </w:rPr>
+        <w:t>la DRISS</w:t>
+      </w:r>
+      <w:r>
+        <w:rPr>
+          <w:rFonts w:ascii="Arial" w:hAnsi="Arial" w:cs="Arial"/>
+          <w:sz w:val="24"/>
+          <w:szCs w:val="24"/>
+        </w:rPr>
+        <w:t xml:space="preserve"> San Marcos hacia la propuesta, se concluye que el proyecto es operativamente factible para su implementación en los centros de salud del departamento de San Marcos</w:t>
       </w:r>
       <w:r>
         <w:rPr>
@@ -10909,7 +11227,32 @@
           <w:sz w:val="24"/>
           <w:szCs w:val="24"/>
         </w:rPr>
-        <w:t xml:space="preserve">Al tratarse de un proyecto académico, el desarrollo será realizado por los integrantes del equipo, lo cual reduce significativamente el costo de mano de obra; sin embargo, para presentar una estimación más realista, se contempla el valor referencial del recurso humano como aporte del equipo de trabajo, así como los costos mínimos necesarios para llevar a cabo el sistema. Esta inversión no supondrá ningún gasto para el centro de salud, ya que el proyecto será donado en su totalidad por el equipo de desarrollo, incluyendo el pago del alojamiento durante </w:t>
+        <w:t xml:space="preserve">Al tratarse de un proyecto académico, el desarrollo será realizado por los integrantes del equipo, lo cual reduce significativamente el costo de mano de obra; </w:t>
+      </w:r>
+      <w:r>
+        <w:rPr>
+          <w:rFonts w:ascii="Arial" w:hAnsi="Arial" w:cs="Arial"/>
+          <w:sz w:val="24"/>
+          <w:szCs w:val="24"/>
+        </w:rPr>
+        <w:lastRenderedPageBreak/>
+        <w:t xml:space="preserve">sin embargo, para presentar una estimación más realista, se contempla el valor referencial del recurso humano como aporte del equipo de trabajo, así como los costos mínimos necesarios para llevar a cabo el sistema. Esta inversión no supondrá ningún gasto para </w:t>
+      </w:r>
+      <w:r>
+        <w:rPr>
+          <w:rFonts w:ascii="Arial" w:hAnsi="Arial" w:cs="Arial"/>
+          <w:sz w:val="24"/>
+          <w:szCs w:val="24"/>
+        </w:rPr>
+        <w:t>la DRISS San Marcos</w:t>
+      </w:r>
+      <w:r>
+        <w:rPr>
+          <w:rFonts w:ascii="Arial" w:hAnsi="Arial" w:cs="Arial"/>
+          <w:sz w:val="24"/>
+          <w:szCs w:val="24"/>
+        </w:rPr>
+        <w:t xml:space="preserve">, ya que el proyecto será donado en su totalidad por el equipo de desarrollo, incluyendo el pago del alojamiento durante </w:t>
       </w:r>
       <w:r>
         <w:rPr>
@@ -10925,16 +11268,7 @@
           <w:sz w:val="24"/>
           <w:szCs w:val="24"/>
         </w:rPr>
-        <w:t xml:space="preserve">. La inversión se justifica por los beneficios que generará el sistema, al permitir aprovechar mejor los recursos disponibles con datos más ordenados y </w:t>
-      </w:r>
-      <w:r>
-        <w:rPr>
-          <w:rFonts w:ascii="Arial" w:hAnsi="Arial" w:cs="Arial"/>
-          <w:sz w:val="24"/>
-          <w:szCs w:val="24"/>
-        </w:rPr>
-        <w:lastRenderedPageBreak/>
-        <w:t>accesibles para el personal autorizado, representando así una alternativa de bajo costo frente al impacto operativo que puede aportar al sistema de salud departamental.</w:t>
+        <w:t>. La inversión se justifica por los beneficios que generará el sistema, al permitir aprovechar mejor los recursos disponibles con datos más ordenados y accesibles para el personal autorizado, representando así una alternativa de bajo costo frente al impacto operativo que puede aportar al sistema de salud departamental.</w:t>
       </w:r>
     </w:p>
     <w:p>
@@ -11034,7 +11368,87 @@
           <w:sz w:val="24"/>
           <w:szCs w:val="24"/>
         </w:rPr>
-        <w:t>En relación al aspecto legal, el desarrollo se ejecutará con la autorización del Centro de Salud de San Marcos y bajo lineamientos de uso responsable de la información. El proyecto se enmarca dentro de lo establecido en el Decreto 25-2024, Ley de Vacunación, que respalda el fortalecimiento de los procesos de inmunización a nivel nacional, sin contravenir ninguna disposición de dicha normativa. Debido a que el sistema estará orientado al registro de disponibilidad de vacunas, no almacenará información personal sensible de pacientes, diagnósticos médicos ni expedientes clínicos individuales, por lo que se enfoca únicamente en información administrativa necesaria para mejorar el control y consulta de existencias.</w:t>
+        <w:t xml:space="preserve">En relación al aspecto legal, el desarrollo se ejecutará con la autorización de </w:t>
+      </w:r>
+      <w:r>
+        <w:rPr>
+          <w:rFonts w:ascii="Arial" w:hAnsi="Arial" w:cs="Arial"/>
+          <w:sz w:val="24"/>
+          <w:szCs w:val="24"/>
+        </w:rPr>
+        <w:t>la DRISS</w:t>
+      </w:r>
+      <w:r>
+        <w:rPr>
+          <w:rFonts w:ascii="Arial" w:hAnsi="Arial" w:cs="Arial"/>
+          <w:sz w:val="24"/>
+          <w:szCs w:val="24"/>
+        </w:rPr>
+        <w:t xml:space="preserve"> San Marcos y bajo lineamientos de uso responsable de la información. El proyecto se enmarca dentro de lo establecido en el Decreto 25-2024, Ley de Vacunación, que respalda el fortalecimiento de los procesos de inmunización a nivel nacional, sin contravenir ninguna disposición de dicha normativa. Debido a que el sistema estará orientado al registro de </w:t>
+      </w:r>
+      <w:r>
+        <w:rPr>
+          <w:rFonts w:ascii="Arial" w:hAnsi="Arial" w:cs="Arial"/>
+          <w:sz w:val="24"/>
+          <w:szCs w:val="24"/>
+        </w:rPr>
+        <w:t>la producción de vacunación reportada por cada centro de salud</w:t>
+      </w:r>
+      <w:r>
+        <w:rPr>
+          <w:rFonts w:ascii="Arial" w:hAnsi="Arial" w:cs="Arial"/>
+          <w:sz w:val="24"/>
+          <w:szCs w:val="24"/>
+        </w:rPr>
+        <w:t xml:space="preserve">, no almacenará información personal sensible de pacientes, diagnósticos médicos ni expedientes clínicos individuales, por lo que se enfoca únicamente en información administrativa necesaria para mejorar el </w:t>
+      </w:r>
+      <w:r>
+        <w:rPr>
+          <w:rFonts w:ascii="Arial" w:hAnsi="Arial" w:cs="Arial"/>
+          <w:sz w:val="24"/>
+          <w:szCs w:val="24"/>
+        </w:rPr>
+        <w:t>registro</w:t>
+      </w:r>
+      <w:r>
+        <w:rPr>
+          <w:rFonts w:ascii="Arial" w:hAnsi="Arial" w:cs="Arial"/>
+          <w:sz w:val="24"/>
+          <w:szCs w:val="24"/>
+        </w:rPr>
+        <w:t xml:space="preserve"> y </w:t>
+      </w:r>
+      <w:r>
+        <w:rPr>
+          <w:rFonts w:ascii="Arial" w:hAnsi="Arial" w:cs="Arial"/>
+          <w:sz w:val="24"/>
+          <w:szCs w:val="24"/>
+        </w:rPr>
+        <w:t xml:space="preserve">la </w:t>
+      </w:r>
+      <w:r>
+        <w:rPr>
+          <w:rFonts w:ascii="Arial" w:hAnsi="Arial" w:cs="Arial"/>
+          <w:sz w:val="24"/>
+          <w:szCs w:val="24"/>
+        </w:rPr>
+        <w:t xml:space="preserve">consulta de </w:t>
+      </w:r>
+      <w:r>
+        <w:rPr>
+          <w:rFonts w:ascii="Arial" w:hAnsi="Arial" w:cs="Arial"/>
+          <w:sz w:val="24"/>
+          <w:szCs w:val="24"/>
+        </w:rPr>
+        <w:t>la información de cobertura</w:t>
+      </w:r>
+      <w:r>
+        <w:rPr>
+          <w:rFonts w:ascii="Arial" w:hAnsi="Arial" w:cs="Arial"/>
+          <w:sz w:val="24"/>
+          <w:szCs w:val="24"/>
+        </w:rPr>
+        <w:t>.</w:t>
       </w:r>
     </w:p>
     <w:p>
@@ -11054,7 +11468,39 @@
           <w:sz w:val="24"/>
           <w:szCs w:val="24"/>
         </w:rPr>
-        <w:t>Para garantizar el uso adecuado del sistema, se establecerán los roles de acceso, credenciales para usuarios autorizados y controles básicos de seguridad. También será necesario proteger la integridad de la información registrada, evitando modificaciones no autorizadas o pérdida de datos. De esta manera, el sistema podrá operar como una herramienta administrativa para el control de vacunas sin vulnerar la privacidad de los usuarios del servicio de salud.</w:t>
+        <w:t xml:space="preserve">Para garantizar el uso adecuado del sistema, se establecerán los roles de acceso, credenciales para usuarios autorizados y controles básicos de seguridad. También será necesario proteger la integridad de la información registrada, evitando modificaciones no autorizadas o pérdida de datos. De esta manera, el sistema podrá operar como una herramienta administrativa para el </w:t>
+      </w:r>
+      <w:r>
+        <w:rPr>
+          <w:rFonts w:ascii="Arial" w:hAnsi="Arial" w:cs="Arial"/>
+          <w:sz w:val="24"/>
+          <w:szCs w:val="24"/>
+        </w:rPr>
+        <w:t>registro</w:t>
+      </w:r>
+      <w:r>
+        <w:rPr>
+          <w:rFonts w:ascii="Arial" w:hAnsi="Arial" w:cs="Arial"/>
+          <w:sz w:val="24"/>
+          <w:szCs w:val="24"/>
+        </w:rPr>
+        <w:t xml:space="preserve"> de </w:t>
+      </w:r>
+      <w:r>
+        <w:rPr>
+          <w:rFonts w:ascii="Arial" w:hAnsi="Arial" w:cs="Arial"/>
+          <w:sz w:val="24"/>
+          <w:szCs w:val="24"/>
+        </w:rPr>
+        <w:t>producción y la generación de reportes de cobertura</w:t>
+      </w:r>
+      <w:r>
+        <w:rPr>
+          <w:rFonts w:ascii="Arial" w:hAnsi="Arial" w:cs="Arial"/>
+          <w:sz w:val="24"/>
+          <w:szCs w:val="24"/>
+        </w:rPr>
+        <w:t xml:space="preserve"> sin vulnerar la privacidad de los usuarios del servicio de salud.</w:t>
       </w:r>
     </w:p>
     <w:p>
@@ -11074,7 +11520,23 @@
           <w:sz w:val="24"/>
           <w:szCs w:val="24"/>
         </w:rPr>
-        <w:t>Asimismo, el proyecto respetará los procedimientos institucionales del centro de salud y de las autoridades correspondientes del departamento de San Marcos, además de funcionar acorde a las leyes del país. La implementación será realizada únicamente con el consentimiento y autorización de las entidades involucradas. Además, se procurará que el uso del sistema se mantenga dentro de los fines establecidos para el proyecto, evitando cualquier manejo inadecuado de la información registrada.</w:t>
+        <w:t xml:space="preserve">Asimismo, el proyecto respetará los procedimientos institucionales de </w:t>
+      </w:r>
+      <w:r>
+        <w:rPr>
+          <w:rFonts w:ascii="Arial" w:hAnsi="Arial" w:cs="Arial"/>
+          <w:sz w:val="24"/>
+          <w:szCs w:val="24"/>
+        </w:rPr>
+        <w:t>la DRISS San Marcos</w:t>
+      </w:r>
+      <w:r>
+        <w:rPr>
+          <w:rFonts w:ascii="Arial" w:hAnsi="Arial" w:cs="Arial"/>
+          <w:sz w:val="24"/>
+          <w:szCs w:val="24"/>
+        </w:rPr>
+        <w:t xml:space="preserve"> y de las autoridades correspondientes del departamento, además de funcionar acorde a las leyes del país. La implementación será realizada únicamente con el consentimiento y autorización de las entidades involucradas. Además, se procurará que el uso del sistema se mantenga dentro de los fines establecidos para el proyecto, evitando cualquier manejo inadecuado de la información registrada.</w:t>
       </w:r>
     </w:p>
     <w:p>
@@ -11096,18 +11558,6 @@
         </w:rPr>
         <w:t>Debido a lo anterior, considerando que se cuenta con la autorización necesaria, no se almacenará información sensible de pacientes y que se emplearán tecnologías de código abierto respetando los derechos de autoría del equipo desarrollador, se concluye que el proyecto es legalmente factible para su implementación en los centros de salud beneficiados.</w:t>
       </w:r>
-    </w:p>
-    <w:p>
-      <w:pPr>
-        <w:spacing w:before="240" w:line="276" w:lineRule="auto"/>
-        <w:ind w:firstLine="709"/>
-        <w:jc w:val="both"/>
-        <w:rPr>
-          <w:rFonts w:ascii="Arial" w:hAnsi="Arial" w:cs="Arial"/>
-          <w:sz w:val="24"/>
-          <w:szCs w:val="24"/>
-        </w:rPr>
-      </w:pPr>
     </w:p>
     <w:p>
       <w:pPr>
@@ -11139,7 +11589,31 @@
           <w:sz w:val="24"/>
           <w:szCs w:val="24"/>
         </w:rPr>
-        <w:t xml:space="preserve">El desarrollo del proyecto contempla la realización de entrevistas y visitas con el personal de los centros de salud del departamento de San Marcos, entre ellas la que ya se tiene programada con el encargado del centro de salud, con el fin de conocer de primera mano sus necesidades y validar el diseño de la solución. La participación del personal en estas actividades será voluntaria e informada, y la </w:t>
+        <w:t>El desarrollo del proyecto contempl</w:t>
+      </w:r>
+      <w:r>
+        <w:rPr>
+          <w:rFonts w:ascii="Arial" w:hAnsi="Arial" w:cs="Arial"/>
+          <w:sz w:val="24"/>
+          <w:szCs w:val="24"/>
+        </w:rPr>
+        <w:t>ó la realización de una entrevista con el personal de la DRISS San Marcos, entre ellos el encargado de tecnología y la estadígrafa</w:t>
+      </w:r>
+      <w:r>
+        <w:rPr>
+          <w:rFonts w:ascii="Arial" w:hAnsi="Arial" w:cs="Arial"/>
+          <w:sz w:val="24"/>
+          <w:szCs w:val="24"/>
+        </w:rPr>
+        <w:t>, con el fin de conocer de primera mano sus necesidades y validar el diseño de la solución. La participación del personal en esta</w:t>
+      </w:r>
+      <w:r>
+        <w:rPr>
+          <w:rFonts w:ascii="Arial" w:hAnsi="Arial" w:cs="Arial"/>
+          <w:sz w:val="24"/>
+          <w:szCs w:val="24"/>
+        </w:rPr>
+        <w:t xml:space="preserve"> actividad fue voluntaria </w:t>
       </w:r>
       <w:r>
         <w:rPr>
@@ -11148,7 +11622,15 @@
           <w:szCs w:val="24"/>
         </w:rPr>
         <w:lastRenderedPageBreak/>
-        <w:t>información compartida se utilizará exclusivamente con fines académicos relacionados con este proyecto.</w:t>
+        <w:t>e informada, y la información compartida se utiliza</w:t>
+      </w:r>
+      <w:r>
+        <w:rPr>
+          <w:rFonts w:ascii="Arial" w:hAnsi="Arial" w:cs="Arial"/>
+          <w:sz w:val="24"/>
+          <w:szCs w:val="24"/>
+        </w:rPr>
+        <w:t xml:space="preserve"> exclusivamente con fines académicos relacionados con este proyecto.</w:t>
       </w:r>
     </w:p>
     <w:p>
@@ -11243,7 +11725,71 @@
           <w:sz w:val="24"/>
           <w:szCs w:val="24"/>
         </w:rPr>
-        <w:t>Para el desarrollo del sistema web de gestión de vacunas del departamento de San Marcos, se elaboró la siguiente estimación de costos. Los rubros considerados incluyen el dominio web, el alojamiento del servidor, el certificado SSL, las herramientas de desarrollo, el material de capacitación, el transporte para las visitas de validación con los usuarios, la documentación técnica y el recurso humano de desarrollo, además de un margen de contingencia del 5% para cubrir variaciones menores de costo. Los montos se presentan en quetzales (Q) y se basan en precios de referencia del mercado.</w:t>
+        <w:t xml:space="preserve">Para el desarrollo del sistema web de </w:t>
+      </w:r>
+      <w:r>
+        <w:rPr>
+          <w:rFonts w:ascii="Arial" w:hAnsi="Arial" w:cs="Arial"/>
+          <w:sz w:val="24"/>
+          <w:szCs w:val="24"/>
+        </w:rPr>
+        <w:t>registro</w:t>
+      </w:r>
+      <w:r>
+        <w:rPr>
+          <w:rFonts w:ascii="Arial" w:hAnsi="Arial" w:cs="Arial"/>
+          <w:sz w:val="24"/>
+          <w:szCs w:val="24"/>
+        </w:rPr>
+        <w:t xml:space="preserve"> de </w:t>
+      </w:r>
+      <w:r>
+        <w:rPr>
+          <w:rFonts w:ascii="Arial" w:hAnsi="Arial" w:cs="Arial"/>
+          <w:sz w:val="24"/>
+          <w:szCs w:val="24"/>
+        </w:rPr>
+        <w:t>producción</w:t>
+      </w:r>
+      <w:r>
+        <w:rPr>
+          <w:rFonts w:ascii="Arial" w:hAnsi="Arial" w:cs="Arial"/>
+          <w:sz w:val="24"/>
+          <w:szCs w:val="24"/>
+        </w:rPr>
+        <w:t xml:space="preserve"> de </w:t>
+      </w:r>
+      <w:r>
+        <w:rPr>
+          <w:rFonts w:ascii="Arial" w:hAnsi="Arial" w:cs="Arial"/>
+          <w:sz w:val="24"/>
+          <w:szCs w:val="24"/>
+        </w:rPr>
+        <w:t xml:space="preserve">vacunación y reportes de cobertura de la DRISS </w:t>
+      </w:r>
+      <w:r>
+        <w:rPr>
+          <w:rFonts w:ascii="Arial" w:hAnsi="Arial" w:cs="Arial"/>
+          <w:sz w:val="24"/>
+          <w:szCs w:val="24"/>
+        </w:rPr>
+        <w:t xml:space="preserve">San Marcos, se elaboró la siguiente estimación de costos. Los rubros considerados incluyen el dominio web, el alojamiento del servidor, el certificado SSL, las herramientas de desarrollo, el material de capacitación, el transporte para las visitas de validación con los usuarios, la documentación técnica y el recurso humano de desarrollo, además de un margen de contingencia del </w:t>
+      </w:r>
+      <w:r>
+        <w:rPr>
+          <w:rFonts w:ascii="Arial" w:hAnsi="Arial" w:cs="Arial"/>
+          <w:sz w:val="24"/>
+          <w:szCs w:val="24"/>
+        </w:rPr>
+        <w:t>15</w:t>
+      </w:r>
+      <w:r>
+        <w:rPr>
+          <w:rFonts w:ascii="Arial" w:hAnsi="Arial" w:cs="Arial"/>
+          <w:sz w:val="24"/>
+          <w:szCs w:val="24"/>
+        </w:rPr>
+        <w:t>% para cubrir variaciones menores de costo. Los montos se presentan en quetzales (Q) y se basan en precios de referencia del mercado.</w:t>
       </w:r>
     </w:p>
     <w:p>
@@ -11288,14 +11834,11 @@
         <w:jc w:val="center"/>
       </w:pPr>
       <w:r>
-        <w:rPr>
-          <w:noProof/>
-        </w:rPr>
         <w:drawing>
-          <wp:inline distT="0" distB="0" distL="0" distR="0" wp14:anchorId="31132607" wp14:editId="4F5E0615">
-            <wp:extent cx="5490478" cy="3238500"/>
-            <wp:effectExtent l="0" t="0" r="0" b="0"/>
-            <wp:docPr id="1634199830" name="Imagen 1"/>
+          <wp:inline distT="0" distB="0" distL="0" distR="0" wp14:anchorId="45C89BA1" wp14:editId="496AE020">
+            <wp:extent cx="5612130" cy="3319780"/>
+            <wp:effectExtent l="0" t="0" r="7620" b="0"/>
+            <wp:docPr id="1832678564" name="Imagen 1"/>
             <wp:cNvGraphicFramePr>
               <a:graphicFrameLocks xmlns:a="http://schemas.openxmlformats.org/drawingml/2006/main" noChangeAspect="1"/>
             </wp:cNvGraphicFramePr>
@@ -11303,7 +11846,7 @@
               <a:graphicData uri="http://schemas.openxmlformats.org/drawingml/2006/picture">
                 <pic:pic xmlns:pic="http://schemas.openxmlformats.org/drawingml/2006/picture">
                   <pic:nvPicPr>
-                    <pic:cNvPr id="1634199830" name=""/>
+                    <pic:cNvPr id="1832678564" name=""/>
                     <pic:cNvPicPr/>
                   </pic:nvPicPr>
                   <pic:blipFill>
@@ -11315,7 +11858,7 @@
                   <pic:spPr>
                     <a:xfrm>
                       <a:off x="0" y="0"/>
-                      <a:ext cx="5497313" cy="3242532"/>
+                      <a:ext cx="5612130" cy="3319780"/>
                     </a:xfrm>
                     <a:prstGeom prst="rect">
                       <a:avLst/>
@@ -12201,7 +12744,7 @@
         <w:rPr>
           <w:noProof/>
         </w:rPr>
-        <w:t>Análisis de viabilidad</w:t>
+        <w:t>Diseño</w:t>
       </w:r>
     </w:fldSimple>
   </w:p>

</xml_diff>

<commit_message>
YO DIGO QUE AHORA SI YA NO
</commit_message>
<xml_diff>
--- a/Propuesta - Vacunas.docx
+++ b/Propuesta - Vacunas.docx
@@ -5,7 +5,7 @@
     <w:p>
       <w:pPr>
         <w:spacing w:line="276" w:lineRule="auto"/>
-        <w:ind w:left="708"/>
+        <w:ind w:left="1416" w:hanging="708"/>
         <w:jc w:val="center"/>
         <w:rPr>
           <w:rFonts w:ascii="Arial" w:hAnsi="Arial" w:cs="Arial"/>
@@ -727,7 +727,7 @@
             </w:rPr>
             <w:fldChar w:fldCharType="separate"/>
           </w:r>
-          <w:hyperlink w:anchor="_Toc237052199" w:history="1">
+          <w:hyperlink w:anchor="_Toc237053312" w:history="1">
             <w:r>
               <w:rPr>
                 <w:rStyle w:val="Hipervnculo"/>
@@ -754,7 +754,7 @@
                 <w:noProof/>
                 <w:webHidden/>
               </w:rPr>
-              <w:instrText xml:space="preserve"> PAGEREF _Toc237052199 \h </w:instrText>
+              <w:instrText xml:space="preserve"> PAGEREF _Toc237053312 \h </w:instrText>
             </w:r>
             <w:r>
               <w:rPr>
@@ -797,7 +797,7 @@
               <w:lang w:eastAsia="es-GT"/>
             </w:rPr>
           </w:pPr>
-          <w:hyperlink w:anchor="_Toc237052200" w:history="1">
+          <w:hyperlink w:anchor="_Toc237053313" w:history="1">
             <w:r>
               <w:rPr>
                 <w:rStyle w:val="Hipervnculo"/>
@@ -824,7 +824,7 @@
                 <w:noProof/>
                 <w:webHidden/>
               </w:rPr>
-              <w:instrText xml:space="preserve"> PAGEREF _Toc237052200 \h </w:instrText>
+              <w:instrText xml:space="preserve"> PAGEREF _Toc237053313 \h </w:instrText>
             </w:r>
             <w:r>
               <w:rPr>
@@ -868,7 +868,7 @@
               <w:lang w:eastAsia="es-GT"/>
             </w:rPr>
           </w:pPr>
-          <w:hyperlink w:anchor="_Toc237052201" w:history="1">
+          <w:hyperlink w:anchor="_Toc237053314" w:history="1">
             <w:r>
               <w:rPr>
                 <w:rStyle w:val="Hipervnculo"/>
@@ -910,7 +910,7 @@
                 <w:noProof/>
                 <w:webHidden/>
               </w:rPr>
-              <w:instrText xml:space="preserve"> PAGEREF _Toc237052201 \h </w:instrText>
+              <w:instrText xml:space="preserve"> PAGEREF _Toc237053314 \h </w:instrText>
             </w:r>
             <w:r>
               <w:rPr>
@@ -954,7 +954,7 @@
               <w:lang w:eastAsia="es-GT"/>
             </w:rPr>
           </w:pPr>
-          <w:hyperlink w:anchor="_Toc237052202" w:history="1">
+          <w:hyperlink w:anchor="_Toc237053315" w:history="1">
             <w:r>
               <w:rPr>
                 <w:rStyle w:val="Hipervnculo"/>
@@ -996,7 +996,7 @@
                 <w:noProof/>
                 <w:webHidden/>
               </w:rPr>
-              <w:instrText xml:space="preserve"> PAGEREF _Toc237052202 \h </w:instrText>
+              <w:instrText xml:space="preserve"> PAGEREF _Toc237053315 \h </w:instrText>
             </w:r>
             <w:r>
               <w:rPr>
@@ -1040,7 +1040,7 @@
               <w:lang w:eastAsia="es-GT"/>
             </w:rPr>
           </w:pPr>
-          <w:hyperlink w:anchor="_Toc237052203" w:history="1">
+          <w:hyperlink w:anchor="_Toc237053316" w:history="1">
             <w:r>
               <w:rPr>
                 <w:rStyle w:val="Hipervnculo"/>
@@ -1082,7 +1082,7 @@
                 <w:noProof/>
                 <w:webHidden/>
               </w:rPr>
-              <w:instrText xml:space="preserve"> PAGEREF _Toc237052203 \h </w:instrText>
+              <w:instrText xml:space="preserve"> PAGEREF _Toc237053316 \h </w:instrText>
             </w:r>
             <w:r>
               <w:rPr>
@@ -1126,7 +1126,7 @@
               <w:lang w:eastAsia="es-GT"/>
             </w:rPr>
           </w:pPr>
-          <w:hyperlink w:anchor="_Toc237052204" w:history="1">
+          <w:hyperlink w:anchor="_Toc237053317" w:history="1">
             <w:r>
               <w:rPr>
                 <w:rStyle w:val="Hipervnculo"/>
@@ -1214,7 +1214,7 @@
                 <w:noProof/>
                 <w:webHidden/>
               </w:rPr>
-              <w:instrText xml:space="preserve"> PAGEREF _Toc237052204 \h </w:instrText>
+              <w:instrText xml:space="preserve"> PAGEREF _Toc237053317 \h </w:instrText>
             </w:r>
             <w:r>
               <w:rPr>
@@ -1258,7 +1258,7 @@
               <w:lang w:eastAsia="es-GT"/>
             </w:rPr>
           </w:pPr>
-          <w:hyperlink w:anchor="_Toc237052205" w:history="1">
+          <w:hyperlink w:anchor="_Toc237053318" w:history="1">
             <w:r>
               <w:rPr>
                 <w:rStyle w:val="Hipervnculo"/>
@@ -1346,7 +1346,7 @@
                 <w:noProof/>
                 <w:webHidden/>
               </w:rPr>
-              <w:instrText xml:space="preserve"> PAGEREF _Toc237052205 \h </w:instrText>
+              <w:instrText xml:space="preserve"> PAGEREF _Toc237053318 \h </w:instrText>
             </w:r>
             <w:r>
               <w:rPr>
@@ -1390,7 +1390,7 @@
               <w:lang w:eastAsia="es-GT"/>
             </w:rPr>
           </w:pPr>
-          <w:hyperlink w:anchor="_Toc237052206" w:history="1">
+          <w:hyperlink w:anchor="_Toc237053319" w:history="1">
             <w:r>
               <w:rPr>
                 <w:rStyle w:val="Hipervnculo"/>
@@ -1432,7 +1432,7 @@
                 <w:noProof/>
                 <w:webHidden/>
               </w:rPr>
-              <w:instrText xml:space="preserve"> PAGEREF _Toc237052206 \h </w:instrText>
+              <w:instrText xml:space="preserve"> PAGEREF _Toc237053319 \h </w:instrText>
             </w:r>
             <w:r>
               <w:rPr>
@@ -1476,7 +1476,7 @@
               <w:lang w:eastAsia="es-GT"/>
             </w:rPr>
           </w:pPr>
-          <w:hyperlink w:anchor="_Toc237052207" w:history="1">
+          <w:hyperlink w:anchor="_Toc237053320" w:history="1">
             <w:r>
               <w:rPr>
                 <w:rStyle w:val="Hipervnculo"/>
@@ -1518,7 +1518,7 @@
                 <w:noProof/>
                 <w:webHidden/>
               </w:rPr>
-              <w:instrText xml:space="preserve"> PAGEREF _Toc237052207 \h </w:instrText>
+              <w:instrText xml:space="preserve"> PAGEREF _Toc237053320 \h </w:instrText>
             </w:r>
             <w:r>
               <w:rPr>
@@ -1562,7 +1562,7 @@
               <w:lang w:eastAsia="es-GT"/>
             </w:rPr>
           </w:pPr>
-          <w:hyperlink w:anchor="_Toc237052212" w:history="1">
+          <w:hyperlink w:anchor="_Toc237053325" w:history="1">
             <w:r>
               <w:rPr>
                 <w:rStyle w:val="Hipervnculo"/>
@@ -1621,7 +1621,7 @@
                 <w:noProof/>
                 <w:webHidden/>
               </w:rPr>
-              <w:instrText xml:space="preserve"> PAGEREF _Toc237052212 \h </w:instrText>
+              <w:instrText xml:space="preserve"> PAGEREF _Toc237053325 \h </w:instrText>
             </w:r>
             <w:r>
               <w:rPr>
@@ -1665,7 +1665,7 @@
               <w:lang w:eastAsia="es-GT"/>
             </w:rPr>
           </w:pPr>
-          <w:hyperlink w:anchor="_Toc237052213" w:history="1">
+          <w:hyperlink w:anchor="_Toc237053326" w:history="1">
             <w:r>
               <w:rPr>
                 <w:rStyle w:val="Hipervnculo"/>
@@ -1722,7 +1722,7 @@
                 <w:noProof/>
                 <w:webHidden/>
               </w:rPr>
-              <w:instrText xml:space="preserve"> PAGEREF _Toc237052213 \h </w:instrText>
+              <w:instrText xml:space="preserve"> PAGEREF _Toc237053326 \h </w:instrText>
             </w:r>
             <w:r>
               <w:rPr>
@@ -1765,7 +1765,7 @@
               <w:lang w:eastAsia="es-GT"/>
             </w:rPr>
           </w:pPr>
-          <w:hyperlink w:anchor="_Toc237052214" w:history="1">
+          <w:hyperlink w:anchor="_Toc237053327" w:history="1">
             <w:r>
               <w:rPr>
                 <w:rStyle w:val="Hipervnculo"/>
@@ -1792,7 +1792,7 @@
                 <w:noProof/>
                 <w:webHidden/>
               </w:rPr>
-              <w:instrText xml:space="preserve"> PAGEREF _Toc237052214 \h </w:instrText>
+              <w:instrText xml:space="preserve"> PAGEREF _Toc237053327 \h </w:instrText>
             </w:r>
             <w:r>
               <w:rPr>
@@ -1836,7 +1836,7 @@
               <w:lang w:eastAsia="es-GT"/>
             </w:rPr>
           </w:pPr>
-          <w:hyperlink w:anchor="_Toc237052215" w:history="1">
+          <w:hyperlink w:anchor="_Toc237053328" w:history="1">
             <w:r>
               <w:rPr>
                 <w:rStyle w:val="Hipervnculo"/>
@@ -1878,7 +1878,7 @@
                 <w:noProof/>
                 <w:webHidden/>
               </w:rPr>
-              <w:instrText xml:space="preserve"> PAGEREF _Toc237052215 \h </w:instrText>
+              <w:instrText xml:space="preserve"> PAGEREF _Toc237053328 \h </w:instrText>
             </w:r>
             <w:r>
               <w:rPr>
@@ -1921,7 +1921,7 @@
               <w:lang w:eastAsia="es-GT"/>
             </w:rPr>
           </w:pPr>
-          <w:hyperlink w:anchor="_Toc237052216" w:history="1">
+          <w:hyperlink w:anchor="_Toc237053329" w:history="1">
             <w:r>
               <w:rPr>
                 <w:rStyle w:val="Hipervnculo"/>
@@ -1948,7 +1948,7 @@
                 <w:noProof/>
                 <w:webHidden/>
               </w:rPr>
-              <w:instrText xml:space="preserve"> PAGEREF _Toc237052216 \h </w:instrText>
+              <w:instrText xml:space="preserve"> PAGEREF _Toc237053329 \h </w:instrText>
             </w:r>
             <w:r>
               <w:rPr>
@@ -1992,7 +1992,7 @@
               <w:lang w:eastAsia="es-GT"/>
             </w:rPr>
           </w:pPr>
-          <w:hyperlink w:anchor="_Toc237052217" w:history="1">
+          <w:hyperlink w:anchor="_Toc237053330" w:history="1">
             <w:r>
               <w:rPr>
                 <w:rStyle w:val="Hipervnculo"/>
@@ -2034,7 +2034,7 @@
                 <w:noProof/>
                 <w:webHidden/>
               </w:rPr>
-              <w:instrText xml:space="preserve"> PAGEREF _Toc237052217 \h </w:instrText>
+              <w:instrText xml:space="preserve"> PAGEREF _Toc237053330 \h </w:instrText>
             </w:r>
             <w:r>
               <w:rPr>
@@ -2078,7 +2078,7 @@
               <w:lang w:eastAsia="es-GT"/>
             </w:rPr>
           </w:pPr>
-          <w:hyperlink w:anchor="_Toc237052218" w:history="1">
+          <w:hyperlink w:anchor="_Toc237053331" w:history="1">
             <w:r>
               <w:rPr>
                 <w:rStyle w:val="Hipervnculo"/>
@@ -2120,7 +2120,7 @@
                 <w:noProof/>
                 <w:webHidden/>
               </w:rPr>
-              <w:instrText xml:space="preserve"> PAGEREF _Toc237052218 \h </w:instrText>
+              <w:instrText xml:space="preserve"> PAGEREF _Toc237053331 \h </w:instrText>
             </w:r>
             <w:r>
               <w:rPr>
@@ -2164,7 +2164,7 @@
               <w:lang w:eastAsia="es-GT"/>
             </w:rPr>
           </w:pPr>
-          <w:hyperlink w:anchor="_Toc237052219" w:history="1">
+          <w:hyperlink w:anchor="_Toc237053332" w:history="1">
             <w:r>
               <w:rPr>
                 <w:rStyle w:val="Hipervnculo"/>
@@ -2206,7 +2206,7 @@
                 <w:noProof/>
                 <w:webHidden/>
               </w:rPr>
-              <w:instrText xml:space="preserve"> PAGEREF _Toc237052219 \h </w:instrText>
+              <w:instrText xml:space="preserve"> PAGEREF _Toc237053332 \h </w:instrText>
             </w:r>
             <w:r>
               <w:rPr>
@@ -2250,7 +2250,7 @@
               <w:lang w:eastAsia="es-GT"/>
             </w:rPr>
           </w:pPr>
-          <w:hyperlink w:anchor="_Toc237052220" w:history="1">
+          <w:hyperlink w:anchor="_Toc237053333" w:history="1">
             <w:r>
               <w:rPr>
                 <w:rStyle w:val="Hipervnculo"/>
@@ -2292,7 +2292,7 @@
                 <w:noProof/>
                 <w:webHidden/>
               </w:rPr>
-              <w:instrText xml:space="preserve"> PAGEREF _Toc237052220 \h </w:instrText>
+              <w:instrText xml:space="preserve"> PAGEREF _Toc237053333 \h </w:instrText>
             </w:r>
             <w:r>
               <w:rPr>
@@ -2336,7 +2336,7 @@
               <w:lang w:eastAsia="es-GT"/>
             </w:rPr>
           </w:pPr>
-          <w:hyperlink w:anchor="_Toc237052221" w:history="1">
+          <w:hyperlink w:anchor="_Toc237053334" w:history="1">
             <w:r>
               <w:rPr>
                 <w:rStyle w:val="Hipervnculo"/>
@@ -2378,7 +2378,7 @@
                 <w:noProof/>
                 <w:webHidden/>
               </w:rPr>
-              <w:instrText xml:space="preserve"> PAGEREF _Toc237052221 \h </w:instrText>
+              <w:instrText xml:space="preserve"> PAGEREF _Toc237053334 \h </w:instrText>
             </w:r>
             <w:r>
               <w:rPr>
@@ -2422,7 +2422,7 @@
               <w:lang w:eastAsia="es-GT"/>
             </w:rPr>
           </w:pPr>
-          <w:hyperlink w:anchor="_Toc237052222" w:history="1">
+          <w:hyperlink w:anchor="_Toc237053335" w:history="1">
             <w:r>
               <w:rPr>
                 <w:rStyle w:val="Hipervnculo"/>
@@ -2464,7 +2464,7 @@
                 <w:noProof/>
                 <w:webHidden/>
               </w:rPr>
-              <w:instrText xml:space="preserve"> PAGEREF _Toc237052222 \h </w:instrText>
+              <w:instrText xml:space="preserve"> PAGEREF _Toc237053335 \h </w:instrText>
             </w:r>
             <w:r>
               <w:rPr>
@@ -2508,7 +2508,7 @@
               <w:lang w:eastAsia="es-GT"/>
             </w:rPr>
           </w:pPr>
-          <w:hyperlink w:anchor="_Toc237052223" w:history="1">
+          <w:hyperlink w:anchor="_Toc237053336" w:history="1">
             <w:r>
               <w:rPr>
                 <w:rStyle w:val="Hipervnculo"/>
@@ -2550,7 +2550,7 @@
                 <w:noProof/>
                 <w:webHidden/>
               </w:rPr>
-              <w:instrText xml:space="preserve"> PAGEREF _Toc237052223 \h </w:instrText>
+              <w:instrText xml:space="preserve"> PAGEREF _Toc237053336 \h </w:instrText>
             </w:r>
             <w:r>
               <w:rPr>
@@ -2594,7 +2594,7 @@
               <w:lang w:eastAsia="es-GT"/>
             </w:rPr>
           </w:pPr>
-          <w:hyperlink w:anchor="_Toc237052224" w:history="1">
+          <w:hyperlink w:anchor="_Toc237053337" w:history="1">
             <w:r>
               <w:rPr>
                 <w:rStyle w:val="Hipervnculo"/>
@@ -2636,7 +2636,7 @@
                 <w:noProof/>
                 <w:webHidden/>
               </w:rPr>
-              <w:instrText xml:space="preserve"> PAGEREF _Toc237052224 \h </w:instrText>
+              <w:instrText xml:space="preserve"> PAGEREF _Toc237053337 \h </w:instrText>
             </w:r>
             <w:r>
               <w:rPr>
@@ -2680,7 +2680,7 @@
               <w:lang w:eastAsia="es-GT"/>
             </w:rPr>
           </w:pPr>
-          <w:hyperlink w:anchor="_Toc237052225" w:history="1">
+          <w:hyperlink w:anchor="_Toc237053338" w:history="1">
             <w:r>
               <w:rPr>
                 <w:rStyle w:val="Hipervnculo"/>
@@ -2722,7 +2722,7 @@
                 <w:noProof/>
                 <w:webHidden/>
               </w:rPr>
-              <w:instrText xml:space="preserve"> PAGEREF _Toc237052225 \h </w:instrText>
+              <w:instrText xml:space="preserve"> PAGEREF _Toc237053338 \h </w:instrText>
             </w:r>
             <w:r>
               <w:rPr>
@@ -2766,7 +2766,7 @@
               <w:lang w:eastAsia="es-GT"/>
             </w:rPr>
           </w:pPr>
-          <w:hyperlink w:anchor="_Toc237052226" w:history="1">
+          <w:hyperlink w:anchor="_Toc237053339" w:history="1">
             <w:r>
               <w:rPr>
                 <w:rStyle w:val="Hipervnculo"/>
@@ -2808,7 +2808,7 @@
                 <w:noProof/>
                 <w:webHidden/>
               </w:rPr>
-              <w:instrText xml:space="preserve"> PAGEREF _Toc237052226 \h </w:instrText>
+              <w:instrText xml:space="preserve"> PAGEREF _Toc237053339 \h </w:instrText>
             </w:r>
             <w:r>
               <w:rPr>
@@ -2852,13 +2852,13 @@
               <w:lang w:eastAsia="es-GT"/>
             </w:rPr>
           </w:pPr>
-          <w:hyperlink w:anchor="_Toc237052227" w:history="1">
+          <w:hyperlink w:anchor="_Toc237053340" w:history="1">
             <w:r>
               <w:rPr>
                 <w:rStyle w:val="Hipervnculo"/>
                 <w:noProof/>
               </w:rPr>
-              <w:t>2.3.4</w:t>
+              <w:t>2.3.5</w:t>
             </w:r>
             <w:r>
               <w:rPr>
@@ -2894,7 +2894,7 @@
                 <w:noProof/>
                 <w:webHidden/>
               </w:rPr>
-              <w:instrText xml:space="preserve"> PAGEREF _Toc237052227 \h </w:instrText>
+              <w:instrText xml:space="preserve"> PAGEREF _Toc237053340 \h </w:instrText>
             </w:r>
             <w:r>
               <w:rPr>
@@ -2937,7 +2937,7 @@
               <w:lang w:eastAsia="es-GT"/>
             </w:rPr>
           </w:pPr>
-          <w:hyperlink w:anchor="_Toc237052228" w:history="1">
+          <w:hyperlink w:anchor="_Toc237053341" w:history="1">
             <w:r>
               <w:rPr>
                 <w:rStyle w:val="Hipervnculo"/>
@@ -2964,7 +2964,7 @@
                 <w:noProof/>
                 <w:webHidden/>
               </w:rPr>
-              <w:instrText xml:space="preserve"> PAGEREF _Toc237052228 \h </w:instrText>
+              <w:instrText xml:space="preserve"> PAGEREF _Toc237053341 \h </w:instrText>
             </w:r>
             <w:r>
               <w:rPr>
@@ -3008,7 +3008,7 @@
               <w:lang w:eastAsia="es-GT"/>
             </w:rPr>
           </w:pPr>
-          <w:hyperlink w:anchor="_Toc237052229" w:history="1">
+          <w:hyperlink w:anchor="_Toc237053342" w:history="1">
             <w:r>
               <w:rPr>
                 <w:rStyle w:val="Hipervnculo"/>
@@ -3050,7 +3050,7 @@
                 <w:noProof/>
                 <w:webHidden/>
               </w:rPr>
-              <w:instrText xml:space="preserve"> PAGEREF _Toc237052229 \h </w:instrText>
+              <w:instrText xml:space="preserve"> PAGEREF _Toc237053342 \h </w:instrText>
             </w:r>
             <w:r>
               <w:rPr>
@@ -3093,7 +3093,7 @@
               <w:lang w:eastAsia="es-GT"/>
             </w:rPr>
           </w:pPr>
-          <w:hyperlink w:anchor="_Toc237052230" w:history="1">
+          <w:hyperlink w:anchor="_Toc237053343" w:history="1">
             <w:r>
               <w:rPr>
                 <w:rStyle w:val="Hipervnculo"/>
@@ -3120,7 +3120,7 @@
                 <w:noProof/>
                 <w:webHidden/>
               </w:rPr>
-              <w:instrText xml:space="preserve"> PAGEREF _Toc237052230 \h </w:instrText>
+              <w:instrText xml:space="preserve"> PAGEREF _Toc237053343 \h </w:instrText>
             </w:r>
             <w:r>
               <w:rPr>
@@ -3517,27 +3517,13 @@
         <w:rPr>
           <w:rFonts w:cstheme="minorHAnsi"/>
         </w:rPr>
-        <w:t>………………………………………………………</w:t>
-      </w:r>
-      <w:proofErr w:type="gramStart"/>
+        <w:t>……………………………………………………………</w:t>
+      </w:r>
       <w:r>
         <w:rPr>
           <w:rFonts w:cstheme="minorHAnsi"/>
         </w:rPr>
-        <w:t>……</w:t>
-      </w:r>
-      <w:r>
-        <w:rPr>
-          <w:rFonts w:cstheme="minorHAnsi"/>
-        </w:rPr>
-        <w:t>.</w:t>
-      </w:r>
-      <w:proofErr w:type="gramEnd"/>
-      <w:r>
-        <w:rPr>
-          <w:rFonts w:cstheme="minorHAnsi"/>
-        </w:rPr>
-        <w:t>.</w:t>
+        <w:t>..</w:t>
       </w:r>
       <w:r>
         <w:rPr>
@@ -3865,15 +3851,7 @@
           <w:bCs/>
           <w:noProof/>
         </w:rPr>
-        <w:t>I</w:t>
-      </w:r>
-      <w:r>
-        <w:rPr>
-          <w:rFonts w:cstheme="minorHAnsi"/>
-          <w:bCs/>
-          <w:noProof/>
-        </w:rPr>
-        <w:t>mágen 2.1 Metodología Scrum</w:t>
+        <w:t>Imágen 2.1 Metodología Scrum</w:t>
       </w:r>
       <w:r>
         <w:rPr>
@@ -4262,7 +4240,7 @@
         <w:pStyle w:val="Ttulo1"/>
         <w:ind w:firstLineChars="0" w:firstLine="0"/>
       </w:pPr>
-      <w:bookmarkStart w:id="4" w:name="_Toc237052199"/>
+      <w:bookmarkStart w:id="4" w:name="_Toc237053312"/>
       <w:r>
         <w:lastRenderedPageBreak/>
         <w:t>INTRODUCCIÓN</w:t>
@@ -4387,23 +4365,7 @@
           <w:rFonts w:ascii="Arial" w:eastAsiaTheme="minorHAnsi" w:hAnsi="Arial" w:cs="Arial"/>
           <w:lang w:val="es-419" w:eastAsia="es-GT"/>
         </w:rPr>
-        <w:t xml:space="preserve">Para el desarrollo del proyecto se utilizará la metodología Scrum, organizada en cuatro </w:t>
-      </w:r>
-      <w:proofErr w:type="spellStart"/>
-      <w:r>
-        <w:rPr>
-          <w:rFonts w:ascii="Arial" w:eastAsiaTheme="minorHAnsi" w:hAnsi="Arial" w:cs="Arial"/>
-          <w:lang w:val="es-419" w:eastAsia="es-GT"/>
-        </w:rPr>
-        <w:t>sprints</w:t>
-      </w:r>
-      <w:proofErr w:type="spellEnd"/>
-      <w:r>
-        <w:rPr>
-          <w:rFonts w:ascii="Arial" w:eastAsiaTheme="minorHAnsi" w:hAnsi="Arial" w:cs="Arial"/>
-          <w:lang w:val="es-419" w:eastAsia="es-GT"/>
-        </w:rPr>
-        <w:t xml:space="preserve"> que abarcan desde el levantamiento de requerimientos y el diseño funcional del sistema, hasta el desarrollo, las pruebas y la elaboración de la documentación técnica y de usuario, favoreciendo un desarrollo iterativo y con validación constante.</w:t>
+        <w:t>Para el desarrollo del proyecto se utilizará la metodología Scrum, organizada en cuatro sprints que abarcan desde el levantamiento de requerimientos y el diseño funcional del sistema, hasta el desarrollo, las pruebas y la elaboración de la documentación técnica y de usuario, favoreciendo un desarrollo iterativo y con validación constante.</w:t>
       </w:r>
     </w:p>
     <w:p>
@@ -4474,7 +4436,7 @@
         <w:pStyle w:val="Ttulo1"/>
         <w:ind w:firstLineChars="0" w:firstLine="0"/>
       </w:pPr>
-      <w:bookmarkStart w:id="5" w:name="_Toc237052200"/>
+      <w:bookmarkStart w:id="5" w:name="_Toc237053313"/>
       <w:r>
         <w:lastRenderedPageBreak/>
         <w:t>CAPÍTULO 1: MARCO CONTEXTUAL Y CONCEPTUAL</w:t>
@@ -4496,7 +4458,7 @@
           <w:numId w:val="24"/>
         </w:numPr>
       </w:pPr>
-      <w:bookmarkStart w:id="6" w:name="_Toc237052201"/>
+      <w:bookmarkStart w:id="6" w:name="_Toc237053314"/>
       <w:r>
         <w:t>Planteamiento del problema</w:t>
       </w:r>
@@ -4703,23 +4665,7 @@
           <w:rFonts w:ascii="Arial" w:eastAsiaTheme="minorHAnsi" w:hAnsi="Arial" w:cs="Arial"/>
           <w:lang w:val="es-419" w:eastAsia="es-GT"/>
         </w:rPr>
-        <w:t xml:space="preserve"> San Marcos cita a un representante de cada uno de los 30 municipios, a razón de 10 personas por día durante tres días, para que verifiquen que la estadígrafa digite correctamente los datos de sus hojas 5C en el primero de los tres archivos de Excel. Una vez recibida y verificada esta información, la estadígrafa dispone del resto del mes para completar los dos archivos restantes y consolidar el archivo de cobertura antes de que finalice el mes, el cual es el que utiliza la epidemióloga para las reuniones del consejo técnico. Este proceso representa una carga de trabajo considerable, concentrada casi en su totalidad en una sola persona. Al respecto, la estadígrafa encargada del proceso señaló que un sistema que automatizara este trabajo le permitiría reducir el tiempo invertido en el ingreso y revisión de la información, así como evitar las llamadas y las interrupciones a reuniones que debe atender actualmente para resolver dudas sobre el proceso (A. </w:t>
-      </w:r>
-      <w:proofErr w:type="spellStart"/>
-      <w:r>
-        <w:rPr>
-          <w:rFonts w:ascii="Arial" w:eastAsiaTheme="minorHAnsi" w:hAnsi="Arial" w:cs="Arial"/>
-          <w:lang w:val="es-419" w:eastAsia="es-GT"/>
-        </w:rPr>
-        <w:t>Floria</w:t>
-      </w:r>
-      <w:proofErr w:type="spellEnd"/>
-      <w:r>
-        <w:rPr>
-          <w:rFonts w:ascii="Arial" w:eastAsiaTheme="minorHAnsi" w:hAnsi="Arial" w:cs="Arial"/>
-          <w:lang w:val="es-419" w:eastAsia="es-GT"/>
-        </w:rPr>
-        <w:t>, comunicación personal, 7 de agosto de 2026).</w:t>
+        <w:t xml:space="preserve"> San Marcos cita a un representante de cada uno de los 30 municipios, a razón de 10 personas por día durante tres días, para que verifiquen que la estadígrafa digite correctamente los datos de sus hojas 5C en el primero de los tres archivos de Excel. Una vez recibida y verificada esta información, la estadígrafa dispone del resto del mes para completar los dos archivos restantes y consolidar el archivo de cobertura antes de que finalice el mes, el cual es el que utiliza la epidemióloga para las reuniones del consejo técnico. Este proceso representa una carga de trabajo considerable, concentrada casi en su totalidad en una sola persona. Al respecto, la estadígrafa encargada del proceso señaló que un sistema que automatizara este trabajo le permitiría reducir el tiempo invertido en el ingreso y revisión de la información, así como evitar las llamadas y las interrupciones a reuniones que debe atender actualmente para resolver dudas sobre el proceso (A. Floria, comunicación personal, 7 de agosto de 2026).</w:t>
       </w:r>
     </w:p>
     <w:p>
@@ -4865,7 +4811,7 @@
       <w:r>
         <w:t xml:space="preserve"> </w:t>
       </w:r>
-      <w:bookmarkStart w:id="7" w:name="_Toc237052202"/>
+      <w:bookmarkStart w:id="7" w:name="_Toc237053315"/>
       <w:r>
         <w:t>Antecedentes</w:t>
       </w:r>
@@ -5016,7 +4962,7 @@
         </w:numPr>
         <w:spacing w:after="0" w:line="276" w:lineRule="auto"/>
       </w:pPr>
-      <w:bookmarkStart w:id="8" w:name="_Toc237052203"/>
+      <w:bookmarkStart w:id="8" w:name="_Toc237053316"/>
       <w:r>
         <w:t>Antecedentes del problema</w:t>
       </w:r>
@@ -5051,23 +4997,7 @@
           <w:rFonts w:ascii="Arial" w:eastAsiaTheme="minorHAnsi" w:hAnsi="Arial" w:cs="Arial"/>
           <w:lang w:val="es-419" w:eastAsia="es-GT"/>
         </w:rPr>
-        <w:t xml:space="preserve"> San Marcos se han utilizado distintos métodos para consolidar la información de vacunación reportada por los 30 municipios del departamento; sin embargo, hasta el momento el único método confirmado es el uso de hojas de cálculo en Excel a partir de las hojas físicas 5C, el cual constituye la principal causa de las dificultades que existen actualmente para generar oportunamente el informe de cobertura. A </w:t>
-      </w:r>
-      <w:proofErr w:type="gramStart"/>
-      <w:r>
-        <w:rPr>
-          <w:rFonts w:ascii="Arial" w:eastAsiaTheme="minorHAnsi" w:hAnsi="Arial" w:cs="Arial"/>
-          <w:lang w:val="es-419" w:eastAsia="es-GT"/>
-        </w:rPr>
-        <w:t>continuación</w:t>
-      </w:r>
-      <w:proofErr w:type="gramEnd"/>
-      <w:r>
-        <w:rPr>
-          <w:rFonts w:ascii="Arial" w:eastAsiaTheme="minorHAnsi" w:hAnsi="Arial" w:cs="Arial"/>
-          <w:lang w:val="es-419" w:eastAsia="es-GT"/>
-        </w:rPr>
-        <w:t xml:space="preserve"> se presenta este intento de solución al problema:</w:t>
+        <w:t xml:space="preserve"> San Marcos se han utilizado distintos métodos para consolidar la información de vacunación reportada por los 30 municipios del departamento; sin embargo, hasta el momento el único método confirmado es el uso de hojas de cálculo en Excel a partir de las hojas físicas 5C, el cual constituye la principal causa de las dificultades que existen actualmente para generar oportunamente el informe de cobertura. A continuación se presenta este intento de solución al problema:</w:t>
       </w:r>
     </w:p>
     <w:p>
@@ -5289,7 +5219,7 @@
         </w:numPr>
         <w:spacing w:after="0" w:line="276" w:lineRule="auto"/>
       </w:pPr>
-      <w:bookmarkStart w:id="9" w:name="_Toc237052204"/>
+      <w:bookmarkStart w:id="9" w:name="_Toc237053317"/>
       <w:r>
         <w:t>Antecedentes</w:t>
       </w:r>
@@ -5418,27 +5348,7 @@
           <w:bCs/>
           <w:lang w:val="es-419" w:eastAsia="es-GT"/>
         </w:rPr>
-        <w:t xml:space="preserve">stema de vigilancia y control y su influencia en el proceso de la toma de decisiones para el tratamiento del vector Aedes </w:t>
-      </w:r>
-      <w:proofErr w:type="spellStart"/>
-      <w:r>
-        <w:rPr>
-          <w:rFonts w:ascii="Arial" w:eastAsiaTheme="minorHAnsi" w:hAnsi="Arial" w:cs="Arial"/>
-          <w:b/>
-          <w:bCs/>
-          <w:lang w:val="es-419" w:eastAsia="es-GT"/>
-        </w:rPr>
-        <w:t>aegypti</w:t>
-      </w:r>
-      <w:proofErr w:type="spellEnd"/>
-      <w:r>
-        <w:rPr>
-          <w:rFonts w:ascii="Arial" w:eastAsiaTheme="minorHAnsi" w:hAnsi="Arial" w:cs="Arial"/>
-          <w:b/>
-          <w:bCs/>
-          <w:lang w:val="es-419" w:eastAsia="es-GT"/>
-        </w:rPr>
-        <w:t xml:space="preserve"> en la Dirección Regional de Salud de San Martín</w:t>
+        <w:t>stema de vigilancia y control y su influencia en el proceso de la toma de decisiones para el tratamiento del vector Aedes aegypti en la Dirección Regional de Salud de San Martín</w:t>
       </w:r>
       <w:r>
         <w:rPr>
@@ -5523,7 +5433,7 @@
         </w:numPr>
         <w:spacing w:after="0" w:line="276" w:lineRule="auto"/>
       </w:pPr>
-      <w:bookmarkStart w:id="10" w:name="_Toc237052205"/>
+      <w:bookmarkStart w:id="10" w:name="_Toc237053318"/>
       <w:r>
         <w:t>Antecedentes</w:t>
       </w:r>
@@ -5981,7 +5891,7 @@
           <w:numId w:val="23"/>
         </w:numPr>
       </w:pPr>
-      <w:bookmarkStart w:id="11" w:name="_Toc237052206"/>
+      <w:bookmarkStart w:id="11" w:name="_Toc237053319"/>
       <w:r>
         <w:t>Justificación</w:t>
       </w:r>
@@ -6088,23 +5998,7 @@
           <w:lang w:val="es-419" w:eastAsia="es-GT"/>
         </w:rPr>
         <w:lastRenderedPageBreak/>
-        <w:t xml:space="preserve">información, así como evitar las llamadas y las interrupciones a reuniones que actualmente debe atender para resolver dudas sobre el proceso (A. </w:t>
-      </w:r>
-      <w:proofErr w:type="spellStart"/>
-      <w:r>
-        <w:rPr>
-          <w:rFonts w:ascii="Arial" w:eastAsiaTheme="minorHAnsi" w:hAnsi="Arial" w:cs="Arial"/>
-          <w:lang w:val="es-419" w:eastAsia="es-GT"/>
-        </w:rPr>
-        <w:t>Floria</w:t>
-      </w:r>
-      <w:proofErr w:type="spellEnd"/>
-      <w:r>
-        <w:rPr>
-          <w:rFonts w:ascii="Arial" w:eastAsiaTheme="minorHAnsi" w:hAnsi="Arial" w:cs="Arial"/>
-          <w:lang w:val="es-419" w:eastAsia="es-GT"/>
-        </w:rPr>
-        <w:t xml:space="preserve">, comunicación personal, 7 de agosto de 2026). Asimismo, se beneficiará al encargado de tecnología, quien revisa la información antes de que esta llegue a la epidemióloga, y a la propia epidemióloga, responsable de presentar los avances de cobertura durante las reuniones multidisciplinarias mensuales. Finalmente, la población de los 30 municipios del departamento se verá beneficiada de forma indirecta, al contar la </w:t>
+        <w:t xml:space="preserve">información, así como evitar las llamadas y las interrupciones a reuniones que actualmente debe atender para resolver dudas sobre el proceso (A. Floria, comunicación personal, 7 de agosto de 2026). Asimismo, se beneficiará al encargado de tecnología, quien revisa la información antes de que esta llegue a la epidemióloga, y a la propia epidemióloga, responsable de presentar los avances de cobertura durante las reuniones multidisciplinarias mensuales. Finalmente, la población de los 30 municipios del departamento se verá beneficiada de forma indirecta, al contar la </w:t>
       </w:r>
       <w:r>
         <w:rPr>
@@ -6189,7 +6083,7 @@
       <w:r>
         <w:t xml:space="preserve"> </w:t>
       </w:r>
-      <w:bookmarkStart w:id="12" w:name="_Toc237052207"/>
+      <w:bookmarkStart w:id="12" w:name="_Toc237053320"/>
       <w:r>
         <w:t>Objetivos</w:t>
       </w:r>
@@ -6230,6 +6124,8 @@
       <w:bookmarkStart w:id="20" w:name="_Toc237050079"/>
       <w:bookmarkStart w:id="21" w:name="_Toc237050111"/>
       <w:bookmarkStart w:id="22" w:name="_Toc237052208"/>
+      <w:bookmarkStart w:id="23" w:name="_Toc237053233"/>
+      <w:bookmarkStart w:id="24" w:name="_Toc237053321"/>
       <w:bookmarkEnd w:id="13"/>
       <w:bookmarkEnd w:id="14"/>
       <w:bookmarkEnd w:id="15"/>
@@ -6240,6 +6136,8 @@
       <w:bookmarkEnd w:id="20"/>
       <w:bookmarkEnd w:id="21"/>
       <w:bookmarkEnd w:id="22"/>
+      <w:bookmarkEnd w:id="23"/>
+      <w:bookmarkEnd w:id="24"/>
     </w:p>
     <w:p>
       <w:pPr>
@@ -6266,18 +6164,18 @@
           <w:szCs w:val="24"/>
         </w:rPr>
       </w:pPr>
-      <w:bookmarkStart w:id="23" w:name="_Toc231924528"/>
-      <w:bookmarkStart w:id="24" w:name="_Toc231924594"/>
-      <w:bookmarkStart w:id="25" w:name="_Toc231925096"/>
-      <w:bookmarkStart w:id="26" w:name="_Toc236118320"/>
-      <w:bookmarkStart w:id="27" w:name="_Toc236848969"/>
-      <w:bookmarkStart w:id="28" w:name="_Toc237047874"/>
-      <w:bookmarkStart w:id="29" w:name="_Toc237050043"/>
-      <w:bookmarkStart w:id="30" w:name="_Toc237050080"/>
-      <w:bookmarkStart w:id="31" w:name="_Toc237050112"/>
-      <w:bookmarkStart w:id="32" w:name="_Toc237052209"/>
-      <w:bookmarkEnd w:id="23"/>
-      <w:bookmarkEnd w:id="24"/>
+      <w:bookmarkStart w:id="25" w:name="_Toc231924528"/>
+      <w:bookmarkStart w:id="26" w:name="_Toc231924594"/>
+      <w:bookmarkStart w:id="27" w:name="_Toc231925096"/>
+      <w:bookmarkStart w:id="28" w:name="_Toc236118320"/>
+      <w:bookmarkStart w:id="29" w:name="_Toc236848969"/>
+      <w:bookmarkStart w:id="30" w:name="_Toc237047874"/>
+      <w:bookmarkStart w:id="31" w:name="_Toc237050043"/>
+      <w:bookmarkStart w:id="32" w:name="_Toc237050080"/>
+      <w:bookmarkStart w:id="33" w:name="_Toc237050112"/>
+      <w:bookmarkStart w:id="34" w:name="_Toc237052209"/>
+      <w:bookmarkStart w:id="35" w:name="_Toc237053234"/>
+      <w:bookmarkStart w:id="36" w:name="_Toc237053322"/>
       <w:bookmarkEnd w:id="25"/>
       <w:bookmarkEnd w:id="26"/>
       <w:bookmarkEnd w:id="27"/>
@@ -6286,6 +6184,10 @@
       <w:bookmarkEnd w:id="30"/>
       <w:bookmarkEnd w:id="31"/>
       <w:bookmarkEnd w:id="32"/>
+      <w:bookmarkEnd w:id="33"/>
+      <w:bookmarkEnd w:id="34"/>
+      <w:bookmarkEnd w:id="35"/>
+      <w:bookmarkEnd w:id="36"/>
     </w:p>
     <w:p>
       <w:pPr>
@@ -6312,26 +6214,30 @@
           <w:szCs w:val="24"/>
         </w:rPr>
       </w:pPr>
-      <w:bookmarkStart w:id="33" w:name="_Toc231924529"/>
-      <w:bookmarkStart w:id="34" w:name="_Toc231924595"/>
-      <w:bookmarkStart w:id="35" w:name="_Toc231925097"/>
-      <w:bookmarkStart w:id="36" w:name="_Toc236118321"/>
-      <w:bookmarkStart w:id="37" w:name="_Toc236848970"/>
-      <w:bookmarkStart w:id="38" w:name="_Toc237047875"/>
-      <w:bookmarkStart w:id="39" w:name="_Toc237050044"/>
-      <w:bookmarkStart w:id="40" w:name="_Toc237050081"/>
-      <w:bookmarkStart w:id="41" w:name="_Toc237050113"/>
-      <w:bookmarkStart w:id="42" w:name="_Toc237052210"/>
-      <w:bookmarkEnd w:id="33"/>
-      <w:bookmarkEnd w:id="34"/>
-      <w:bookmarkEnd w:id="35"/>
-      <w:bookmarkEnd w:id="36"/>
+      <w:bookmarkStart w:id="37" w:name="_Toc231924529"/>
+      <w:bookmarkStart w:id="38" w:name="_Toc231924595"/>
+      <w:bookmarkStart w:id="39" w:name="_Toc231925097"/>
+      <w:bookmarkStart w:id="40" w:name="_Toc236118321"/>
+      <w:bookmarkStart w:id="41" w:name="_Toc236848970"/>
+      <w:bookmarkStart w:id="42" w:name="_Toc237047875"/>
+      <w:bookmarkStart w:id="43" w:name="_Toc237050044"/>
+      <w:bookmarkStart w:id="44" w:name="_Toc237050081"/>
+      <w:bookmarkStart w:id="45" w:name="_Toc237050113"/>
+      <w:bookmarkStart w:id="46" w:name="_Toc237052210"/>
+      <w:bookmarkStart w:id="47" w:name="_Toc237053235"/>
+      <w:bookmarkStart w:id="48" w:name="_Toc237053323"/>
       <w:bookmarkEnd w:id="37"/>
       <w:bookmarkEnd w:id="38"/>
       <w:bookmarkEnd w:id="39"/>
       <w:bookmarkEnd w:id="40"/>
       <w:bookmarkEnd w:id="41"/>
       <w:bookmarkEnd w:id="42"/>
+      <w:bookmarkEnd w:id="43"/>
+      <w:bookmarkEnd w:id="44"/>
+      <w:bookmarkEnd w:id="45"/>
+      <w:bookmarkEnd w:id="46"/>
+      <w:bookmarkEnd w:id="47"/>
+      <w:bookmarkEnd w:id="48"/>
     </w:p>
     <w:p>
       <w:pPr>
@@ -6358,26 +6264,30 @@
           <w:szCs w:val="24"/>
         </w:rPr>
       </w:pPr>
-      <w:bookmarkStart w:id="43" w:name="_Toc231924530"/>
-      <w:bookmarkStart w:id="44" w:name="_Toc231924596"/>
-      <w:bookmarkStart w:id="45" w:name="_Toc231925098"/>
-      <w:bookmarkStart w:id="46" w:name="_Toc236118322"/>
-      <w:bookmarkStart w:id="47" w:name="_Toc236848971"/>
-      <w:bookmarkStart w:id="48" w:name="_Toc237047876"/>
-      <w:bookmarkStart w:id="49" w:name="_Toc237050045"/>
-      <w:bookmarkStart w:id="50" w:name="_Toc237050082"/>
-      <w:bookmarkStart w:id="51" w:name="_Toc237050114"/>
-      <w:bookmarkStart w:id="52" w:name="_Toc237052211"/>
-      <w:bookmarkEnd w:id="43"/>
-      <w:bookmarkEnd w:id="44"/>
-      <w:bookmarkEnd w:id="45"/>
-      <w:bookmarkEnd w:id="46"/>
-      <w:bookmarkEnd w:id="47"/>
-      <w:bookmarkEnd w:id="48"/>
+      <w:bookmarkStart w:id="49" w:name="_Toc231924530"/>
+      <w:bookmarkStart w:id="50" w:name="_Toc231924596"/>
+      <w:bookmarkStart w:id="51" w:name="_Toc231925098"/>
+      <w:bookmarkStart w:id="52" w:name="_Toc236118322"/>
+      <w:bookmarkStart w:id="53" w:name="_Toc236848971"/>
+      <w:bookmarkStart w:id="54" w:name="_Toc237047876"/>
+      <w:bookmarkStart w:id="55" w:name="_Toc237050045"/>
+      <w:bookmarkStart w:id="56" w:name="_Toc237050082"/>
+      <w:bookmarkStart w:id="57" w:name="_Toc237050114"/>
+      <w:bookmarkStart w:id="58" w:name="_Toc237052211"/>
+      <w:bookmarkStart w:id="59" w:name="_Toc237053236"/>
+      <w:bookmarkStart w:id="60" w:name="_Toc237053324"/>
       <w:bookmarkEnd w:id="49"/>
       <w:bookmarkEnd w:id="50"/>
       <w:bookmarkEnd w:id="51"/>
       <w:bookmarkEnd w:id="52"/>
+      <w:bookmarkEnd w:id="53"/>
+      <w:bookmarkEnd w:id="54"/>
+      <w:bookmarkEnd w:id="55"/>
+      <w:bookmarkEnd w:id="56"/>
+      <w:bookmarkEnd w:id="57"/>
+      <w:bookmarkEnd w:id="58"/>
+      <w:bookmarkEnd w:id="59"/>
+      <w:bookmarkEnd w:id="60"/>
     </w:p>
     <w:p>
       <w:pPr>
@@ -6391,7 +6301,7 @@
           <w:spacing w:val="-2"/>
         </w:rPr>
       </w:pPr>
-      <w:bookmarkStart w:id="53" w:name="_Toc237052212"/>
+      <w:bookmarkStart w:id="61" w:name="_Toc237053325"/>
       <w:r>
         <w:t>Objetivo</w:t>
       </w:r>
@@ -6407,7 +6317,7 @@
         </w:rPr>
         <w:t>general</w:t>
       </w:r>
-      <w:bookmarkEnd w:id="53"/>
+      <w:bookmarkEnd w:id="61"/>
     </w:p>
     <w:p>
       <w:pPr>
@@ -6464,7 +6374,7 @@
         </w:numPr>
         <w:spacing w:before="240" w:after="0" w:line="276" w:lineRule="auto"/>
       </w:pPr>
-      <w:bookmarkStart w:id="54" w:name="_Toc237052213"/>
+      <w:bookmarkStart w:id="62" w:name="_Toc237053326"/>
       <w:r>
         <w:t>Objetivos</w:t>
       </w:r>
@@ -6477,7 +6387,7 @@
       <w:r>
         <w:t>específicos:</w:t>
       </w:r>
-      <w:bookmarkEnd w:id="54"/>
+      <w:bookmarkEnd w:id="62"/>
     </w:p>
     <w:p>
       <w:pPr>
@@ -6937,20 +6847,20 @@
           <w:docGrid w:linePitch="360"/>
         </w:sectPr>
       </w:pPr>
-      <w:bookmarkStart w:id="55" w:name="_Toc229417571"/>
+      <w:bookmarkStart w:id="63" w:name="_Toc229417571"/>
     </w:p>
     <w:p>
       <w:pPr>
         <w:pStyle w:val="Ttulo1"/>
         <w:ind w:firstLineChars="0" w:firstLine="0"/>
       </w:pPr>
-      <w:bookmarkStart w:id="56" w:name="_Toc237052214"/>
+      <w:bookmarkStart w:id="64" w:name="_Toc237053327"/>
       <w:r>
         <w:lastRenderedPageBreak/>
         <w:t>CAPÍTULO 2: DISEÑO Y MÉTODO</w:t>
       </w:r>
-      <w:bookmarkEnd w:id="55"/>
-      <w:bookmarkEnd w:id="56"/>
+      <w:bookmarkEnd w:id="63"/>
+      <w:bookmarkEnd w:id="64"/>
     </w:p>
     <w:p>
       <w:pPr>
@@ -6988,11 +6898,11 @@
       <w:r>
         <w:t xml:space="preserve"> </w:t>
       </w:r>
-      <w:bookmarkStart w:id="57" w:name="_Toc237052215"/>
+      <w:bookmarkStart w:id="65" w:name="_Toc237053328"/>
       <w:r>
         <w:t>Diseño</w:t>
       </w:r>
-      <w:bookmarkEnd w:id="57"/>
+      <w:bookmarkEnd w:id="65"/>
     </w:p>
     <w:p>
       <w:pPr>
@@ -7114,12 +7024,12 @@
       <w:pPr>
         <w:pStyle w:val="Ttulo3"/>
       </w:pPr>
-      <w:bookmarkStart w:id="58" w:name="_Toc237052216"/>
+      <w:bookmarkStart w:id="66" w:name="_Toc237053329"/>
       <w:r>
         <w:lastRenderedPageBreak/>
         <w:t>2.1.1 Diagramas del sistema</w:t>
       </w:r>
-      <w:bookmarkEnd w:id="58"/>
+      <w:bookmarkEnd w:id="66"/>
     </w:p>
     <w:p>
       <w:pPr>
@@ -7298,43 +7208,61 @@
                                 <w:lang w:val="es-MX"/>
                               </w:rPr>
                             </w:pPr>
-                            <w:bookmarkStart w:id="59" w:name="_Toc236942818"/>
-                            <w:bookmarkStart w:id="60" w:name="_Toc237049804"/>
+                            <w:bookmarkStart w:id="67" w:name="_Toc236942818"/>
+                            <w:bookmarkStart w:id="68" w:name="_Toc237049804"/>
                             <w:r>
                               <w:t xml:space="preserve">Ilustración  </w:t>
                             </w:r>
-                            <w:fldSimple w:instr=" SEQ Ilustración_ \* ARABIC ">
-                              <w:r>
-                                <w:rPr>
-                                  <w:noProof/>
-                                </w:rPr>
-                                <w:t>2</w:t>
-                              </w:r>
-                            </w:fldSimple>
                             <w:r>
-                              <w:t xml:space="preserve"> Diagrama de contexto del </w:t>
+                              <w:fldChar w:fldCharType="begin"/>
                             </w:r>
-                            <w:proofErr w:type="spellStart"/>
                             <w:r>
-                              <w:t>sistemaIlustración</w:t>
+                              <w:instrText xml:space="preserve"> SEQ Ilustración_ \* ARABIC </w:instrText>
                             </w:r>
-                            <w:proofErr w:type="spellEnd"/>
                             <w:r>
-                              <w:t xml:space="preserve">  </w:t>
+                              <w:fldChar w:fldCharType="separate"/>
                             </w:r>
-                            <w:fldSimple w:instr=" SEQ Ilustración_ \* ARABIC ">
-                              <w:r>
-                                <w:rPr>
-                                  <w:noProof/>
-                                </w:rPr>
-                                <w:t>1</w:t>
-                              </w:r>
-                            </w:fldSimple>
+                            <w:r>
+                              <w:rPr>
+                                <w:noProof/>
+                              </w:rPr>
+                              <w:t>2</w:t>
+                            </w:r>
+                            <w:r>
+                              <w:rPr>
+                                <w:noProof/>
+                              </w:rPr>
+                              <w:fldChar w:fldCharType="end"/>
+                            </w:r>
+                            <w:r>
+                              <w:t xml:space="preserve"> Diagrama de contexto del sistemaIlustración  </w:t>
+                            </w:r>
+                            <w:r>
+                              <w:fldChar w:fldCharType="begin"/>
+                            </w:r>
+                            <w:r>
+                              <w:instrText xml:space="preserve"> SEQ Ilustración_ \* ARABIC </w:instrText>
+                            </w:r>
+                            <w:r>
+                              <w:fldChar w:fldCharType="separate"/>
+                            </w:r>
+                            <w:r>
+                              <w:rPr>
+                                <w:noProof/>
+                              </w:rPr>
+                              <w:t>1</w:t>
+                            </w:r>
+                            <w:r>
+                              <w:rPr>
+                                <w:noProof/>
+                              </w:rPr>
+                              <w:fldChar w:fldCharType="end"/>
+                            </w:r>
                             <w:r>
                               <w:t xml:space="preserve"> Diagrama de bloques del proyecto</w:t>
                             </w:r>
-                            <w:bookmarkEnd w:id="59"/>
-                            <w:bookmarkEnd w:id="60"/>
+                            <w:bookmarkEnd w:id="67"/>
+                            <w:bookmarkEnd w:id="68"/>
                           </w:p>
                           <w:p>
                             <w:pPr>
@@ -7411,8 +7339,8 @@
                           <w:lang w:val="es-MX"/>
                         </w:rPr>
                       </w:pPr>
-                      <w:bookmarkStart w:id="57" w:name="_Toc236942818"/>
-                      <w:bookmarkStart w:id="58" w:name="_Toc237049804"/>
+                      <w:bookmarkStart w:id="69" w:name="_Toc236942818"/>
+                      <w:bookmarkStart w:id="70" w:name="_Toc237049804"/>
                       <w:r>
                         <w:t xml:space="preserve">Ilustración  </w:t>
                       </w:r>
@@ -7438,15 +7366,7 @@
                         <w:fldChar w:fldCharType="end"/>
                       </w:r>
                       <w:r>
-                        <w:t xml:space="preserve"> Diagrama de contexto del </w:t>
-                      </w:r>
-                      <w:proofErr w:type="spellStart"/>
-                      <w:r>
-                        <w:t>sistemaIlustración</w:t>
-                      </w:r>
-                      <w:proofErr w:type="spellEnd"/>
-                      <w:r>
-                        <w:t xml:space="preserve">  </w:t>
+                        <w:t xml:space="preserve"> Diagrama de contexto del sistemaIlustración  </w:t>
                       </w:r>
                       <w:r>
                         <w:fldChar w:fldCharType="begin"/>
@@ -7472,8 +7392,8 @@
                       <w:r>
                         <w:t xml:space="preserve"> Diagrama de bloques del proyecto</w:t>
                       </w:r>
-                      <w:bookmarkEnd w:id="57"/>
-                      <w:bookmarkEnd w:id="58"/>
+                      <w:bookmarkEnd w:id="69"/>
+                      <w:bookmarkEnd w:id="70"/>
                     </w:p>
                     <w:p>
                       <w:pPr>
@@ -7590,25 +7510,7 @@
           <w:sz w:val="24"/>
           <w:szCs w:val="24"/>
         </w:rPr>
-        <w:t xml:space="preserve">desarrollada con </w:t>
-      </w:r>
-      <w:proofErr w:type="spellStart"/>
-      <w:r>
-        <w:rPr>
-          <w:rFonts w:ascii="Arial" w:hAnsi="Arial" w:cs="Arial"/>
-          <w:sz w:val="24"/>
-          <w:szCs w:val="24"/>
-        </w:rPr>
-        <w:t>React</w:t>
-      </w:r>
-      <w:proofErr w:type="spellEnd"/>
-      <w:r>
-        <w:rPr>
-          <w:rFonts w:ascii="Arial" w:hAnsi="Arial" w:cs="Arial"/>
-          <w:sz w:val="24"/>
-          <w:szCs w:val="24"/>
-        </w:rPr>
-        <w:t xml:space="preserve">, es el medio mediante el cual el personal de los centros de salud y las autoridades de la </w:t>
+        <w:t xml:space="preserve">desarrollada con React, es el medio mediante el cual el personal de los centros de salud y las autoridades de la </w:t>
       </w:r>
       <w:r>
         <w:rPr>
@@ -7863,27 +7765,7 @@
           <w:szCs w:val="24"/>
           <w:lang w:val="es-MX"/>
         </w:rPr>
-        <w:t xml:space="preserve"> mediante </w:t>
-      </w:r>
-      <w:proofErr w:type="spellStart"/>
-      <w:r>
-        <w:rPr>
-          <w:rFonts w:ascii="Arial" w:hAnsi="Arial" w:cs="Arial"/>
-          <w:sz w:val="24"/>
-          <w:szCs w:val="24"/>
-          <w:lang w:val="es-MX"/>
-        </w:rPr>
-        <w:t>DigitalOcean</w:t>
-      </w:r>
-      <w:proofErr w:type="spellEnd"/>
-      <w:r>
-        <w:rPr>
-          <w:rFonts w:ascii="Arial" w:hAnsi="Arial" w:cs="Arial"/>
-          <w:sz w:val="24"/>
-          <w:szCs w:val="24"/>
-          <w:lang w:val="es-MX"/>
-        </w:rPr>
-        <w:t>, encargado de proveer la infraestructura necesaria y brindar el enlace para que el usuario final pueda acceder al sistema a través de internet.</w:t>
+        <w:t xml:space="preserve"> mediante DigitalOcean, encargado de proveer la infraestructura necesaria y brindar el enlace para que el usuario final pueda acceder al sistema a través de internet.</w:t>
       </w:r>
     </w:p>
     <w:p>
@@ -7920,47 +7802,7 @@
           <w:szCs w:val="24"/>
           <w:lang w:val="es-MX"/>
         </w:rPr>
-        <w:t xml:space="preserve"> creada a través de un </w:t>
-      </w:r>
-      <w:proofErr w:type="spellStart"/>
-      <w:r>
-        <w:rPr>
-          <w:rFonts w:ascii="Arial" w:hAnsi="Arial" w:cs="Arial"/>
-          <w:sz w:val="24"/>
-          <w:szCs w:val="24"/>
-          <w:lang w:val="es-MX"/>
-        </w:rPr>
-        <w:t>droplet</w:t>
-      </w:r>
-      <w:proofErr w:type="spellEnd"/>
-      <w:r>
-        <w:rPr>
-          <w:rFonts w:ascii="Arial" w:hAnsi="Arial" w:cs="Arial"/>
-          <w:sz w:val="24"/>
-          <w:szCs w:val="24"/>
-          <w:lang w:val="es-MX"/>
-        </w:rPr>
-        <w:t xml:space="preserve"> de </w:t>
-      </w:r>
-      <w:proofErr w:type="spellStart"/>
-      <w:r>
-        <w:rPr>
-          <w:rFonts w:ascii="Arial" w:hAnsi="Arial" w:cs="Arial"/>
-          <w:sz w:val="24"/>
-          <w:szCs w:val="24"/>
-          <w:lang w:val="es-MX"/>
-        </w:rPr>
-        <w:t>DigitalOcean</w:t>
-      </w:r>
-      <w:proofErr w:type="spellEnd"/>
-      <w:r>
-        <w:rPr>
-          <w:rFonts w:ascii="Arial" w:hAnsi="Arial" w:cs="Arial"/>
-          <w:sz w:val="24"/>
-          <w:szCs w:val="24"/>
-          <w:lang w:val="es-MX"/>
-        </w:rPr>
-        <w:t xml:space="preserve"> con distribución Linux, que provee el entorno básico para la configuración y el funcionamiento del sistema.</w:t>
+        <w:t xml:space="preserve"> creada a través de un droplet de DigitalOcean con distribución Linux, que provee el entorno básico para la configuración y el funcionamiento del sistema.</w:t>
       </w:r>
     </w:p>
     <w:p>
@@ -8132,28 +7974,41 @@
                                 <w:lang w:val="es-MX"/>
                               </w:rPr>
                             </w:pPr>
-                            <w:bookmarkStart w:id="61" w:name="_Toc236942819"/>
-                            <w:bookmarkStart w:id="62" w:name="_Toc237049805"/>
-                            <w:bookmarkStart w:id="63" w:name="_Toc236942482"/>
+                            <w:bookmarkStart w:id="71" w:name="_Toc236942819"/>
+                            <w:bookmarkStart w:id="72" w:name="_Toc237049805"/>
+                            <w:bookmarkStart w:id="73" w:name="_Toc236942482"/>
                             <w:r>
                               <w:t xml:space="preserve">Ilustración  </w:t>
                             </w:r>
-                            <w:fldSimple w:instr=" SEQ Ilustración_ \* ARABIC ">
-                              <w:r>
-                                <w:rPr>
-                                  <w:noProof/>
-                                </w:rPr>
-                                <w:t>2</w:t>
-                              </w:r>
-                            </w:fldSimple>
+                            <w:r>
+                              <w:fldChar w:fldCharType="begin"/>
+                            </w:r>
+                            <w:r>
+                              <w:instrText xml:space="preserve"> SEQ Ilustración_ \* ARABIC </w:instrText>
+                            </w:r>
+                            <w:r>
+                              <w:fldChar w:fldCharType="separate"/>
+                            </w:r>
+                            <w:r>
+                              <w:rPr>
+                                <w:noProof/>
+                              </w:rPr>
+                              <w:t>2</w:t>
+                            </w:r>
+                            <w:r>
+                              <w:rPr>
+                                <w:noProof/>
+                              </w:rPr>
+                              <w:fldChar w:fldCharType="end"/>
+                            </w:r>
                             <w:r>
                               <w:t>.2</w:t>
                             </w:r>
                             <w:r>
                               <w:t xml:space="preserve"> Diagrama de contexto del sistema</w:t>
                             </w:r>
-                            <w:bookmarkEnd w:id="61"/>
-                            <w:bookmarkEnd w:id="62"/>
+                            <w:bookmarkEnd w:id="71"/>
+                            <w:bookmarkEnd w:id="72"/>
                           </w:p>
                           <w:p/>
                           <w:p>
@@ -8165,47 +8020,65 @@
                                 <w:lang w:val="es-MX"/>
                               </w:rPr>
                             </w:pPr>
-                            <w:bookmarkStart w:id="64" w:name="_Toc236942820"/>
-                            <w:bookmarkStart w:id="65" w:name="_Toc237049806"/>
+                            <w:bookmarkStart w:id="74" w:name="_Toc236942820"/>
+                            <w:bookmarkStart w:id="75" w:name="_Toc237049806"/>
                             <w:r>
                               <w:t xml:space="preserve">Ilustración  </w:t>
                             </w:r>
-                            <w:fldSimple w:instr=" SEQ Ilustración_ \* ARABIC ">
-                              <w:r>
-                                <w:rPr>
-                                  <w:noProof/>
-                                </w:rPr>
-                                <w:t>3</w:t>
-                              </w:r>
-                            </w:fldSimple>
+                            <w:r>
+                              <w:fldChar w:fldCharType="begin"/>
+                            </w:r>
+                            <w:r>
+                              <w:instrText xml:space="preserve"> SEQ Ilustración_ \* ARABIC </w:instrText>
+                            </w:r>
+                            <w:r>
+                              <w:fldChar w:fldCharType="separate"/>
+                            </w:r>
+                            <w:r>
+                              <w:rPr>
+                                <w:noProof/>
+                              </w:rPr>
+                              <w:t>3</w:t>
+                            </w:r>
+                            <w:r>
+                              <w:rPr>
+                                <w:noProof/>
+                              </w:rPr>
+                              <w:fldChar w:fldCharType="end"/>
+                            </w:r>
                             <w:r>
                               <w:t xml:space="preserve"> </w:t>
                             </w:r>
                             <w:r>
-                              <w:t xml:space="preserve">Diagrama de flujo del </w:t>
+                              <w:t xml:space="preserve">Diagrama de flujo del sistemaIlustración  </w:t>
                             </w:r>
-                            <w:proofErr w:type="spellStart"/>
                             <w:r>
-                              <w:t>sistemaIlustración</w:t>
+                              <w:fldChar w:fldCharType="begin"/>
                             </w:r>
-                            <w:proofErr w:type="spellEnd"/>
                             <w:r>
-                              <w:t xml:space="preserve">  </w:t>
+                              <w:instrText xml:space="preserve"> SEQ Ilustración_ \* ARABIC </w:instrText>
                             </w:r>
-                            <w:fldSimple w:instr=" SEQ Ilustración_ \* ARABIC ">
-                              <w:r>
-                                <w:rPr>
-                                  <w:noProof/>
-                                </w:rPr>
-                                <w:t>2</w:t>
-                              </w:r>
-                            </w:fldSimple>
+                            <w:r>
+                              <w:fldChar w:fldCharType="separate"/>
+                            </w:r>
+                            <w:r>
+                              <w:rPr>
+                                <w:noProof/>
+                              </w:rPr>
+                              <w:t>2</w:t>
+                            </w:r>
+                            <w:r>
+                              <w:rPr>
+                                <w:noProof/>
+                              </w:rPr>
+                              <w:fldChar w:fldCharType="end"/>
+                            </w:r>
                             <w:r>
                               <w:t xml:space="preserve"> Diagrama de contexto del sistema</w:t>
                             </w:r>
-                            <w:bookmarkEnd w:id="63"/>
-                            <w:bookmarkEnd w:id="64"/>
-                            <w:bookmarkEnd w:id="65"/>
+                            <w:bookmarkEnd w:id="73"/>
+                            <w:bookmarkEnd w:id="74"/>
+                            <w:bookmarkEnd w:id="75"/>
                           </w:p>
                         </w:txbxContent>
                       </wps:txbx>
@@ -8238,9 +8111,9 @@
                           <w:lang w:val="es-MX"/>
                         </w:rPr>
                       </w:pPr>
-                      <w:bookmarkStart w:id="64" w:name="_Toc236942819"/>
-                      <w:bookmarkStart w:id="65" w:name="_Toc236942482"/>
-                      <w:bookmarkStart w:id="66" w:name="_Toc237049805"/>
+                      <w:bookmarkStart w:id="76" w:name="_Toc236942819"/>
+                      <w:bookmarkStart w:id="77" w:name="_Toc237049805"/>
+                      <w:bookmarkStart w:id="78" w:name="_Toc236942482"/>
                       <w:r>
                         <w:t xml:space="preserve">Ilustración  </w:t>
                       </w:r>
@@ -8271,8 +8144,8 @@
                       <w:r>
                         <w:t xml:space="preserve"> Diagrama de contexto del sistema</w:t>
                       </w:r>
-                      <w:bookmarkEnd w:id="64"/>
-                      <w:bookmarkEnd w:id="66"/>
+                      <w:bookmarkEnd w:id="76"/>
+                      <w:bookmarkEnd w:id="77"/>
                     </w:p>
                     <w:p/>
                     <w:p>
@@ -8284,8 +8157,8 @@
                           <w:lang w:val="es-MX"/>
                         </w:rPr>
                       </w:pPr>
-                      <w:bookmarkStart w:id="67" w:name="_Toc236942820"/>
-                      <w:bookmarkStart w:id="68" w:name="_Toc237049806"/>
+                      <w:bookmarkStart w:id="79" w:name="_Toc236942820"/>
+                      <w:bookmarkStart w:id="80" w:name="_Toc237049806"/>
                       <w:r>
                         <w:t xml:space="preserve">Ilustración  </w:t>
                       </w:r>
@@ -8314,15 +8187,7 @@
                         <w:t xml:space="preserve"> </w:t>
                       </w:r>
                       <w:r>
-                        <w:t xml:space="preserve">Diagrama de flujo del </w:t>
-                      </w:r>
-                      <w:proofErr w:type="spellStart"/>
-                      <w:r>
-                        <w:t>sistemaIlustración</w:t>
-                      </w:r>
-                      <w:proofErr w:type="spellEnd"/>
-                      <w:r>
-                        <w:t xml:space="preserve">  </w:t>
+                        <w:t xml:space="preserve">Diagrama de flujo del sistemaIlustración  </w:t>
                       </w:r>
                       <w:r>
                         <w:fldChar w:fldCharType="begin"/>
@@ -8348,9 +8213,9 @@
                       <w:r>
                         <w:t xml:space="preserve"> Diagrama de contexto del sistema</w:t>
                       </w:r>
-                      <w:bookmarkEnd w:id="65"/>
-                      <w:bookmarkEnd w:id="67"/>
-                      <w:bookmarkEnd w:id="68"/>
+                      <w:bookmarkEnd w:id="78"/>
+                      <w:bookmarkEnd w:id="79"/>
+                      <w:bookmarkEnd w:id="80"/>
                     </w:p>
                   </w:txbxContent>
                 </v:textbox>
@@ -8871,31 +8736,44 @@
                                 <w:lang w:val="es-MX"/>
                               </w:rPr>
                             </w:pPr>
-                            <w:bookmarkStart w:id="66" w:name="_Toc236942821"/>
-                            <w:bookmarkStart w:id="67" w:name="_Toc237049807"/>
-                            <w:bookmarkStart w:id="68" w:name="_Toc236942483"/>
+                            <w:bookmarkStart w:id="81" w:name="_Toc236942821"/>
+                            <w:bookmarkStart w:id="82" w:name="_Toc237049807"/>
+                            <w:bookmarkStart w:id="83" w:name="_Toc236942483"/>
                             <w:r>
                               <w:t>Ilustración 2</w:t>
                             </w:r>
                             <w:r>
                               <w:t>.</w:t>
                             </w:r>
-                            <w:fldSimple w:instr=" SEQ Ilustración_ \* ARABIC ">
-                              <w:r>
-                                <w:rPr>
-                                  <w:noProof/>
-                                </w:rPr>
-                                <w:t>3</w:t>
-                              </w:r>
-                            </w:fldSimple>
+                            <w:r>
+                              <w:fldChar w:fldCharType="begin"/>
+                            </w:r>
+                            <w:r>
+                              <w:instrText xml:space="preserve"> SEQ Ilustración_ \* ARABIC </w:instrText>
+                            </w:r>
+                            <w:r>
+                              <w:fldChar w:fldCharType="separate"/>
+                            </w:r>
+                            <w:r>
+                              <w:rPr>
+                                <w:noProof/>
+                              </w:rPr>
+                              <w:t>3</w:t>
+                            </w:r>
+                            <w:r>
+                              <w:rPr>
+                                <w:noProof/>
+                              </w:rPr>
+                              <w:fldChar w:fldCharType="end"/>
+                            </w:r>
                             <w:r>
                               <w:t xml:space="preserve"> </w:t>
                             </w:r>
                             <w:r>
                               <w:t>Diagrama de flujo del sistema</w:t>
                             </w:r>
-                            <w:bookmarkEnd w:id="66"/>
-                            <w:bookmarkEnd w:id="67"/>
+                            <w:bookmarkEnd w:id="81"/>
+                            <w:bookmarkEnd w:id="82"/>
                           </w:p>
                           <w:p/>
                           <w:p>
@@ -8907,28 +8785,41 @@
                                 <w:lang w:val="es-MX"/>
                               </w:rPr>
                             </w:pPr>
-                            <w:bookmarkStart w:id="69" w:name="_Toc236942822"/>
-                            <w:bookmarkStart w:id="70" w:name="_Toc237049808"/>
+                            <w:bookmarkStart w:id="84" w:name="_Toc236942822"/>
+                            <w:bookmarkStart w:id="85" w:name="_Toc237049808"/>
                             <w:r>
                               <w:t xml:space="preserve">Ilustración  </w:t>
                             </w:r>
-                            <w:fldSimple w:instr=" SEQ Ilustración_ \* ARABIC ">
-                              <w:r>
-                                <w:rPr>
-                                  <w:noProof/>
-                                </w:rPr>
-                                <w:t>3</w:t>
-                              </w:r>
-                            </w:fldSimple>
+                            <w:r>
+                              <w:fldChar w:fldCharType="begin"/>
+                            </w:r>
+                            <w:r>
+                              <w:instrText xml:space="preserve"> SEQ Ilustración_ \* ARABIC </w:instrText>
+                            </w:r>
+                            <w:r>
+                              <w:fldChar w:fldCharType="separate"/>
+                            </w:r>
+                            <w:r>
+                              <w:rPr>
+                                <w:noProof/>
+                              </w:rPr>
+                              <w:t>3</w:t>
+                            </w:r>
+                            <w:r>
+                              <w:rPr>
+                                <w:noProof/>
+                              </w:rPr>
+                              <w:fldChar w:fldCharType="end"/>
+                            </w:r>
                             <w:r>
                               <w:t xml:space="preserve"> </w:t>
                             </w:r>
                             <w:r>
                               <w:t>Diagrama de flujo del sistema</w:t>
                             </w:r>
-                            <w:bookmarkEnd w:id="68"/>
-                            <w:bookmarkEnd w:id="69"/>
-                            <w:bookmarkEnd w:id="70"/>
+                            <w:bookmarkEnd w:id="83"/>
+                            <w:bookmarkEnd w:id="84"/>
+                            <w:bookmarkEnd w:id="85"/>
                           </w:p>
                         </w:txbxContent>
                       </wps:txbx>
@@ -8961,9 +8852,9 @@
                           <w:lang w:val="es-MX"/>
                         </w:rPr>
                       </w:pPr>
-                      <w:bookmarkStart w:id="74" w:name="_Toc236942821"/>
-                      <w:bookmarkStart w:id="75" w:name="_Toc236942483"/>
-                      <w:bookmarkStart w:id="76" w:name="_Toc237049807"/>
+                      <w:bookmarkStart w:id="86" w:name="_Toc236942821"/>
+                      <w:bookmarkStart w:id="87" w:name="_Toc237049807"/>
+                      <w:bookmarkStart w:id="88" w:name="_Toc236942483"/>
                       <w:r>
                         <w:t>Ilustración 2</w:t>
                       </w:r>
@@ -8997,8 +8888,8 @@
                       <w:r>
                         <w:t>Diagrama de flujo del sistema</w:t>
                       </w:r>
-                      <w:bookmarkEnd w:id="74"/>
-                      <w:bookmarkEnd w:id="76"/>
+                      <w:bookmarkEnd w:id="86"/>
+                      <w:bookmarkEnd w:id="87"/>
                     </w:p>
                     <w:p/>
                     <w:p>
@@ -9010,8 +8901,8 @@
                           <w:lang w:val="es-MX"/>
                         </w:rPr>
                       </w:pPr>
-                      <w:bookmarkStart w:id="77" w:name="_Toc236942822"/>
-                      <w:bookmarkStart w:id="78" w:name="_Toc237049808"/>
+                      <w:bookmarkStart w:id="89" w:name="_Toc236942822"/>
+                      <w:bookmarkStart w:id="90" w:name="_Toc237049808"/>
                       <w:r>
                         <w:t xml:space="preserve">Ilustración  </w:t>
                       </w:r>
@@ -9042,9 +8933,9 @@
                       <w:r>
                         <w:t>Diagrama de flujo del sistema</w:t>
                       </w:r>
-                      <w:bookmarkEnd w:id="75"/>
-                      <w:bookmarkEnd w:id="77"/>
-                      <w:bookmarkEnd w:id="78"/>
+                      <w:bookmarkEnd w:id="88"/>
+                      <w:bookmarkEnd w:id="89"/>
+                      <w:bookmarkEnd w:id="90"/>
                     </w:p>
                   </w:txbxContent>
                 </v:textbox>
@@ -10725,11 +10616,11 @@
       <w:r>
         <w:t xml:space="preserve">  </w:t>
       </w:r>
-      <w:bookmarkStart w:id="71" w:name="_Toc237052217"/>
+      <w:bookmarkStart w:id="91" w:name="_Toc237053330"/>
       <w:r>
         <w:t>Método</w:t>
       </w:r>
-      <w:bookmarkEnd w:id="71"/>
+      <w:bookmarkEnd w:id="91"/>
     </w:p>
     <w:p>
       <w:pPr>
@@ -10746,39 +10637,7 @@
           <w:rFonts w:ascii="Arial" w:eastAsiaTheme="minorHAnsi" w:hAnsi="Arial" w:cs="Arial"/>
           <w:lang w:val="es-419" w:eastAsia="es-GT"/>
         </w:rPr>
-        <w:t xml:space="preserve">Para el desarrollo del proyecto se utilizará la metodología Scrum, debido a que permite organizar el trabajo en ciclos cortos e incrementales, conocidos como </w:t>
-      </w:r>
-      <w:proofErr w:type="spellStart"/>
-      <w:r>
-        <w:rPr>
-          <w:rFonts w:ascii="Arial" w:eastAsiaTheme="minorHAnsi" w:hAnsi="Arial" w:cs="Arial"/>
-          <w:lang w:val="es-419" w:eastAsia="es-GT"/>
-        </w:rPr>
-        <w:t>sprints</w:t>
-      </w:r>
-      <w:proofErr w:type="spellEnd"/>
-      <w:r>
-        <w:rPr>
-          <w:rFonts w:ascii="Arial" w:eastAsiaTheme="minorHAnsi" w:hAnsi="Arial" w:cs="Arial"/>
-          <w:lang w:val="es-419" w:eastAsia="es-GT"/>
-        </w:rPr>
-        <w:t xml:space="preserve">. Según </w:t>
-      </w:r>
-      <w:proofErr w:type="spellStart"/>
-      <w:r>
-        <w:rPr>
-          <w:rFonts w:ascii="Arial" w:eastAsiaTheme="minorHAnsi" w:hAnsi="Arial" w:cs="Arial"/>
-          <w:lang w:val="es-419" w:eastAsia="es-GT"/>
-        </w:rPr>
-        <w:t>Schwaber</w:t>
-      </w:r>
-      <w:proofErr w:type="spellEnd"/>
-      <w:r>
-        <w:rPr>
-          <w:rFonts w:ascii="Arial" w:eastAsiaTheme="minorHAnsi" w:hAnsi="Arial" w:cs="Arial"/>
-          <w:lang w:val="es-419" w:eastAsia="es-GT"/>
-        </w:rPr>
-        <w:t xml:space="preserve"> y Sutherland (2020), autores de la Guía de Scrum, este es un marco de trabajo ligero que ayuda a las personas, equipos y organizaciones a generar valor mediante soluciones adaptables para problemas complejos, a través de dichos ciclos cortos e iterativos. Esta metodología resulta adecuada para proyectos de software en los que se requiere flexibilidad, revisión constante y adaptación a cambios durante el proceso de desarrollo. La elección de Scrum responde a la naturaleza del proyecto, ya que el desarrollo de una aplicación web para centros de salud requiere validaciones frecuentes, definición progresiva de funcionalidades y revisión constante de los módulos implementados. Esto favorece la reducción de errores, mejora la comunicación del equipo y permite entregar incrementos funcionales durante el desarrollo.</w:t>
+        <w:t>Para el desarrollo del proyecto se utilizará la metodología Scrum, debido a que permite organizar el trabajo en ciclos cortos e incrementales, conocidos como sprints. Según Schwaber y Sutherland (2020), autores de la Guía de Scrum, este es un marco de trabajo ligero que ayuda a las personas, equipos y organizaciones a generar valor mediante soluciones adaptables para problemas complejos, a través de dichos ciclos cortos e iterativos. Esta metodología resulta adecuada para proyectos de software en los que se requiere flexibilidad, revisión constante y adaptación a cambios durante el proceso de desarrollo. La elección de Scrum responde a la naturaleza del proyecto, ya que el desarrollo de una aplicación web para centros de salud requiere validaciones frecuentes, definición progresiva de funcionalidades y revisión constante de los módulos implementados. Esto favorece la reducción de errores, mejora la comunicación del equipo y permite entregar incrementos funcionales durante el desarrollo.</w:t>
       </w:r>
     </w:p>
     <w:p>
@@ -10796,55 +10655,7 @@
           <w:rFonts w:ascii="Arial" w:eastAsiaTheme="minorHAnsi" w:hAnsi="Arial" w:cs="Arial"/>
           <w:lang w:val="es-419" w:eastAsia="es-GT"/>
         </w:rPr>
-        <w:t xml:space="preserve">El rol de </w:t>
-      </w:r>
-      <w:proofErr w:type="spellStart"/>
-      <w:r>
-        <w:rPr>
-          <w:rFonts w:ascii="Arial" w:eastAsiaTheme="minorHAnsi" w:hAnsi="Arial" w:cs="Arial"/>
-          <w:lang w:val="es-419" w:eastAsia="es-GT"/>
-        </w:rPr>
-        <w:t>Product</w:t>
-      </w:r>
-      <w:proofErr w:type="spellEnd"/>
-      <w:r>
-        <w:rPr>
-          <w:rFonts w:ascii="Arial" w:eastAsiaTheme="minorHAnsi" w:hAnsi="Arial" w:cs="Arial"/>
-          <w:lang w:val="es-419" w:eastAsia="es-GT"/>
-        </w:rPr>
-        <w:t xml:space="preserve"> </w:t>
-      </w:r>
-      <w:proofErr w:type="spellStart"/>
-      <w:r>
-        <w:rPr>
-          <w:rFonts w:ascii="Arial" w:eastAsiaTheme="minorHAnsi" w:hAnsi="Arial" w:cs="Arial"/>
-          <w:lang w:val="es-419" w:eastAsia="es-GT"/>
-        </w:rPr>
-        <w:t>Owner</w:t>
-      </w:r>
-      <w:proofErr w:type="spellEnd"/>
-      <w:r>
-        <w:rPr>
-          <w:rFonts w:ascii="Arial" w:eastAsiaTheme="minorHAnsi" w:hAnsi="Arial" w:cs="Arial"/>
-          <w:lang w:val="es-419" w:eastAsia="es-GT"/>
-        </w:rPr>
-        <w:t xml:space="preserve"> será representado por el integrante encargado de priorizar los requerimientos del sistema, considerando las necesidades del centro de salud y los objetivos del proyecto. El Scrum Master será el responsable de coordinar el cumplimiento de la metodología, organizar las reuniones y apoyar al equipo en la eliminación de obstáculos. Los </w:t>
-      </w:r>
-      <w:proofErr w:type="spellStart"/>
-      <w:r>
-        <w:rPr>
-          <w:rFonts w:ascii="Arial" w:eastAsiaTheme="minorHAnsi" w:hAnsi="Arial" w:cs="Arial"/>
-          <w:lang w:val="es-419" w:eastAsia="es-GT"/>
-        </w:rPr>
-        <w:t>Developers</w:t>
-      </w:r>
-      <w:proofErr w:type="spellEnd"/>
-      <w:r>
-        <w:rPr>
-          <w:rFonts w:ascii="Arial" w:eastAsiaTheme="minorHAnsi" w:hAnsi="Arial" w:cs="Arial"/>
-          <w:lang w:val="es-419" w:eastAsia="es-GT"/>
-        </w:rPr>
-        <w:t xml:space="preserve"> serán los integrantes </w:t>
+        <w:t xml:space="preserve">El rol de Product Owner será representado por el integrante encargado de priorizar los requerimientos del sistema, considerando las necesidades del centro de salud y los objetivos del proyecto. El Scrum Master será el responsable de coordinar el cumplimiento de la metodología, organizar las reuniones y apoyar al equipo en la eliminación de obstáculos. Los Developers serán los integrantes </w:t>
       </w:r>
       <w:r>
         <w:rPr>
@@ -10870,39 +10681,7 @@
           <w:rFonts w:ascii="Arial" w:eastAsiaTheme="minorHAnsi" w:hAnsi="Arial" w:cs="Arial"/>
           <w:lang w:val="es-419" w:eastAsia="es-GT"/>
         </w:rPr>
-        <w:t xml:space="preserve">Las principales herramientas de Scrum que se utilizarán en el proyecto serán el </w:t>
-      </w:r>
-      <w:proofErr w:type="spellStart"/>
-      <w:r>
-        <w:rPr>
-          <w:rFonts w:ascii="Arial" w:eastAsiaTheme="minorHAnsi" w:hAnsi="Arial" w:cs="Arial"/>
-          <w:lang w:val="es-419" w:eastAsia="es-GT"/>
-        </w:rPr>
-        <w:t>Product</w:t>
-      </w:r>
-      <w:proofErr w:type="spellEnd"/>
-      <w:r>
-        <w:rPr>
-          <w:rFonts w:ascii="Arial" w:eastAsiaTheme="minorHAnsi" w:hAnsi="Arial" w:cs="Arial"/>
-          <w:lang w:val="es-419" w:eastAsia="es-GT"/>
-        </w:rPr>
-        <w:t xml:space="preserve"> Backlog, el Sprint Backlog y el Incremento. El </w:t>
-      </w:r>
-      <w:proofErr w:type="spellStart"/>
-      <w:r>
-        <w:rPr>
-          <w:rFonts w:ascii="Arial" w:eastAsiaTheme="minorHAnsi" w:hAnsi="Arial" w:cs="Arial"/>
-          <w:lang w:val="es-419" w:eastAsia="es-GT"/>
-        </w:rPr>
-        <w:t>Product</w:t>
-      </w:r>
-      <w:proofErr w:type="spellEnd"/>
-      <w:r>
-        <w:rPr>
-          <w:rFonts w:ascii="Arial" w:eastAsiaTheme="minorHAnsi" w:hAnsi="Arial" w:cs="Arial"/>
-          <w:lang w:val="es-419" w:eastAsia="es-GT"/>
-        </w:rPr>
-        <w:t xml:space="preserve"> Backlog contendrá la lista priorizada de funcionalidades del sistema, tales como autenticación de usuarios, registro de </w:t>
+        <w:t xml:space="preserve">Las principales herramientas de Scrum que se utilizarán en el proyecto serán el Product Backlog, el Sprint Backlog y el Incremento. El Product Backlog contendrá la lista priorizada de funcionalidades del sistema, tales como autenticación de usuarios, registro de </w:t>
       </w:r>
       <w:r>
         <w:rPr>
@@ -10976,39 +10755,7 @@
           <w:rFonts w:ascii="Arial" w:eastAsiaTheme="minorHAnsi" w:hAnsi="Arial" w:cs="Arial"/>
           <w:lang w:val="es-419" w:eastAsia="es-GT"/>
         </w:rPr>
-        <w:t xml:space="preserve">Esta metodología se desarrollará a lo largo de cuatro </w:t>
-      </w:r>
-      <w:proofErr w:type="spellStart"/>
-      <w:r>
-        <w:rPr>
-          <w:rFonts w:ascii="Arial" w:eastAsiaTheme="minorHAnsi" w:hAnsi="Arial" w:cs="Arial"/>
-          <w:lang w:val="es-419" w:eastAsia="es-GT"/>
-        </w:rPr>
-        <w:t>Sprints</w:t>
-      </w:r>
-      <w:proofErr w:type="spellEnd"/>
-      <w:r>
-        <w:rPr>
-          <w:rFonts w:ascii="Arial" w:eastAsiaTheme="minorHAnsi" w:hAnsi="Arial" w:cs="Arial"/>
-          <w:lang w:val="es-419" w:eastAsia="es-GT"/>
-        </w:rPr>
-        <w:t xml:space="preserve"> adaptadas al contexto del proyecto, manteniendo relación directa con los objetivos específicos establecidos en el capítulo uno, verificando que se cumpla cada uno de ellos. Estos </w:t>
-      </w:r>
-      <w:proofErr w:type="spellStart"/>
-      <w:r>
-        <w:rPr>
-          <w:rFonts w:ascii="Arial" w:eastAsiaTheme="minorHAnsi" w:hAnsi="Arial" w:cs="Arial"/>
-          <w:lang w:val="es-419" w:eastAsia="es-GT"/>
-        </w:rPr>
-        <w:t>Sprints</w:t>
-      </w:r>
-      <w:proofErr w:type="spellEnd"/>
-      <w:r>
-        <w:rPr>
-          <w:rFonts w:ascii="Arial" w:eastAsiaTheme="minorHAnsi" w:hAnsi="Arial" w:cs="Arial"/>
-          <w:lang w:val="es-419" w:eastAsia="es-GT"/>
-        </w:rPr>
-        <w:t xml:space="preserve"> permitirán organizar el desarrollo de la aplicación web desde el levantamiento de requerimientos hasta la validación del sistema con usuarios.</w:t>
+        <w:t>Esta metodología se desarrollará a lo largo de cuatro Sprints adaptadas al contexto del proyecto, manteniendo relación directa con los objetivos específicos establecidos en el capítulo uno, verificando que se cumpla cada uno de ellos. Estos Sprints permitirán organizar el desarrollo de la aplicación web desde el levantamiento de requerimientos hasta la validación del sistema con usuarios.</w:t>
       </w:r>
     </w:p>
     <w:p>
@@ -11066,30 +10813,38 @@
                                 <w:noProof/>
                               </w:rPr>
                             </w:pPr>
-                            <w:bookmarkStart w:id="72" w:name="_Toc236943127"/>
-                            <w:proofErr w:type="spellStart"/>
+                            <w:bookmarkStart w:id="92" w:name="_Toc236943127"/>
                             <w:r>
-                              <w:t>Imágen</w:t>
-                            </w:r>
-                            <w:proofErr w:type="spellEnd"/>
-                            <w:r>
-                              <w:t xml:space="preserve"> </w:t>
+                              <w:t xml:space="preserve">Imágen </w:t>
                             </w:r>
                             <w:r>
                               <w:t>2.</w:t>
                             </w:r>
-                            <w:fldSimple w:instr=" SEQ Imágen \* ARABIC ">
-                              <w:r>
-                                <w:rPr>
-                                  <w:noProof/>
-                                </w:rPr>
-                                <w:t>1</w:t>
-                              </w:r>
-                            </w:fldSimple>
+                            <w:r>
+                              <w:fldChar w:fldCharType="begin"/>
+                            </w:r>
+                            <w:r>
+                              <w:instrText xml:space="preserve"> SEQ Imágen \* ARABIC </w:instrText>
+                            </w:r>
+                            <w:r>
+                              <w:fldChar w:fldCharType="separate"/>
+                            </w:r>
+                            <w:r>
+                              <w:rPr>
+                                <w:noProof/>
+                              </w:rPr>
+                              <w:t>1</w:t>
+                            </w:r>
+                            <w:r>
+                              <w:rPr>
+                                <w:noProof/>
+                              </w:rPr>
+                              <w:fldChar w:fldCharType="end"/>
+                            </w:r>
                             <w:r>
                               <w:t xml:space="preserve"> Metodología Scrum</w:t>
                             </w:r>
-                            <w:bookmarkEnd w:id="72"/>
+                            <w:bookmarkEnd w:id="92"/>
                           </w:p>
                           <w:p/>
                           <w:p>
@@ -11100,27 +10855,35 @@
                                 <w:noProof/>
                               </w:rPr>
                             </w:pPr>
-                            <w:bookmarkStart w:id="73" w:name="_Toc236943128"/>
-                            <w:proofErr w:type="spellStart"/>
+                            <w:bookmarkStart w:id="93" w:name="_Toc236943128"/>
                             <w:r>
-                              <w:t>Imágen</w:t>
+                              <w:t xml:space="preserve">Imágen </w:t>
                             </w:r>
-                            <w:proofErr w:type="spellEnd"/>
                             <w:r>
-                              <w:t xml:space="preserve"> </w:t>
+                              <w:fldChar w:fldCharType="begin"/>
                             </w:r>
-                            <w:fldSimple w:instr=" SEQ Imágen \* ARABIC ">
-                              <w:r>
-                                <w:rPr>
-                                  <w:noProof/>
-                                </w:rPr>
-                                <w:t>1</w:t>
-                              </w:r>
-                            </w:fldSimple>
+                            <w:r>
+                              <w:instrText xml:space="preserve"> SEQ Imágen \* ARABIC </w:instrText>
+                            </w:r>
+                            <w:r>
+                              <w:fldChar w:fldCharType="separate"/>
+                            </w:r>
+                            <w:r>
+                              <w:rPr>
+                                <w:noProof/>
+                              </w:rPr>
+                              <w:t>1</w:t>
+                            </w:r>
+                            <w:r>
+                              <w:rPr>
+                                <w:noProof/>
+                              </w:rPr>
+                              <w:fldChar w:fldCharType="end"/>
+                            </w:r>
                             <w:r>
                               <w:t xml:space="preserve"> Metodología Scrum</w:t>
                             </w:r>
-                            <w:bookmarkEnd w:id="73"/>
+                            <w:bookmarkEnd w:id="93"/>
                           </w:p>
                         </w:txbxContent>
                       </wps:txbx>
@@ -11155,14 +10918,9 @@
                           <w:noProof/>
                         </w:rPr>
                       </w:pPr>
-                      <w:bookmarkStart w:id="82" w:name="_Toc236943127"/>
-                      <w:proofErr w:type="spellStart"/>
+                      <w:bookmarkStart w:id="94" w:name="_Toc236943127"/>
                       <w:r>
-                        <w:t>Imágen</w:t>
-                      </w:r>
-                      <w:proofErr w:type="spellEnd"/>
-                      <w:r>
-                        <w:t xml:space="preserve"> </w:t>
+                        <w:t xml:space="preserve">Imágen </w:t>
                       </w:r>
                       <w:r>
                         <w:t>2.</w:t>
@@ -11191,7 +10949,7 @@
                       <w:r>
                         <w:t xml:space="preserve"> Metodología Scrum</w:t>
                       </w:r>
-                      <w:bookmarkEnd w:id="82"/>
+                      <w:bookmarkEnd w:id="94"/>
                     </w:p>
                     <w:p/>
                     <w:p>
@@ -11202,14 +10960,9 @@
                           <w:noProof/>
                         </w:rPr>
                       </w:pPr>
-                      <w:bookmarkStart w:id="83" w:name="_Toc236943128"/>
-                      <w:proofErr w:type="spellStart"/>
+                      <w:bookmarkStart w:id="95" w:name="_Toc236943128"/>
                       <w:r>
-                        <w:t>Imágen</w:t>
-                      </w:r>
-                      <w:proofErr w:type="spellEnd"/>
-                      <w:r>
-                        <w:t xml:space="preserve"> </w:t>
+                        <w:t xml:space="preserve">Imágen </w:t>
                       </w:r>
                       <w:r>
                         <w:fldChar w:fldCharType="begin"/>
@@ -11235,7 +10988,7 @@
                       <w:r>
                         <w:t xml:space="preserve"> Metodología Scrum</w:t>
                       </w:r>
-                      <w:bookmarkEnd w:id="83"/>
+                      <w:bookmarkEnd w:id="95"/>
                     </w:p>
                   </w:txbxContent>
                 </v:textbox>
@@ -11337,20 +11090,12 @@
         </w:numPr>
         <w:spacing w:after="0" w:line="276" w:lineRule="auto"/>
       </w:pPr>
-      <w:bookmarkStart w:id="74" w:name="_Toc237052218"/>
+      <w:bookmarkStart w:id="96" w:name="_Toc237053331"/>
       <w:r>
         <w:lastRenderedPageBreak/>
-        <w:t xml:space="preserve">Sprint 1: levantamiento de requerimientos y definición del </w:t>
-      </w:r>
-      <w:proofErr w:type="spellStart"/>
-      <w:r>
-        <w:t>Product</w:t>
-      </w:r>
-      <w:proofErr w:type="spellEnd"/>
-      <w:r>
-        <w:t xml:space="preserve"> Backlog</w:t>
-      </w:r>
-      <w:bookmarkEnd w:id="74"/>
+        <w:t>Sprint 1: levantamiento de requerimientos y definición del Product Backlog</w:t>
+      </w:r>
+      <w:bookmarkEnd w:id="96"/>
     </w:p>
     <w:p>
       <w:pPr>
@@ -11517,11 +11262,11 @@
         </w:numPr>
         <w:spacing w:after="0" w:line="276" w:lineRule="auto"/>
       </w:pPr>
-      <w:bookmarkStart w:id="75" w:name="_Toc237052219"/>
+      <w:bookmarkStart w:id="97" w:name="_Toc237053332"/>
       <w:r>
         <w:t>Sprint 2: diseño funcional y diseño de la estructura del sistema</w:t>
       </w:r>
-      <w:bookmarkEnd w:id="75"/>
+      <w:bookmarkEnd w:id="97"/>
     </w:p>
     <w:p>
       <w:pPr>
@@ -11619,11 +11364,11 @@
         </w:numPr>
         <w:spacing w:after="0" w:line="276" w:lineRule="auto"/>
       </w:pPr>
-      <w:bookmarkStart w:id="76" w:name="_Toc237052220"/>
+      <w:bookmarkStart w:id="98" w:name="_Toc237053333"/>
       <w:r>
         <w:t>Sprint 3: desarrollo del sistema</w:t>
       </w:r>
-      <w:bookmarkEnd w:id="76"/>
+      <w:bookmarkEnd w:id="98"/>
     </w:p>
     <w:p>
       <w:pPr>
@@ -11783,25 +11528,7 @@
           <w:sz w:val="24"/>
           <w:szCs w:val="24"/>
         </w:rPr>
-        <w:t xml:space="preserve">Herramientas a utilizar: entorno de desarrollo integrado para escribir y organizar el código del sistema, lenguaje de programación web para crear las funciones principales de la aplicación, </w:t>
-      </w:r>
-      <w:proofErr w:type="spellStart"/>
-      <w:r>
-        <w:rPr>
-          <w:rFonts w:ascii="Arial" w:hAnsi="Arial" w:cs="Arial"/>
-          <w:sz w:val="24"/>
-          <w:szCs w:val="24"/>
-        </w:rPr>
-        <w:t>framework</w:t>
-      </w:r>
-      <w:proofErr w:type="spellEnd"/>
-      <w:r>
-        <w:rPr>
-          <w:rFonts w:ascii="Arial" w:hAnsi="Arial" w:cs="Arial"/>
-          <w:sz w:val="24"/>
-          <w:szCs w:val="24"/>
-        </w:rPr>
-        <w:t xml:space="preserve"> de desarrollo para facilitar la estructura del proyecto, gestor de base de datos para almacenar la información de usuarios, vacunas, centros de salud, tipos de vacuna y población objetivo, sistema de control de versiones para guardar los cambios realizados y llevar un mejor control del avance durante el desarrollo, y pruebas funcionales para verificar que el ingreso de datos, la asociación con centros de salud, </w:t>
+        <w:t xml:space="preserve">Herramientas a utilizar: entorno de desarrollo integrado para escribir y organizar el código del sistema, lenguaje de programación web para crear las funciones principales de la aplicación, framework de desarrollo para facilitar la estructura del proyecto, gestor de base de datos para almacenar la información de usuarios, vacunas, centros de salud, tipos de vacuna y población objetivo, sistema de control de versiones para guardar los cambios realizados y llevar un mejor control del avance durante el desarrollo, y pruebas funcionales para verificar que el ingreso de datos, la asociación con centros de salud, </w:t>
       </w:r>
       <w:r>
         <w:rPr>
@@ -11829,11 +11556,11 @@
         </w:numPr>
         <w:spacing w:after="0" w:line="276" w:lineRule="auto"/>
       </w:pPr>
-      <w:bookmarkStart w:id="77" w:name="_Toc237052221"/>
+      <w:bookmarkStart w:id="99" w:name="_Toc237053334"/>
       <w:r>
         <w:t>Sprint 4: elaboración de manuales, pruebas, validación y ajustes finales</w:t>
       </w:r>
-      <w:bookmarkEnd w:id="77"/>
+      <w:bookmarkEnd w:id="99"/>
     </w:p>
     <w:p>
       <w:pPr>
@@ -11959,11 +11686,11 @@
         <w:lastRenderedPageBreak/>
         <w:t xml:space="preserve"> </w:t>
       </w:r>
-      <w:bookmarkStart w:id="78" w:name="_Toc237052222"/>
+      <w:bookmarkStart w:id="100" w:name="_Toc237053335"/>
       <w:r>
         <w:t>Análisis de viabilidad</w:t>
       </w:r>
-      <w:bookmarkEnd w:id="78"/>
+      <w:bookmarkEnd w:id="100"/>
     </w:p>
     <w:p>
       <w:pPr>
@@ -12034,11 +11761,11 @@
         </w:numPr>
         <w:spacing w:after="0" w:line="276" w:lineRule="auto"/>
       </w:pPr>
-      <w:bookmarkStart w:id="79" w:name="_Toc237052223"/>
+      <w:bookmarkStart w:id="101" w:name="_Toc237053336"/>
       <w:r>
         <w:t>Factibilidad técnica</w:t>
       </w:r>
-      <w:bookmarkEnd w:id="79"/>
+      <w:bookmarkEnd w:id="101"/>
     </w:p>
     <w:p>
       <w:pPr>
@@ -12245,11 +11972,11 @@
         </w:numPr>
         <w:spacing w:after="0" w:line="276" w:lineRule="auto"/>
       </w:pPr>
-      <w:bookmarkStart w:id="80" w:name="_Toc237052224"/>
+      <w:bookmarkStart w:id="102" w:name="_Toc237053337"/>
       <w:r>
         <w:t>Factibilidad operativa</w:t>
       </w:r>
-      <w:bookmarkEnd w:id="80"/>
+      <w:bookmarkEnd w:id="102"/>
     </w:p>
     <w:p>
       <w:pPr>
@@ -12549,11 +12276,11 @@
         </w:numPr>
         <w:spacing w:after="0" w:line="276" w:lineRule="auto"/>
       </w:pPr>
-      <w:bookmarkStart w:id="81" w:name="_Toc237052225"/>
+      <w:bookmarkStart w:id="103" w:name="_Toc237053338"/>
       <w:r>
         <w:t>Factibilidad económica</w:t>
       </w:r>
-      <w:bookmarkEnd w:id="81"/>
+      <w:bookmarkEnd w:id="103"/>
     </w:p>
     <w:p>
       <w:pPr>
@@ -12717,11 +12444,11 @@
         </w:numPr>
         <w:spacing w:after="0" w:line="276" w:lineRule="auto"/>
       </w:pPr>
-      <w:bookmarkStart w:id="82" w:name="_Toc237052226"/>
+      <w:bookmarkStart w:id="104" w:name="_Toc237053339"/>
       <w:r>
         <w:t>Factibilidad legal</w:t>
       </w:r>
-      <w:bookmarkEnd w:id="82"/>
+      <w:bookmarkEnd w:id="104"/>
     </w:p>
     <w:p>
       <w:pPr>
@@ -12980,16 +12707,17 @@
       <w:pPr>
         <w:pStyle w:val="Ttulo3"/>
         <w:numPr>
-          <w:ilvl w:val="0"/>
-          <w:numId w:val="17"/>
+          <w:ilvl w:val="2"/>
+          <w:numId w:val="43"/>
         </w:numPr>
         <w:spacing w:after="0" w:line="276" w:lineRule="auto"/>
-      </w:pPr>
-      <w:bookmarkStart w:id="83" w:name="_Toc237052227"/>
+        <w:ind w:left="505" w:hanging="505"/>
+      </w:pPr>
+      <w:bookmarkStart w:id="105" w:name="_Toc237053340"/>
       <w:r>
         <w:t>Aspecto ético</w:t>
       </w:r>
-      <w:bookmarkEnd w:id="83"/>
+      <w:bookmarkEnd w:id="105"/>
     </w:p>
     <w:p>
       <w:pPr>
@@ -13155,12 +12883,12 @@
           <w:numId w:val="18"/>
         </w:numPr>
       </w:pPr>
-      <w:bookmarkStart w:id="84" w:name="_Toc237052228"/>
+      <w:bookmarkStart w:id="106" w:name="_Toc237053341"/>
       <w:r>
         <w:lastRenderedPageBreak/>
         <w:t>Estimación de costos</w:t>
       </w:r>
-      <w:bookmarkEnd w:id="84"/>
+      <w:bookmarkEnd w:id="106"/>
     </w:p>
     <w:p>
       <w:pPr>
@@ -13277,29 +13005,42 @@
         <w:spacing w:line="276" w:lineRule="auto"/>
         <w:jc w:val="center"/>
       </w:pPr>
-      <w:bookmarkStart w:id="85" w:name="_Toc236943086"/>
-      <w:bookmarkStart w:id="86" w:name="_Toc237049718"/>
+      <w:bookmarkStart w:id="107" w:name="_Toc236943086"/>
+      <w:bookmarkStart w:id="108" w:name="_Toc237049718"/>
       <w:r>
         <w:t xml:space="preserve">Tabla </w:t>
       </w:r>
       <w:r>
         <w:t>2.</w:t>
       </w:r>
-      <w:fldSimple w:instr=" SEQ Tabla \* ARABIC ">
-        <w:r>
-          <w:rPr>
-            <w:noProof/>
-          </w:rPr>
-          <w:t>1</w:t>
-        </w:r>
-      </w:fldSimple>
+      <w:r>
+        <w:fldChar w:fldCharType="begin"/>
+      </w:r>
+      <w:r>
+        <w:instrText xml:space="preserve"> SEQ Tabla \* ARABIC </w:instrText>
+      </w:r>
+      <w:r>
+        <w:fldChar w:fldCharType="separate"/>
+      </w:r>
+      <w:r>
+        <w:rPr>
+          <w:noProof/>
+        </w:rPr>
+        <w:t>1</w:t>
+      </w:r>
+      <w:r>
+        <w:rPr>
+          <w:noProof/>
+        </w:rPr>
+        <w:fldChar w:fldCharType="end"/>
+      </w:r>
       <w:r>
         <w:t xml:space="preserve"> Presupuesto del proyecto</w:t>
       </w:r>
       <w:bookmarkEnd w:id="2"/>
       <w:bookmarkEnd w:id="3"/>
-      <w:bookmarkEnd w:id="85"/>
-      <w:bookmarkEnd w:id="86"/>
+      <w:bookmarkEnd w:id="107"/>
+      <w:bookmarkEnd w:id="108"/>
     </w:p>
     <w:p>
       <w:pPr>
@@ -13378,11 +13119,11 @@
         <w:lastRenderedPageBreak/>
         <w:t xml:space="preserve"> </w:t>
       </w:r>
-      <w:bookmarkStart w:id="87" w:name="_Toc237052229"/>
+      <w:bookmarkStart w:id="109" w:name="_Toc237053342"/>
       <w:r>
         <w:t>Cronograma de actividades</w:t>
       </w:r>
-      <w:bookmarkEnd w:id="87"/>
+      <w:bookmarkEnd w:id="109"/>
     </w:p>
     <w:p>
       <w:pPr>
@@ -13443,22 +13184,35 @@
                               <w:spacing w:line="276" w:lineRule="auto"/>
                               <w:jc w:val="center"/>
                             </w:pPr>
-                            <w:bookmarkStart w:id="88" w:name="_Toc236942823"/>
+                            <w:bookmarkStart w:id="110" w:name="_Toc236942823"/>
                             <w:r>
                               <w:t>Ilustración 2.</w:t>
                             </w:r>
-                            <w:fldSimple w:instr=" SEQ Ilustración_ \* ARABIC ">
-                              <w:r>
-                                <w:rPr>
-                                  <w:noProof/>
-                                </w:rPr>
-                                <w:t>4</w:t>
-                              </w:r>
-                            </w:fldSimple>
+                            <w:r>
+                              <w:fldChar w:fldCharType="begin"/>
+                            </w:r>
+                            <w:r>
+                              <w:instrText xml:space="preserve"> SEQ Ilustración_ \* ARABIC </w:instrText>
+                            </w:r>
+                            <w:r>
+                              <w:fldChar w:fldCharType="separate"/>
+                            </w:r>
+                            <w:r>
+                              <w:rPr>
+                                <w:noProof/>
+                              </w:rPr>
+                              <w:t>4</w:t>
+                            </w:r>
+                            <w:r>
+                              <w:rPr>
+                                <w:noProof/>
+                              </w:rPr>
+                              <w:fldChar w:fldCharType="end"/>
+                            </w:r>
                             <w:r>
                               <w:t xml:space="preserve">  Diagrama de Gantt del proyecto</w:t>
                             </w:r>
-                            <w:bookmarkEnd w:id="88"/>
+                            <w:bookmarkEnd w:id="110"/>
                           </w:p>
                           <w:p>
                             <w:pPr>
@@ -13498,7 +13252,7 @@
                         <w:spacing w:line="276" w:lineRule="auto"/>
                         <w:jc w:val="center"/>
                       </w:pPr>
-                      <w:bookmarkStart w:id="99" w:name="_Toc236942823"/>
+                      <w:bookmarkStart w:id="111" w:name="_Toc236942823"/>
                       <w:r>
                         <w:t>Ilustración 2.</w:t>
                       </w:r>
@@ -13526,7 +13280,7 @@
                       <w:r>
                         <w:t xml:space="preserve">  Diagrama de Gantt del proyecto</w:t>
                       </w:r>
-                      <w:bookmarkEnd w:id="99"/>
+                      <w:bookmarkEnd w:id="111"/>
                     </w:p>
                     <w:p>
                       <w:pPr>
@@ -13551,25 +13305,7 @@
           <w:sz w:val="24"/>
           <w:szCs w:val="24"/>
         </w:rPr>
-        <w:t xml:space="preserve">El desarrollo del proyecto se llevará a cabo en un periodo de cuatro meses (dieciséis semanas), distribuido en las fases descritas en el apartado de método: levantamiento de requerimientos, diseño del sistema, los cuatro </w:t>
-      </w:r>
-      <w:proofErr w:type="spellStart"/>
-      <w:r>
-        <w:rPr>
-          <w:rFonts w:ascii="Arial" w:hAnsi="Arial" w:cs="Arial"/>
-          <w:sz w:val="24"/>
-          <w:szCs w:val="24"/>
-        </w:rPr>
-        <w:t>Sprints</w:t>
-      </w:r>
-      <w:proofErr w:type="spellEnd"/>
-      <w:r>
-        <w:rPr>
-          <w:rFonts w:ascii="Arial" w:hAnsi="Arial" w:cs="Arial"/>
-          <w:sz w:val="24"/>
-          <w:szCs w:val="24"/>
-        </w:rPr>
-        <w:t xml:space="preserve"> de desarrollo, pruebas con usuarios, capacitación y documentación, y entrega final. A continuación, se presenta el cronograma de actividades mediante un diagrama de Gantt.</w:t>
+        <w:t>El desarrollo del proyecto se llevará a cabo en un periodo de cuatro meses (dieciséis semanas), distribuido en las fases descritas en el apartado de método: levantamiento de requerimientos, diseño del sistema, los cuatro Sprints de desarrollo, pruebas con usuarios, capacitación y documentación, y entrega final. A continuación, se presenta el cronograma de actividades mediante un diagrama de Gantt.</w:t>
       </w:r>
     </w:p>
     <w:p>
@@ -13744,7 +13480,7 @@
         <w:pStyle w:val="Ttulo1"/>
         <w:ind w:firstLineChars="0" w:firstLine="0"/>
       </w:pPr>
-      <w:bookmarkStart w:id="89" w:name="_Toc237052230"/>
+      <w:bookmarkStart w:id="112" w:name="_Toc237053343"/>
       <w:r>
         <w:lastRenderedPageBreak/>
         <w:t>BIBLIOGR</w:t>
@@ -13752,7 +13488,7 @@
       <w:r>
         <w:t>AFÍA</w:t>
       </w:r>
-      <w:bookmarkEnd w:id="89"/>
+      <w:bookmarkEnd w:id="112"/>
     </w:p>
     <w:p>
       <w:pPr>
@@ -13978,27 +13714,7 @@
           <w:szCs w:val="24"/>
           <w:lang w:val="es-419" w:eastAsia="es-GT"/>
         </w:rPr>
-        <w:t xml:space="preserve">Organización Panamericana de la Salud [OPS/OMS]. (2024). *Ministerio de Salud automatiza Programa Ampliado de Inmunizaciones (SIPAI, </w:t>
-      </w:r>
-      <w:proofErr w:type="gramStart"/>
-      <w:r>
-        <w:rPr>
-          <w:rFonts w:ascii="Arial" w:hAnsi="Arial" w:cs="Arial"/>
-          <w:sz w:val="24"/>
-          <w:szCs w:val="24"/>
-          <w:lang w:val="es-419" w:eastAsia="es-GT"/>
-        </w:rPr>
-        <w:t>Nicaragua)*</w:t>
-      </w:r>
-      <w:proofErr w:type="gramEnd"/>
-      <w:r>
-        <w:rPr>
-          <w:rFonts w:ascii="Arial" w:hAnsi="Arial" w:cs="Arial"/>
-          <w:sz w:val="24"/>
-          <w:szCs w:val="24"/>
-          <w:lang w:val="es-419" w:eastAsia="es-GT"/>
-        </w:rPr>
-        <w:t>. https://www.paho.org/en/node/96676</w:t>
+        <w:t>Organización Panamericana de la Salud [OPS/OMS]. (2024). *Ministerio de Salud automatiza Programa Ampliado de Inmunizaciones (SIPAI, Nicaragua)*. https://www.paho.org/en/node/96676</w:t>
       </w:r>
     </w:p>
     <w:p>
@@ -14013,25 +13729,14 @@
           <w:lang w:val="es-419" w:eastAsia="es-GT"/>
         </w:rPr>
       </w:pPr>
-      <w:proofErr w:type="spellStart"/>
-      <w:r>
-        <w:rPr>
-          <w:rFonts w:ascii="Arial" w:hAnsi="Arial" w:cs="Arial"/>
-          <w:sz w:val="24"/>
-          <w:szCs w:val="24"/>
-          <w:lang w:val="es-419" w:eastAsia="es-GT"/>
-        </w:rPr>
-        <w:t>Schwaber</w:t>
-      </w:r>
-      <w:proofErr w:type="spellEnd"/>
-      <w:r>
-        <w:rPr>
-          <w:rFonts w:ascii="Arial" w:hAnsi="Arial" w:cs="Arial"/>
-          <w:sz w:val="24"/>
-          <w:szCs w:val="24"/>
-          <w:lang w:val="es-419" w:eastAsia="es-GT"/>
-        </w:rPr>
-        <w:t>, K. y Sutherland, J. (2020). *La Guía de Scrum*. https://scrumguides.org/</w:t>
+      <w:r>
+        <w:rPr>
+          <w:rFonts w:ascii="Arial" w:hAnsi="Arial" w:cs="Arial"/>
+          <w:sz w:val="24"/>
+          <w:szCs w:val="24"/>
+          <w:lang w:val="es-419" w:eastAsia="es-GT"/>
+        </w:rPr>
+        <w:t>Schwaber, K. y Sutherland, J. (2020). *La Guía de Scrum*. https://scrumguides.org/</w:t>
       </w:r>
     </w:p>
     <w:p>
@@ -14089,27 +13794,7 @@
           <w:szCs w:val="24"/>
           <w:lang w:val="es-419" w:eastAsia="es-GT"/>
         </w:rPr>
-        <w:t xml:space="preserve">Tucto Pinedo, D. K. (2019). *Sistema de vigilancia y control y su influencia en el proceso de la toma de decisiones para el tratamiento del vector Aedes </w:t>
-      </w:r>
-      <w:proofErr w:type="spellStart"/>
-      <w:r>
-        <w:rPr>
-          <w:rFonts w:ascii="Arial" w:hAnsi="Arial" w:cs="Arial"/>
-          <w:sz w:val="24"/>
-          <w:szCs w:val="24"/>
-          <w:lang w:val="es-419" w:eastAsia="es-GT"/>
-        </w:rPr>
-        <w:t>aegypti</w:t>
-      </w:r>
-      <w:proofErr w:type="spellEnd"/>
-      <w:r>
-        <w:rPr>
-          <w:rFonts w:ascii="Arial" w:hAnsi="Arial" w:cs="Arial"/>
-          <w:sz w:val="24"/>
-          <w:szCs w:val="24"/>
-          <w:lang w:val="es-419" w:eastAsia="es-GT"/>
-        </w:rPr>
-        <w:t xml:space="preserve"> en la Dirección Regional de Salud de San Martín* [Tesis, Universidad Nacional de San Martín – Tarapoto]. https://repositorio.unsm.edu.pe/item/2b7758da-de0a-482f-a86c-c7faa9a9eb39</w:t>
+        <w:t>Tucto Pinedo, D. K. (2019). *Sistema de vigilancia y control y su influencia en el proceso de la toma de decisiones para el tratamiento del vector Aedes aegypti en la Dirección Regional de Salud de San Martín* [Tesis, Universidad Nacional de San Martín – Tarapoto]. https://repositorio.unsm.edu.pe/item/2b7758da-de0a-482f-a86c-c7faa9a9eb39</w:t>
       </w:r>
     </w:p>
     <w:sectPr>
@@ -14361,15 +14046,48 @@
         <w:bottom w:val="single" w:sz="4" w:space="1" w:color="auto"/>
       </w:pBdr>
       <w:jc w:val="right"/>
+      <w:rPr>
+        <w:i/>
+        <w:iCs/>
+      </w:rPr>
     </w:pPr>
-    <w:fldSimple w:instr=" STYLEREF  &quot;Título 2&quot;  \* MERGEFORMAT ">
-      <w:r>
-        <w:rPr>
-          <w:noProof/>
-        </w:rPr>
-        <w:t>Objetivos</w:t>
-      </w:r>
-    </w:fldSimple>
+    <w:r>
+      <w:rPr>
+        <w:i/>
+        <w:iCs/>
+      </w:rPr>
+      <w:fldChar w:fldCharType="begin"/>
+    </w:r>
+    <w:r>
+      <w:rPr>
+        <w:i/>
+        <w:iCs/>
+      </w:rPr>
+      <w:instrText xml:space="preserve"> STYLEREF  "Título 2"  \* MERGEFORMAT </w:instrText>
+    </w:r>
+    <w:r>
+      <w:rPr>
+        <w:i/>
+        <w:iCs/>
+      </w:rPr>
+      <w:fldChar w:fldCharType="separate"/>
+    </w:r>
+    <w:r>
+      <w:rPr>
+        <w:i/>
+        <w:iCs/>
+        <w:noProof/>
+      </w:rPr>
+      <w:t>Objetivos</w:t>
+    </w:r>
+    <w:r>
+      <w:rPr>
+        <w:i/>
+        <w:iCs/>
+        <w:noProof/>
+      </w:rPr>
+      <w:fldChar w:fldCharType="end"/>
+    </w:r>
   </w:p>
 </w:hdr>
 </file>
@@ -14382,8 +14100,16 @@
       <w:pBdr>
         <w:bottom w:val="single" w:sz="4" w:space="1" w:color="auto"/>
       </w:pBdr>
+      <w:rPr>
+        <w:i/>
+        <w:iCs/>
+      </w:rPr>
     </w:pPr>
     <w:r>
+      <w:rPr>
+        <w:i/>
+        <w:iCs/>
+      </w:rPr>
       <w:t>Capítulo 1: Marco Contextual y Conceptual</w:t>
     </w:r>
   </w:p>
@@ -14410,15 +14136,48 @@
         <w:bottom w:val="single" w:sz="4" w:space="1" w:color="auto"/>
       </w:pBdr>
       <w:jc w:val="right"/>
+      <w:rPr>
+        <w:i/>
+        <w:iCs/>
+      </w:rPr>
     </w:pPr>
-    <w:fldSimple w:instr=" STYLEREF  &quot;Título 2&quot;  \* MERGEFORMAT ">
-      <w:r>
-        <w:rPr>
-          <w:noProof/>
-        </w:rPr>
-        <w:t>Diseño</w:t>
-      </w:r>
-    </w:fldSimple>
+    <w:r>
+      <w:rPr>
+        <w:i/>
+        <w:iCs/>
+      </w:rPr>
+      <w:fldChar w:fldCharType="begin"/>
+    </w:r>
+    <w:r>
+      <w:rPr>
+        <w:i/>
+        <w:iCs/>
+      </w:rPr>
+      <w:instrText xml:space="preserve"> STYLEREF  "Título 2"  \* MERGEFORMAT </w:instrText>
+    </w:r>
+    <w:r>
+      <w:rPr>
+        <w:i/>
+        <w:iCs/>
+      </w:rPr>
+      <w:fldChar w:fldCharType="separate"/>
+    </w:r>
+    <w:r>
+      <w:rPr>
+        <w:i/>
+        <w:iCs/>
+        <w:noProof/>
+      </w:rPr>
+      <w:t>Análisis de viabilidad</w:t>
+    </w:r>
+    <w:r>
+      <w:rPr>
+        <w:i/>
+        <w:iCs/>
+        <w:noProof/>
+      </w:rPr>
+      <w:fldChar w:fldCharType="end"/>
+    </w:r>
   </w:p>
 </w:hdr>
 </file>
@@ -14431,8 +14190,16 @@
       <w:pBdr>
         <w:bottom w:val="single" w:sz="4" w:space="1" w:color="auto"/>
       </w:pBdr>
+      <w:rPr>
+        <w:i/>
+        <w:iCs/>
+      </w:rPr>
     </w:pPr>
     <w:r>
+      <w:rPr>
+        <w:i/>
+        <w:iCs/>
+      </w:rPr>
       <w:t>Capítulo 2: Diseño y Método</w:t>
     </w:r>
   </w:p>
@@ -14828,6 +14595,119 @@
     </w:lvl>
   </w:abstractNum>
   <w:abstractNum w:abstractNumId="3" w15:restartNumberingAfterBreak="0">
+    <w:nsid w:val="048461F7"/>
+    <w:multiLevelType w:val="multilevel"/>
+    <w:tmpl w:val="F6ACED6C"/>
+    <w:lvl w:ilvl="0">
+      <w:start w:val="1"/>
+      <w:numFmt w:val="none"/>
+      <w:lvlText w:val="2.3.4"/>
+      <w:lvlJc w:val="left"/>
+      <w:pPr>
+        <w:ind w:left="360" w:hanging="360"/>
+      </w:pPr>
+      <w:rPr>
+        <w:rFonts w:hint="default"/>
+      </w:rPr>
+    </w:lvl>
+    <w:lvl w:ilvl="1">
+      <w:start w:val="1"/>
+      <w:numFmt w:val="decimal"/>
+      <w:lvlText w:val="%1.%2."/>
+      <w:lvlJc w:val="left"/>
+      <w:pPr>
+        <w:ind w:left="792" w:hanging="432"/>
+      </w:pPr>
+      <w:rPr>
+        <w:rFonts w:hint="default"/>
+      </w:rPr>
+    </w:lvl>
+    <w:lvl w:ilvl="2">
+      <w:start w:val="1"/>
+      <w:numFmt w:val="decimal"/>
+      <w:lvlText w:val="%12.3.5"/>
+      <w:lvlJc w:val="left"/>
+      <w:pPr>
+        <w:ind w:left="1224" w:hanging="504"/>
+      </w:pPr>
+      <w:rPr>
+        <w:rFonts w:hint="default"/>
+      </w:rPr>
+    </w:lvl>
+    <w:lvl w:ilvl="3">
+      <w:start w:val="1"/>
+      <w:numFmt w:val="decimal"/>
+      <w:lvlText w:val="%1.%2.%3.%4."/>
+      <w:lvlJc w:val="left"/>
+      <w:pPr>
+        <w:ind w:left="1728" w:hanging="648"/>
+      </w:pPr>
+      <w:rPr>
+        <w:rFonts w:hint="default"/>
+      </w:rPr>
+    </w:lvl>
+    <w:lvl w:ilvl="4">
+      <w:start w:val="1"/>
+      <w:numFmt w:val="decimal"/>
+      <w:lvlText w:val="%1.%2.%3.%4.%5."/>
+      <w:lvlJc w:val="left"/>
+      <w:pPr>
+        <w:ind w:left="2232" w:hanging="792"/>
+      </w:pPr>
+      <w:rPr>
+        <w:rFonts w:hint="default"/>
+      </w:rPr>
+    </w:lvl>
+    <w:lvl w:ilvl="5">
+      <w:start w:val="1"/>
+      <w:numFmt w:val="decimal"/>
+      <w:lvlText w:val="%1.%2.%3.%4.%5.%6."/>
+      <w:lvlJc w:val="left"/>
+      <w:pPr>
+        <w:ind w:left="2736" w:hanging="936"/>
+      </w:pPr>
+      <w:rPr>
+        <w:rFonts w:hint="default"/>
+      </w:rPr>
+    </w:lvl>
+    <w:lvl w:ilvl="6">
+      <w:start w:val="1"/>
+      <w:numFmt w:val="decimal"/>
+      <w:lvlText w:val="%1.%2.%3.%4.%5.%6.%7."/>
+      <w:lvlJc w:val="left"/>
+      <w:pPr>
+        <w:ind w:left="3240" w:hanging="1080"/>
+      </w:pPr>
+      <w:rPr>
+        <w:rFonts w:hint="default"/>
+      </w:rPr>
+    </w:lvl>
+    <w:lvl w:ilvl="7">
+      <w:start w:val="1"/>
+      <w:numFmt w:val="decimal"/>
+      <w:lvlText w:val="%1.%2.%3.%4.%5.%6.%7.%8."/>
+      <w:lvlJc w:val="left"/>
+      <w:pPr>
+        <w:ind w:left="3744" w:hanging="1224"/>
+      </w:pPr>
+      <w:rPr>
+        <w:rFonts w:hint="default"/>
+      </w:rPr>
+    </w:lvl>
+    <w:lvl w:ilvl="8">
+      <w:start w:val="1"/>
+      <w:numFmt w:val="decimal"/>
+      <w:lvlText w:val="%1.%2.%3.%4.%5.%6.%7.%8.%9."/>
+      <w:lvlJc w:val="left"/>
+      <w:pPr>
+        <w:ind w:left="4320" w:hanging="1440"/>
+      </w:pPr>
+      <w:rPr>
+        <w:rFonts w:hint="default"/>
+      </w:rPr>
+    </w:lvl>
+  </w:abstractNum>
+  <w:abstractNum w:abstractNumId="4" w15:restartNumberingAfterBreak="0">
     <w:nsid w:val="05801F27"/>
     <w:multiLevelType w:val="hybridMultilevel"/>
     <w:tmpl w:val="845C21B8"/>
@@ -14916,7 +14796,7 @@
       </w:pPr>
     </w:lvl>
   </w:abstractNum>
-  <w:abstractNum w:abstractNumId="4" w15:restartNumberingAfterBreak="0">
+  <w:abstractNum w:abstractNumId="5" w15:restartNumberingAfterBreak="0">
     <w:nsid w:val="062D0AA8"/>
     <w:multiLevelType w:val="multilevel"/>
     <w:tmpl w:val="DDFED54E"/>
@@ -15065,7 +14945,7 @@
       </w:rPr>
     </w:lvl>
   </w:abstractNum>
-  <w:abstractNum w:abstractNumId="5" w15:restartNumberingAfterBreak="0">
+  <w:abstractNum w:abstractNumId="6" w15:restartNumberingAfterBreak="0">
     <w:nsid w:val="080273F8"/>
     <w:multiLevelType w:val="multilevel"/>
     <w:tmpl w:val="8DD49D60"/>
@@ -15154,7 +15034,7 @@
       </w:pPr>
     </w:lvl>
   </w:abstractNum>
-  <w:abstractNum w:abstractNumId="6" w15:restartNumberingAfterBreak="0">
+  <w:abstractNum w:abstractNumId="7" w15:restartNumberingAfterBreak="0">
     <w:nsid w:val="0B4E6662"/>
     <w:multiLevelType w:val="multilevel"/>
     <w:tmpl w:val="247E43A2"/>
@@ -15267,7 +15147,7 @@
       </w:rPr>
     </w:lvl>
   </w:abstractNum>
-  <w:abstractNum w:abstractNumId="7" w15:restartNumberingAfterBreak="0">
+  <w:abstractNum w:abstractNumId="8" w15:restartNumberingAfterBreak="0">
     <w:nsid w:val="0E016E41"/>
     <w:multiLevelType w:val="multilevel"/>
     <w:tmpl w:val="1B96AFC4"/>
@@ -15416,7 +15296,7 @@
       </w:rPr>
     </w:lvl>
   </w:abstractNum>
-  <w:abstractNum w:abstractNumId="8" w15:restartNumberingAfterBreak="0">
+  <w:abstractNum w:abstractNumId="9" w15:restartNumberingAfterBreak="0">
     <w:nsid w:val="0E7607D9"/>
     <w:multiLevelType w:val="multilevel"/>
     <w:tmpl w:val="701AF388"/>
@@ -15565,7 +15445,7 @@
       </w:rPr>
     </w:lvl>
   </w:abstractNum>
-  <w:abstractNum w:abstractNumId="9" w15:restartNumberingAfterBreak="0">
+  <w:abstractNum w:abstractNumId="10" w15:restartNumberingAfterBreak="0">
     <w:nsid w:val="0F376702"/>
     <w:multiLevelType w:val="multilevel"/>
     <w:tmpl w:val="6E30C4CE"/>
@@ -15678,7 +15558,7 @@
       </w:rPr>
     </w:lvl>
   </w:abstractNum>
-  <w:abstractNum w:abstractNumId="10" w15:restartNumberingAfterBreak="0">
+  <w:abstractNum w:abstractNumId="11" w15:restartNumberingAfterBreak="0">
     <w:nsid w:val="17DF6D22"/>
     <w:multiLevelType w:val="multilevel"/>
     <w:tmpl w:val="64C68624"/>
@@ -15791,7 +15671,7 @@
       </w:rPr>
     </w:lvl>
   </w:abstractNum>
-  <w:abstractNum w:abstractNumId="11" w15:restartNumberingAfterBreak="0">
+  <w:abstractNum w:abstractNumId="12" w15:restartNumberingAfterBreak="0">
     <w:nsid w:val="18F765CC"/>
     <w:multiLevelType w:val="hybridMultilevel"/>
     <w:tmpl w:val="4472485E"/>
@@ -15904,7 +15784,7 @@
       </w:rPr>
     </w:lvl>
   </w:abstractNum>
-  <w:abstractNum w:abstractNumId="12" w15:restartNumberingAfterBreak="0">
+  <w:abstractNum w:abstractNumId="13" w15:restartNumberingAfterBreak="0">
     <w:nsid w:val="19E33CA0"/>
     <w:multiLevelType w:val="multilevel"/>
     <w:tmpl w:val="0F6CF188"/>
@@ -16018,7 +15898,7 @@
       </w:rPr>
     </w:lvl>
   </w:abstractNum>
-  <w:abstractNum w:abstractNumId="13" w15:restartNumberingAfterBreak="0">
+  <w:abstractNum w:abstractNumId="14" w15:restartNumberingAfterBreak="0">
     <w:nsid w:val="1A31795E"/>
     <w:multiLevelType w:val="hybridMultilevel"/>
     <w:tmpl w:val="5FCA6254"/>
@@ -16107,7 +15987,7 @@
       </w:pPr>
     </w:lvl>
   </w:abstractNum>
-  <w:abstractNum w:abstractNumId="14" w15:restartNumberingAfterBreak="0">
+  <w:abstractNum w:abstractNumId="15" w15:restartNumberingAfterBreak="0">
     <w:nsid w:val="1CF92578"/>
     <w:multiLevelType w:val="multilevel"/>
     <w:tmpl w:val="E11A5F7A"/>
@@ -16220,7 +16100,7 @@
       </w:rPr>
     </w:lvl>
   </w:abstractNum>
-  <w:abstractNum w:abstractNumId="15" w15:restartNumberingAfterBreak="0">
+  <w:abstractNum w:abstractNumId="16" w15:restartNumberingAfterBreak="0">
     <w:nsid w:val="21AD26EA"/>
     <w:multiLevelType w:val="multilevel"/>
     <w:tmpl w:val="574C8E0A"/>
@@ -16369,7 +16249,7 @@
       </w:rPr>
     </w:lvl>
   </w:abstractNum>
-  <w:abstractNum w:abstractNumId="16" w15:restartNumberingAfterBreak="0">
+  <w:abstractNum w:abstractNumId="17" w15:restartNumberingAfterBreak="0">
     <w:nsid w:val="21AF7BC4"/>
     <w:multiLevelType w:val="hybridMultilevel"/>
     <w:tmpl w:val="BDBC5B0C"/>
@@ -16455,7 +16335,7 @@
       </w:pPr>
     </w:lvl>
   </w:abstractNum>
-  <w:abstractNum w:abstractNumId="17" w15:restartNumberingAfterBreak="0">
+  <w:abstractNum w:abstractNumId="18" w15:restartNumberingAfterBreak="0">
     <w:nsid w:val="24417E57"/>
     <w:multiLevelType w:val="hybridMultilevel"/>
     <w:tmpl w:val="8618D892"/>
@@ -16544,7 +16424,7 @@
       </w:pPr>
     </w:lvl>
   </w:abstractNum>
-  <w:abstractNum w:abstractNumId="18" w15:restartNumberingAfterBreak="0">
+  <w:abstractNum w:abstractNumId="19" w15:restartNumberingAfterBreak="0">
     <w:nsid w:val="27CA3C8A"/>
     <w:multiLevelType w:val="multilevel"/>
     <w:tmpl w:val="C4A6B3E8"/>
@@ -16657,7 +16537,7 @@
       </w:rPr>
     </w:lvl>
   </w:abstractNum>
-  <w:abstractNum w:abstractNumId="19" w15:restartNumberingAfterBreak="0">
+  <w:abstractNum w:abstractNumId="20" w15:restartNumberingAfterBreak="0">
     <w:nsid w:val="2DF26BA8"/>
     <w:multiLevelType w:val="multilevel"/>
     <w:tmpl w:val="75EAEBC2"/>
@@ -16770,7 +16650,7 @@
       </w:rPr>
     </w:lvl>
   </w:abstractNum>
-  <w:abstractNum w:abstractNumId="20" w15:restartNumberingAfterBreak="0">
+  <w:abstractNum w:abstractNumId="21" w15:restartNumberingAfterBreak="0">
     <w:nsid w:val="30DE7053"/>
     <w:multiLevelType w:val="multilevel"/>
     <w:tmpl w:val="02329816"/>
@@ -16883,7 +16763,7 @@
       </w:rPr>
     </w:lvl>
   </w:abstractNum>
-  <w:abstractNum w:abstractNumId="21" w15:restartNumberingAfterBreak="0">
+  <w:abstractNum w:abstractNumId="22" w15:restartNumberingAfterBreak="0">
     <w:nsid w:val="31122DD5"/>
     <w:multiLevelType w:val="multilevel"/>
     <w:tmpl w:val="8F74FBEA"/>
@@ -16996,7 +16876,7 @@
       </w:rPr>
     </w:lvl>
   </w:abstractNum>
-  <w:abstractNum w:abstractNumId="22" w15:restartNumberingAfterBreak="0">
+  <w:abstractNum w:abstractNumId="23" w15:restartNumberingAfterBreak="0">
     <w:nsid w:val="31F40E78"/>
     <w:multiLevelType w:val="hybridMultilevel"/>
     <w:tmpl w:val="43183F58"/>
@@ -17085,7 +16965,7 @@
       </w:pPr>
     </w:lvl>
   </w:abstractNum>
-  <w:abstractNum w:abstractNumId="23" w15:restartNumberingAfterBreak="0">
+  <w:abstractNum w:abstractNumId="24" w15:restartNumberingAfterBreak="0">
     <w:nsid w:val="32564737"/>
     <w:multiLevelType w:val="multilevel"/>
     <w:tmpl w:val="D5D29798"/>
@@ -17198,7 +17078,7 @@
       </w:rPr>
     </w:lvl>
   </w:abstractNum>
-  <w:abstractNum w:abstractNumId="24" w15:restartNumberingAfterBreak="0">
+  <w:abstractNum w:abstractNumId="25" w15:restartNumberingAfterBreak="0">
     <w:nsid w:val="392C1642"/>
     <w:multiLevelType w:val="multilevel"/>
     <w:tmpl w:val="2CAACA4A"/>
@@ -17311,7 +17191,7 @@
       </w:rPr>
     </w:lvl>
   </w:abstractNum>
-  <w:abstractNum w:abstractNumId="25" w15:restartNumberingAfterBreak="0">
+  <w:abstractNum w:abstractNumId="26" w15:restartNumberingAfterBreak="0">
     <w:nsid w:val="43A558DD"/>
     <w:multiLevelType w:val="multilevel"/>
     <w:tmpl w:val="82821402"/>
@@ -17424,7 +17304,7 @@
       </w:rPr>
     </w:lvl>
   </w:abstractNum>
-  <w:abstractNum w:abstractNumId="26" w15:restartNumberingAfterBreak="0">
+  <w:abstractNum w:abstractNumId="27" w15:restartNumberingAfterBreak="0">
     <w:nsid w:val="487D321E"/>
     <w:multiLevelType w:val="multilevel"/>
     <w:tmpl w:val="F19C7DBC"/>
@@ -17537,7 +17417,7 @@
       </w:rPr>
     </w:lvl>
   </w:abstractNum>
-  <w:abstractNum w:abstractNumId="27" w15:restartNumberingAfterBreak="0">
+  <w:abstractNum w:abstractNumId="28" w15:restartNumberingAfterBreak="0">
     <w:nsid w:val="4AA27C2F"/>
     <w:multiLevelType w:val="multilevel"/>
     <w:tmpl w:val="D96C882E"/>
@@ -17650,7 +17530,7 @@
       </w:rPr>
     </w:lvl>
   </w:abstractNum>
-  <w:abstractNum w:abstractNumId="28" w15:restartNumberingAfterBreak="0">
+  <w:abstractNum w:abstractNumId="29" w15:restartNumberingAfterBreak="0">
     <w:nsid w:val="4BF94498"/>
     <w:multiLevelType w:val="multilevel"/>
     <w:tmpl w:val="8DD49D60"/>
@@ -17739,7 +17619,7 @@
       </w:pPr>
     </w:lvl>
   </w:abstractNum>
-  <w:abstractNum w:abstractNumId="29" w15:restartNumberingAfterBreak="0">
+  <w:abstractNum w:abstractNumId="30" w15:restartNumberingAfterBreak="0">
     <w:nsid w:val="503008DE"/>
     <w:multiLevelType w:val="multilevel"/>
     <w:tmpl w:val="E6922B78"/>
@@ -17852,10 +17732,10 @@
       </w:rPr>
     </w:lvl>
   </w:abstractNum>
-  <w:abstractNum w:abstractNumId="30" w15:restartNumberingAfterBreak="0">
+  <w:abstractNum w:abstractNumId="31" w15:restartNumberingAfterBreak="0">
     <w:nsid w:val="55944BC8"/>
     <w:multiLevelType w:val="multilevel"/>
-    <w:tmpl w:val="A8C04996"/>
+    <w:tmpl w:val="7FC0573C"/>
     <w:lvl w:ilvl="0">
       <w:start w:val="1"/>
       <w:numFmt w:val="none"/>
@@ -17965,7 +17845,7 @@
       </w:rPr>
     </w:lvl>
   </w:abstractNum>
-  <w:abstractNum w:abstractNumId="31" w15:restartNumberingAfterBreak="0">
+  <w:abstractNum w:abstractNumId="32" w15:restartNumberingAfterBreak="0">
     <w:nsid w:val="57B03FA5"/>
     <w:multiLevelType w:val="hybridMultilevel"/>
     <w:tmpl w:val="D4928B38"/>
@@ -18078,7 +17958,7 @@
       </w:rPr>
     </w:lvl>
   </w:abstractNum>
-  <w:abstractNum w:abstractNumId="32" w15:restartNumberingAfterBreak="0">
+  <w:abstractNum w:abstractNumId="33" w15:restartNumberingAfterBreak="0">
     <w:nsid w:val="582C49AE"/>
     <w:multiLevelType w:val="hybridMultilevel"/>
     <w:tmpl w:val="C1F469D2"/>
@@ -18164,7 +18044,7 @@
       </w:pPr>
     </w:lvl>
   </w:abstractNum>
-  <w:abstractNum w:abstractNumId="33" w15:restartNumberingAfterBreak="0">
+  <w:abstractNum w:abstractNumId="34" w15:restartNumberingAfterBreak="0">
     <w:nsid w:val="5A443096"/>
     <w:multiLevelType w:val="multilevel"/>
     <w:tmpl w:val="84E6E9C8"/>
@@ -18277,7 +18157,7 @@
       </w:rPr>
     </w:lvl>
   </w:abstractNum>
-  <w:abstractNum w:abstractNumId="34" w15:restartNumberingAfterBreak="0">
+  <w:abstractNum w:abstractNumId="35" w15:restartNumberingAfterBreak="0">
     <w:nsid w:val="5C3938C8"/>
     <w:multiLevelType w:val="multilevel"/>
     <w:tmpl w:val="B7B89A6A"/>
@@ -18390,7 +18270,7 @@
       </w:rPr>
     </w:lvl>
   </w:abstractNum>
-  <w:abstractNum w:abstractNumId="35" w15:restartNumberingAfterBreak="0">
+  <w:abstractNum w:abstractNumId="36" w15:restartNumberingAfterBreak="0">
     <w:nsid w:val="647E0F49"/>
     <w:multiLevelType w:val="multilevel"/>
     <w:tmpl w:val="0BF05B74"/>
@@ -18539,7 +18419,7 @@
       </w:rPr>
     </w:lvl>
   </w:abstractNum>
-  <w:abstractNum w:abstractNumId="36" w15:restartNumberingAfterBreak="0">
+  <w:abstractNum w:abstractNumId="37" w15:restartNumberingAfterBreak="0">
     <w:nsid w:val="6A5501F5"/>
     <w:multiLevelType w:val="multilevel"/>
     <w:tmpl w:val="85708A5A"/>
@@ -18652,7 +18532,120 @@
       </w:rPr>
     </w:lvl>
   </w:abstractNum>
-  <w:abstractNum w:abstractNumId="37" w15:restartNumberingAfterBreak="0">
+  <w:abstractNum w:abstractNumId="38" w15:restartNumberingAfterBreak="0">
+    <w:nsid w:val="6A633388"/>
+    <w:multiLevelType w:val="multilevel"/>
+    <w:tmpl w:val="F6ACED6C"/>
+    <w:lvl w:ilvl="0">
+      <w:start w:val="1"/>
+      <w:numFmt w:val="none"/>
+      <w:lvlText w:val="2.3.4"/>
+      <w:lvlJc w:val="left"/>
+      <w:pPr>
+        <w:ind w:left="360" w:hanging="360"/>
+      </w:pPr>
+      <w:rPr>
+        <w:rFonts w:hint="default"/>
+      </w:rPr>
+    </w:lvl>
+    <w:lvl w:ilvl="1">
+      <w:start w:val="1"/>
+      <w:numFmt w:val="decimal"/>
+      <w:lvlText w:val="%1.%2."/>
+      <w:lvlJc w:val="left"/>
+      <w:pPr>
+        <w:ind w:left="792" w:hanging="432"/>
+      </w:pPr>
+      <w:rPr>
+        <w:rFonts w:hint="default"/>
+      </w:rPr>
+    </w:lvl>
+    <w:lvl w:ilvl="2">
+      <w:start w:val="1"/>
+      <w:numFmt w:val="decimal"/>
+      <w:lvlText w:val="%12.3.5"/>
+      <w:lvlJc w:val="left"/>
+      <w:pPr>
+        <w:ind w:left="1224" w:hanging="504"/>
+      </w:pPr>
+      <w:rPr>
+        <w:rFonts w:hint="default"/>
+      </w:rPr>
+    </w:lvl>
+    <w:lvl w:ilvl="3">
+      <w:start w:val="1"/>
+      <w:numFmt w:val="decimal"/>
+      <w:lvlText w:val="%1.%2.%3.%4."/>
+      <w:lvlJc w:val="left"/>
+      <w:pPr>
+        <w:ind w:left="1728" w:hanging="648"/>
+      </w:pPr>
+      <w:rPr>
+        <w:rFonts w:hint="default"/>
+      </w:rPr>
+    </w:lvl>
+    <w:lvl w:ilvl="4">
+      <w:start w:val="1"/>
+      <w:numFmt w:val="decimal"/>
+      <w:lvlText w:val="%1.%2.%3.%4.%5."/>
+      <w:lvlJc w:val="left"/>
+      <w:pPr>
+        <w:ind w:left="2232" w:hanging="792"/>
+      </w:pPr>
+      <w:rPr>
+        <w:rFonts w:hint="default"/>
+      </w:rPr>
+    </w:lvl>
+    <w:lvl w:ilvl="5">
+      <w:start w:val="1"/>
+      <w:numFmt w:val="decimal"/>
+      <w:lvlText w:val="%1.%2.%3.%4.%5.%6."/>
+      <w:lvlJc w:val="left"/>
+      <w:pPr>
+        <w:ind w:left="2736" w:hanging="936"/>
+      </w:pPr>
+      <w:rPr>
+        <w:rFonts w:hint="default"/>
+      </w:rPr>
+    </w:lvl>
+    <w:lvl w:ilvl="6">
+      <w:start w:val="1"/>
+      <w:numFmt w:val="decimal"/>
+      <w:lvlText w:val="%1.%2.%3.%4.%5.%6.%7."/>
+      <w:lvlJc w:val="left"/>
+      <w:pPr>
+        <w:ind w:left="3240" w:hanging="1080"/>
+      </w:pPr>
+      <w:rPr>
+        <w:rFonts w:hint="default"/>
+      </w:rPr>
+    </w:lvl>
+    <w:lvl w:ilvl="7">
+      <w:start w:val="1"/>
+      <w:numFmt w:val="decimal"/>
+      <w:lvlText w:val="%1.%2.%3.%4.%5.%6.%7.%8."/>
+      <w:lvlJc w:val="left"/>
+      <w:pPr>
+        <w:ind w:left="3744" w:hanging="1224"/>
+      </w:pPr>
+      <w:rPr>
+        <w:rFonts w:hint="default"/>
+      </w:rPr>
+    </w:lvl>
+    <w:lvl w:ilvl="8">
+      <w:start w:val="1"/>
+      <w:numFmt w:val="decimal"/>
+      <w:lvlText w:val="%1.%2.%3.%4.%5.%6.%7.%8.%9."/>
+      <w:lvlJc w:val="left"/>
+      <w:pPr>
+        <w:ind w:left="4320" w:hanging="1440"/>
+      </w:pPr>
+      <w:rPr>
+        <w:rFonts w:hint="default"/>
+      </w:rPr>
+    </w:lvl>
+  </w:abstractNum>
+  <w:abstractNum w:abstractNumId="39" w15:restartNumberingAfterBreak="0">
     <w:nsid w:val="6A98264B"/>
     <w:multiLevelType w:val="hybridMultilevel"/>
     <w:tmpl w:val="84508DB2"/>
@@ -18765,7 +18758,7 @@
       </w:rPr>
     </w:lvl>
   </w:abstractNum>
-  <w:abstractNum w:abstractNumId="38" w15:restartNumberingAfterBreak="0">
+  <w:abstractNum w:abstractNumId="40" w15:restartNumberingAfterBreak="0">
     <w:nsid w:val="6B781FDD"/>
     <w:multiLevelType w:val="hybridMultilevel"/>
     <w:tmpl w:val="88F8090A"/>
@@ -18854,7 +18847,7 @@
       </w:pPr>
     </w:lvl>
   </w:abstractNum>
-  <w:abstractNum w:abstractNumId="39" w15:restartNumberingAfterBreak="0">
+  <w:abstractNum w:abstractNumId="41" w15:restartNumberingAfterBreak="0">
     <w:nsid w:val="77D20A9A"/>
     <w:multiLevelType w:val="multilevel"/>
     <w:tmpl w:val="B4E44232"/>
@@ -18967,7 +18960,7 @@
       </w:rPr>
     </w:lvl>
   </w:abstractNum>
-  <w:abstractNum w:abstractNumId="40" w15:restartNumberingAfterBreak="0">
+  <w:abstractNum w:abstractNumId="42" w15:restartNumberingAfterBreak="0">
     <w:nsid w:val="7A08627F"/>
     <w:multiLevelType w:val="multilevel"/>
     <w:tmpl w:val="F11454A6"/>
@@ -19080,7 +19073,7 @@
       </w:rPr>
     </w:lvl>
   </w:abstractNum>
-  <w:abstractNum w:abstractNumId="41" w15:restartNumberingAfterBreak="0">
+  <w:abstractNum w:abstractNumId="43" w15:restartNumberingAfterBreak="0">
     <w:nsid w:val="7D6B3C57"/>
     <w:multiLevelType w:val="hybridMultilevel"/>
     <w:tmpl w:val="13006A00"/>
@@ -19170,130 +19163,136 @@
     </w:lvl>
   </w:abstractNum>
   <w:num w:numId="1">
-    <w:abstractNumId w:val="39"/>
+    <w:abstractNumId w:val="41"/>
   </w:num>
   <w:num w:numId="2">
-    <w:abstractNumId w:val="14"/>
+    <w:abstractNumId w:val="15"/>
   </w:num>
   <w:num w:numId="3">
-    <w:abstractNumId w:val="9"/>
+    <w:abstractNumId w:val="10"/>
   </w:num>
   <w:num w:numId="4">
-    <w:abstractNumId w:val="19"/>
+    <w:abstractNumId w:val="20"/>
   </w:num>
   <w:num w:numId="5">
     <w:abstractNumId w:val="1"/>
   </w:num>
   <w:num w:numId="6">
-    <w:abstractNumId w:val="32"/>
+    <w:abstractNumId w:val="33"/>
   </w:num>
   <w:num w:numId="7">
-    <w:abstractNumId w:val="16"/>
+    <w:abstractNumId w:val="17"/>
   </w:num>
   <w:num w:numId="8">
-    <w:abstractNumId w:val="23"/>
+    <w:abstractNumId w:val="24"/>
   </w:num>
   <w:num w:numId="9">
-    <w:abstractNumId w:val="36"/>
+    <w:abstractNumId w:val="37"/>
   </w:num>
   <w:num w:numId="10">
-    <w:abstractNumId w:val="21"/>
+    <w:abstractNumId w:val="22"/>
   </w:num>
   <w:num w:numId="11">
-    <w:abstractNumId w:val="34"/>
+    <w:abstractNumId w:val="35"/>
   </w:num>
   <w:num w:numId="12">
     <w:abstractNumId w:val="2"/>
   </w:num>
   <w:num w:numId="13">
-    <w:abstractNumId w:val="29"/>
+    <w:abstractNumId w:val="30"/>
   </w:num>
   <w:num w:numId="14">
+    <w:abstractNumId w:val="28"/>
+  </w:num>
+  <w:num w:numId="15">
+    <w:abstractNumId w:val="34"/>
+  </w:num>
+  <w:num w:numId="16">
+    <w:abstractNumId w:val="26"/>
+  </w:num>
+  <w:num w:numId="17">
+    <w:abstractNumId w:val="31"/>
+  </w:num>
+  <w:num w:numId="18">
+    <w:abstractNumId w:val="13"/>
+  </w:num>
+  <w:num w:numId="19">
+    <w:abstractNumId w:val="19"/>
+  </w:num>
+  <w:num w:numId="20">
+    <w:abstractNumId w:val="42"/>
+  </w:num>
+  <w:num w:numId="21">
+    <w:abstractNumId w:val="11"/>
+  </w:num>
+  <w:num w:numId="22">
+    <w:abstractNumId w:val="7"/>
+  </w:num>
+  <w:num w:numId="23">
     <w:abstractNumId w:val="27"/>
   </w:num>
-  <w:num w:numId="15">
-    <w:abstractNumId w:val="33"/>
-  </w:num>
-  <w:num w:numId="16">
+  <w:num w:numId="24">
     <w:abstractNumId w:val="25"/>
   </w:num>
-  <w:num w:numId="17">
-    <w:abstractNumId w:val="30"/>
+  <w:num w:numId="25">
+    <w:abstractNumId w:val="39"/>
   </w:num>
-  <w:num w:numId="18">
+  <w:num w:numId="26">
+    <w:abstractNumId w:val="23"/>
+  </w:num>
+  <w:num w:numId="27">
+    <w:abstractNumId w:val="18"/>
+  </w:num>
+  <w:num w:numId="28">
+    <w:abstractNumId w:val="43"/>
+  </w:num>
+  <w:num w:numId="29">
+    <w:abstractNumId w:val="32"/>
+  </w:num>
+  <w:num w:numId="30">
+    <w:abstractNumId w:val="21"/>
+  </w:num>
+  <w:num w:numId="31">
     <w:abstractNumId w:val="12"/>
   </w:num>
-  <w:num w:numId="19">
-    <w:abstractNumId w:val="18"/>
-  </w:num>
-  <w:num w:numId="20">
+  <w:num w:numId="32">
     <w:abstractNumId w:val="40"/>
   </w:num>
-  <w:num w:numId="21">
-    <w:abstractNumId w:val="10"/>
-  </w:num>
-  <w:num w:numId="22">
-    <w:abstractNumId w:val="6"/>
-  </w:num>
-  <w:num w:numId="23">
-    <w:abstractNumId w:val="26"/>
-  </w:num>
-  <w:num w:numId="24">
-    <w:abstractNumId w:val="24"/>
-  </w:num>
-  <w:num w:numId="25">
-    <w:abstractNumId w:val="37"/>
-  </w:num>
-  <w:num w:numId="26">
-    <w:abstractNumId w:val="22"/>
-  </w:num>
-  <w:num w:numId="27">
-    <w:abstractNumId w:val="17"/>
-  </w:num>
-  <w:num w:numId="28">
-    <w:abstractNumId w:val="41"/>
-  </w:num>
-  <w:num w:numId="29">
-    <w:abstractNumId w:val="31"/>
-  </w:num>
-  <w:num w:numId="30">
-    <w:abstractNumId w:val="20"/>
-  </w:num>
-  <w:num w:numId="31">
-    <w:abstractNumId w:val="11"/>
-  </w:num>
-  <w:num w:numId="32">
-    <w:abstractNumId w:val="38"/>
-  </w:num>
   <w:num w:numId="33">
-    <w:abstractNumId w:val="13"/>
+    <w:abstractNumId w:val="14"/>
   </w:num>
   <w:num w:numId="34">
     <w:abstractNumId w:val="0"/>
   </w:num>
   <w:num w:numId="35">
-    <w:abstractNumId w:val="7"/>
+    <w:abstractNumId w:val="8"/>
   </w:num>
   <w:num w:numId="36">
-    <w:abstractNumId w:val="35"/>
+    <w:abstractNumId w:val="36"/>
   </w:num>
   <w:num w:numId="37">
-    <w:abstractNumId w:val="8"/>
+    <w:abstractNumId w:val="9"/>
   </w:num>
   <w:num w:numId="38">
-    <w:abstractNumId w:val="15"/>
+    <w:abstractNumId w:val="16"/>
   </w:num>
   <w:num w:numId="39">
+    <w:abstractNumId w:val="5"/>
+  </w:num>
+  <w:num w:numId="40">
+    <w:abstractNumId w:val="6"/>
+  </w:num>
+  <w:num w:numId="41">
     <w:abstractNumId w:val="4"/>
   </w:num>
-  <w:num w:numId="40">
-    <w:abstractNumId w:val="5"/>
+  <w:num w:numId="42">
+    <w:abstractNumId w:val="29"/>
   </w:num>
-  <w:num w:numId="41">
+  <w:num w:numId="43">
     <w:abstractNumId w:val="3"/>
   </w:num>
-  <w:num w:numId="42">
-    <w:abstractNumId w:val="28"/>
+  <w:num w:numId="44">
+    <w:abstractNumId w:val="38"/>
   </w:num>
   <w:numIdMacAtCleanup w:val="42"/>
 </w:numbering>
@@ -19770,6 +19769,7 @@
   <w:style w:type="character" w:default="1" w:styleId="Fuentedeprrafopredeter">
     <w:name w:val="Default Paragraph Font"/>
     <w:uiPriority w:val="1"/>
+    <w:semiHidden/>
     <w:unhideWhenUsed/>
   </w:style>
   <w:style w:type="table" w:default="1" w:styleId="Tablanormal">

</xml_diff>